<commit_message>
DevPod enhancements addendum: persistent SSH host keys
</commit_message>
<xml_diff>
--- a/docs/Homelab_DevPod_Enhancements_Addendum.docx
+++ b/docs/Homelab_DevPod_Enhancements_Addendum.docx
@@ -30,7 +30,7 @@
         <w:pStyle w:val="Subtitle"/>
       </w:pPr>
       <w:r>
-        <w:t>Cloudflare SSH, git rewrite, cluster-admin kubectl, SOPS key and k8s tools in the Skynet DevPod.</w:t>
+        <w:t>Cloudflare SSH, git rewrite, cluster-admin kubectl, SOPS key, persistent host keys and k8s tools.</w:t>
       </w:r>
     </w:p>
     <w:p>
@@ -46,7 +46,7 @@
           <w:color w:val="595959"/>
           <w:sz w:val="20"/>
         </w:rPr>
-        <w:t>homelab-cluster main 8ba0a60 · dotfiles main 2dd1f99 · StatefulSet devpod (devpod-0, devpod-1 ready) · Verified 3 October 2026 · No secrets in this document</w:t>
+        <w:t>homelab-cluster main 9ae6231 · dotfiles main 2dd1f99 · StatefulSet devpod (devpod-0, devpod-1 ready) · Verified 3 October 2026 · No secrets in this document</w:t>
       </w:r>
     </w:p>
     <w:tbl>
@@ -458,7 +458,7 @@
                 <w:color w:val="365F91"/>
                 <w:sz w:val="20"/>
               </w:rPr>
-              <w:t>Dotfiles</w:t>
+              <w:t>SSH host keys</w:t>
             </w:r>
           </w:p>
         </w:tc>
@@ -477,7 +477,7 @@
                 <w:color w:val="365F91"/>
                 <w:sz w:val="20"/>
               </w:rPr>
-              <w:t>mise: kubectl, flux2, helm, kustomize, k9s, sops, age · Invertedlight/dotfiles commit 2dd1f99</w:t>
+              <w:t>Persistent ed25519/rsa/ecdsa keys from Secret devpod/devpod-ssh-host-keys (NOT in Git), shared by all replicas · commit 9ae6231</w:t>
             </w:r>
           </w:p>
         </w:tc>
@@ -502,7 +502,7 @@
                 <w:color w:val="365F91"/>
                 <w:sz w:val="20"/>
               </w:rPr>
-              <w:t>Files in Git</w:t>
+              <w:t>Dotfiles</w:t>
             </w:r>
           </w:p>
         </w:tc>
@@ -521,7 +521,7 @@
                 <w:color w:val="365F91"/>
                 <w:sz w:val="20"/>
               </w:rPr>
-              <w:t>apps/base/devpod/{serviceaccount-devpod.yaml, clusterrolebinding-devpod-admin.yaml, kustomization.yaml, devpod-statefulset.yaml, bootstrap/devpod-runtime.sh, README.md}; dotfiles dot_config/mise/config.toml</w:t>
+              <w:t>mise: kubectl, flux2, helm, kustomize, k9s, sops, age · Invertedlight/dotfiles commit 2dd1f99</w:t>
             </w:r>
           </w:p>
         </w:tc>
@@ -546,7 +546,7 @@
                 <w:color w:val="365F91"/>
                 <w:sz w:val="20"/>
               </w:rPr>
-              <w:t>Not in Git</w:t>
+              <w:t>Files in Git</w:t>
             </w:r>
           </w:p>
         </w:tc>
@@ -565,7 +565,7 @@
                 <w:color w:val="365F91"/>
                 <w:sz w:val="20"/>
               </w:rPr>
-              <w:t>Secret devpod/sops-age, Cloudflare tunnel/DNS/Access config, M5 ~/.ssh/config</w:t>
+              <w:t>apps/base/devpod/{serviceaccount-devpod.yaml, clusterrolebinding-devpod-admin.yaml, kustomization.yaml, devpod-statefulset.yaml, bootstrap/devpod-runtime.sh, README.md}; dotfiles dot_config/mise/config.toml</w:t>
             </w:r>
           </w:p>
         </w:tc>
@@ -590,6 +590,50 @@
                 <w:color w:val="365F91"/>
                 <w:sz w:val="20"/>
               </w:rPr>
+              <w:t>Not in Git</w:t>
+            </w:r>
+          </w:p>
+        </w:tc>
+        <w:tc>
+          <w:tcPr>
+            <w:tcW w:type="dxa" w:w="7488"/>
+            <w:shd w:val="clear" w:color="auto" w:fill="D3DFEE"/>
+          </w:tcPr>
+          <w:p>
+            <w:pPr>
+              <w:spacing w:before="40" w:after="40" w:line="240" w:lineRule="auto"/>
+            </w:pPr>
+            <w:r/>
+            <w:r>
+              <w:rPr>
+                <w:color w:val="365F91"/>
+                <w:sz w:val="20"/>
+              </w:rPr>
+              <w:t>Secrets devpod/sops-age and devpod/devpod-ssh-host-keys, Cloudflare tunnel/DNS/Access config, M5 ~/.ssh/config</w:t>
+            </w:r>
+          </w:p>
+        </w:tc>
+      </w:tr>
+      <w:tr>
+        <w:trPr>
+          <w:cantSplit/>
+        </w:trPr>
+        <w:tc>
+          <w:tcPr>
+            <w:tcW w:type="dxa" w:w="2592"/>
+            <w:shd w:val="clear" w:color="auto" w:fill="FFFFFF"/>
+          </w:tcPr>
+          <w:p>
+            <w:pPr>
+              <w:spacing w:before="40" w:after="40" w:line="240" w:lineRule="auto"/>
+            </w:pPr>
+            <w:r/>
+            <w:r>
+              <w:rPr>
+                <w:b/>
+                <w:color w:val="365F91"/>
+                <w:sz w:val="20"/>
+              </w:rPr>
               <w:t>PVCs (never delete)</w:t>
             </w:r>
           </w:p>
@@ -597,7 +641,7 @@
         <w:tc>
           <w:tcPr>
             <w:tcW w:type="dxa" w:w="7488"/>
-            <w:shd w:val="clear" w:color="auto" w:fill="D3DFEE"/>
+            <w:shd w:val="clear" w:color="auto" w:fill="FFFFFF"/>
           </w:tcPr>
           <w:p>
             <w:pPr>
@@ -1533,6 +1577,88 @@
           </w:p>
         </w:tc>
       </w:tr>
+      <w:tr>
+        <w:trPr>
+          <w:cantSplit/>
+        </w:trPr>
+        <w:tc>
+          <w:tcPr>
+            <w:tcW w:type="dxa" w:w="432"/>
+            <w:shd w:val="clear" w:color="auto" w:fill="D3DFEE"/>
+          </w:tcPr>
+          <w:p>
+            <w:pPr>
+              <w:spacing w:before="40" w:after="40" w:line="240" w:lineRule="auto"/>
+            </w:pPr>
+            <w:r/>
+            <w:r>
+              <w:rPr>
+                <w:b/>
+                <w:color w:val="365F91"/>
+                <w:sz w:val="20"/>
+              </w:rPr>
+              <w:t>7</w:t>
+            </w:r>
+          </w:p>
+        </w:tc>
+        <w:tc>
+          <w:tcPr>
+            <w:tcW w:type="dxa" w:w="3456"/>
+            <w:shd w:val="clear" w:color="auto" w:fill="D3DFEE"/>
+          </w:tcPr>
+          <w:p>
+            <w:pPr>
+              <w:spacing w:before="40" w:after="40" w:line="240" w:lineRule="auto"/>
+            </w:pPr>
+            <w:r/>
+            <w:r>
+              <w:rPr>
+                <w:color w:val="365F91"/>
+                <w:sz w:val="20"/>
+              </w:rPr>
+              <w:t>Persistent SSH host keys (out-of-band Secret)</w:t>
+            </w:r>
+          </w:p>
+        </w:tc>
+        <w:tc>
+          <w:tcPr>
+            <w:tcW w:type="dxa" w:w="4752"/>
+            <w:shd w:val="clear" w:color="auto" w:fill="D3DFEE"/>
+          </w:tcPr>
+          <w:p>
+            <w:pPr>
+              <w:spacing w:before="40" w:after="40" w:line="240" w:lineRule="auto"/>
+            </w:pPr>
+            <w:r/>
+            <w:r>
+              <w:rPr>
+                <w:color w:val="365F91"/>
+                <w:sz w:val="20"/>
+              </w:rPr>
+              <w:t>kubectl; devpod-statefulset.yaml, devpod-runtime.sh, README.md</w:t>
+            </w:r>
+          </w:p>
+        </w:tc>
+        <w:tc>
+          <w:tcPr>
+            <w:tcW w:type="dxa" w:w="1440"/>
+            <w:shd w:val="clear" w:color="auto" w:fill="D3DFEE"/>
+          </w:tcPr>
+          <w:p>
+            <w:pPr>
+              <w:spacing w:before="40" w:after="40" w:line="240" w:lineRule="auto"/>
+            </w:pPr>
+            <w:r/>
+            <w:r>
+              <w:rPr>
+                <w:color w:val="365F91"/>
+                <w:sz w:val="20"/>
+              </w:rPr>
+              <w:t>9ae6231</w:t>
+            </w:r>
+          </w:p>
+        </w:tc>
+      </w:tr>
     </w:tbl>
     <w:p>
       <w:pPr>
@@ -1912,7 +2038,7 @@
                 <w:color w:val="365F91"/>
                 <w:sz w:val="20"/>
               </w:rPr>
-              <w:t>2dd1f99 (dotfiles)</w:t>
+              <w:t>9ae6231</w:t>
             </w:r>
           </w:p>
         </w:tc>
@@ -1931,6 +2057,69 @@
                 <w:color w:val="365F91"/>
                 <w:sz w:val="20"/>
               </w:rPr>
+              <w:t>14:03</w:t>
+            </w:r>
+          </w:p>
+        </w:tc>
+        <w:tc>
+          <w:tcPr>
+            <w:tcW w:type="dxa" w:w="6480"/>
+            <w:shd w:val="clear" w:color="auto" w:fill="D3DFEE"/>
+          </w:tcPr>
+          <w:p>
+            <w:pPr>
+              <w:spacing w:before="40" w:after="40" w:line="240" w:lineRule="auto"/>
+            </w:pPr>
+            <w:r/>
+            <w:r>
+              <w:rPr>
+                <w:color w:val="365F91"/>
+                <w:sz w:val="20"/>
+              </w:rPr>
+              <w:t>DevPod: persistent SSH host keys from out-of-band Secret</w:t>
+            </w:r>
+          </w:p>
+        </w:tc>
+      </w:tr>
+      <w:tr>
+        <w:trPr>
+          <w:cantSplit/>
+        </w:trPr>
+        <w:tc>
+          <w:tcPr>
+            <w:tcW w:type="dxa" w:w="2304"/>
+            <w:shd w:val="clear" w:color="auto" w:fill="FFFFFF"/>
+          </w:tcPr>
+          <w:p>
+            <w:pPr>
+              <w:spacing w:before="40" w:after="40" w:line="240" w:lineRule="auto"/>
+            </w:pPr>
+            <w:r/>
+            <w:r>
+              <w:rPr>
+                <w:b/>
+                <w:color w:val="365F91"/>
+                <w:sz w:val="20"/>
+              </w:rPr>
+              <w:t>2dd1f99 (dotfiles)</w:t>
+            </w:r>
+          </w:p>
+        </w:tc>
+        <w:tc>
+          <w:tcPr>
+            <w:tcW w:type="dxa" w:w="1296"/>
+            <w:shd w:val="clear" w:color="auto" w:fill="FFFFFF"/>
+          </w:tcPr>
+          <w:p>
+            <w:pPr>
+              <w:spacing w:before="40" w:after="40" w:line="240" w:lineRule="auto"/>
+            </w:pPr>
+            <w:r/>
+            <w:r>
+              <w:rPr>
+                <w:color w:val="365F91"/>
+                <w:sz w:val="20"/>
+              </w:rPr>
               <w:t>13:27</w:t>
             </w:r>
           </w:p>
@@ -1938,7 +2127,7 @@
         <w:tc>
           <w:tcPr>
             <w:tcW w:type="dxa" w:w="6480"/>
-            <w:shd w:val="clear" w:color="auto" w:fill="D3DFEE"/>
+            <w:shd w:val="clear" w:color="auto" w:fill="FFFFFF"/>
           </w:tcPr>
           <w:p>
             <w:pPr>
@@ -2489,7 +2678,7 @@
     </w:p>
     <w:p>
       <w:r>
-        <w:t>StatefulSet devpod at main 8ba0a60. New today: serviceAccountName devpod, automountServiceAccountToken, pod securityContext fsGroup 1000 / OnRootMismatch, the sops-age volume and its read-only mount at /etc/sops-age.</w:t>
+        <w:t>StatefulSet devpod at main 9ae6231. New today: serviceAccountName devpod, automountServiceAccountToken, pod securityContext fsGroup 1000 / OnRootMismatch, the sops-age volume and its read-only mount at /etc/sops-age; the ssh-host-keys volume (Secret devpod-ssh-host-keys) mounted at /etc/devpod/ssh-host-keys, and ssh-keygen -A only as a fallback (9ae6231).</w:t>
       </w:r>
     </w:p>
     <w:p>
@@ -2719,7 +2908,17 @@
         <w:br/>
         <w:t xml:space="preserve">              mkdir -p /var/run/sshd /home/vscode/.ssh</w:t>
         <w:br/>
-        <w:t xml:space="preserve">              ssh-keygen -A || true</w:t>
+        <w:t xml:space="preserve">              # Host keys come from Secret devpod-ssh-host-keys (copied by</w:t>
+        <w:br/>
+        <w:t xml:space="preserve">              # devpod-runtime.sh). Generate throwaway keys only if absent.</w:t>
+        <w:br/>
+        <w:t xml:space="preserve">              if ! ls /etc/ssh/ssh_host_*_key &gt;/dev/null 2&gt;&amp;1; then</w:t>
+        <w:br/>
+        <w:t xml:space="preserve">                echo "no persistent host keys; generating (will change on restart)"</w:t>
+        <w:br/>
+        <w:t xml:space="preserve">                ssh-keygen -A || true</w:t>
+        <w:br/>
+        <w:t xml:space="preserve">              fi</w:t>
         <w:br/>
         <w:t xml:space="preserve">              if [ -f /etc/ssh/sshd_config ]; then</w:t>
         <w:br/>
@@ -2819,6 +3018,16 @@
         <w:br/>
         <w:t xml:space="preserve">              readOnly: true</w:t>
         <w:br/>
+        <w:t xml:space="preserve">            # SSH host keys (Secret devpod/devpod-ssh-host-keys, created by</w:t>
+        <w:br/>
+        <w:t xml:space="preserve">            # kubectl out of band, not in Git). Shared by all replicas.</w:t>
+        <w:br/>
+        <w:t xml:space="preserve">            - name: ssh-host-keys</w:t>
+        <w:br/>
+        <w:t xml:space="preserve">              mountPath: /etc/devpod/ssh-host-keys</w:t>
+        <w:br/>
+        <w:t xml:space="preserve">              readOnly: true</w:t>
+        <w:br/>
         <w:t xml:space="preserve">      volumes:</w:t>
         <w:br/>
         <w:t xml:space="preserve">        - name: scratch</w:t>
@@ -2864,6 +3073,20 @@
         <w:t xml:space="preserve">          secret:</w:t>
         <w:br/>
         <w:t xml:space="preserve">            secretName: sops-age</w:t>
+        <w:br/>
+        <w:t xml:space="preserve">            optional: true</w:t>
+        <w:br/>
+        <w:t xml:space="preserve">            defaultMode: 0400</w:t>
+        <w:br/>
+        <w:t xml:space="preserve">        # Persistent sshd host keys so the fingerprint survives restarts.</w:t>
+        <w:br/>
+        <w:t xml:space="preserve">        # NOT in Git; see README. devpod-runtime.sh copies them to /etc/ssh.</w:t>
+        <w:br/>
+        <w:t xml:space="preserve">        - name: ssh-host-keys</w:t>
+        <w:br/>
+        <w:t xml:space="preserve">          secret:</w:t>
+        <w:br/>
+        <w:t xml:space="preserve">            secretName: devpod-ssh-host-keys</w:t>
         <w:br/>
         <w:t xml:space="preserve">            optional: true</w:t>
         <w:br/>
@@ -2906,7 +3129,7 @@
     </w:p>
     <w:p>
       <w:r>
-        <w:t>Runs as root on every workspace start. New today: GitHub insteadOf rewrite (0989587), SOPS age key copy to /run/devpod-sops/keys.txt + ~/.config/sops/age/keys.txt symlink (b1017b5), /etc/environment for kubectl/sops in SSH sessions (8ba0a60).</w:t>
+        <w:t>Runs as root on every workspace start. New today: GitHub insteadOf rewrite (0989587), SOPS age key copy to /run/devpod-sops/keys.txt + ~/.config/sops/age/keys.txt symlink (b1017b5), /etc/environment for kubectl/sops in SSH sessions (8ba0a60), persistent SSH host keys copied into /etc/ssh (9ae6231).</w:t>
       </w:r>
     </w:p>
     <w:p>
@@ -2983,6 +3206,39 @@
         <w:t>else</w:t>
         <w:br/>
         <w:t xml:space="preserve">  echo "devpod-runtime: no GitHub token mounted; private repos will not clone"</w:t>
+        <w:br/>
+        <w:t>fi</w:t>
+        <w:br/>
+        <w:br/>
+        <w:t># Persistent SSH host keys (Secret devpod/devpod-ssh-host-keys, mounted only</w:t>
+        <w:br/>
+        <w:t># in workspace). Copy before sshd is installed/started so the fingerprint is</w:t>
+        <w:br/>
+        <w:t># the same on every restart and every replica. Without the Secret the</w:t>
+        <w:br/>
+        <w:t># workspace command falls back to ssh-keygen -A (keys change on restart).</w:t>
+        <w:br/>
+        <w:t>HK_SRC=/etc/devpod/ssh-host-keys</w:t>
+        <w:br/>
+        <w:t>if ls "$HK_SRC"/ssh_host_*_key &gt;/dev/null 2&gt;&amp;1; then</w:t>
+        <w:br/>
+        <w:t xml:space="preserve">  mkdir -p /etc/ssh</w:t>
+        <w:br/>
+        <w:t xml:space="preserve">  for k in "$HK_SRC"/ssh_host_*_key; do</w:t>
+        <w:br/>
+        <w:t xml:space="preserve">    n=$(basename "$k")</w:t>
+        <w:br/>
+        <w:t xml:space="preserve">    install -m 0600 -o 0 -g 0 "$k" "/etc/ssh/$n"</w:t>
+        <w:br/>
+        <w:t xml:space="preserve">    [ -s "$k.pub" ] &amp;&amp; install -m 0644 -o 0 -g 0 "$k.pub" "/etc/ssh/$n.pub"</w:t>
+        <w:br/>
+        <w:t xml:space="preserve">  done</w:t>
+        <w:br/>
+        <w:t xml:space="preserve">  echo "devpod-runtime: persistent SSH host keys installed"</w:t>
+        <w:br/>
+        <w:t>else</w:t>
+        <w:br/>
+        <w:t xml:space="preserve">  echo "devpod-runtime: no SSH host key Secret; sshd will generate throwaway keys"</w:t>
         <w:br/>
         <w:t>fi</w:t>
         <w:br/>
@@ -4248,7 +4504,7 @@
     </w:p>
     <w:p>
       <w:r>
-        <w:t>Namespace README at 8ba0a60, including the new Cluster access and SOPS age key sections.</w:t>
+        <w:t>Namespace README at 9ae6231, including the new Cluster access, SOPS age key and SSH host key sections.</w:t>
       </w:r>
     </w:p>
     <w:p>
@@ -4352,6 +4608,41 @@
         <w:br/>
         <w:br/>
         <w:t>Flux doesn't prune it (it isn't in Git). To remove the key from the pods: `kubectl -n devpod delete secret sops-age` and restart the StatefulSet.</w:t>
+        <w:br/>
+        <w:br/>
+        <w:t>### SSH host keys (`Secret devpod/devpod-ssh-host-keys`, not in Git)</w:t>
+        <w:br/>
+        <w:br/>
+        <w:t>sshd's host keys (ed25519, rsa, ecdsa) live in a Secret created with kubectl, **never committed**, shared by every replica so `devpod-0` and `devpod-1` present the same fingerprint and it survives restarts. The workspace container mounts it read-only at `/etc/devpod/ssh-host-keys` (`optional: true`); `devpod-runtime.sh` copies the keys to `/etc/ssh` (private 0600, `.pub` 0644, root) before sshd starts. Without the Secret the pod falls back to `ssh-keygen -A`, and the fingerprint changes on every restart.</w:t>
+        <w:br/>
+        <w:br/>
+        <w:t>Create or rotate it (from a Mac with cluster access; nothing is printed and the temp dir is removed):</w:t>
+        <w:br/>
+        <w:br/>
+        <w:t>```sh</w:t>
+        <w:br/>
+        <w:t>bash -c '</w:t>
+        <w:br/>
+        <w:t>set -e; d=$(mktemp -d); trap "rm -rf \"$d\"" EXIT; umask 077</w:t>
+        <w:br/>
+        <w:t>for t in ed25519 rsa ecdsa; do b=""; [ $t = rsa ] &amp;&amp; b="-b 4096"</w:t>
+        <w:br/>
+        <w:t xml:space="preserve">  ssh-keygen -q -t $t $b -N "" -C root@devpod -f "$d/ssh_host_${t}_key"; done</w:t>
+        <w:br/>
+        <w:t>args=(); for f in "$d"/ssh_host_*; do args+=("--from-file=$(basename "$f")=$f"); done</w:t>
+        <w:br/>
+        <w:t>kubectl -n devpod delete secret devpod-ssh-host-keys --ignore-not-found</w:t>
+        <w:br/>
+        <w:t>kubectl -n devpod create secret generic devpod-ssh-host-keys "${args[@]}" &gt;/dev/null</w:t>
+        <w:br/>
+        <w:t>for t in ed25519 rsa ecdsa; do ssh-keygen -lf "$d/ssh_host_${t}_key.pub"; done'</w:t>
+        <w:br/>
+        <w:t>kubectl -n devpod rollout restart statefulset/devpod</w:t>
+        <w:br/>
+        <w:t>```</w:t>
+        <w:br/>
+        <w:br/>
+        <w:t>After a rotation, on each Mac run `ssh-keygen -R devpod-0` and `ssh-keygen -R devpod-1`, then reconnect and accept the new fingerprint (or add the new `ssh_host_ed25519_key.pub` to `~/.ssh/known_hosts` as `devpod-0 ssh-ed25519 …` and `devpod-1 ssh-ed25519 …`).</w:t>
         <w:br/>
         <w:br/>
         <w:t>## Scratch storage (`smb-32tb`)</w:t>
@@ -4512,7 +4803,496 @@
         <w:pStyle w:val="Heading1"/>
       </w:pPr>
       <w:r>
-        <w:t>15. Verification (3 Oct 2026, 13:30-13:40 CT)</w:t>
+        <w:t>15. Persistent SSH host keys (Secret devpod/devpod-ssh-host-keys)</w:t>
+      </w:r>
+    </w:p>
+    <w:p>
+      <w:r>
+        <w:t>Before 9ae6231 the workspace ran ssh-keygen -A on the container filesystem at every start, so each restart presented a new host key and ssh devpod-0 failed host key verification. Now one set of keys (ed25519, rsa 4096, ecdsa) lives in a Secret created with kubectl, shared by devpod-0 and devpod-1. The workspace container mounts it read-only (0400, optional) at /etc/devpod/ssh-host-keys; devpod-runtime.sh copies the keys into /etc/ssh (private 0600, .pub 0644, root) before openssh is installed and sshd starts. ssh-keygen -A runs only when no host key is present (Secret missing).</w:t>
+      </w:r>
+    </w:p>
+    <w:tbl>
+      <w:tblPr>
+        <w:tblStyle w:val="LightShading-Accent1"/>
+        <w:tblW w:type="auto" w:w="0"/>
+        <w:tblLayout w:type="fixed"/>
+        <w:tblLook w:firstColumn="1" w:firstRow="1" w:lastColumn="0" w:lastRow="0" w:noHBand="0" w:noVBand="1" w:val="04A0"/>
+        <w:tblBorders>
+          <w:top w:val="single" w:sz="8" w:space="0" w:color="4F81BD"/>
+          <w:left w:val="nil"/>
+          <w:bottom w:val="single" w:sz="8" w:space="0" w:color="4F81BD"/>
+          <w:right w:val="nil"/>
+          <w:insideH w:val="nil"/>
+          <w:insideV w:val="nil"/>
+        </w:tblBorders>
+      </w:tblPr>
+      <w:tblGrid>
+        <w:gridCol w:w="3168"/>
+        <w:gridCol w:w="1728"/>
+        <w:gridCol w:w="5184"/>
+      </w:tblGrid>
+      <w:tr>
+        <w:trPr>
+          <w:cantSplit/>
+          <w:tblHeader w:val="true"/>
+        </w:trPr>
+        <w:tc>
+          <w:tcPr>
+            <w:tcW w:type="dxa" w:w="3168"/>
+            <w:tcBorders>
+              <w:top w:val="single" w:sz="8" w:space="0" w:color="4F81BD"/>
+              <w:bottom w:val="single" w:sz="8" w:space="0" w:color="4F81BD"/>
+            </w:tcBorders>
+            <w:shd w:val="clear" w:color="auto" w:fill="365F91"/>
+          </w:tcPr>
+          <w:p>
+            <w:pPr>
+              <w:keepNext/>
+              <w:spacing w:before="40" w:after="40" w:line="240" w:lineRule="auto"/>
+            </w:pPr>
+            <w:r/>
+            <w:r>
+              <w:rPr>
+                <w:b/>
+                <w:color w:val="FFFFFF"/>
+                <w:sz w:val="20"/>
+              </w:rPr>
+              <w:t>Secret key</w:t>
+            </w:r>
+          </w:p>
+        </w:tc>
+        <w:tc>
+          <w:tcPr>
+            <w:tcW w:type="dxa" w:w="1728"/>
+            <w:tcBorders>
+              <w:top w:val="single" w:sz="8" w:space="0" w:color="4F81BD"/>
+              <w:bottom w:val="single" w:sz="8" w:space="0" w:color="4F81BD"/>
+            </w:tcBorders>
+            <w:shd w:val="clear" w:color="auto" w:fill="365F91"/>
+          </w:tcPr>
+          <w:p>
+            <w:pPr>
+              <w:keepNext/>
+              <w:spacing w:before="40" w:after="40" w:line="240" w:lineRule="auto"/>
+            </w:pPr>
+            <w:r/>
+            <w:r>
+              <w:rPr>
+                <w:b/>
+                <w:color w:val="FFFFFF"/>
+                <w:sz w:val="20"/>
+              </w:rPr>
+              <w:t>Type</w:t>
+            </w:r>
+          </w:p>
+        </w:tc>
+        <w:tc>
+          <w:tcPr>
+            <w:tcW w:type="dxa" w:w="5184"/>
+            <w:tcBorders>
+              <w:top w:val="single" w:sz="8" w:space="0" w:color="4F81BD"/>
+              <w:bottom w:val="single" w:sz="8" w:space="0" w:color="4F81BD"/>
+            </w:tcBorders>
+            <w:shd w:val="clear" w:color="auto" w:fill="365F91"/>
+          </w:tcPr>
+          <w:p>
+            <w:pPr>
+              <w:keepNext/>
+              <w:spacing w:before="40" w:after="40" w:line="240" w:lineRule="auto"/>
+            </w:pPr>
+            <w:r/>
+            <w:r>
+              <w:rPr>
+                <w:b/>
+                <w:color w:val="FFFFFF"/>
+                <w:sz w:val="20"/>
+              </w:rPr>
+              <w:t>Fingerprint (public, safe to share)</w:t>
+            </w:r>
+          </w:p>
+        </w:tc>
+      </w:tr>
+      <w:tr>
+        <w:trPr>
+          <w:cantSplit/>
+        </w:trPr>
+        <w:tc>
+          <w:tcPr>
+            <w:tcW w:type="dxa" w:w="3168"/>
+            <w:shd w:val="clear" w:color="auto" w:fill="D3DFEE"/>
+          </w:tcPr>
+          <w:p>
+            <w:pPr>
+              <w:spacing w:before="40" w:after="40" w:line="240" w:lineRule="auto"/>
+            </w:pPr>
+            <w:r/>
+            <w:r>
+              <w:rPr>
+                <w:b/>
+                <w:color w:val="365F91"/>
+                <w:sz w:val="20"/>
+              </w:rPr>
+              <w:t>ssh_host_ed25519_key(.pub)</w:t>
+            </w:r>
+          </w:p>
+        </w:tc>
+        <w:tc>
+          <w:tcPr>
+            <w:tcW w:type="dxa" w:w="1728"/>
+            <w:shd w:val="clear" w:color="auto" w:fill="D3DFEE"/>
+          </w:tcPr>
+          <w:p>
+            <w:pPr>
+              <w:spacing w:before="40" w:after="40" w:line="240" w:lineRule="auto"/>
+            </w:pPr>
+            <w:r/>
+            <w:r>
+              <w:rPr>
+                <w:color w:val="365F91"/>
+                <w:sz w:val="20"/>
+              </w:rPr>
+              <w:t>ED25519 256</w:t>
+            </w:r>
+          </w:p>
+        </w:tc>
+        <w:tc>
+          <w:tcPr>
+            <w:tcW w:type="dxa" w:w="5184"/>
+            <w:shd w:val="clear" w:color="auto" w:fill="D3DFEE"/>
+          </w:tcPr>
+          <w:p>
+            <w:pPr>
+              <w:spacing w:before="40" w:after="40" w:line="240" w:lineRule="auto"/>
+            </w:pPr>
+            <w:r/>
+            <w:r>
+              <w:rPr>
+                <w:color w:val="365F91"/>
+                <w:sz w:val="20"/>
+              </w:rPr>
+              <w:t>SHA256:LofwfAOeWEyde5UMKRAR53ka7v0Mt5Kmjvo+3uWDl0o</w:t>
+            </w:r>
+          </w:p>
+        </w:tc>
+      </w:tr>
+      <w:tr>
+        <w:trPr>
+          <w:cantSplit/>
+        </w:trPr>
+        <w:tc>
+          <w:tcPr>
+            <w:tcW w:type="dxa" w:w="3168"/>
+            <w:shd w:val="clear" w:color="auto" w:fill="FFFFFF"/>
+          </w:tcPr>
+          <w:p>
+            <w:pPr>
+              <w:spacing w:before="40" w:after="40" w:line="240" w:lineRule="auto"/>
+            </w:pPr>
+            <w:r/>
+            <w:r>
+              <w:rPr>
+                <w:b/>
+                <w:color w:val="365F91"/>
+                <w:sz w:val="20"/>
+              </w:rPr>
+              <w:t>ssh_host_rsa_key(.pub)</w:t>
+            </w:r>
+          </w:p>
+        </w:tc>
+        <w:tc>
+          <w:tcPr>
+            <w:tcW w:type="dxa" w:w="1728"/>
+            <w:shd w:val="clear" w:color="auto" w:fill="FFFFFF"/>
+          </w:tcPr>
+          <w:p>
+            <w:pPr>
+              <w:spacing w:before="40" w:after="40" w:line="240" w:lineRule="auto"/>
+            </w:pPr>
+            <w:r/>
+            <w:r>
+              <w:rPr>
+                <w:color w:val="365F91"/>
+                <w:sz w:val="20"/>
+              </w:rPr>
+              <w:t>RSA 4096</w:t>
+            </w:r>
+          </w:p>
+        </w:tc>
+        <w:tc>
+          <w:tcPr>
+            <w:tcW w:type="dxa" w:w="5184"/>
+            <w:shd w:val="clear" w:color="auto" w:fill="FFFFFF"/>
+          </w:tcPr>
+          <w:p>
+            <w:pPr>
+              <w:spacing w:before="40" w:after="40" w:line="240" w:lineRule="auto"/>
+            </w:pPr>
+            <w:r/>
+            <w:r>
+              <w:rPr>
+                <w:color w:val="365F91"/>
+                <w:sz w:val="20"/>
+              </w:rPr>
+              <w:t>SHA256:VZ6LmqLvRJ9yKruXlJABfpAj2Gsh8uxUzPu03G11iY0</w:t>
+            </w:r>
+          </w:p>
+        </w:tc>
+      </w:tr>
+      <w:tr>
+        <w:trPr>
+          <w:cantSplit/>
+        </w:trPr>
+        <w:tc>
+          <w:tcPr>
+            <w:tcW w:type="dxa" w:w="3168"/>
+            <w:shd w:val="clear" w:color="auto" w:fill="D3DFEE"/>
+          </w:tcPr>
+          <w:p>
+            <w:pPr>
+              <w:spacing w:before="40" w:after="40" w:line="240" w:lineRule="auto"/>
+            </w:pPr>
+            <w:r/>
+            <w:r>
+              <w:rPr>
+                <w:b/>
+                <w:color w:val="365F91"/>
+                <w:sz w:val="20"/>
+              </w:rPr>
+              <w:t>ssh_host_ecdsa_key(.pub)</w:t>
+            </w:r>
+          </w:p>
+        </w:tc>
+        <w:tc>
+          <w:tcPr>
+            <w:tcW w:type="dxa" w:w="1728"/>
+            <w:shd w:val="clear" w:color="auto" w:fill="D3DFEE"/>
+          </w:tcPr>
+          <w:p>
+            <w:pPr>
+              <w:spacing w:before="40" w:after="40" w:line="240" w:lineRule="auto"/>
+            </w:pPr>
+            <w:r/>
+            <w:r>
+              <w:rPr>
+                <w:color w:val="365F91"/>
+                <w:sz w:val="20"/>
+              </w:rPr>
+              <w:t>ECDSA 256</w:t>
+            </w:r>
+          </w:p>
+        </w:tc>
+        <w:tc>
+          <w:tcPr>
+            <w:tcW w:type="dxa" w:w="5184"/>
+            <w:shd w:val="clear" w:color="auto" w:fill="D3DFEE"/>
+          </w:tcPr>
+          <w:p>
+            <w:pPr>
+              <w:spacing w:before="40" w:after="40" w:line="240" w:lineRule="auto"/>
+            </w:pPr>
+            <w:r/>
+            <w:r>
+              <w:rPr>
+                <w:color w:val="365F91"/>
+                <w:sz w:val="20"/>
+              </w:rPr>
+              <w:t>SHA256:btqn6AL1GRF6jswoU9xhGFtHUaCHYwGQC0aMPTh259I</w:t>
+            </w:r>
+          </w:p>
+        </w:tc>
+      </w:tr>
+    </w:tbl>
+    <w:p>
+      <w:pPr>
+        <w:spacing w:after="40" w:line="120" w:lineRule="exact"/>
+      </w:pPr>
+    </w:p>
+    <w:p>
+      <w:pPr>
+        <w:shd w:val="clear" w:color="auto" w:fill="FBEAEA"/>
+        <w:keepLines/>
+        <w:pBdr>
+          <w:left w:val="single" w:sz="36" w:space="6" w:color="A52A23"/>
+        </w:pBdr>
+        <w:spacing w:before="40" w:after="180"/>
+        <w:ind w:left="144" w:right="86"/>
+      </w:pPr>
+      <w:r>
+        <w:rPr>
+          <w:rFonts w:ascii="Calibri" w:hAnsi="Calibri" w:eastAsia="Calibri"/>
+          <w:b/>
+          <w:color w:val="A52A23"/>
+        </w:rPr>
+        <w:t xml:space="preserve">CRITICAL STEP  </w:t>
+      </w:r>
+      <w:r>
+        <w:rPr>
+          <w:rFonts w:ascii="Calibri" w:hAnsi="Calibri" w:eastAsia="Calibri"/>
+          <w:b/>
+          <w:color w:val="A52A23"/>
+        </w:rPr>
+        <w:t>Never commit SSH host private keys, print them, or paste them anywhere.</w:t>
+      </w:r>
+      <w:r>
+        <w:br/>
+      </w:r>
+      <w:r>
+        <w:rPr>
+          <w:rFonts w:ascii="Calibri" w:hAnsi="Calibri" w:eastAsia="Calibri"/>
+          <w:b/>
+          <w:color w:val="A52A23"/>
+        </w:rPr>
+        <w:t>Generate them in a temp dir, load them with kubectl create secret generic, print only fingerprints, and let the trap delete the temp dir. Created on the Mac mini at 14:00 CT; temp dir confirmed removed.</w:t>
+      </w:r>
+    </w:p>
+    <w:p>
+      <w:pPr>
+        <w:keepLines/>
+        <w:spacing w:line="240" w:lineRule="auto" w:before="40" w:after="180"/>
+        <w:ind w:left="86" w:right="86"/>
+        <w:shd w:val="clear" w:color="auto" w:fill="F0F4F7"/>
+      </w:pPr>
+      <w:r>
+        <w:rPr>
+          <w:rFonts w:ascii="Courier New" w:hAnsi="Courier New" w:eastAsia="Courier New"/>
+          <w:sz w:val="18"/>
+        </w:rPr>
+        <w:t>bash -c '</w:t>
+        <w:br/>
+        <w:t>set -e; d=$(mktemp -d); trap "rm -rf \"$d\"" EXIT; umask 077</w:t>
+        <w:br/>
+        <w:t>for t in ed25519 rsa ecdsa; do b=""; [ $t = rsa ] &amp;&amp; b="-b 4096"</w:t>
+        <w:br/>
+        <w:t xml:space="preserve">  ssh-keygen -q -t $t $b -N "" -C root@devpod -f "$d/ssh_host_${t}_key"; done</w:t>
+        <w:br/>
+        <w:t>args=(); for f in "$d"/ssh_host_*; do args+=("--from-file=$(basename "$f")=$f"); done</w:t>
+        <w:br/>
+        <w:t>kubectl -n devpod delete secret devpod-ssh-host-keys --ignore-not-found     # rotation only</w:t>
+        <w:br/>
+        <w:t>kubectl -n devpod create secret generic devpod-ssh-host-keys "${args[@]}" &gt;/dev/null</w:t>
+        <w:br/>
+        <w:t>kubectl -n devpod label secret devpod-ssh-host-keys app.kubernetes.io/name=devpod app.kubernetes.io/part-of=homelab-dev</w:t>
+        <w:br/>
+        <w:t>for t in ed25519 rsa ecdsa; do ssh-keygen -lf "$d/ssh_host_${t}_key.pub"; done'      # fingerprints only</w:t>
+        <w:br/>
+        <w:t>kubectl -n devpod rollout restart statefulset/devpod</w:t>
+      </w:r>
+    </w:p>
+    <w:p>
+      <w:pPr>
+        <w:pStyle w:val="Heading1"/>
+      </w:pPr>
+      <w:r>
+        <w:t>15.1. File: apps/base/devpod/README.md (excerpt: SSH host keys)</w:t>
+      </w:r>
+    </w:p>
+    <w:p>
+      <w:r>
+        <w:t>The README section added in 9ae6231 (the whole README is in section 13).</w:t>
+      </w:r>
+    </w:p>
+    <w:p>
+      <w:pPr>
+        <w:pStyle w:val="Heading3"/>
+      </w:pPr>
+      <w:r>
+        <w:t>Excerpt</w:t>
+      </w:r>
+    </w:p>
+    <w:p>
+      <w:pPr>
+        <w:spacing w:line="240" w:lineRule="auto" w:before="40" w:after="180"/>
+        <w:ind w:left="86" w:right="86"/>
+        <w:shd w:val="clear" w:color="auto" w:fill="F0F4F7"/>
+      </w:pPr>
+      <w:r>
+        <w:rPr>
+          <w:rFonts w:ascii="Courier New" w:hAnsi="Courier New" w:eastAsia="Courier New"/>
+          <w:sz w:val="18"/>
+        </w:rPr>
+        <w:t>### SSH host keys (`Secret devpod/devpod-ssh-host-keys`, not in Git)</w:t>
+        <w:br/>
+        <w:br/>
+        <w:t>sshd's host keys (ed25519, rsa, ecdsa) live in a Secret created with kubectl, **never committed**, shared by every replica so `devpod-0` and `devpod-1` present the same fingerprint and it survives restarts. The workspace container mounts it read-only at `/etc/devpod/ssh-host-keys` (`optional: true`); `devpod-runtime.sh` copies the keys to `/etc/ssh` (private 0600, `.pub` 0644, root) before sshd starts. Without the Secret the pod falls back to `ssh-keygen -A`, and the fingerprint changes on every restart.</w:t>
+        <w:br/>
+        <w:br/>
+        <w:t>Create or rotate it (from a Mac with cluster access; nothing is printed and the temp dir is removed):</w:t>
+        <w:br/>
+        <w:br/>
+        <w:t>```sh</w:t>
+        <w:br/>
+        <w:t>bash -c '</w:t>
+        <w:br/>
+        <w:t>set -e; d=$(mktemp -d); trap "rm -rf \"$d\"" EXIT; umask 077</w:t>
+        <w:br/>
+        <w:t>for t in ed25519 rsa ecdsa; do b=""; [ $t = rsa ] &amp;&amp; b="-b 4096"</w:t>
+        <w:br/>
+        <w:t xml:space="preserve">  ssh-keygen -q -t $t $b -N "" -C root@devpod -f "$d/ssh_host_${t}_key"; done</w:t>
+        <w:br/>
+        <w:t>args=(); for f in "$d"/ssh_host_*; do args+=("--from-file=$(basename "$f")=$f"); done</w:t>
+        <w:br/>
+        <w:t>kubectl -n devpod delete secret devpod-ssh-host-keys --ignore-not-found</w:t>
+        <w:br/>
+        <w:t>kubectl -n devpod create secret generic devpod-ssh-host-keys "${args[@]}" &gt;/dev/null</w:t>
+        <w:br/>
+        <w:t>for t in ed25519 rsa ecdsa; do ssh-keygen -lf "$d/ssh_host_${t}_key.pub"; done'</w:t>
+        <w:br/>
+        <w:t>kubectl -n devpod rollout restart statefulset/devpod</w:t>
+        <w:br/>
+        <w:t>```</w:t>
+        <w:br/>
+        <w:br/>
+        <w:t>After a rotation, on each Mac run `ssh-keygen -R devpod-0` and `ssh-keygen -R devpod-1`, then reconnect and accept the new fingerprint (or add the new `ssh_host_ed25519_key.pub` to `~/.ssh/known_hosts` as `devpod-0 ssh-ed25519 …` and `devpod-1 ssh-ed25519 …`).</w:t>
+      </w:r>
+    </w:p>
+    <w:p>
+      <w:pPr>
+        <w:pStyle w:val="Heading2"/>
+      </w:pPr>
+      <w:r>
+        <w:t>15.2 known_hosts on the Macs</w:t>
+      </w:r>
+    </w:p>
+    <w:p>
+      <w:r>
+        <w:t>Done on 3 Oct 2026 on the M5 and the Mac mini: back up ~/.ssh/known_hosts, remove old entries, add the three public keys for both host aliases. The M5 then connected with normal StrictHostKeyChecking (ask).</w:t>
+      </w:r>
+    </w:p>
+    <w:p>
+      <w:pPr>
+        <w:keepLines/>
+        <w:spacing w:line="240" w:lineRule="auto" w:before="40" w:after="180"/>
+        <w:ind w:left="86" w:right="86"/>
+        <w:shd w:val="clear" w:color="auto" w:fill="F0F4F7"/>
+      </w:pPr>
+      <w:r>
+        <w:rPr>
+          <w:rFonts w:ascii="Courier New" w:hAnsi="Courier New" w:eastAsia="Courier New"/>
+          <w:sz w:val="18"/>
+        </w:rPr>
+        <w:t>cp -p ~/.ssh/known_hosts ~/.ssh/known_hosts.bak-20261003-hostkeys</w:t>
+        <w:br/>
+        <w:t>ssh-keygen -R devpod-0; ssh-keygen -R devpod-1</w:t>
+        <w:br/>
+        <w:t># public keys only, from the Secret (needs cluster access):</w:t>
+        <w:br/>
+        <w:t>kubectl -n devpod get secret devpod-ssh-host-keys -o json \</w:t>
+        <w:br/>
+        <w:t xml:space="preserve">  | jq -r '.data|to_entries[]|select(.key|endswith(".pub"))|.value|@base64d' | awk 'NF{print $1, $2}' &gt; /tmp/devpod-hostkeys.pub</w:t>
+        <w:br/>
+        <w:t>for h in devpod-0 devpod-1; do sed "s/^/$h /" /tmp/devpod-hostkeys.pub &gt;&gt; ~/.ssh/known_hosts; done</w:t>
+        <w:br/>
+        <w:t>rm /tmp/devpod-hostkeys.pub</w:t>
+        <w:br/>
+        <w:t>ssh-keygen -F devpod-0 -l; ssh devpod-0 true &amp;&amp; echo ok</w:t>
+      </w:r>
+    </w:p>
+    <w:p>
+      <w:pPr>
+        <w:pStyle w:val="Heading1"/>
+      </w:pPr>
+      <w:r>
+        <w:t>16. Verification (3 Oct 2026, 13:30-14:10 CT)</w:t>
       </w:r>
     </w:p>
     <w:tbl>
@@ -5050,6 +5830,182 @@
                 <w:color w:val="365F91"/>
                 <w:sz w:val="20"/>
               </w:rPr>
+              <w:t>Host keys: Flux rollout of 9ae6231</w:t>
+            </w:r>
+          </w:p>
+        </w:tc>
+        <w:tc>
+          <w:tcPr>
+            <w:tcW w:type="dxa" w:w="6048"/>
+            <w:shd w:val="clear" w:color="auto" w:fill="D3DFEE"/>
+          </w:tcPr>
+          <w:p>
+            <w:pPr>
+              <w:spacing w:before="40" w:after="40" w:line="240" w:lineRule="auto"/>
+            </w:pPr>
+            <w:r/>
+            <w:r>
+              <w:rPr>
+                <w:color w:val="365F91"/>
+                <w:sz w:val="20"/>
+              </w:rPr>
+              <w:t>devpod-0 recreated 14:04 CT; log 'devpod-runtime: persistent SSH host keys installed'; /etc/ssh keys 0600, .pub 0644 root</w:t>
+            </w:r>
+          </w:p>
+        </w:tc>
+      </w:tr>
+      <w:tr>
+        <w:trPr>
+          <w:cantSplit/>
+        </w:trPr>
+        <w:tc>
+          <w:tcPr>
+            <w:tcW w:type="dxa" w:w="4032"/>
+            <w:shd w:val="clear" w:color="auto" w:fill="FFFFFF"/>
+          </w:tcPr>
+          <w:p>
+            <w:pPr>
+              <w:spacing w:before="40" w:after="40" w:line="240" w:lineRule="auto"/>
+            </w:pPr>
+            <w:r/>
+            <w:r>
+              <w:rPr>
+                <w:b/>
+                <w:color w:val="365F91"/>
+                <w:sz w:val="20"/>
+              </w:rPr>
+              <w:t>Host keys served by sshd (ssh-keyscan -p 2222 127.0.0.1)</w:t>
+            </w:r>
+          </w:p>
+        </w:tc>
+        <w:tc>
+          <w:tcPr>
+            <w:tcW w:type="dxa" w:w="6048"/>
+            <w:shd w:val="clear" w:color="auto" w:fill="FFFFFF"/>
+          </w:tcPr>
+          <w:p>
+            <w:pPr>
+              <w:spacing w:before="40" w:after="40" w:line="240" w:lineRule="auto"/>
+            </w:pPr>
+            <w:r/>
+            <w:r>
+              <w:rPr>
+                <w:color w:val="365F91"/>
+                <w:sz w:val="20"/>
+              </w:rPr>
+              <w:t>ED25519 LofwfAOe…l0o · RSA VZ6LmqLv…iY0 · ECDSA btqn6AL1…59I = Secret</w:t>
+            </w:r>
+          </w:p>
+        </w:tc>
+      </w:tr>
+      <w:tr>
+        <w:trPr>
+          <w:cantSplit/>
+        </w:trPr>
+        <w:tc>
+          <w:tcPr>
+            <w:tcW w:type="dxa" w:w="4032"/>
+            <w:shd w:val="clear" w:color="auto" w:fill="D3DFEE"/>
+          </w:tcPr>
+          <w:p>
+            <w:pPr>
+              <w:spacing w:before="40" w:after="40" w:line="240" w:lineRule="auto"/>
+            </w:pPr>
+            <w:r/>
+            <w:r>
+              <w:rPr>
+                <w:b/>
+                <w:color w:val="365F91"/>
+                <w:sz w:val="20"/>
+              </w:rPr>
+              <w:t>After kubectl delete pod devpod-0 (pod only)</w:t>
+            </w:r>
+          </w:p>
+        </w:tc>
+        <w:tc>
+          <w:tcPr>
+            <w:tcW w:type="dxa" w:w="6048"/>
+            <w:shd w:val="clear" w:color="auto" w:fill="D3DFEE"/>
+          </w:tcPr>
+          <w:p>
+            <w:pPr>
+              <w:spacing w:before="40" w:after="40" w:line="240" w:lineRule="auto"/>
+            </w:pPr>
+            <w:r/>
+            <w:r>
+              <w:rPr>
+                <w:color w:val="365F91"/>
+                <w:sz w:val="20"/>
+              </w:rPr>
+              <w:t>Recreated 14:06 CT; same three fingerprints; PVCs untouched</w:t>
+            </w:r>
+          </w:p>
+        </w:tc>
+      </w:tr>
+      <w:tr>
+        <w:trPr>
+          <w:cantSplit/>
+        </w:trPr>
+        <w:tc>
+          <w:tcPr>
+            <w:tcW w:type="dxa" w:w="4032"/>
+            <w:shd w:val="clear" w:color="auto" w:fill="FFFFFF"/>
+          </w:tcPr>
+          <w:p>
+            <w:pPr>
+              <w:spacing w:before="40" w:after="40" w:line="240" w:lineRule="auto"/>
+            </w:pPr>
+            <w:r/>
+            <w:r>
+              <w:rPr>
+                <w:b/>
+                <w:color w:val="365F91"/>
+                <w:sz w:val="20"/>
+              </w:rPr>
+              <w:t>M5: ssh devpod-0 true</w:t>
+            </w:r>
+          </w:p>
+        </w:tc>
+        <w:tc>
+          <w:tcPr>
+            <w:tcW w:type="dxa" w:w="6048"/>
+            <w:shd w:val="clear" w:color="auto" w:fill="FFFFFF"/>
+          </w:tcPr>
+          <w:p>
+            <w:pPr>
+              <w:spacing w:before="40" w:after="40" w:line="240" w:lineRule="auto"/>
+            </w:pPr>
+            <w:r/>
+            <w:r>
+              <w:rPr>
+                <w:color w:val="365F91"/>
+                <w:sz w:val="20"/>
+              </w:rPr>
+              <w:t>exit 0 with StrictHostKeyChecking ask (no prompt, no warning)</w:t>
+            </w:r>
+          </w:p>
+        </w:tc>
+      </w:tr>
+      <w:tr>
+        <w:trPr>
+          <w:cantSplit/>
+        </w:trPr>
+        <w:tc>
+          <w:tcPr>
+            <w:tcW w:type="dxa" w:w="4032"/>
+            <w:shd w:val="clear" w:color="auto" w:fill="D3DFEE"/>
+          </w:tcPr>
+          <w:p>
+            <w:pPr>
+              <w:spacing w:before="40" w:after="40" w:line="240" w:lineRule="auto"/>
+            </w:pPr>
+            <w:r/>
+            <w:r>
+              <w:rPr>
+                <w:b/>
+                <w:color w:val="365F91"/>
+                <w:sz w:val="20"/>
+              </w:rPr>
               <w:t>PVCs</w:t>
             </w:r>
           </w:p>
@@ -5092,6 +6048,31 @@
           <w:rFonts w:ascii="Courier New" w:hAnsi="Courier New" w:eastAsia="Courier New"/>
           <w:sz w:val="18"/>
         </w:rPr>
+        <w:t>$ kubectl -n devpod exec devpod-0 -c workspace -- sh -c 'ssh-keyscan -p 2222 127.0.0.1 2&gt;/dev/null | ssh-keygen -lf -'</w:t>
+        <w:br/>
+        <w:t>4096 SHA256:VZ6LmqLvRJ9yKruXlJABfpAj2Gsh8uxUzPu03G11iY0 [127.0.0.1]:2222 (RSA)</w:t>
+        <w:br/>
+        <w:t>256 SHA256:btqn6AL1GRF6jswoU9xhGFtHUaCHYwGQC0aMPTh259I [127.0.0.1]:2222 (ECDSA)</w:t>
+        <w:br/>
+        <w:t>256 SHA256:LofwfAOeWEyde5UMKRAR53ka7v0Mt5Kmjvo+3uWDl0o [127.0.0.1]:2222 (ED25519)</w:t>
+        <w:br/>
+        <w:t>$ kubectl -n devpod delete pod devpod-0     # pod only, never the PVC</w:t>
+        <w:br/>
+        <w:t>... same three fingerprints after the restart (pod created 19:06:42Z = 14:06 CT)</w:t>
+      </w:r>
+    </w:p>
+    <w:p>
+      <w:pPr>
+        <w:keepLines/>
+        <w:spacing w:line="240" w:lineRule="auto" w:before="40" w:after="180"/>
+        <w:ind w:left="86" w:right="86"/>
+        <w:shd w:val="clear" w:color="auto" w:fill="F0F4F7"/>
+      </w:pPr>
+      <w:r>
+        <w:rPr>
+          <w:rFonts w:ascii="Courier New" w:hAnsi="Courier New" w:eastAsia="Courier New"/>
+          <w:sz w:val="18"/>
+        </w:rPr>
         <w:t>$ su - vscode -c 'kubectl get nodes'</w:t>
         <w:br/>
         <w:t>NAME            STATUS   ROLES                AGE   VERSION</w:t>
@@ -5114,7 +6095,7 @@
         <w:pStyle w:val="Heading1"/>
       </w:pPr>
       <w:r>
-        <w:t>16. Known issues</w:t>
+        <w:t>17. Known issues</w:t>
       </w:r>
     </w:p>
     <w:tbl>
@@ -5213,7 +6194,7 @@
                 <w:color w:val="FFFFFF"/>
                 <w:sz w:val="20"/>
               </w:rPr>
-              <w:t>Workaround / fix idea</w:t>
+              <w:t>Status / workaround</w:t>
             </w:r>
           </w:p>
         </w:tc>
@@ -5238,7 +6219,7 @@
                 <w:color w:val="365F91"/>
                 <w:sz w:val="20"/>
               </w:rPr>
-              <w:t>SSH host keys regenerate on every restart (ssh-keygen -A writes to the container filesystem)</w:t>
+              <w:t>SSH host keys regenerated on every restart (ssh-keygen -A on the container filesystem)</w:t>
             </w:r>
           </w:p>
         </w:tc>
@@ -5276,7 +6257,7 @@
                 <w:color w:val="365F91"/>
                 <w:sz w:val="20"/>
               </w:rPr>
-              <w:t>ssh-keygen -R devpod-0 on each Mac, then reconnect. Permanent fix: keep host keys on the home PVC or in a Secret.</w:t>
+              <w:t>RESOLVED in 9ae6231 (section 15): keys come from Secret devpod-ssh-host-keys. Only after a deliberate key rotation: ssh-keygen -R devpod-0 / devpod-1 and re-add.</w:t>
             </w:r>
           </w:p>
         </w:tc>
@@ -5983,7 +6964,7 @@
                 <w:color w:val="365F91"/>
                 <w:sz w:val="20"/>
               </w:rPr>
-              <w:t>9</w:t>
+              <w:t>8a</w:t>
             </w:r>
           </w:p>
         </w:tc>
@@ -6002,7 +6983,7 @@
                 <w:color w:val="365F91"/>
                 <w:sz w:val="20"/>
               </w:rPr>
-              <w:t>Dotfiles dot_config/mise/config.toml; chezmoi update &amp;&amp; mise install</w:t>
+              <w:t>Secret devpod/devpod-ssh-host-keys by kubectl (section 15; then restart the StatefulSet)</w:t>
             </w:r>
           </w:p>
         </w:tc>
@@ -6021,7 +7002,7 @@
                 <w:color w:val="365F91"/>
                 <w:sz w:val="20"/>
               </w:rPr>
-              <w:t>Section 12</w:t>
+              <w:t>Section 15</w:t>
             </w:r>
           </w:p>
         </w:tc>
@@ -6046,7 +7027,7 @@
                 <w:color w:val="365F91"/>
                 <w:sz w:val="20"/>
               </w:rPr>
-              <w:t>10</w:t>
+              <w:t>9</w:t>
             </w:r>
           </w:p>
         </w:tc>
@@ -6065,7 +7046,7 @@
                 <w:color w:val="365F91"/>
                 <w:sz w:val="20"/>
               </w:rPr>
-              <w:t>Cloudflare ingress, DNS, Access; ~/.ssh/config on the Mac</w:t>
+              <w:t>Dotfiles dot_config/mise/config.toml; chezmoi update &amp;&amp; mise install</w:t>
             </w:r>
           </w:p>
         </w:tc>
@@ -6084,7 +7065,133 @@
                 <w:color w:val="365F91"/>
                 <w:sz w:val="20"/>
               </w:rPr>
+              <w:t>Section 12</w:t>
+            </w:r>
+          </w:p>
+        </w:tc>
+      </w:tr>
+      <w:tr>
+        <w:trPr>
+          <w:cantSplit/>
+        </w:trPr>
+        <w:tc>
+          <w:tcPr>
+            <w:tcW w:type="dxa" w:w="864"/>
+            <w:shd w:val="clear" w:color="auto" w:fill="D3DFEE"/>
+          </w:tcPr>
+          <w:p>
+            <w:pPr>
+              <w:spacing w:before="40" w:after="40" w:line="240" w:lineRule="auto"/>
+            </w:pPr>
+            <w:r/>
+            <w:r>
+              <w:rPr>
+                <w:b/>
+                <w:color w:val="365F91"/>
+                <w:sz w:val="20"/>
+              </w:rPr>
+              <w:t>10</w:t>
+            </w:r>
+          </w:p>
+        </w:tc>
+        <w:tc>
+          <w:tcPr>
+            <w:tcW w:type="dxa" w:w="6624"/>
+            <w:shd w:val="clear" w:color="auto" w:fill="D3DFEE"/>
+          </w:tcPr>
+          <w:p>
+            <w:pPr>
+              <w:spacing w:before="40" w:after="40" w:line="240" w:lineRule="auto"/>
+            </w:pPr>
+            <w:r/>
+            <w:r>
+              <w:rPr>
+                <w:color w:val="365F91"/>
+                <w:sz w:val="20"/>
+              </w:rPr>
+              <w:t>Cloudflare ingress, DNS, Access; ~/.ssh/config on the Mac</w:t>
+            </w:r>
+          </w:p>
+        </w:tc>
+        <w:tc>
+          <w:tcPr>
+            <w:tcW w:type="dxa" w:w="2592"/>
+            <w:shd w:val="clear" w:color="auto" w:fill="D3DFEE"/>
+          </w:tcPr>
+          <w:p>
+            <w:pPr>
+              <w:spacing w:before="40" w:after="40" w:line="240" w:lineRule="auto"/>
+            </w:pPr>
+            <w:r/>
+            <w:r>
+              <w:rPr>
+                <w:color w:val="365F91"/>
+                <w:sz w:val="20"/>
+              </w:rPr>
               <w:t>Sections 4-5 + Cloudflare guide</w:t>
+            </w:r>
+          </w:p>
+        </w:tc>
+      </w:tr>
+      <w:tr>
+        <w:trPr>
+          <w:cantSplit/>
+        </w:trPr>
+        <w:tc>
+          <w:tcPr>
+            <w:tcW w:type="dxa" w:w="864"/>
+            <w:shd w:val="clear" w:color="auto" w:fill="FFFFFF"/>
+          </w:tcPr>
+          <w:p>
+            <w:pPr>
+              <w:spacing w:before="40" w:after="40" w:line="240" w:lineRule="auto"/>
+            </w:pPr>
+            <w:r/>
+            <w:r>
+              <w:rPr>
+                <w:b/>
+                <w:color w:val="365F91"/>
+                <w:sz w:val="20"/>
+              </w:rPr>
+              <w:t>11</w:t>
+            </w:r>
+          </w:p>
+        </w:tc>
+        <w:tc>
+          <w:tcPr>
+            <w:tcW w:type="dxa" w:w="6624"/>
+            <w:shd w:val="clear" w:color="auto" w:fill="FFFFFF"/>
+          </w:tcPr>
+          <w:p>
+            <w:pPr>
+              <w:spacing w:before="40" w:after="40" w:line="240" w:lineRule="auto"/>
+            </w:pPr>
+            <w:r/>
+            <w:r>
+              <w:rPr>
+                <w:color w:val="365F91"/>
+                <w:sz w:val="20"/>
+              </w:rPr>
+              <w:t>known_hosts entries for devpod-0 and devpod-1 on each Mac</w:t>
+            </w:r>
+          </w:p>
+        </w:tc>
+        <w:tc>
+          <w:tcPr>
+            <w:tcW w:type="dxa" w:w="2592"/>
+            <w:shd w:val="clear" w:color="auto" w:fill="FFFFFF"/>
+          </w:tcPr>
+          <w:p>
+            <w:pPr>
+              <w:spacing w:before="40" w:after="40" w:line="240" w:lineRule="auto"/>
+            </w:pPr>
+            <w:r/>
+            <w:r>
+              <w:rPr>
+                <w:color w:val="365F91"/>
+                <w:sz w:val="20"/>
+              </w:rPr>
+              <w:t>Section 15.2</w:t>
             </w:r>
           </w:p>
         </w:tc>
@@ -6131,6 +7238,44 @@
           <w:color w:val="A52A23"/>
         </w:rPr>
         <w:t>home-devpod-0, devpod-scratch and devpod-default-de-115ea hold data. Deleting the StatefulSet keeps the home PVC (Retain); do not 'clean it up'.</w:t>
+      </w:r>
+    </w:p>
+    <w:p>
+      <w:pPr>
+        <w:shd w:val="clear" w:color="auto" w:fill="FBEAEA"/>
+        <w:keepLines/>
+        <w:pBdr>
+          <w:left w:val="single" w:sz="36" w:space="6" w:color="A52A23"/>
+        </w:pBdr>
+        <w:spacing w:before="40" w:after="180"/>
+        <w:ind w:left="144" w:right="86"/>
+      </w:pPr>
+      <w:r>
+        <w:rPr>
+          <w:rFonts w:ascii="Calibri" w:hAnsi="Calibri" w:eastAsia="Calibri"/>
+          <w:b/>
+          <w:color w:val="A52A23"/>
+        </w:rPr>
+        <w:t xml:space="preserve">CRITICAL STEP  </w:t>
+      </w:r>
+      <w:r>
+        <w:rPr>
+          <w:rFonts w:ascii="Calibri" w:hAnsi="Calibri" w:eastAsia="Calibri"/>
+          <w:b/>
+          <w:color w:val="A52A23"/>
+        </w:rPr>
+        <w:t>If the host key Secret is lost, generate a new set (section 15) and update known_hosts on every Mac.</w:t>
+      </w:r>
+      <w:r>
+        <w:br/>
+      </w:r>
+      <w:r>
+        <w:rPr>
+          <w:rFonts w:ascii="Calibri" w:hAnsi="Calibri" w:eastAsia="Calibri"/>
+          <w:b/>
+          <w:color w:val="A52A23"/>
+        </w:rPr>
+        <w:t>Never restore host private keys from a file in the repo or a document; they exist only in the cluster Secret.</w:t>
       </w:r>
     </w:p>
     <w:p>
@@ -6381,7 +7526,9 @@
           <w:rFonts w:ascii="Courier New" w:hAnsi="Courier New" w:eastAsia="Courier New"/>
           <w:sz w:val="18"/>
         </w:rPr>
-        <w:t>ssh-keygen -R devpod-0          # after every pod restart (known issue)</w:t>
+        <w:t>ssh-keygen -F devpod-0 -l                          # fingerprints in known_hosts</w:t>
+        <w:br/>
+        <w:t>ssh-keygen -R devpod-0          # only after a deliberate host key rotation</w:t>
         <w:br/>
         <w:t>ssh devpod-0 'hostname; kubectl get nodes --no-headers | wc -l'</w:t>
         <w:br/>
@@ -6393,7 +7540,40 @@
         <w:pStyle w:val="Heading2"/>
       </w:pPr>
       <w:r>
-        <w:t>B.8 Safety check before committing docs</w:t>
+        <w:t>B.8 SSH host keys (fingerprints only)</w:t>
+      </w:r>
+    </w:p>
+    <w:p>
+      <w:pPr>
+        <w:keepLines/>
+        <w:spacing w:line="240" w:lineRule="auto" w:before="40" w:after="180"/>
+        <w:ind w:left="86" w:right="86"/>
+        <w:shd w:val="clear" w:color="auto" w:fill="F0F4F7"/>
+      </w:pPr>
+      <w:r>
+        <w:rPr>
+          <w:rFonts w:ascii="Courier New" w:hAnsi="Courier New" w:eastAsia="Courier New"/>
+          <w:sz w:val="18"/>
+        </w:rPr>
+        <w:t>kubectl -n devpod get secret devpod-ssh-host-keys -o json | jq -r '.data|keys[]'</w:t>
+        <w:br/>
+        <w:t>kubectl -n devpod get secret devpod-ssh-host-keys -o json \</w:t>
+        <w:br/>
+        <w:t xml:space="preserve">  | jq -r '.data|to_entries[]|select(.key|endswith(".pub"))|.value|@base64d' | ssh-keygen -lf -</w:t>
+        <w:br/>
+        <w:t>kubectl -n devpod exec devpod-0 -c workspace -- sh -c 'ssh-keyscan -p 2222 127.0.0.1 2&gt;/dev/null | ssh-keygen -lf -'</w:t>
+        <w:br/>
+        <w:t>kubectl -n devpod logs devpod-0 -c workspace | grep 'host keys'</w:t>
+        <w:br/>
+        <w:t>kubectl -n devpod delete pod devpod-0                # restart test; never delete the PVC</w:t>
+      </w:r>
+    </w:p>
+    <w:p>
+      <w:pPr>
+        <w:pStyle w:val="Heading2"/>
+      </w:pPr>
+      <w:r>
+        <w:t>B.9 Safety check before committing docs</w:t>
       </w:r>
     </w:p>
     <w:p>

</xml_diff>

<commit_message>
DevPod enhancements addendum: supplement for devpod-1 and repo-managed authorized_keys
</commit_message>
<xml_diff>
--- a/docs/Homelab_DevPod_Enhancements_Addendum.docx
+++ b/docs/Homelab_DevPod_Enhancements_Addendum.docx
@@ -7589,6 +7589,3219 @@
           <w:sz w:val="18"/>
         </w:rPr>
         <w:t>rg -n 'AGE-SECRET-KEY|ghp_|github_pat_|BEGIN (OPENSSH|RSA|EC) PRIVATE KEY|eyJ[A-Za-z0-9_-]{20,}' docs/ || echo clean</w:t>
+      </w:r>
+    </w:p>
+    <w:p>
+      <w:pPr>
+        <w:pStyle w:val="Heading1"/>
+        <w:pageBreakBefore/>
+      </w:pPr>
+      <w:r>
+        <w:t>Supplement: devpod-1 and repo-managed authorized_keys (Oct 3, 2026)</w:t>
+      </w:r>
+    </w:p>
+    <w:p>
+      <w:r>
+        <w:t>Added after the rest of this addendum so only these pages need printing. Sections 1-17 and Appendices A-B above are unchanged and describe main at 9ae6231; this supplement covers 1de0d06 and 3d78804.</w:t>
+      </w:r>
+    </w:p>
+    <w:tbl>
+      <w:tblPr>
+        <w:tblStyle w:val="LightShading-Accent1"/>
+        <w:tblW w:type="auto" w:w="0"/>
+        <w:tblLayout w:type="fixed"/>
+        <w:tblLook w:firstColumn="1" w:firstRow="1" w:lastColumn="0" w:lastRow="0" w:noHBand="0" w:noVBand="1" w:val="04A0"/>
+        <w:tblBorders>
+          <w:top w:val="single" w:sz="8" w:space="0" w:color="4F81BD"/>
+          <w:left w:val="nil"/>
+          <w:bottom w:val="single" w:sz="8" w:space="0" w:color="4F81BD"/>
+          <w:right w:val="nil"/>
+          <w:insideH w:val="nil"/>
+          <w:insideV w:val="nil"/>
+        </w:tblBorders>
+      </w:tblPr>
+      <w:tblGrid>
+        <w:gridCol w:w="2592"/>
+        <w:gridCol w:w="7488"/>
+      </w:tblGrid>
+      <w:tr>
+        <w:trPr>
+          <w:cantSplit/>
+          <w:tblHeader w:val="true"/>
+        </w:trPr>
+        <w:tc>
+          <w:tcPr>
+            <w:tcW w:type="dxa" w:w="2592"/>
+            <w:tcBorders>
+              <w:top w:val="single" w:sz="8" w:space="0" w:color="4F81BD"/>
+              <w:bottom w:val="single" w:sz="8" w:space="0" w:color="4F81BD"/>
+            </w:tcBorders>
+            <w:shd w:val="clear" w:color="auto" w:fill="365F91"/>
+          </w:tcPr>
+          <w:p>
+            <w:pPr>
+              <w:keepNext/>
+              <w:spacing w:before="40" w:after="40" w:line="240" w:lineRule="auto"/>
+            </w:pPr>
+            <w:r/>
+            <w:r>
+              <w:rPr>
+                <w:b/>
+                <w:color w:val="FFFFFF"/>
+                <w:sz w:val="20"/>
+              </w:rPr>
+              <w:t>Field</w:t>
+            </w:r>
+          </w:p>
+        </w:tc>
+        <w:tc>
+          <w:tcPr>
+            <w:tcW w:type="dxa" w:w="7488"/>
+            <w:tcBorders>
+              <w:top w:val="single" w:sz="8" w:space="0" w:color="4F81BD"/>
+              <w:bottom w:val="single" w:sz="8" w:space="0" w:color="4F81BD"/>
+            </w:tcBorders>
+            <w:shd w:val="clear" w:color="auto" w:fill="365F91"/>
+          </w:tcPr>
+          <w:p>
+            <w:pPr>
+              <w:keepNext/>
+              <w:spacing w:before="40" w:after="40" w:line="240" w:lineRule="auto"/>
+            </w:pPr>
+            <w:r/>
+            <w:r>
+              <w:rPr>
+                <w:b/>
+                <w:color w:val="FFFFFF"/>
+                <w:sz w:val="20"/>
+              </w:rPr>
+              <w:t>Value</w:t>
+            </w:r>
+          </w:p>
+        </w:tc>
+      </w:tr>
+      <w:tr>
+        <w:trPr>
+          <w:cantSplit/>
+        </w:trPr>
+        <w:tc>
+          <w:tcPr>
+            <w:tcW w:type="dxa" w:w="2592"/>
+            <w:shd w:val="clear" w:color="auto" w:fill="D3DFEE"/>
+          </w:tcPr>
+          <w:p>
+            <w:pPr>
+              <w:spacing w:before="40" w:after="40" w:line="240" w:lineRule="auto"/>
+            </w:pPr>
+            <w:r/>
+            <w:r>
+              <w:rPr>
+                <w:b/>
+                <w:color w:val="365F91"/>
+                <w:sz w:val="20"/>
+              </w:rPr>
+              <w:t>Replicas</w:t>
+            </w:r>
+          </w:p>
+        </w:tc>
+        <w:tc>
+          <w:tcPr>
+            <w:tcW w:type="dxa" w:w="7488"/>
+            <w:shd w:val="clear" w:color="auto" w:fill="D3DFEE"/>
+          </w:tcPr>
+          <w:p>
+            <w:pPr>
+              <w:spacing w:before="40" w:after="40" w:line="240" w:lineRule="auto"/>
+            </w:pPr>
+            <w:r/>
+            <w:r>
+              <w:rPr>
+                <w:color w:val="365F91"/>
+                <w:sz w:val="20"/>
+              </w:rPr>
+              <w:t>StatefulSet devpod scaled 1 → 2 (James, commit 1de0d06, 15:10 CT): devpod-0 + devpod-1</w:t>
+            </w:r>
+          </w:p>
+        </w:tc>
+      </w:tr>
+      <w:tr>
+        <w:trPr>
+          <w:cantSplit/>
+        </w:trPr>
+        <w:tc>
+          <w:tcPr>
+            <w:tcW w:type="dxa" w:w="2592"/>
+            <w:shd w:val="clear" w:color="auto" w:fill="FFFFFF"/>
+          </w:tcPr>
+          <w:p>
+            <w:pPr>
+              <w:spacing w:before="40" w:after="40" w:line="240" w:lineRule="auto"/>
+            </w:pPr>
+            <w:r/>
+            <w:r>
+              <w:rPr>
+                <w:b/>
+                <w:color w:val="365F91"/>
+                <w:sz w:val="20"/>
+              </w:rPr>
+              <w:t>New volume</w:t>
+            </w:r>
+          </w:p>
+        </w:tc>
+        <w:tc>
+          <w:tcPr>
+            <w:tcW w:type="dxa" w:w="7488"/>
+            <w:shd w:val="clear" w:color="auto" w:fill="FFFFFF"/>
+          </w:tcPr>
+          <w:p>
+            <w:pPr>
+              <w:spacing w:before="40" w:after="40" w:line="240" w:lineRule="auto"/>
+            </w:pPr>
+            <w:r/>
+            <w:r>
+              <w:rPr>
+                <w:color w:val="365F91"/>
+                <w:sz w:val="20"/>
+              </w:rPr>
+              <w:t>home-devpod-1 (Longhorn 20Gi, from volumeClaimTemplates) on skynet-wrk-01</w:t>
+            </w:r>
+          </w:p>
+        </w:tc>
+      </w:tr>
+      <w:tr>
+        <w:trPr>
+          <w:cantSplit/>
+        </w:trPr>
+        <w:tc>
+          <w:tcPr>
+            <w:tcW w:type="dxa" w:w="2592"/>
+            <w:shd w:val="clear" w:color="auto" w:fill="D3DFEE"/>
+          </w:tcPr>
+          <w:p>
+            <w:pPr>
+              <w:spacing w:before="40" w:after="40" w:line="240" w:lineRule="auto"/>
+            </w:pPr>
+            <w:r/>
+            <w:r>
+              <w:rPr>
+                <w:b/>
+                <w:color w:val="365F91"/>
+                <w:sz w:val="20"/>
+              </w:rPr>
+              <w:t>Wrong state (fixed)</w:t>
+            </w:r>
+          </w:p>
+        </w:tc>
+        <w:tc>
+          <w:tcPr>
+            <w:tcW w:type="dxa" w:w="7488"/>
+            <w:shd w:val="clear" w:color="auto" w:fill="D3DFEE"/>
+          </w:tcPr>
+          <w:p>
+            <w:pPr>
+              <w:spacing w:before="40" w:after="40" w:line="240" w:lineRule="auto"/>
+            </w:pPr>
+            <w:r>
+              <w:rPr>
+                <w:b/>
+                <w:color w:val="A52A23"/>
+              </w:rPr>
+            </w:r>
+            <w:r>
+              <w:rPr>
+                <w:b/>
+                <w:color w:val="A52A23"/>
+                <w:sz w:val="20"/>
+              </w:rPr>
+              <w:t>authorized_keys added by hand on devpod-0's home volume only; devpod-1 started with none</w:t>
+            </w:r>
+          </w:p>
+        </w:tc>
+      </w:tr>
+      <w:tr>
+        <w:trPr>
+          <w:cantSplit/>
+        </w:trPr>
+        <w:tc>
+          <w:tcPr>
+            <w:tcW w:type="dxa" w:w="2592"/>
+            <w:shd w:val="clear" w:color="auto" w:fill="FFFFFF"/>
+          </w:tcPr>
+          <w:p>
+            <w:pPr>
+              <w:spacing w:before="40" w:after="40" w:line="240" w:lineRule="auto"/>
+            </w:pPr>
+            <w:r/>
+            <w:r>
+              <w:rPr>
+                <w:b/>
+                <w:color w:val="365F91"/>
+                <w:sz w:val="20"/>
+              </w:rPr>
+              <w:t>Fix</w:t>
+            </w:r>
+          </w:p>
+        </w:tc>
+        <w:tc>
+          <w:tcPr>
+            <w:tcW w:type="dxa" w:w="7488"/>
+            <w:shd w:val="clear" w:color="auto" w:fill="FFFFFF"/>
+          </w:tcPr>
+          <w:p>
+            <w:pPr>
+              <w:spacing w:before="40" w:after="40" w:line="240" w:lineRule="auto"/>
+            </w:pPr>
+            <w:r/>
+            <w:r>
+              <w:rPr>
+                <w:color w:val="365F91"/>
+                <w:sz w:val="20"/>
+              </w:rPr>
+              <w:t>bootstrap/authorized_keys in Git → ConfigMap devpod-bootstrap → devpod-runtime.sh overwrites /home/vscode/.ssh/authorized_keys on every start, every replica · commit 3d78804 (15:19 CT)</w:t>
+            </w:r>
+          </w:p>
+        </w:tc>
+      </w:tr>
+      <w:tr>
+        <w:trPr>
+          <w:cantSplit/>
+        </w:trPr>
+        <w:tc>
+          <w:tcPr>
+            <w:tcW w:type="dxa" w:w="2592"/>
+            <w:shd w:val="clear" w:color="auto" w:fill="D3DFEE"/>
+          </w:tcPr>
+          <w:p>
+            <w:pPr>
+              <w:spacing w:before="40" w:after="40" w:line="240" w:lineRule="auto"/>
+            </w:pPr>
+            <w:r/>
+            <w:r>
+              <w:rPr>
+                <w:b/>
+                <w:color w:val="365F91"/>
+                <w:sz w:val="20"/>
+              </w:rPr>
+              <w:t>Keys</w:t>
+            </w:r>
+          </w:p>
+        </w:tc>
+        <w:tc>
+          <w:tcPr>
+            <w:tcW w:type="dxa" w:w="7488"/>
+            <w:shd w:val="clear" w:color="auto" w:fill="D3DFEE"/>
+          </w:tcPr>
+          <w:p>
+            <w:pPr>
+              <w:spacing w:before="40" w:after="40" w:line="240" w:lineRule="auto"/>
+            </w:pPr>
+            <w:r/>
+            <w:r>
+              <w:rPr>
+                <w:color w:val="365F91"/>
+                <w:sz w:val="20"/>
+              </w:rPr>
+              <w:t>M5 SHA256:PBPgT1A69fRgGM1wdwWBMA/BJtPfdsXdFasYUod7JrM · Mac mini SHA256:94wTnD+20VEazwsIfbXdS8+pTOAfWJWKKKi+iquPrL4</w:t>
+            </w:r>
+          </w:p>
+        </w:tc>
+      </w:tr>
+      <w:tr>
+        <w:trPr>
+          <w:cantSplit/>
+        </w:trPr>
+        <w:tc>
+          <w:tcPr>
+            <w:tcW w:type="dxa" w:w="2592"/>
+            <w:shd w:val="clear" w:color="auto" w:fill="FFFFFF"/>
+          </w:tcPr>
+          <w:p>
+            <w:pPr>
+              <w:spacing w:before="40" w:after="40" w:line="240" w:lineRule="auto"/>
+            </w:pPr>
+            <w:r/>
+            <w:r>
+              <w:rPr>
+                <w:b/>
+                <w:color w:val="365F91"/>
+                <w:sz w:val="20"/>
+              </w:rPr>
+              <w:t>Source of truth</w:t>
+            </w:r>
+          </w:p>
+        </w:tc>
+        <w:tc>
+          <w:tcPr>
+            <w:tcW w:type="dxa" w:w="7488"/>
+            <w:shd w:val="clear" w:color="auto" w:fill="FFFFFF"/>
+          </w:tcPr>
+          <w:p>
+            <w:pPr>
+              <w:spacing w:before="40" w:after="40" w:line="240" w:lineRule="auto"/>
+            </w:pPr>
+            <w:r/>
+            <w:r>
+              <w:rPr>
+                <w:color w:val="365F91"/>
+                <w:sz w:val="20"/>
+              </w:rPr>
+              <w:t>Git. Removing a line revokes that key after the rollout; keys added by hand in a pod are overwritten</w:t>
+            </w:r>
+          </w:p>
+        </w:tc>
+      </w:tr>
+      <w:tr>
+        <w:trPr>
+          <w:cantSplit/>
+        </w:trPr>
+        <w:tc>
+          <w:tcPr>
+            <w:tcW w:type="dxa" w:w="2592"/>
+            <w:shd w:val="clear" w:color="auto" w:fill="D3DFEE"/>
+          </w:tcPr>
+          <w:p>
+            <w:pPr>
+              <w:spacing w:before="40" w:after="40" w:line="240" w:lineRule="auto"/>
+            </w:pPr>
+            <w:r/>
+            <w:r>
+              <w:rPr>
+                <w:b/>
+                <w:color w:val="365F91"/>
+                <w:sz w:val="20"/>
+              </w:rPr>
+              <w:t>Files changed</w:t>
+            </w:r>
+          </w:p>
+        </w:tc>
+        <w:tc>
+          <w:tcPr>
+            <w:tcW w:type="dxa" w:w="7488"/>
+            <w:shd w:val="clear" w:color="auto" w:fill="D3DFEE"/>
+          </w:tcPr>
+          <w:p>
+            <w:pPr>
+              <w:spacing w:before="40" w:after="40" w:line="240" w:lineRule="auto"/>
+            </w:pPr>
+            <w:r/>
+            <w:r>
+              <w:rPr>
+                <w:color w:val="365F91"/>
+                <w:sz w:val="20"/>
+              </w:rPr>
+              <w:t>apps/base/devpod/bootstrap/authorized_keys (new), kustomization.yaml, bootstrap/devpod-runtime.sh, README.md (devpod-statefulset.yaml: replicas only, 1de0d06)</w:t>
+            </w:r>
+          </w:p>
+        </w:tc>
+      </w:tr>
+      <w:tr>
+        <w:trPr>
+          <w:cantSplit/>
+        </w:trPr>
+        <w:tc>
+          <w:tcPr>
+            <w:tcW w:type="dxa" w:w="2592"/>
+            <w:shd w:val="clear" w:color="auto" w:fill="FFFFFF"/>
+          </w:tcPr>
+          <w:p>
+            <w:pPr>
+              <w:spacing w:before="40" w:after="40" w:line="240" w:lineRule="auto"/>
+            </w:pPr>
+            <w:r/>
+            <w:r>
+              <w:rPr>
+                <w:b/>
+                <w:color w:val="365F91"/>
+                <w:sz w:val="20"/>
+              </w:rPr>
+              <w:t>PVCs (never delete)</w:t>
+            </w:r>
+          </w:p>
+        </w:tc>
+        <w:tc>
+          <w:tcPr>
+            <w:tcW w:type="dxa" w:w="7488"/>
+            <w:shd w:val="clear" w:color="auto" w:fill="FFFFFF"/>
+          </w:tcPr>
+          <w:p>
+            <w:pPr>
+              <w:spacing w:before="40" w:after="40" w:line="240" w:lineRule="auto"/>
+            </w:pPr>
+            <w:r/>
+            <w:r>
+              <w:rPr>
+                <w:color w:val="365F91"/>
+                <w:sz w:val="20"/>
+              </w:rPr>
+              <w:t>home-devpod-0, home-devpod-1, devpod-scratch, devpod-default-de-115ea</w:t>
+            </w:r>
+          </w:p>
+        </w:tc>
+      </w:tr>
+    </w:tbl>
+    <w:p>
+      <w:pPr>
+        <w:spacing w:after="40" w:line="120" w:lineRule="exact"/>
+      </w:pPr>
+    </w:p>
+    <w:p>
+      <w:pPr>
+        <w:pStyle w:val="Heading2"/>
+      </w:pPr>
+      <w:r>
+        <w:t>S.1 Overview</w:t>
+      </w:r>
+    </w:p>
+    <w:tbl>
+      <w:tblPr>
+        <w:tblStyle w:val="LightShading-Accent1"/>
+        <w:tblW w:type="auto" w:w="0"/>
+        <w:tblLayout w:type="fixed"/>
+        <w:tblLook w:firstColumn="1" w:firstRow="1" w:lastColumn="0" w:lastRow="0" w:noHBand="0" w:noVBand="1" w:val="04A0"/>
+        <w:tblBorders>
+          <w:top w:val="single" w:sz="8" w:space="0" w:color="4F81BD"/>
+          <w:left w:val="nil"/>
+          <w:bottom w:val="single" w:sz="8" w:space="0" w:color="4F81BD"/>
+          <w:right w:val="nil"/>
+          <w:insideH w:val="nil"/>
+          <w:insideV w:val="nil"/>
+        </w:tblBorders>
+      </w:tblPr>
+      <w:tblGrid>
+        <w:gridCol w:w="432"/>
+        <w:gridCol w:w="3744"/>
+        <w:gridCol w:w="4464"/>
+        <w:gridCol w:w="1440"/>
+      </w:tblGrid>
+      <w:tr>
+        <w:trPr>
+          <w:cantSplit/>
+          <w:tblHeader w:val="true"/>
+        </w:trPr>
+        <w:tc>
+          <w:tcPr>
+            <w:tcW w:type="dxa" w:w="432"/>
+            <w:tcBorders>
+              <w:top w:val="single" w:sz="8" w:space="0" w:color="4F81BD"/>
+              <w:bottom w:val="single" w:sz="8" w:space="0" w:color="4F81BD"/>
+            </w:tcBorders>
+            <w:shd w:val="clear" w:color="auto" w:fill="365F91"/>
+          </w:tcPr>
+          <w:p>
+            <w:pPr>
+              <w:keepNext/>
+              <w:spacing w:before="40" w:after="40" w:line="240" w:lineRule="auto"/>
+            </w:pPr>
+            <w:r/>
+            <w:r>
+              <w:rPr>
+                <w:b/>
+                <w:color w:val="FFFFFF"/>
+                <w:sz w:val="20"/>
+              </w:rPr>
+              <w:t>#</w:t>
+            </w:r>
+          </w:p>
+        </w:tc>
+        <w:tc>
+          <w:tcPr>
+            <w:tcW w:type="dxa" w:w="3744"/>
+            <w:tcBorders>
+              <w:top w:val="single" w:sz="8" w:space="0" w:color="4F81BD"/>
+              <w:bottom w:val="single" w:sz="8" w:space="0" w:color="4F81BD"/>
+            </w:tcBorders>
+            <w:shd w:val="clear" w:color="auto" w:fill="365F91"/>
+          </w:tcPr>
+          <w:p>
+            <w:pPr>
+              <w:keepNext/>
+              <w:spacing w:before="40" w:after="40" w:line="240" w:lineRule="auto"/>
+            </w:pPr>
+            <w:r/>
+            <w:r>
+              <w:rPr>
+                <w:b/>
+                <w:color w:val="FFFFFF"/>
+                <w:sz w:val="20"/>
+              </w:rPr>
+              <w:t>Enhancement</w:t>
+            </w:r>
+          </w:p>
+        </w:tc>
+        <w:tc>
+          <w:tcPr>
+            <w:tcW w:type="dxa" w:w="4464"/>
+            <w:tcBorders>
+              <w:top w:val="single" w:sz="8" w:space="0" w:color="4F81BD"/>
+              <w:bottom w:val="single" w:sz="8" w:space="0" w:color="4F81BD"/>
+            </w:tcBorders>
+            <w:shd w:val="clear" w:color="auto" w:fill="365F91"/>
+          </w:tcPr>
+          <w:p>
+            <w:pPr>
+              <w:keepNext/>
+              <w:spacing w:before="40" w:after="40" w:line="240" w:lineRule="auto"/>
+            </w:pPr>
+            <w:r/>
+            <w:r>
+              <w:rPr>
+                <w:b/>
+                <w:color w:val="FFFFFF"/>
+                <w:sz w:val="20"/>
+              </w:rPr>
+              <w:t>Where</w:t>
+            </w:r>
+          </w:p>
+        </w:tc>
+        <w:tc>
+          <w:tcPr>
+            <w:tcW w:type="dxa" w:w="1440"/>
+            <w:tcBorders>
+              <w:top w:val="single" w:sz="8" w:space="0" w:color="4F81BD"/>
+              <w:bottom w:val="single" w:sz="8" w:space="0" w:color="4F81BD"/>
+            </w:tcBorders>
+            <w:shd w:val="clear" w:color="auto" w:fill="365F91"/>
+          </w:tcPr>
+          <w:p>
+            <w:pPr>
+              <w:keepNext/>
+              <w:spacing w:before="40" w:after="40" w:line="240" w:lineRule="auto"/>
+            </w:pPr>
+            <w:r/>
+            <w:r>
+              <w:rPr>
+                <w:b/>
+                <w:color w:val="FFFFFF"/>
+                <w:sz w:val="20"/>
+              </w:rPr>
+              <w:t>Commit</w:t>
+            </w:r>
+          </w:p>
+        </w:tc>
+      </w:tr>
+      <w:tr>
+        <w:trPr>
+          <w:cantSplit/>
+        </w:trPr>
+        <w:tc>
+          <w:tcPr>
+            <w:tcW w:type="dxa" w:w="432"/>
+            <w:shd w:val="clear" w:color="auto" w:fill="D3DFEE"/>
+          </w:tcPr>
+          <w:p>
+            <w:pPr>
+              <w:spacing w:before="40" w:after="40" w:line="240" w:lineRule="auto"/>
+            </w:pPr>
+            <w:r/>
+            <w:r>
+              <w:rPr>
+                <w:b/>
+                <w:color w:val="365F91"/>
+                <w:sz w:val="20"/>
+              </w:rPr>
+              <w:t>8</w:t>
+            </w:r>
+          </w:p>
+        </w:tc>
+        <w:tc>
+          <w:tcPr>
+            <w:tcW w:type="dxa" w:w="3744"/>
+            <w:shd w:val="clear" w:color="auto" w:fill="D3DFEE"/>
+          </w:tcPr>
+          <w:p>
+            <w:pPr>
+              <w:spacing w:before="40" w:after="40" w:line="240" w:lineRule="auto"/>
+            </w:pPr>
+            <w:r/>
+            <w:r>
+              <w:rPr>
+                <w:color w:val="365F91"/>
+                <w:sz w:val="20"/>
+              </w:rPr>
+              <w:t>Second replica devpod-1 (own home volume)</w:t>
+            </w:r>
+          </w:p>
+        </w:tc>
+        <w:tc>
+          <w:tcPr>
+            <w:tcW w:type="dxa" w:w="4464"/>
+            <w:shd w:val="clear" w:color="auto" w:fill="D3DFEE"/>
+          </w:tcPr>
+          <w:p>
+            <w:pPr>
+              <w:spacing w:before="40" w:after="40" w:line="240" w:lineRule="auto"/>
+            </w:pPr>
+            <w:r/>
+            <w:r>
+              <w:rPr>
+                <w:color w:val="365F91"/>
+                <w:sz w:val="20"/>
+              </w:rPr>
+              <w:t>devpod-statefulset.yaml replicas: 2</w:t>
+            </w:r>
+          </w:p>
+        </w:tc>
+        <w:tc>
+          <w:tcPr>
+            <w:tcW w:type="dxa" w:w="1440"/>
+            <w:shd w:val="clear" w:color="auto" w:fill="D3DFEE"/>
+          </w:tcPr>
+          <w:p>
+            <w:pPr>
+              <w:spacing w:before="40" w:after="40" w:line="240" w:lineRule="auto"/>
+            </w:pPr>
+            <w:r/>
+            <w:r>
+              <w:rPr>
+                <w:color w:val="365F91"/>
+                <w:sz w:val="20"/>
+              </w:rPr>
+              <w:t>1de0d06</w:t>
+            </w:r>
+          </w:p>
+        </w:tc>
+      </w:tr>
+      <w:tr>
+        <w:trPr>
+          <w:cantSplit/>
+        </w:trPr>
+        <w:tc>
+          <w:tcPr>
+            <w:tcW w:type="dxa" w:w="432"/>
+            <w:shd w:val="clear" w:color="auto" w:fill="FFFFFF"/>
+          </w:tcPr>
+          <w:p>
+            <w:pPr>
+              <w:spacing w:before="40" w:after="40" w:line="240" w:lineRule="auto"/>
+            </w:pPr>
+            <w:r/>
+            <w:r>
+              <w:rPr>
+                <w:b/>
+                <w:color w:val="365F91"/>
+                <w:sz w:val="20"/>
+              </w:rPr>
+              <w:t>9</w:t>
+            </w:r>
+          </w:p>
+        </w:tc>
+        <w:tc>
+          <w:tcPr>
+            <w:tcW w:type="dxa" w:w="3744"/>
+            <w:shd w:val="clear" w:color="auto" w:fill="FFFFFF"/>
+          </w:tcPr>
+          <w:p>
+            <w:pPr>
+              <w:spacing w:before="40" w:after="40" w:line="240" w:lineRule="auto"/>
+            </w:pPr>
+            <w:r/>
+            <w:r>
+              <w:rPr>
+                <w:color w:val="365F91"/>
+                <w:sz w:val="20"/>
+              </w:rPr>
+              <w:t>Repo-managed SSH authorized_keys for all replicas</w:t>
+            </w:r>
+          </w:p>
+        </w:tc>
+        <w:tc>
+          <w:tcPr>
+            <w:tcW w:type="dxa" w:w="4464"/>
+            <w:shd w:val="clear" w:color="auto" w:fill="FFFFFF"/>
+          </w:tcPr>
+          <w:p>
+            <w:pPr>
+              <w:spacing w:before="40" w:after="40" w:line="240" w:lineRule="auto"/>
+            </w:pPr>
+            <w:r/>
+            <w:r>
+              <w:rPr>
+                <w:color w:val="365F91"/>
+                <w:sz w:val="20"/>
+              </w:rPr>
+              <w:t>bootstrap/authorized_keys, kustomization.yaml, devpod-runtime.sh, README.md</w:t>
+            </w:r>
+          </w:p>
+        </w:tc>
+        <w:tc>
+          <w:tcPr>
+            <w:tcW w:type="dxa" w:w="1440"/>
+            <w:shd w:val="clear" w:color="auto" w:fill="FFFFFF"/>
+          </w:tcPr>
+          <w:p>
+            <w:pPr>
+              <w:spacing w:before="40" w:after="40" w:line="240" w:lineRule="auto"/>
+            </w:pPr>
+            <w:r/>
+            <w:r>
+              <w:rPr>
+                <w:color w:val="365F91"/>
+                <w:sz w:val="20"/>
+              </w:rPr>
+              <w:t>3d78804</w:t>
+            </w:r>
+          </w:p>
+        </w:tc>
+      </w:tr>
+    </w:tbl>
+    <w:p>
+      <w:pPr>
+        <w:spacing w:after="40" w:line="120" w:lineRule="exact"/>
+      </w:pPr>
+    </w:p>
+    <w:tbl>
+      <w:tblPr>
+        <w:tblStyle w:val="LightShading-Accent1"/>
+        <w:tblW w:type="auto" w:w="0"/>
+        <w:tblLayout w:type="fixed"/>
+        <w:tblLook w:firstColumn="1" w:firstRow="1" w:lastColumn="0" w:lastRow="0" w:noHBand="0" w:noVBand="1" w:val="04A0"/>
+        <w:tblBorders>
+          <w:top w:val="single" w:sz="8" w:space="0" w:color="4F81BD"/>
+          <w:left w:val="nil"/>
+          <w:bottom w:val="single" w:sz="8" w:space="0" w:color="4F81BD"/>
+          <w:right w:val="nil"/>
+          <w:insideH w:val="nil"/>
+          <w:insideV w:val="nil"/>
+        </w:tblBorders>
+      </w:tblPr>
+      <w:tblGrid>
+        <w:gridCol w:w="2304"/>
+        <w:gridCol w:w="1296"/>
+        <w:gridCol w:w="6480"/>
+      </w:tblGrid>
+      <w:tr>
+        <w:trPr>
+          <w:cantSplit/>
+          <w:tblHeader w:val="true"/>
+        </w:trPr>
+        <w:tc>
+          <w:tcPr>
+            <w:tcW w:type="dxa" w:w="2304"/>
+            <w:tcBorders>
+              <w:top w:val="single" w:sz="8" w:space="0" w:color="4F81BD"/>
+              <w:bottom w:val="single" w:sz="8" w:space="0" w:color="4F81BD"/>
+            </w:tcBorders>
+            <w:shd w:val="clear" w:color="auto" w:fill="365F91"/>
+          </w:tcPr>
+          <w:p>
+            <w:pPr>
+              <w:keepNext/>
+              <w:spacing w:before="40" w:after="40" w:line="240" w:lineRule="auto"/>
+            </w:pPr>
+            <w:r/>
+            <w:r>
+              <w:rPr>
+                <w:b/>
+                <w:color w:val="FFFFFF"/>
+                <w:sz w:val="20"/>
+              </w:rPr>
+              <w:t>Commit (homelab-cluster)</w:t>
+            </w:r>
+          </w:p>
+        </w:tc>
+        <w:tc>
+          <w:tcPr>
+            <w:tcW w:type="dxa" w:w="1296"/>
+            <w:tcBorders>
+              <w:top w:val="single" w:sz="8" w:space="0" w:color="4F81BD"/>
+              <w:bottom w:val="single" w:sz="8" w:space="0" w:color="4F81BD"/>
+            </w:tcBorders>
+            <w:shd w:val="clear" w:color="auto" w:fill="365F91"/>
+          </w:tcPr>
+          <w:p>
+            <w:pPr>
+              <w:keepNext/>
+              <w:spacing w:before="40" w:after="40" w:line="240" w:lineRule="auto"/>
+            </w:pPr>
+            <w:r/>
+            <w:r>
+              <w:rPr>
+                <w:b/>
+                <w:color w:val="FFFFFF"/>
+                <w:sz w:val="20"/>
+              </w:rPr>
+              <w:t>Time (CT)</w:t>
+            </w:r>
+          </w:p>
+        </w:tc>
+        <w:tc>
+          <w:tcPr>
+            <w:tcW w:type="dxa" w:w="6480"/>
+            <w:tcBorders>
+              <w:top w:val="single" w:sz="8" w:space="0" w:color="4F81BD"/>
+              <w:bottom w:val="single" w:sz="8" w:space="0" w:color="4F81BD"/>
+            </w:tcBorders>
+            <w:shd w:val="clear" w:color="auto" w:fill="365F91"/>
+          </w:tcPr>
+          <w:p>
+            <w:pPr>
+              <w:keepNext/>
+              <w:spacing w:before="40" w:after="40" w:line="240" w:lineRule="auto"/>
+            </w:pPr>
+            <w:r/>
+            <w:r>
+              <w:rPr>
+                <w:b/>
+                <w:color w:val="FFFFFF"/>
+                <w:sz w:val="20"/>
+              </w:rPr>
+              <w:t>Message</w:t>
+            </w:r>
+          </w:p>
+        </w:tc>
+      </w:tr>
+      <w:tr>
+        <w:trPr>
+          <w:cantSplit/>
+        </w:trPr>
+        <w:tc>
+          <w:tcPr>
+            <w:tcW w:type="dxa" w:w="2304"/>
+            <w:shd w:val="clear" w:color="auto" w:fill="D3DFEE"/>
+          </w:tcPr>
+          <w:p>
+            <w:pPr>
+              <w:spacing w:before="40" w:after="40" w:line="240" w:lineRule="auto"/>
+            </w:pPr>
+            <w:r/>
+            <w:r>
+              <w:rPr>
+                <w:b/>
+                <w:color w:val="365F91"/>
+                <w:sz w:val="20"/>
+              </w:rPr>
+              <w:t>1de0d06</w:t>
+            </w:r>
+          </w:p>
+        </w:tc>
+        <w:tc>
+          <w:tcPr>
+            <w:tcW w:type="dxa" w:w="1296"/>
+            <w:shd w:val="clear" w:color="auto" w:fill="D3DFEE"/>
+          </w:tcPr>
+          <w:p>
+            <w:pPr>
+              <w:spacing w:before="40" w:after="40" w:line="240" w:lineRule="auto"/>
+            </w:pPr>
+            <w:r/>
+            <w:r>
+              <w:rPr>
+                <w:color w:val="365F91"/>
+                <w:sz w:val="20"/>
+              </w:rPr>
+              <w:t>15:10</w:t>
+            </w:r>
+          </w:p>
+        </w:tc>
+        <w:tc>
+          <w:tcPr>
+            <w:tcW w:type="dxa" w:w="6480"/>
+            <w:shd w:val="clear" w:color="auto" w:fill="D3DFEE"/>
+          </w:tcPr>
+          <w:p>
+            <w:pPr>
+              <w:spacing w:before="40" w:after="40" w:line="240" w:lineRule="auto"/>
+            </w:pPr>
+            <w:r/>
+            <w:r>
+              <w:rPr>
+                <w:color w:val="365F91"/>
+                <w:sz w:val="20"/>
+              </w:rPr>
+              <w:t>increasing devpod stateful set to 2 (James)</w:t>
+            </w:r>
+          </w:p>
+        </w:tc>
+      </w:tr>
+      <w:tr>
+        <w:trPr>
+          <w:cantSplit/>
+        </w:trPr>
+        <w:tc>
+          <w:tcPr>
+            <w:tcW w:type="dxa" w:w="2304"/>
+            <w:shd w:val="clear" w:color="auto" w:fill="FFFFFF"/>
+          </w:tcPr>
+          <w:p>
+            <w:pPr>
+              <w:spacing w:before="40" w:after="40" w:line="240" w:lineRule="auto"/>
+            </w:pPr>
+            <w:r/>
+            <w:r>
+              <w:rPr>
+                <w:b/>
+                <w:color w:val="365F91"/>
+                <w:sz w:val="20"/>
+              </w:rPr>
+              <w:t>3d78804</w:t>
+            </w:r>
+          </w:p>
+        </w:tc>
+        <w:tc>
+          <w:tcPr>
+            <w:tcW w:type="dxa" w:w="1296"/>
+            <w:shd w:val="clear" w:color="auto" w:fill="FFFFFF"/>
+          </w:tcPr>
+          <w:p>
+            <w:pPr>
+              <w:spacing w:before="40" w:after="40" w:line="240" w:lineRule="auto"/>
+            </w:pPr>
+            <w:r/>
+            <w:r>
+              <w:rPr>
+                <w:color w:val="365F91"/>
+                <w:sz w:val="20"/>
+              </w:rPr>
+              <w:t>15:19</w:t>
+            </w:r>
+          </w:p>
+        </w:tc>
+        <w:tc>
+          <w:tcPr>
+            <w:tcW w:type="dxa" w:w="6480"/>
+            <w:shd w:val="clear" w:color="auto" w:fill="FFFFFF"/>
+          </w:tcPr>
+          <w:p>
+            <w:pPr>
+              <w:spacing w:before="40" w:after="40" w:line="240" w:lineRule="auto"/>
+            </w:pPr>
+            <w:r/>
+            <w:r>
+              <w:rPr>
+                <w:color w:val="365F91"/>
+                <w:sz w:val="20"/>
+              </w:rPr>
+              <w:t>DevPod: manage SSH authorized_keys from repo for all replicas</w:t>
+            </w:r>
+          </w:p>
+        </w:tc>
+      </w:tr>
+    </w:tbl>
+    <w:p>
+      <w:pPr>
+        <w:spacing w:after="40" w:line="120" w:lineRule="exact"/>
+      </w:pPr>
+    </w:p>
+    <w:p>
+      <w:pPr>
+        <w:shd w:val="clear" w:color="auto" w:fill="D3DFEE"/>
+        <w:keepLines/>
+        <w:pBdr>
+          <w:left w:val="single" w:sz="24" w:space="6" w:color="4F81BD"/>
+        </w:pBdr>
+        <w:spacing w:before="40" w:after="180"/>
+        <w:ind w:left="115" w:right="86"/>
+      </w:pPr>
+      <w:r>
+        <w:rPr>
+          <w:b/>
+          <w:color w:val="173A53"/>
+        </w:rPr>
+        <w:t xml:space="preserve">Note  </w:t>
+      </w:r>
+      <w:r>
+        <w:t>Cloudflare routing for devpod-1 (tunnel rule, DNS, Access app, Host devpod-1 on both Macs) and the shared host keys were already in place (sections 3-5 and 15), so devpod-1 needed no Cloudflare change.</w:t>
+      </w:r>
+    </w:p>
+    <w:p>
+      <w:pPr>
+        <w:pStyle w:val="Heading2"/>
+      </w:pPr>
+      <w:r>
+        <w:t>S.2 Mistake</w:t>
+      </w:r>
+    </w:p>
+    <w:p>
+      <w:pPr>
+        <w:shd w:val="clear" w:color="auto" w:fill="FBEAEA"/>
+        <w:keepNext/>
+        <w:keepLines/>
+        <w:pBdr>
+          <w:left w:val="single" w:sz="36" w:space="6" w:color="A52A23"/>
+        </w:pBdr>
+        <w:spacing w:before="40" w:after="0"/>
+        <w:ind w:left="144" w:right="86"/>
+      </w:pPr>
+      <w:r>
+        <w:rPr>
+          <w:rFonts w:ascii="Calibri" w:hAnsi="Calibri" w:eastAsia="Calibri"/>
+          <w:b/>
+          <w:color w:val="A52A23"/>
+        </w:rPr>
+        <w:t xml:space="preserve">MISTAKE  </w:t>
+      </w:r>
+      <w:r>
+        <w:rPr>
+          <w:rFonts w:ascii="Calibri" w:hAnsi="Calibri" w:eastAsia="Calibri"/>
+          <w:b/>
+          <w:color w:val="A52A23"/>
+        </w:rPr>
+        <w:t>SSH keys lived only on devpod-0's home volume</w:t>
+      </w:r>
+      <w:r>
+        <w:br/>
+      </w:r>
+      <w:r>
+        <w:rPr>
+          <w:rFonts w:ascii="Calibri" w:hAnsi="Calibri" w:eastAsia="Calibri"/>
+          <w:b/>
+          <w:color w:val="A52A23"/>
+        </w:rPr>
+        <w:t>Wrong state: the M5 key (and later the Mac mini key) were appended to /home/vscode/.ssh/authorized_keys by hand inside devpod-0. That file is on home-devpod-0, so nothing put it on a new replica.</w:t>
+      </w:r>
+      <w:r>
+        <w:br/>
+      </w:r>
+      <w:r>
+        <w:rPr>
+          <w:rFonts w:ascii="Calibri" w:hAnsi="Calibri" w:eastAsia="Calibri"/>
+          <w:b/>
+          <w:color w:val="A52A23"/>
+        </w:rPr>
+        <w:t>Do not add keys by hand inside a pod; after 3d78804 the next restart overwrites them anyway.</w:t>
+      </w:r>
+    </w:p>
+    <w:p>
+      <w:pPr>
+        <w:shd w:val="clear" w:color="auto" w:fill="FBEAEA"/>
+        <w:keepNext/>
+        <w:keepLines/>
+        <w:pBdr>
+          <w:left w:val="single" w:sz="36" w:space="6" w:color="A52A23"/>
+        </w:pBdr>
+        <w:spacing w:before="80" w:after="0"/>
+        <w:ind w:left="144" w:right="86"/>
+      </w:pPr>
+      <w:r>
+        <w:rPr>
+          <w:rFonts w:ascii="Calibri" w:hAnsi="Calibri" w:eastAsia="Calibri"/>
+          <w:b/>
+          <w:color w:val="A52A23"/>
+          <w:sz w:val="20"/>
+        </w:rPr>
+        <w:t>Observed failure</w:t>
+      </w:r>
+    </w:p>
+    <w:p>
+      <w:pPr>
+        <w:shd w:val="clear" w:color="auto" w:fill="FBEAEA"/>
+        <w:keepNext/>
+        <w:keepLines/>
+        <w:pBdr>
+          <w:left w:val="single" w:sz="36" w:space="6" w:color="A52A23"/>
+        </w:pBdr>
+        <w:spacing w:before="0" w:after="0" w:line="240" w:lineRule="auto"/>
+        <w:ind w:left="144" w:right="86"/>
+      </w:pPr>
+      <w:r>
+        <w:rPr>
+          <w:rFonts w:ascii="Courier New" w:hAnsi="Courier New" w:eastAsia="Courier New"/>
+          <w:b w:val="0"/>
+          <w:color w:val="A52A23"/>
+          <w:sz w:val="18"/>
+        </w:rPr>
+        <w:t># devpod-1 right after scaling to replicas: 2 (15:10 CT, fresh home-devpod-1 volume)</w:t>
+        <w:br/>
+        <w:t>/home/vscode/.ssh/authorized_keys on devpod-1: missing (no keys on the new volume)</w:t>
+        <w:br/>
+        <w:t>=&gt; no Mac key accepted by devpod-1 until devpod-0's file was copied over by hand</w:t>
+      </w:r>
+    </w:p>
+    <w:p>
+      <w:pPr>
+        <w:shd w:val="clear" w:color="auto" w:fill="FBEAEA"/>
+        <w:keepLines/>
+        <w:pBdr>
+          <w:left w:val="single" w:sz="36" w:space="6" w:color="A52A23"/>
+        </w:pBdr>
+        <w:spacing w:before="80" w:after="180"/>
+        <w:ind w:left="144" w:right="86"/>
+      </w:pPr>
+      <w:r>
+        <w:rPr>
+          <w:rFonts w:ascii="Calibri" w:hAnsi="Calibri" w:eastAsia="Calibri"/>
+          <w:b/>
+          <w:color w:val="A52A23"/>
+        </w:rPr>
+        <w:t xml:space="preserve">Also wrong  </w:t>
+      </w:r>
+      <w:r>
+        <w:rPr>
+          <w:rFonts w:ascii="Calibri" w:hAnsi="Calibri" w:eastAsia="Calibri"/>
+          <w:b/>
+          <w:color w:val="A52A23"/>
+        </w:rPr>
+        <w:t>Stopgap: devpod-0's file was copied by hand to devpod-1. That works until the next new volume or key change, and the two copies drift.</w:t>
+      </w:r>
+    </w:p>
+    <w:p>
+      <w:r>
+        <w:rPr>
+          <w:b/>
+          <w:color w:val="173A53"/>
+        </w:rPr>
+        <w:t xml:space="preserve">Fix  </w:t>
+      </w:r>
+      <w:r>
+        <w:t>Keys are in Git (S.3); devpod-runtime.sh writes them on every start of every replica (S.5).</w:t>
+      </w:r>
+    </w:p>
+    <w:p>
+      <w:pPr>
+        <w:pStyle w:val="Heading1"/>
+      </w:pPr>
+      <w:r>
+        <w:t>S.3. File: apps/base/devpod/bootstrap/authorized_keys</w:t>
+      </w:r>
+    </w:p>
+    <w:p>
+      <w:r>
+        <w:t>New file. Public keys only (one per line, with fingerprint comments).</w:t>
+      </w:r>
+    </w:p>
+    <w:p>
+      <w:pPr>
+        <w:pStyle w:val="Heading3"/>
+      </w:pPr>
+      <w:r>
+        <w:t>Full file</w:t>
+      </w:r>
+    </w:p>
+    <w:p>
+      <w:pPr>
+        <w:keepLines/>
+        <w:spacing w:line="240" w:lineRule="auto" w:before="40" w:after="180"/>
+        <w:ind w:left="86" w:right="86"/>
+        <w:shd w:val="clear" w:color="auto" w:fill="F0F4F7"/>
+      </w:pPr>
+      <w:r>
+        <w:rPr>
+          <w:rFonts w:ascii="Courier New" w:hAnsi="Courier New" w:eastAsia="Courier New"/>
+          <w:sz w:val="18"/>
+        </w:rPr>
+        <w:t># SSH public keys allowed to log in as vscode on EVERY DevPod replica.</w:t>
+        <w:br/>
+        <w:t># Source of truth: devpod-runtime.sh overwrites /home/vscode/.ssh/authorized_keys</w:t>
+        <w:br/>
+        <w:t># from this file on each start, so removing a line here revokes that key after</w:t>
+        <w:br/>
+        <w:t># the rollout. Public keys only. One key per line; comments are ignored by sshd.</w:t>
+        <w:br/>
+        <w:t># M5 (SHA256:PBPgT1A69fRgGM1wdwWBMA/BJtPfdsXdFasYUod7JrM)</w:t>
+        <w:br/>
+        <w:t>ssh-ed25519 AAAAC3NzaC1lZDI1NTE5AAAAILsJOJoQ3ER+1depvyKbowRDYCuMzv3TrmQfiReNifSN cyberstar@M5.local</w:t>
+        <w:br/>
+        <w:t># Mac mini (SHA256:94wTnD+20VEazwsIfbXdS8+pTOAfWJWKKKi+iquPrL4)</w:t>
+        <w:br/>
+        <w:t>ssh-ed25519 AAAAC3NzaC1lZDI1NTE5AAAAIHCwtsmUTypZCoxGRvWqfuWrUSI1iXT7XROuC29aJHTP cyberstar@Mac-mini.local</w:t>
+      </w:r>
+    </w:p>
+    <w:p>
+      <w:pPr>
+        <w:shd w:val="clear" w:color="auto" w:fill="FBEAEA"/>
+        <w:keepLines/>
+        <w:pBdr>
+          <w:left w:val="single" w:sz="36" w:space="6" w:color="A52A23"/>
+        </w:pBdr>
+        <w:spacing w:before="40" w:after="180"/>
+        <w:ind w:left="144" w:right="86"/>
+      </w:pPr>
+      <w:r>
+        <w:rPr>
+          <w:rFonts w:ascii="Calibri" w:hAnsi="Calibri" w:eastAsia="Calibri"/>
+          <w:b/>
+          <w:color w:val="A52A23"/>
+        </w:rPr>
+        <w:t xml:space="preserve">CRITICAL  </w:t>
+      </w:r>
+      <w:r>
+        <w:rPr>
+          <w:rFonts w:ascii="Calibri" w:hAnsi="Calibri" w:eastAsia="Calibri"/>
+          <w:b/>
+          <w:color w:val="A52A23"/>
+        </w:rPr>
+        <w:t>Public keys only. Never commit a private key (id_ed25519 without .pub).</w:t>
+      </w:r>
+      <w:r>
+        <w:br/>
+      </w:r>
+      <w:r>
+        <w:rPr>
+          <w:rFonts w:ascii="Calibri" w:hAnsi="Calibri" w:eastAsia="Calibri"/>
+          <w:b/>
+          <w:color w:val="A52A23"/>
+        </w:rPr>
+        <w:t>Check with ssh-keygen -lf before committing; every line must be a public key or a comment.</w:t>
+      </w:r>
+    </w:p>
+    <w:p>
+      <w:pPr>
+        <w:pStyle w:val="Heading1"/>
+      </w:pPr>
+      <w:r>
+        <w:t>S.4. File: apps/base/devpod/kustomization.yaml</w:t>
+      </w:r>
+    </w:p>
+    <w:p>
+      <w:r>
+        <w:t>Adds bootstrap/authorized_keys to the devpod-bootstrap configMapGenerator; a key change gives the ConfigMap a new hash and rolls every replica.</w:t>
+      </w:r>
+    </w:p>
+    <w:p>
+      <w:pPr>
+        <w:pStyle w:val="Heading3"/>
+      </w:pPr>
+      <w:r>
+        <w:t>Full file</w:t>
+      </w:r>
+    </w:p>
+    <w:p>
+      <w:pPr>
+        <w:spacing w:line="240" w:lineRule="auto" w:before="40" w:after="180"/>
+        <w:ind w:left="86" w:right="86"/>
+        <w:shd w:val="clear" w:color="auto" w:fill="F0F4F7"/>
+      </w:pPr>
+      <w:r>
+        <w:rPr>
+          <w:rFonts w:ascii="Courier New" w:hAnsi="Courier New" w:eastAsia="Courier New"/>
+          <w:sz w:val="18"/>
+        </w:rPr>
+        <w:t>apiVersion: kustomize.config.k8s.io/v1beta1</w:t>
+        <w:br/>
+        <w:t>kind: Kustomization</w:t>
+        <w:br/>
+        <w:t>resources:</w:t>
+        <w:br/>
+        <w:t xml:space="preserve">  - namespace.yaml</w:t>
+        <w:br/>
+        <w:t xml:space="preserve">  - resourcequota.yaml</w:t>
+        <w:br/>
+        <w:t xml:space="preserve">  - limitrange.yaml</w:t>
+        <w:br/>
+        <w:t xml:space="preserve">  - devpod-scratch-pvc.yaml</w:t>
+        <w:br/>
+        <w:t xml:space="preserve">  - service.yaml</w:t>
+        <w:br/>
+        <w:t xml:space="preserve">  - serviceaccount-devpod.yaml</w:t>
+        <w:br/>
+        <w:t xml:space="preserve">  - clusterrolebinding-devpod-admin.yaml</w:t>
+        <w:br/>
+        <w:t xml:space="preserve">  - devpod-statefulset.yaml</w:t>
+        <w:br/>
+        <w:t xml:space="preserve">  - nodeport-controller.yaml</w:t>
+        <w:br/>
+        <w:t>configMapGenerator:</w:t>
+        <w:br/>
+        <w:t xml:space="preserve">  # Bootstrap scripts for every DevPod replica. The name gets a content</w:t>
+        <w:br/>
+        <w:t xml:space="preserve">  # hash, so editing a script rolls the StatefulSet. No secrets here.</w:t>
+        <w:br/>
+        <w:t xml:space="preserve">  - name: devpod-bootstrap</w:t>
+        <w:br/>
+        <w:t xml:space="preserve">    namespace: devpod</w:t>
+        <w:br/>
+        <w:t xml:space="preserve">    files:</w:t>
+        <w:br/>
+        <w:t xml:space="preserve">      - bootstrap/bootstrap.sh</w:t>
+        <w:br/>
+        <w:t xml:space="preserve">      - bootstrap/devpod-runtime.sh</w:t>
+        <w:br/>
+        <w:t xml:space="preserve">      - bootstrap/git-credential-devpod</w:t>
+        <w:br/>
+        <w:t xml:space="preserve">      - bootstrap/devpod-brew.sh</w:t>
+        <w:br/>
+        <w:t xml:space="preserve">      - bootstrap/authorized_keys</w:t>
+      </w:r>
+    </w:p>
+    <w:p>
+      <w:pPr>
+        <w:pStyle w:val="Heading1"/>
+      </w:pPr>
+      <w:r>
+        <w:t>S.5. File: apps/base/devpod/bootstrap/devpod-runtime.sh</w:t>
+      </w:r>
+    </w:p>
+    <w:p>
+      <w:r>
+        <w:t>New block near the top writes authorized_keys (dir 0700, file 0600, vscode:vscode) via a temp file + mv. Lockout guard: if the ConfigMap copy has no key lines the existing file is kept.</w:t>
+      </w:r>
+    </w:p>
+    <w:p>
+      <w:pPr>
+        <w:shd w:val="clear" w:color="auto" w:fill="D3DFEE"/>
+        <w:keepLines/>
+        <w:pBdr>
+          <w:left w:val="single" w:sz="24" w:space="6" w:color="4F81BD"/>
+        </w:pBdr>
+        <w:spacing w:before="40" w:after="180"/>
+        <w:ind w:left="115" w:right="86"/>
+      </w:pPr>
+      <w:r>
+        <w:rPr>
+          <w:b/>
+          <w:color w:val="173A53"/>
+        </w:rPr>
+        <w:t xml:space="preserve">Note  </w:t>
+      </w:r>
+      <w:r>
+        <w:t>Supersedes the copy of this file in section 7.</w:t>
+      </w:r>
+    </w:p>
+    <w:p>
+      <w:pPr>
+        <w:pStyle w:val="Heading3"/>
+      </w:pPr>
+      <w:r>
+        <w:t>Full file</w:t>
+      </w:r>
+    </w:p>
+    <w:p>
+      <w:pPr>
+        <w:spacing w:line="240" w:lineRule="auto" w:before="40" w:after="180"/>
+        <w:ind w:left="86" w:right="86"/>
+        <w:shd w:val="clear" w:color="auto" w:fill="F0F4F7"/>
+      </w:pPr>
+      <w:r>
+        <w:rPr>
+          <w:rFonts w:ascii="Courier New" w:hAnsi="Courier New" w:eastAsia="Courier New"/>
+          <w:sz w:val="18"/>
+        </w:rPr>
+        <w:t>#!/bin/bash</w:t>
+        <w:br/>
+        <w:t># Per-start setup for anything that lives on the container filesystem</w:t>
+        <w:br/>
+        <w:t># (lost on every restart): git credential helper, gh token, login shell,</w:t>
+        <w:br/>
+        <w:t># mise on PATH. Safe to run in the bootstrap initContainer and in workspace.</w:t>
+        <w:br/>
+        <w:t>set -uo pipefail</w:t>
+        <w:br/>
+        <w:t>DEV_USER=vscode</w:t>
+        <w:br/>
+        <w:t>DEV_HOME=/home/vscode</w:t>
+        <w:br/>
+        <w:t>SRC=/etc/devpod/github/token</w:t>
+        <w:br/>
+        <w:t>RUN_DIR=/run/devpod-github</w:t>
+        <w:br/>
+        <w:br/>
+        <w:t># Copy the token to a vscode-readable file outside the home PVC.</w:t>
+        <w:br/>
+        <w:t>if [ -s "$SRC" ]; then</w:t>
+        <w:br/>
+        <w:t xml:space="preserve">  mkdir -p "$RUN_DIR"</w:t>
+        <w:br/>
+        <w:t xml:space="preserve">  install -m 0400 -o 1000 -g 1000 "$SRC" "$RUN_DIR/token"</w:t>
+        <w:br/>
+        <w:t xml:space="preserve">  chmod 0500 "$RUN_DIR"; chown 1000:1000 "$RUN_DIR"</w:t>
+        <w:br/>
+        <w:t xml:space="preserve">  echo "devpod-runtime: GitHub token present"</w:t>
+        <w:br/>
+        <w:t>else</w:t>
+        <w:br/>
+        <w:t xml:space="preserve">  echo "devpod-runtime: no GitHub token mounted; private repos will not clone"</w:t>
+        <w:br/>
+        <w:t>fi</w:t>
+        <w:br/>
+        <w:br/>
+        <w:t># SSH authorized_keys for vscode, from the repo (bootstrap/authorized_keys in</w:t>
+        <w:br/>
+        <w:t># ConfigMap devpod-bootstrap). Overwritten on every start so Git is the source</w:t>
+        <w:br/>
+        <w:t># of truth: removing a key in Git revokes it. Skipped (existing file kept) if</w:t>
+        <w:br/>
+        <w:t># the ConfigMap copy has no key lines, so a bad edit can't lock everyone out.</w:t>
+        <w:br/>
+        <w:t>AK_SRC=/opt/devpod-bootstrap/authorized_keys</w:t>
+        <w:br/>
+        <w:t>AK_DIR="$DEV_HOME/.ssh"</w:t>
+        <w:br/>
+        <w:t>if [ -f "$AK_SRC" ] &amp;&amp; grep -qE '^(ssh-|ecdsa-|sk-)' "$AK_SRC"; then</w:t>
+        <w:br/>
+        <w:t xml:space="preserve">  install -d -m 0700 -o 1000 -g 1000 "$AK_DIR"</w:t>
+        <w:br/>
+        <w:t xml:space="preserve">  install -m 0600 -o 1000 -g 1000 "$AK_SRC" "$AK_DIR/authorized_keys.new"</w:t>
+        <w:br/>
+        <w:t xml:space="preserve">  mv -f "$AK_DIR/authorized_keys.new" "$AK_DIR/authorized_keys"</w:t>
+        <w:br/>
+        <w:t xml:space="preserve">  echo "devpod-runtime: authorized_keys written from repo ($(grep -cE '^(ssh-|ecdsa-|sk-)' "$AK_SRC") keys)"</w:t>
+        <w:br/>
+        <w:t>else</w:t>
+        <w:br/>
+        <w:t xml:space="preserve">  echo "devpod-runtime: no keys in $AK_SRC; leaving existing authorized_keys"</w:t>
+        <w:br/>
+        <w:t>fi</w:t>
+        <w:br/>
+        <w:br/>
+        <w:t># Persistent SSH host keys (Secret devpod/devpod-ssh-host-keys, mounted only</w:t>
+        <w:br/>
+        <w:t># in workspace). Copy before sshd is installed/started so the fingerprint is</w:t>
+        <w:br/>
+        <w:t># the same on every restart and every replica. Without the Secret the</w:t>
+        <w:br/>
+        <w:t># workspace command falls back to ssh-keygen -A (keys change on restart).</w:t>
+        <w:br/>
+        <w:t>HK_SRC=/etc/devpod/ssh-host-keys</w:t>
+        <w:br/>
+        <w:t>if ls "$HK_SRC"/ssh_host_*_key &gt;/dev/null 2&gt;&amp;1; then</w:t>
+        <w:br/>
+        <w:t xml:space="preserve">  mkdir -p /etc/ssh</w:t>
+        <w:br/>
+        <w:t xml:space="preserve">  for k in "$HK_SRC"/ssh_host_*_key; do</w:t>
+        <w:br/>
+        <w:t xml:space="preserve">    n=$(basename "$k")</w:t>
+        <w:br/>
+        <w:t xml:space="preserve">    install -m 0600 -o 0 -g 0 "$k" "/etc/ssh/$n"</w:t>
+        <w:br/>
+        <w:t xml:space="preserve">    [ -s "$k.pub" ] &amp;&amp; install -m 0644 -o 0 -g 0 "$k.pub" "/etc/ssh/$n.pub"</w:t>
+        <w:br/>
+        <w:t xml:space="preserve">  done</w:t>
+        <w:br/>
+        <w:t xml:space="preserve">  echo "devpod-runtime: persistent SSH host keys installed"</w:t>
+        <w:br/>
+        <w:t>else</w:t>
+        <w:br/>
+        <w:t xml:space="preserve">  echo "devpod-runtime: no SSH host key Secret; sshd will generate throwaway keys"</w:t>
+        <w:br/>
+        <w:t>fi</w:t>
+        <w:br/>
+        <w:br/>
+        <w:t># SOPS age private key (Secret devpod/sops-age, mounted only in workspace).</w:t>
+        <w:br/>
+        <w:t># Copy to the container fs for vscode; ~/.config/sops/age/keys.txt (sops'</w:t>
+        <w:br/>
+        <w:t># default path) is only a symlink, so the key never lands on the home PVC.</w:t>
+        <w:br/>
+        <w:t>AGE_SRC=/etc/sops-age/age.agekey</w:t>
+        <w:br/>
+        <w:t>AGE_DIR=/run/devpod-sops</w:t>
+        <w:br/>
+        <w:t>if [ -s "$AGE_SRC" ]; then</w:t>
+        <w:br/>
+        <w:t xml:space="preserve">  mkdir -p "$AGE_DIR"</w:t>
+        <w:br/>
+        <w:t xml:space="preserve">  install -m 0400 -o 1000 -g 1000 "$AGE_SRC" "$AGE_DIR/keys.txt"</w:t>
+        <w:br/>
+        <w:t xml:space="preserve">  chmod 0500 "$AGE_DIR"; chown 1000:1000 "$AGE_DIR"</w:t>
+        <w:br/>
+        <w:t xml:space="preserve">  install -d -m 0700 -o 1000 -g 1000 "$DEV_HOME/.config/sops" "$DEV_HOME/.config/sops/age"</w:t>
+        <w:br/>
+        <w:t xml:space="preserve">  if [ ! -e "$DEV_HOME/.config/sops/age/keys.txt" ] || [ -L "$DEV_HOME/.config/sops/age/keys.txt" ]; then</w:t>
+        <w:br/>
+        <w:t xml:space="preserve">    ln -sfn "$AGE_DIR/keys.txt" "$DEV_HOME/.config/sops/age/keys.txt"</w:t>
+        <w:br/>
+        <w:t xml:space="preserve">    chown -h 1000:1000 "$DEV_HOME/.config/sops/age/keys.txt"</w:t>
+        <w:br/>
+        <w:t xml:space="preserve">  fi</w:t>
+        <w:br/>
+        <w:t xml:space="preserve">  cat &gt; /etc/profile.d/devpod-sops.sh &lt;&lt;'PROF'</w:t>
+        <w:br/>
+        <w:t>if [ -r /run/devpod-sops/keys.txt ]; then SOPS_AGE_KEY_FILE=/run/devpod-sops/keys.txt; export SOPS_AGE_KEY_FILE; fi</w:t>
+        <w:br/>
+        <w:t>PROF</w:t>
+        <w:br/>
+        <w:t xml:space="preserve">  echo "devpod-runtime: SOPS age key present"</w:t>
+        <w:br/>
+        <w:t>else</w:t>
+        <w:br/>
+        <w:t xml:space="preserve">  echo "devpod-runtime: no SOPS age key mounted; sops -d will not work"</w:t>
+        <w:br/>
+        <w:t>fi</w:t>
+        <w:br/>
+        <w:br/>
+        <w:t># System git config: helper for github.com over HTTPS, never prompt.</w:t>
+        <w:br/>
+        <w:t>git config --system credential.https://github.com.helper /opt/devpod-bootstrap/git-credential-devpod</w:t>
+        <w:br/>
+        <w:t>git config --system credential.https://github.com.username x-access-token</w:t>
+        <w:br/>
+        <w:t>git config --system credential.https://github.com.useHttpPath false</w:t>
+        <w:br/>
+        <w:t># Rewrite SSH-style GitHub URLs (git@github.com:, ssh://git@github.com/,</w:t>
+        <w:br/>
+        <w:t># bare github.com:) to HTTPS so the token helper above is used; the pod has</w:t>
+        <w:br/>
+        <w:t># no SSH key on GitHub. Reset and re-add so reruns stay idempotent.</w:t>
+        <w:br/>
+        <w:t>git config --system --unset-all url.https://github.com/.insteadOf 2&gt;/dev/null || true</w:t>
+        <w:br/>
+        <w:t>for pfx in git@github.com: ssh://git@github.com/ github.com:; do</w:t>
+        <w:br/>
+        <w:t xml:space="preserve">  git config --system --add url.https://github.com/.insteadOf "$pfx" || echo "devpod-runtime: insteadOf $pfx failed"</w:t>
+        <w:br/>
+        <w:t>done</w:t>
+        <w:br/>
+        <w:br/>
+        <w:t># gh (if installed) reads GH_TOKEN in login shells.</w:t>
+        <w:br/>
+        <w:t>cat &gt; /etc/profile.d/devpod-github.sh &lt;&lt;'PROF'</w:t>
+        <w:br/>
+        <w:t>if [ -r /run/devpod-github/token ]; then GH_TOKEN="$(cat /run/devpod-github/token)"; export GH_TOKEN; fi</w:t>
+        <w:br/>
+        <w:t>PROF</w:t>
+        <w:br/>
+        <w:t># mise for every login shell (root via kubectl exec, vscode via ssh).</w:t>
+        <w:br/>
+        <w:t>cat &gt; /etc/profile.d/devpod-mise.sh &lt;&lt;'PROF'</w:t>
+        <w:br/>
+        <w:t>case ":$PATH:" in *":/home/vscode/.local/bin:"*) ;; *) PATH="/home/vscode/.local/bin:$PATH";; esac</w:t>
+        <w:br/>
+        <w:t>export PATH</w:t>
+        <w:br/>
+        <w:t>PROF</w:t>
+        <w:br/>
+        <w:t>ln -sf "$DEV_HOME/.local/bin/mise" /usr/local/bin/mise 2&gt;/dev/null || true</w:t>
+        <w:br/>
+        <w:t># Homebrew (on the home PVC) for every login shell, including bash login</w:t>
+        <w:br/>
+        <w:t># shells that never reach the dotfiles' interactive .bashrc.</w:t>
+        <w:br/>
+        <w:t>cat &gt; /etc/profile.d/devpod-brew.sh &lt;&lt;'PROF'</w:t>
+        <w:br/>
+        <w:t>if [ -x /home/linuxbrew/.linuxbrew/bin/brew ]; then</w:t>
+        <w:br/>
+        <w:t xml:space="preserve">  case ":$PATH:" in *":/home/linuxbrew/.linuxbrew/bin:"*) ;; *) eval "$(/home/linuxbrew/.linuxbrew/bin/brew shellenv)";; esac</w:t>
+        <w:br/>
+        <w:t>fi</w:t>
+        <w:br/>
+        <w:t>PROF</w:t>
+        <w:br/>
+        <w:br/>
+        <w:t># SSH and "su -" sessions don't inherit the container env, so kubectl's</w:t>
+        <w:br/>
+        <w:t># in-cluster config (KUBERNETES_SERVICE_HOST/PORT + the mounted SA token)</w:t>
+        <w:br/>
+        <w:t># would fall back to localhost:8080. pam_env reads /etc/environment for</w:t>
+        <w:br/>
+        <w:t># sshd and su regardless of shell (zsh skips /etc/profile.d).</w:t>
+        <w:br/>
+        <w:t>sed -i '/^KUBERNETES_SERVICE_HOST=/d;/^KUBERNETES_SERVICE_PORT=/d;/^SOPS_AGE_KEY_FILE=/d' /etc/environment 2&gt;/dev/null || true</w:t>
+        <w:br/>
+        <w:t>if [ -n "${KUBERNETES_SERVICE_HOST:-}" ]; then</w:t>
+        <w:br/>
+        <w:t xml:space="preserve">  printf 'KUBERNETES_SERVICE_HOST=%s\nKUBERNETES_SERVICE_PORT=%s\n' "$KUBERNETES_SERVICE_HOST" "${KUBERNETES_SERVICE_PORT:-443}" &gt;&gt; /etc/environment</w:t>
+        <w:br/>
+        <w:t>fi</w:t>
+        <w:br/>
+        <w:t>if [ -r "${AGE_DIR}/keys.txt" ]; then</w:t>
+        <w:br/>
+        <w:t xml:space="preserve">  echo "SOPS_AGE_KEY_FILE=${AGE_DIR}/keys.txt" &gt;&gt; /etc/environment</w:t>
+        <w:br/>
+        <w:t>fi</w:t>
+        <w:br/>
+        <w:br/>
+        <w:t># The dotfiles setup runs "sudo chsh -s zsh $USER"; /etc/passwd is not</w:t>
+        <w:br/>
+        <w:t># on the PVC, so repeat it on every start.</w:t>
+        <w:br/>
+        <w:t>if command -v zsh &gt;/dev/null 2&gt;&amp;1; then</w:t>
+        <w:br/>
+        <w:t xml:space="preserve">  chsh -s "$(command -v zsh)" "$DEV_USER" || echo "devpod-runtime: chsh failed"</w:t>
+        <w:br/>
+        <w:t>fi</w:t>
+        <w:br/>
+        <w:t>exit 0</w:t>
+      </w:r>
+    </w:p>
+    <w:p>
+      <w:pPr>
+        <w:pStyle w:val="Heading1"/>
+      </w:pPr>
+      <w:r>
+        <w:t>S.6. File: apps/base/devpod/devpod-statefulset.yaml</w:t>
+      </w:r>
+    </w:p>
+    <w:p>
+      <w:r>
+        <w:t>Only change since section 6: spec.replicas 1 → 2 (1de0d06). Full file at 3d78804.</w:t>
+      </w:r>
+    </w:p>
+    <w:p>
+      <w:pPr>
+        <w:shd w:val="clear" w:color="auto" w:fill="D3DFEE"/>
+        <w:keepLines/>
+        <w:pBdr>
+          <w:left w:val="single" w:sz="24" w:space="6" w:color="4F81BD"/>
+        </w:pBdr>
+        <w:spacing w:before="40" w:after="180"/>
+        <w:ind w:left="115" w:right="86"/>
+      </w:pPr>
+      <w:r>
+        <w:rPr>
+          <w:b/>
+          <w:color w:val="173A53"/>
+        </w:rPr>
+        <w:t xml:space="preserve">Note  </w:t>
+      </w:r>
+      <w:r>
+        <w:t>Supersedes the copy of this file in section 6.</w:t>
+      </w:r>
+    </w:p>
+    <w:p>
+      <w:pPr>
+        <w:pStyle w:val="Heading3"/>
+      </w:pPr>
+      <w:r>
+        <w:t>Full file</w:t>
+      </w:r>
+    </w:p>
+    <w:p>
+      <w:pPr>
+        <w:spacing w:line="240" w:lineRule="auto" w:before="40" w:after="180"/>
+        <w:ind w:left="86" w:right="86"/>
+        <w:shd w:val="clear" w:color="auto" w:fill="F0F4F7"/>
+      </w:pPr>
+      <w:r>
+        <w:rPr>
+          <w:rFonts w:ascii="Courier New" w:hAnsi="Courier New" w:eastAsia="Courier New"/>
+          <w:sz w:val="18"/>
+        </w:rPr>
+        <w:t>apiVersion: apps/v1</w:t>
+        <w:br/>
+        <w:t>kind: StatefulSet</w:t>
+        <w:br/>
+        <w:t>metadata:</w:t>
+        <w:br/>
+        <w:t xml:space="preserve">  name: devpod</w:t>
+        <w:br/>
+        <w:t xml:space="preserve">  namespace: devpod</w:t>
+        <w:br/>
+        <w:t xml:space="preserve">  labels:</w:t>
+        <w:br/>
+        <w:t xml:space="preserve">    app.kubernetes.io/name: devpod</w:t>
+        <w:br/>
+        <w:t xml:space="preserve">    app.kubernetes.io/part-of: homelab-dev</w:t>
+        <w:br/>
+        <w:t>spec:</w:t>
+        <w:br/>
+        <w:t xml:space="preserve">  serviceName: devpod</w:t>
+        <w:br/>
+        <w:t xml:space="preserve">  replicas: 2</w:t>
+        <w:br/>
+        <w:t xml:space="preserve">  podManagementPolicy: Parallel</w:t>
+        <w:br/>
+        <w:t xml:space="preserve">  selector:</w:t>
+        <w:br/>
+        <w:t xml:space="preserve">    matchLabels:</w:t>
+        <w:br/>
+        <w:t xml:space="preserve">      app.kubernetes.io/name: devpod</w:t>
+        <w:br/>
+        <w:t xml:space="preserve">  template:</w:t>
+        <w:br/>
+        <w:t xml:space="preserve">    metadata:</w:t>
+        <w:br/>
+        <w:t xml:space="preserve">      labels:</w:t>
+        <w:br/>
+        <w:t xml:space="preserve">        app.kubernetes.io/name: devpod</w:t>
+        <w:br/>
+        <w:t xml:space="preserve">        app.kubernetes.io/part-of: homelab-dev</w:t>
+        <w:br/>
+        <w:t xml:space="preserve">    spec:</w:t>
+        <w:br/>
+        <w:t xml:space="preserve">      # cluster-admin via clusterrolebinding-devpod-admin.yaml; kubectl uses</w:t>
+        <w:br/>
+        <w:t xml:space="preserve">      # the mounted token (in-cluster config), no kubeconfig needed.</w:t>
+        <w:br/>
+        <w:t xml:space="preserve">      serviceAccountName: devpod</w:t>
+        <w:br/>
+        <w:t xml:space="preserve">      automountServiceAccountToken: true</w:t>
+        <w:br/>
+        <w:t xml:space="preserve">      # Containers run as root, so the projected SA token would be root-only</w:t>
+        <w:br/>
+        <w:t xml:space="preserve">      # (0600). fsGroup 1000 makes it group-readable for vscode (kubectl over</w:t>
+        <w:br/>
+        <w:t xml:space="preserve">      # SSH). OnRootMismatch: the Longhorn home root is already 1000:1000, so</w:t>
+        <w:br/>
+        <w:t xml:space="preserve">      # no recursive chown; the RWX SMB scratch is skipped by its CSI policy.</w:t>
+        <w:br/>
+        <w:t xml:space="preserve">      securityContext:</w:t>
+        <w:br/>
+        <w:t xml:space="preserve">        fsGroup: 1000</w:t>
+        <w:br/>
+        <w:t xml:space="preserve">        fsGroupChangePolicy: OnRootMismatch</w:t>
+        <w:br/>
+        <w:t xml:space="preserve">      affinity:</w:t>
+        <w:br/>
+        <w:t xml:space="preserve">        nodeAffinity:</w:t>
+        <w:br/>
+        <w:t xml:space="preserve">          requiredDuringSchedulingIgnoredDuringExecution:</w:t>
+        <w:br/>
+        <w:t xml:space="preserve">            nodeSelectorTerms:</w:t>
+        <w:br/>
+        <w:t xml:space="preserve">              - matchExpressions:</w:t>
+        <w:br/>
+        <w:t xml:space="preserve">                  - key: kubernetes.io/hostname</w:t>
+        <w:br/>
+        <w:t xml:space="preserve">                    operator: In</w:t>
+        <w:br/>
+        <w:t xml:space="preserve">                    values: [skynet-wrk-01, skynet-wrk-02, skynet-wrk-03]</w:t>
+        <w:br/>
+        <w:t xml:space="preserve">      initContainers:</w:t>
+        <w:br/>
+        <w:t xml:space="preserve">        - name: home-perms</w:t>
+        <w:br/>
+        <w:t xml:space="preserve">          image: mcr.microsoft.com/devcontainers/base:debian</w:t>
+        <w:br/>
+        <w:t xml:space="preserve">          imagePullPolicy: IfNotPresent</w:t>
+        <w:br/>
+        <w:t xml:space="preserve">          command:</w:t>
+        <w:br/>
+        <w:t xml:space="preserve">            - sh</w:t>
+        <w:br/>
+        <w:t xml:space="preserve">            - -c</w:t>
+        <w:br/>
+        <w:t xml:space="preserve">            - |</w:t>
+        <w:br/>
+        <w:t xml:space="preserve">              mkdir -p /home/vscode</w:t>
+        <w:br/>
+        <w:t xml:space="preserve">              if [ ! -f /home/vscode/.profile ]; then</w:t>
+        <w:br/>
+        <w:t xml:space="preserve">                cp -a /etc/skel/. /home/vscode/ 2&gt;/dev/null || true</w:t>
+        <w:br/>
+        <w:t xml:space="preserve">              fi</w:t>
+        <w:br/>
+        <w:t xml:space="preserve">              chown -R 1000:1000 /home/vscode</w:t>
+        <w:br/>
+        <w:t xml:space="preserve">          securityContext:</w:t>
+        <w:br/>
+        <w:t xml:space="preserve">            runAsUser: 0</w:t>
+        <w:br/>
+        <w:t xml:space="preserve">          volumeMounts:</w:t>
+        <w:br/>
+        <w:t xml:space="preserve">            - name: home</w:t>
+        <w:br/>
+        <w:t xml:space="preserve">              mountPath: /home/vscode</w:t>
+        <w:br/>
+        <w:t xml:space="preserve">        # Base environment: GitHub auth, Invertedlight/dotfiles setup,</w:t>
+        <w:br/>
+        <w:t xml:space="preserve">        # mise + tools. Full run only when ~/.devpod-bootstrap-done is</w:t>
+        <w:br/>
+        <w:t xml:space="preserve">        # missing (new home volume); otherwise skips. Always exits 0;</w:t>
+        <w:br/>
+        <w:t xml:space="preserve">        # result in ~/.devpod-bootstrap.status and ~/.devpod-bootstrap.log.</w:t>
+        <w:br/>
+        <w:t xml:space="preserve">        - name: bootstrap</w:t>
+        <w:br/>
+        <w:t xml:space="preserve">          image: mcr.microsoft.com/devcontainers/base:debian</w:t>
+        <w:br/>
+        <w:t xml:space="preserve">          imagePullPolicy: IfNotPresent</w:t>
+        <w:br/>
+        <w:t xml:space="preserve">          command: ["/bin/bash", "/opt/devpod-bootstrap/bootstrap.sh"]</w:t>
+        <w:br/>
+        <w:t xml:space="preserve">          securityContext:</w:t>
+        <w:br/>
+        <w:t xml:space="preserve">            runAsUser: 0</w:t>
+        <w:br/>
+        <w:t xml:space="preserve">          resources:</w:t>
+        <w:br/>
+        <w:t xml:space="preserve">            requests:</w:t>
+        <w:br/>
+        <w:t xml:space="preserve">              cpu: 250m</w:t>
+        <w:br/>
+        <w:t xml:space="preserve">              memory: 512Mi</w:t>
+        <w:br/>
+        <w:t xml:space="preserve">            limits:</w:t>
+        <w:br/>
+        <w:t xml:space="preserve">              cpu: "2"</w:t>
+        <w:br/>
+        <w:t xml:space="preserve">              memory: 4Gi</w:t>
+        <w:br/>
+        <w:t xml:space="preserve">          volumeMounts:</w:t>
+        <w:br/>
+        <w:t xml:space="preserve">            - name: home</w:t>
+        <w:br/>
+        <w:t xml:space="preserve">              mountPath: /home/vscode</w:t>
+        <w:br/>
+        <w:t xml:space="preserve">            - name: bootstrap</w:t>
+        <w:br/>
+        <w:t xml:space="preserve">              mountPath: /opt/devpod-bootstrap</w:t>
+        <w:br/>
+        <w:t xml:space="preserve">              readOnly: true</w:t>
+        <w:br/>
+        <w:t xml:space="preserve">            - name: github-credentials</w:t>
+        <w:br/>
+        <w:t xml:space="preserve">              mountPath: /etc/devpod/github</w:t>
+        <w:br/>
+        <w:t xml:space="preserve">              readOnly: true</w:t>
+        <w:br/>
+        <w:t xml:space="preserve">      containers:</w:t>
+        <w:br/>
+        <w:t xml:space="preserve">        - name: workspace</w:t>
+        <w:br/>
+        <w:t xml:space="preserve">          image: mcr.microsoft.com/devcontainers/base:debian</w:t>
+        <w:br/>
+        <w:t xml:space="preserve">          imagePullPolicy: IfNotPresent</w:t>
+        <w:br/>
+        <w:t xml:space="preserve">          # base:debian has no ssh-init.sh. Install openssh as root, listen</w:t>
+        <w:br/>
+        <w:t xml:space="preserve">          # on 2222, then stay up. A man-db trigger must not fail the pod.</w:t>
+        <w:br/>
+        <w:t xml:space="preserve">          command: ["/bin/bash", "-lc"]</w:t>
+        <w:br/>
+        <w:t xml:space="preserve">          args:</w:t>
+        <w:br/>
+        <w:t xml:space="preserve">            - |</w:t>
+        <w:br/>
+        <w:t xml:space="preserve">              set -uo pipefail</w:t>
+        <w:br/>
+        <w:t xml:space="preserve">              # git credential helper, GH_TOKEN, zsh login shell, mise PATH.</w:t>
+        <w:br/>
+        <w:t xml:space="preserve">              /opt/devpod-bootstrap/devpod-runtime.sh || echo "devpod-runtime failed"</w:t>
+        <w:br/>
+        <w:t xml:space="preserve">              if ! command -v sshd &gt;/dev/null 2&gt;&amp;1; then</w:t>
+        <w:br/>
+        <w:t xml:space="preserve">                mkdir -p /etc/dpkg/dpkg.cfg.d</w:t>
+        <w:br/>
+        <w:t xml:space="preserve">                printf 'path-exclude=/usr/share/man/*\npath-exclude=/usr/share/doc/*\n' &gt; /etc/dpkg/dpkg.cfg.d/01-nodoc</w:t>
+        <w:br/>
+        <w:t xml:space="preserve">                rm -f /var/lib/man-db/auto-update</w:t>
+        <w:br/>
+        <w:t xml:space="preserve">                apt-get update</w:t>
+        <w:br/>
+        <w:t xml:space="preserve">                DEBIAN_FRONTEND=noninteractive apt-get install -y --no-install-recommends openssh-server file || true</w:t>
+        <w:br/>
+        <w:t xml:space="preserve">              fi</w:t>
+        <w:br/>
+        <w:t xml:space="preserve">              mkdir -p /var/run/sshd /home/vscode/.ssh</w:t>
+        <w:br/>
+        <w:t xml:space="preserve">              # Host keys come from Secret devpod-ssh-host-keys (copied by</w:t>
+        <w:br/>
+        <w:t xml:space="preserve">              # devpod-runtime.sh). Generate throwaway keys only if absent.</w:t>
+        <w:br/>
+        <w:t xml:space="preserve">              if ! ls /etc/ssh/ssh_host_*_key &gt;/dev/null 2&gt;&amp;1; then</w:t>
+        <w:br/>
+        <w:t xml:space="preserve">                echo "no persistent host keys; generating (will change on restart)"</w:t>
+        <w:br/>
+        <w:t xml:space="preserve">                ssh-keygen -A || true</w:t>
+        <w:br/>
+        <w:t xml:space="preserve">              fi</w:t>
+        <w:br/>
+        <w:t xml:space="preserve">              if [ -f /etc/ssh/sshd_config ]; then</w:t>
+        <w:br/>
+        <w:t xml:space="preserve">                sed -i 's/^#\?Port .*/Port 2222/' /etc/ssh/sshd_config</w:t>
+        <w:br/>
+        <w:t xml:space="preserve">                grep -q '^Port 2222' /etc/ssh/sshd_config || echo 'Port 2222' &gt;&gt; /etc/ssh/sshd_config</w:t>
+        <w:br/>
+        <w:t xml:space="preserve">                sed -i 's/^#\?PasswordAuthentication.*/PasswordAuthentication no/' /etc/ssh/sshd_config</w:t>
+        <w:br/>
+        <w:t xml:space="preserve">                sed -i 's/^#\?PermitRootLogin.*/PermitRootLogin no/' /etc/ssh/sshd_config</w:t>
+        <w:br/>
+        <w:t xml:space="preserve">              fi</w:t>
+        <w:br/>
+        <w:t xml:space="preserve">              chown -R vscode:vscode /home/vscode/.ssh || true</w:t>
+        <w:br/>
+        <w:t xml:space="preserve">              chmod 700 /home/vscode/.ssh || true</w:t>
+        <w:br/>
+        <w:t xml:space="preserve">              if [ -x /usr/sbin/sshd ]; then</w:t>
+        <w:br/>
+        <w:t xml:space="preserve">                /usr/sbin/sshd || echo "sshd failed to start"</w:t>
+        <w:br/>
+        <w:t xml:space="preserve">              else</w:t>
+        <w:br/>
+        <w:t xml:space="preserve">                echo "sshd binary missing after install"</w:t>
+        <w:br/>
+        <w:t xml:space="preserve">              fi</w:t>
+        <w:br/>
+        <w:t xml:space="preserve">              # Homebrew on the home PVC (/home/linuxbrew); installs as</w:t>
+        <w:br/>
+        <w:t xml:space="preserve">              # vscode only when missing. Background so sshd is not delayed.</w:t>
+        <w:br/>
+        <w:t xml:space="preserve">              /opt/devpod-bootstrap/devpod-brew.sh &amp;</w:t>
+        <w:br/>
+        <w:t xml:space="preserve">              exec sleep infinity</w:t>
+        <w:br/>
+        <w:t xml:space="preserve">          securityContext:</w:t>
+        <w:br/>
+        <w:t xml:space="preserve">            runAsUser: 0</w:t>
+        <w:br/>
+        <w:t xml:space="preserve">          ports:</w:t>
+        <w:br/>
+        <w:t xml:space="preserve">            - name: ssh</w:t>
+        <w:br/>
+        <w:t xml:space="preserve">              containerPort: 2222</w:t>
+        <w:br/>
+        <w:t xml:space="preserve">          resources:</w:t>
+        <w:br/>
+        <w:t xml:space="preserve">            requests:</w:t>
+        <w:br/>
+        <w:t xml:space="preserve">              cpu: 250m</w:t>
+        <w:br/>
+        <w:t xml:space="preserve">              memory: 512Mi</w:t>
+        <w:br/>
+        <w:t xml:space="preserve">            limits:</w:t>
+        <w:br/>
+        <w:t xml:space="preserve">              cpu: "2"</w:t>
+        <w:br/>
+        <w:t xml:space="preserve">              memory: 4Gi</w:t>
+        <w:br/>
+        <w:t xml:space="preserve">          volumeMounts:</w:t>
+        <w:br/>
+        <w:t xml:space="preserve">            - name: home</w:t>
+        <w:br/>
+        <w:t xml:space="preserve">              mountPath: /home/vscode</w:t>
+        <w:br/>
+        <w:t xml:space="preserve">            # Homebrew prefix on the same PVC so it survives restarts.</w:t>
+        <w:br/>
+        <w:t xml:space="preserve">            - name: home</w:t>
+        <w:br/>
+        <w:t xml:space="preserve">              mountPath: /home/linuxbrew</w:t>
+        <w:br/>
+        <w:t xml:space="preserve">              subPath: .linuxbrew-root</w:t>
+        <w:br/>
+        <w:t xml:space="preserve">            - name: scratch</w:t>
+        <w:br/>
+        <w:t xml:space="preserve">              mountPath: /scratch</w:t>
+        <w:br/>
+        <w:t xml:space="preserve">            - name: bootstrap</w:t>
+        <w:br/>
+        <w:t xml:space="preserve">              mountPath: /opt/devpod-bootstrap</w:t>
+        <w:br/>
+        <w:t xml:space="preserve">              readOnly: true</w:t>
+        <w:br/>
+        <w:t xml:space="preserve">            - name: github-credentials</w:t>
+        <w:br/>
+        <w:t xml:space="preserve">              mountPath: /etc/devpod/github</w:t>
+        <w:br/>
+        <w:t xml:space="preserve">              readOnly: true</w:t>
+        <w:br/>
+        <w:t xml:space="preserve">            # SOPS age private key (Secret devpod/sops-age, created by</w:t>
+        <w:br/>
+        <w:t xml:space="preserve">            # kubectl out of band, not in Git). See README.</w:t>
+        <w:br/>
+        <w:t xml:space="preserve">            - name: sops-age</w:t>
+        <w:br/>
+        <w:t xml:space="preserve">              mountPath: /etc/sops-age</w:t>
+        <w:br/>
+        <w:t xml:space="preserve">              readOnly: true</w:t>
+        <w:br/>
+        <w:t xml:space="preserve">            # SSH host keys (Secret devpod/devpod-ssh-host-keys, created by</w:t>
+        <w:br/>
+        <w:t xml:space="preserve">            # kubectl out of band, not in Git). Shared by all replicas.</w:t>
+        <w:br/>
+        <w:t xml:space="preserve">            - name: ssh-host-keys</w:t>
+        <w:br/>
+        <w:t xml:space="preserve">              mountPath: /etc/devpod/ssh-host-keys</w:t>
+        <w:br/>
+        <w:t xml:space="preserve">              readOnly: true</w:t>
+        <w:br/>
+        <w:t xml:space="preserve">      volumes:</w:t>
+        <w:br/>
+        <w:t xml:space="preserve">        - name: scratch</w:t>
+        <w:br/>
+        <w:t xml:space="preserve">          persistentVolumeClaim:</w:t>
+        <w:br/>
+        <w:t xml:space="preserve">            claimName: devpod-scratch</w:t>
+        <w:br/>
+        <w:t xml:space="preserve">        - name: bootstrap</w:t>
+        <w:br/>
+        <w:t xml:space="preserve">          configMap:</w:t>
+        <w:br/>
+        <w:t xml:space="preserve">            name: devpod-bootstrap</w:t>
+        <w:br/>
+        <w:t xml:space="preserve">            defaultMode: 0755</w:t>
+        <w:br/>
+        <w:t xml:space="preserve">        # SOPS secret from apps/staging/devpod/github-credentials.yaml.</w:t>
+        <w:br/>
+        <w:t xml:space="preserve">        # Root-only on disk; devpod-runtime.sh copies the token to</w:t>
+        <w:br/>
+        <w:t xml:space="preserve">        # /run/devpod-github (container fs, not the PVC) for vscode.</w:t>
+        <w:br/>
+        <w:t xml:space="preserve">        - name: github-credentials</w:t>
+        <w:br/>
+        <w:t xml:space="preserve">          secret:</w:t>
+        <w:br/>
+        <w:t xml:space="preserve">            secretName: github-credentials</w:t>
+        <w:br/>
+        <w:t xml:space="preserve">            optional: true</w:t>
+        <w:br/>
+        <w:t xml:space="preserve">            defaultMode: 0400</w:t>
+        <w:br/>
+        <w:t xml:space="preserve">        # Copy of flux-system/sops-age (key age.agekey), made with kubectl;</w:t>
+        <w:br/>
+        <w:t xml:space="preserve">        # NOT in Git. Root-only on disk; devpod-runtime.sh copies it to</w:t>
+        <w:br/>
+        <w:t xml:space="preserve">        # /run/devpod-sops/keys.txt (container fs, not the PVC) for vscode.</w:t>
+        <w:br/>
+        <w:t xml:space="preserve">        # optional so the pod still starts if the Secret is missing.</w:t>
+        <w:br/>
+        <w:t xml:space="preserve">        - name: sops-age</w:t>
+        <w:br/>
+        <w:t xml:space="preserve">          secret:</w:t>
+        <w:br/>
+        <w:t xml:space="preserve">            secretName: sops-age</w:t>
+        <w:br/>
+        <w:t xml:space="preserve">            optional: true</w:t>
+        <w:br/>
+        <w:t xml:space="preserve">            defaultMode: 0400</w:t>
+        <w:br/>
+        <w:t xml:space="preserve">        # Persistent sshd host keys so the fingerprint survives restarts.</w:t>
+        <w:br/>
+        <w:t xml:space="preserve">        # NOT in Git; see README. devpod-runtime.sh copies them to /etc/ssh.</w:t>
+        <w:br/>
+        <w:t xml:space="preserve">        - name: ssh-host-keys</w:t>
+        <w:br/>
+        <w:t xml:space="preserve">          secret:</w:t>
+        <w:br/>
+        <w:t xml:space="preserve">            secretName: devpod-ssh-host-keys</w:t>
+        <w:br/>
+        <w:t xml:space="preserve">            optional: true</w:t>
+        <w:br/>
+        <w:t xml:space="preserve">            defaultMode: 0400</w:t>
+        <w:br/>
+        <w:t xml:space="preserve">  volumeClaimTemplates:</w:t>
+        <w:br/>
+        <w:t xml:space="preserve">    - metadata:</w:t>
+        <w:br/>
+        <w:t xml:space="preserve">        name: home</w:t>
+        <w:br/>
+        <w:t xml:space="preserve">        labels:</w:t>
+        <w:br/>
+        <w:t xml:space="preserve">          app.kubernetes.io/name: devpod</w:t>
+        <w:br/>
+        <w:t xml:space="preserve">          app.kubernetes.io/part-of: homelab-dev</w:t>
+        <w:br/>
+        <w:t xml:space="preserve">      spec:</w:t>
+        <w:br/>
+        <w:t xml:space="preserve">        accessModes:</w:t>
+        <w:br/>
+        <w:t xml:space="preserve">          - ReadWriteOnce</w:t>
+        <w:br/>
+        <w:t xml:space="preserve">        storageClassName: longhorn</w:t>
+        <w:br/>
+        <w:t xml:space="preserve">        resources:</w:t>
+        <w:br/>
+        <w:t xml:space="preserve">          requests:</w:t>
+        <w:br/>
+        <w:t xml:space="preserve">            storage: 20Gi</w:t>
+      </w:r>
+    </w:p>
+    <w:p>
+      <w:pPr>
+        <w:pStyle w:val="Heading1"/>
+      </w:pPr>
+      <w:r>
+        <w:t>S.7. File: apps/base/devpod/README.md (excerpt: SSH authorized_keys)</w:t>
+      </w:r>
+    </w:p>
+    <w:p>
+      <w:r>
+        <w:t>New README section: how to add or remove a Mac key.</w:t>
+      </w:r>
+    </w:p>
+    <w:p>
+      <w:pPr>
+        <w:pStyle w:val="Heading3"/>
+      </w:pPr>
+      <w:r>
+        <w:t>Excerpt</w:t>
+      </w:r>
+    </w:p>
+    <w:p>
+      <w:pPr>
+        <w:keepLines/>
+        <w:spacing w:line="240" w:lineRule="auto" w:before="40" w:after="180"/>
+        <w:ind w:left="86" w:right="86"/>
+        <w:shd w:val="clear" w:color="auto" w:fill="F0F4F7"/>
+      </w:pPr>
+      <w:r>
+        <w:rPr>
+          <w:rFonts w:ascii="Courier New" w:hAnsi="Courier New" w:eastAsia="Courier New"/>
+          <w:sz w:val="18"/>
+        </w:rPr>
+        <w:t>### SSH authorized_keys (repo-managed, all replicas)</w:t>
+        <w:br/>
+        <w:br/>
+        <w:t>`bootstrap/authorized_keys` lists the public keys allowed to log in as `vscode`. It ships in ConfigMap `devpod-bootstrap-&lt;hash&gt;`, and on every start `devpod-runtime.sh` overwrites `/home/vscode/.ssh/authorized_keys` on each replica's home volume from it (`~/.ssh` 0700, file 0600, `vscode:vscode`). Git is the source of truth: keys added by hand inside a pod are lost on the next restart. If the file has no key lines the pod keeps its existing `authorized_keys` (lockout guard).</w:t>
+        <w:br/>
+        <w:br/>
+        <w:t>- **Add a Mac:** on that Mac run `cat ~/.ssh/id_ed25519.pub` and `ssh-keygen -lf ~/.ssh/id_ed25519.pub`, append the public line (plus a `# &lt;Mac&gt; (SHA256:…)` comment) to `bootstrap/authorized_keys`, commit and push. The ConfigMap hash changes, so Flux rolls every replica within about a minute. **Public keys only; never commit a private key.**</w:t>
+        <w:br/>
+        <w:t>- **Remove a Mac:** delete its line, commit and push. After the rollout that key is revoked on every replica.</w:t>
+        <w:br/>
+        <w:t>- **Check:** `kubectl -n devpod exec devpod-N -c workspace -- ssh-keygen -lf /home/vscode/.ssh/authorized_keys`.</w:t>
+      </w:r>
+    </w:p>
+    <w:p>
+      <w:pPr>
+        <w:pStyle w:val="Heading1"/>
+      </w:pPr>
+      <w:r>
+        <w:t>S.8 Verification (3 Oct 2026, 15:20-15:30 CT)</w:t>
+      </w:r>
+    </w:p>
+    <w:tbl>
+      <w:tblPr>
+        <w:tblStyle w:val="LightShading-Accent1"/>
+        <w:tblW w:type="auto" w:w="0"/>
+        <w:tblLayout w:type="fixed"/>
+        <w:tblLook w:firstColumn="1" w:firstRow="1" w:lastColumn="0" w:lastRow="0" w:noHBand="0" w:noVBand="1" w:val="04A0"/>
+        <w:tblBorders>
+          <w:top w:val="single" w:sz="8" w:space="0" w:color="4F81BD"/>
+          <w:left w:val="nil"/>
+          <w:bottom w:val="single" w:sz="8" w:space="0" w:color="4F81BD"/>
+          <w:right w:val="nil"/>
+          <w:insideH w:val="nil"/>
+          <w:insideV w:val="nil"/>
+        </w:tblBorders>
+      </w:tblPr>
+      <w:tblGrid>
+        <w:gridCol w:w="4032"/>
+        <w:gridCol w:w="6048"/>
+      </w:tblGrid>
+      <w:tr>
+        <w:trPr>
+          <w:cantSplit/>
+          <w:tblHeader w:val="true"/>
+        </w:trPr>
+        <w:tc>
+          <w:tcPr>
+            <w:tcW w:type="dxa" w:w="4032"/>
+            <w:tcBorders>
+              <w:top w:val="single" w:sz="8" w:space="0" w:color="4F81BD"/>
+              <w:bottom w:val="single" w:sz="8" w:space="0" w:color="4F81BD"/>
+            </w:tcBorders>
+            <w:shd w:val="clear" w:color="auto" w:fill="365F91"/>
+          </w:tcPr>
+          <w:p>
+            <w:pPr>
+              <w:keepNext/>
+              <w:spacing w:before="40" w:after="40" w:line="240" w:lineRule="auto"/>
+            </w:pPr>
+            <w:r/>
+            <w:r>
+              <w:rPr>
+                <w:b/>
+                <w:color w:val="FFFFFF"/>
+                <w:sz w:val="20"/>
+              </w:rPr>
+              <w:t>Check</w:t>
+            </w:r>
+          </w:p>
+        </w:tc>
+        <w:tc>
+          <w:tcPr>
+            <w:tcW w:type="dxa" w:w="6048"/>
+            <w:tcBorders>
+              <w:top w:val="single" w:sz="8" w:space="0" w:color="4F81BD"/>
+              <w:bottom w:val="single" w:sz="8" w:space="0" w:color="4F81BD"/>
+            </w:tcBorders>
+            <w:shd w:val="clear" w:color="auto" w:fill="365F91"/>
+          </w:tcPr>
+          <w:p>
+            <w:pPr>
+              <w:keepNext/>
+              <w:spacing w:before="40" w:after="40" w:line="240" w:lineRule="auto"/>
+            </w:pPr>
+            <w:r/>
+            <w:r>
+              <w:rPr>
+                <w:b/>
+                <w:color w:val="FFFFFF"/>
+                <w:sz w:val="20"/>
+              </w:rPr>
+              <w:t>Result</w:t>
+            </w:r>
+          </w:p>
+        </w:tc>
+      </w:tr>
+      <w:tr>
+        <w:trPr>
+          <w:cantSplit/>
+        </w:trPr>
+        <w:tc>
+          <w:tcPr>
+            <w:tcW w:type="dxa" w:w="4032"/>
+            <w:shd w:val="clear" w:color="auto" w:fill="D3DFEE"/>
+          </w:tcPr>
+          <w:p>
+            <w:pPr>
+              <w:spacing w:before="40" w:after="40" w:line="240" w:lineRule="auto"/>
+            </w:pPr>
+            <w:r/>
+            <w:r>
+              <w:rPr>
+                <w:b/>
+                <w:color w:val="365F91"/>
+                <w:sz w:val="20"/>
+              </w:rPr>
+              <w:t>Key lines in Git vs devpod-0 before push</w:t>
+            </w:r>
+          </w:p>
+        </w:tc>
+        <w:tc>
+          <w:tcPr>
+            <w:tcW w:type="dxa" w:w="6048"/>
+            <w:shd w:val="clear" w:color="auto" w:fill="D3DFEE"/>
+          </w:tcPr>
+          <w:p>
+            <w:pPr>
+              <w:spacing w:before="40" w:after="40" w:line="240" w:lineRule="auto"/>
+            </w:pPr>
+            <w:r/>
+            <w:r>
+              <w:rPr>
+                <w:color w:val="365F91"/>
+                <w:sz w:val="20"/>
+              </w:rPr>
+              <w:t>sha256 of key lines identical (668dc602…aeb35)</w:t>
+            </w:r>
+          </w:p>
+        </w:tc>
+      </w:tr>
+      <w:tr>
+        <w:trPr>
+          <w:cantSplit/>
+        </w:trPr>
+        <w:tc>
+          <w:tcPr>
+            <w:tcW w:type="dxa" w:w="4032"/>
+            <w:shd w:val="clear" w:color="auto" w:fill="FFFFFF"/>
+          </w:tcPr>
+          <w:p>
+            <w:pPr>
+              <w:spacing w:before="40" w:after="40" w:line="240" w:lineRule="auto"/>
+            </w:pPr>
+            <w:r/>
+            <w:r>
+              <w:rPr>
+                <w:b/>
+                <w:color w:val="365F91"/>
+                <w:sz w:val="20"/>
+              </w:rPr>
+              <w:t>Flux apps lastAppliedRevision</w:t>
+            </w:r>
+          </w:p>
+        </w:tc>
+        <w:tc>
+          <w:tcPr>
+            <w:tcW w:type="dxa" w:w="6048"/>
+            <w:shd w:val="clear" w:color="auto" w:fill="FFFFFF"/>
+          </w:tcPr>
+          <w:p>
+            <w:pPr>
+              <w:spacing w:before="40" w:after="40" w:line="240" w:lineRule="auto"/>
+            </w:pPr>
+            <w:r/>
+            <w:r>
+              <w:rPr>
+                <w:color w:val="365F91"/>
+                <w:sz w:val="20"/>
+              </w:rPr>
+              <w:t>main@sha1:3d78804fe9a4dbd24b1c116046dd59306e1fadf3</w:t>
+            </w:r>
+          </w:p>
+        </w:tc>
+      </w:tr>
+      <w:tr>
+        <w:trPr>
+          <w:cantSplit/>
+        </w:trPr>
+        <w:tc>
+          <w:tcPr>
+            <w:tcW w:type="dxa" w:w="4032"/>
+            <w:shd w:val="clear" w:color="auto" w:fill="D3DFEE"/>
+          </w:tcPr>
+          <w:p>
+            <w:pPr>
+              <w:spacing w:before="40" w:after="40" w:line="240" w:lineRule="auto"/>
+            </w:pPr>
+            <w:r/>
+            <w:r>
+              <w:rPr>
+                <w:b/>
+                <w:color w:val="365F91"/>
+                <w:sz w:val="20"/>
+              </w:rPr>
+              <w:t>Rollout</w:t>
+            </w:r>
+          </w:p>
+        </w:tc>
+        <w:tc>
+          <w:tcPr>
+            <w:tcW w:type="dxa" w:w="6048"/>
+            <w:shd w:val="clear" w:color="auto" w:fill="D3DFEE"/>
+          </w:tcPr>
+          <w:p>
+            <w:pPr>
+              <w:spacing w:before="40" w:after="40" w:line="240" w:lineRule="auto"/>
+            </w:pPr>
+            <w:r/>
+            <w:r>
+              <w:rPr>
+                <w:color w:val="365F91"/>
+                <w:sz w:val="20"/>
+              </w:rPr>
+              <w:t>devpod-1 recreated 15:21:00 CT (skynet-wrk-01), devpod-0 15:21:48 CT (skynet-wrk-02); both 1/1 Ready</w:t>
+            </w:r>
+          </w:p>
+        </w:tc>
+      </w:tr>
+      <w:tr>
+        <w:trPr>
+          <w:cantSplit/>
+        </w:trPr>
+        <w:tc>
+          <w:tcPr>
+            <w:tcW w:type="dxa" w:w="4032"/>
+            <w:shd w:val="clear" w:color="auto" w:fill="FFFFFF"/>
+          </w:tcPr>
+          <w:p>
+            <w:pPr>
+              <w:spacing w:before="40" w:after="40" w:line="240" w:lineRule="auto"/>
+            </w:pPr>
+            <w:r/>
+            <w:r>
+              <w:rPr>
+                <w:b/>
+                <w:color w:val="365F91"/>
+                <w:sz w:val="20"/>
+              </w:rPr>
+              <w:t>Pod log (both)</w:t>
+            </w:r>
+          </w:p>
+        </w:tc>
+        <w:tc>
+          <w:tcPr>
+            <w:tcW w:type="dxa" w:w="6048"/>
+            <w:shd w:val="clear" w:color="auto" w:fill="FFFFFF"/>
+          </w:tcPr>
+          <w:p>
+            <w:pPr>
+              <w:spacing w:before="40" w:after="40" w:line="240" w:lineRule="auto"/>
+            </w:pPr>
+            <w:r/>
+            <w:r>
+              <w:rPr>
+                <w:color w:val="365F91"/>
+                <w:sz w:val="20"/>
+              </w:rPr>
+              <w:t>devpod-runtime: authorized_keys written from repo (2 keys)</w:t>
+            </w:r>
+          </w:p>
+        </w:tc>
+      </w:tr>
+      <w:tr>
+        <w:trPr>
+          <w:cantSplit/>
+        </w:trPr>
+        <w:tc>
+          <w:tcPr>
+            <w:tcW w:type="dxa" w:w="4032"/>
+            <w:shd w:val="clear" w:color="auto" w:fill="D3DFEE"/>
+          </w:tcPr>
+          <w:p>
+            <w:pPr>
+              <w:spacing w:before="40" w:after="40" w:line="240" w:lineRule="auto"/>
+            </w:pPr>
+            <w:r/>
+            <w:r>
+              <w:rPr>
+                <w:b/>
+                <w:color w:val="365F91"/>
+                <w:sz w:val="20"/>
+              </w:rPr>
+              <w:t>Perms (both)</w:t>
+            </w:r>
+          </w:p>
+        </w:tc>
+        <w:tc>
+          <w:tcPr>
+            <w:tcW w:type="dxa" w:w="6048"/>
+            <w:shd w:val="clear" w:color="auto" w:fill="D3DFEE"/>
+          </w:tcPr>
+          <w:p>
+            <w:pPr>
+              <w:spacing w:before="40" w:after="40" w:line="240" w:lineRule="auto"/>
+            </w:pPr>
+            <w:r/>
+            <w:r>
+              <w:rPr>
+                <w:color w:val="365F91"/>
+                <w:sz w:val="20"/>
+              </w:rPr>
+              <w:t>drwx--S--- vscode vscode ~/.ssh · -rw------- vscode vscode authorized_keys</w:t>
+            </w:r>
+          </w:p>
+        </w:tc>
+      </w:tr>
+      <w:tr>
+        <w:trPr>
+          <w:cantSplit/>
+        </w:trPr>
+        <w:tc>
+          <w:tcPr>
+            <w:tcW w:type="dxa" w:w="4032"/>
+            <w:shd w:val="clear" w:color="auto" w:fill="FFFFFF"/>
+          </w:tcPr>
+          <w:p>
+            <w:pPr>
+              <w:spacing w:before="40" w:after="40" w:line="240" w:lineRule="auto"/>
+            </w:pPr>
+            <w:r/>
+            <w:r>
+              <w:rPr>
+                <w:b/>
+                <w:color w:val="365F91"/>
+                <w:sz w:val="20"/>
+              </w:rPr>
+              <w:t>Fingerprints (both)</w:t>
+            </w:r>
+          </w:p>
+        </w:tc>
+        <w:tc>
+          <w:tcPr>
+            <w:tcW w:type="dxa" w:w="6048"/>
+            <w:shd w:val="clear" w:color="auto" w:fill="FFFFFF"/>
+          </w:tcPr>
+          <w:p>
+            <w:pPr>
+              <w:spacing w:before="40" w:after="40" w:line="240" w:lineRule="auto"/>
+            </w:pPr>
+            <w:r/>
+            <w:r>
+              <w:rPr>
+                <w:color w:val="365F91"/>
+                <w:sz w:val="20"/>
+              </w:rPr>
+              <w:t>exactly M5 PBPgT1A6…7JrM and Mac mini 94wTnD+2…rL4</w:t>
+            </w:r>
+          </w:p>
+        </w:tc>
+      </w:tr>
+      <w:tr>
+        <w:trPr>
+          <w:cantSplit/>
+        </w:trPr>
+        <w:tc>
+          <w:tcPr>
+            <w:tcW w:type="dxa" w:w="4032"/>
+            <w:shd w:val="clear" w:color="auto" w:fill="D3DFEE"/>
+          </w:tcPr>
+          <w:p>
+            <w:pPr>
+              <w:spacing w:before="40" w:after="40" w:line="240" w:lineRule="auto"/>
+            </w:pPr>
+            <w:r/>
+            <w:r>
+              <w:rPr>
+                <w:b/>
+                <w:color w:val="365F91"/>
+                <w:sz w:val="20"/>
+              </w:rPr>
+              <w:t>Overwrite test</w:t>
+            </w:r>
+          </w:p>
+        </w:tc>
+        <w:tc>
+          <w:tcPr>
+            <w:tcW w:type="dxa" w:w="6048"/>
+            <w:shd w:val="clear" w:color="auto" w:fill="D3DFEE"/>
+          </w:tcPr>
+          <w:p>
+            <w:pPr>
+              <w:spacing w:before="40" w:after="40" w:line="240" w:lineRule="auto"/>
+            </w:pPr>
+            <w:r/>
+            <w:r>
+              <w:rPr>
+                <w:color w:val="365F91"/>
+                <w:sz w:val="20"/>
+              </w:rPr>
+              <w:t>marker line appended by hand to devpod-1's file before the rollout: gone afterwards (0 matches)</w:t>
+            </w:r>
+          </w:p>
+        </w:tc>
+      </w:tr>
+      <w:tr>
+        <w:trPr>
+          <w:cantSplit/>
+        </w:trPr>
+        <w:tc>
+          <w:tcPr>
+            <w:tcW w:type="dxa" w:w="4032"/>
+            <w:shd w:val="clear" w:color="auto" w:fill="FFFFFF"/>
+          </w:tcPr>
+          <w:p>
+            <w:pPr>
+              <w:spacing w:before="40" w:after="40" w:line="240" w:lineRule="auto"/>
+            </w:pPr>
+            <w:r/>
+            <w:r>
+              <w:rPr>
+                <w:b/>
+                <w:color w:val="365F91"/>
+                <w:sz w:val="20"/>
+              </w:rPr>
+              <w:t>Mac mini → devpod-0 (kubectl port-forward, mini key, throwaway known_hosts)</w:t>
+            </w:r>
+          </w:p>
+        </w:tc>
+        <w:tc>
+          <w:tcPr>
+            <w:tcW w:type="dxa" w:w="6048"/>
+            <w:shd w:val="clear" w:color="auto" w:fill="FFFFFF"/>
+          </w:tcPr>
+          <w:p>
+            <w:pPr>
+              <w:spacing w:before="40" w:after="40" w:line="240" w:lineRule="auto"/>
+            </w:pPr>
+            <w:r/>
+            <w:r>
+              <w:rPr>
+                <w:color w:val="365F91"/>
+                <w:sz w:val="20"/>
+              </w:rPr>
+              <w:t>auth-ok vscode@devpod-0, exit 0, host key ED25519 LofwfAOe…l0o</w:t>
+            </w:r>
+          </w:p>
+        </w:tc>
+      </w:tr>
+      <w:tr>
+        <w:trPr>
+          <w:cantSplit/>
+        </w:trPr>
+        <w:tc>
+          <w:tcPr>
+            <w:tcW w:type="dxa" w:w="4032"/>
+            <w:shd w:val="clear" w:color="auto" w:fill="D3DFEE"/>
+          </w:tcPr>
+          <w:p>
+            <w:pPr>
+              <w:spacing w:before="40" w:after="40" w:line="240" w:lineRule="auto"/>
+            </w:pPr>
+            <w:r/>
+            <w:r>
+              <w:rPr>
+                <w:b/>
+                <w:color w:val="365F91"/>
+                <w:sz w:val="20"/>
+              </w:rPr>
+              <w:t>Mac mini → devpod-1 (same method)</w:t>
+            </w:r>
+          </w:p>
+        </w:tc>
+        <w:tc>
+          <w:tcPr>
+            <w:tcW w:type="dxa" w:w="6048"/>
+            <w:shd w:val="clear" w:color="auto" w:fill="D3DFEE"/>
+          </w:tcPr>
+          <w:p>
+            <w:pPr>
+              <w:spacing w:before="40" w:after="40" w:line="240" w:lineRule="auto"/>
+            </w:pPr>
+            <w:r/>
+            <w:r>
+              <w:rPr>
+                <w:color w:val="365F91"/>
+                <w:sz w:val="20"/>
+              </w:rPr>
+              <w:t>auth-ok vscode@devpod-1, exit 0, same host key</w:t>
+            </w:r>
+          </w:p>
+        </w:tc>
+      </w:tr>
+      <w:tr>
+        <w:trPr>
+          <w:cantSplit/>
+        </w:trPr>
+        <w:tc>
+          <w:tcPr>
+            <w:tcW w:type="dxa" w:w="4032"/>
+            <w:shd w:val="clear" w:color="auto" w:fill="FFFFFF"/>
+          </w:tcPr>
+          <w:p>
+            <w:pPr>
+              <w:spacing w:before="40" w:after="40" w:line="240" w:lineRule="auto"/>
+            </w:pPr>
+            <w:r/>
+            <w:r>
+              <w:rPr>
+                <w:b/>
+                <w:color w:val="365F91"/>
+                <w:sz w:val="20"/>
+              </w:rPr>
+              <w:t>M5 → ssh devpod-0 via Cloudflare</w:t>
+            </w:r>
+          </w:p>
+        </w:tc>
+        <w:tc>
+          <w:tcPr>
+            <w:tcW w:type="dxa" w:w="6048"/>
+            <w:shd w:val="clear" w:color="auto" w:fill="FFFFFF"/>
+          </w:tcPr>
+          <w:p>
+            <w:pPr>
+              <w:spacing w:before="40" w:after="40" w:line="240" w:lineRule="auto"/>
+            </w:pPr>
+            <w:r/>
+            <w:r>
+              <w:rPr>
+                <w:color w:val="365F91"/>
+                <w:sz w:val="20"/>
+              </w:rPr>
+              <w:t>exit 0 (ok-devpod-0). First try during the rollout, before sshd was up: 'websocket: bad handshake'; retry seconds later succeeded</w:t>
+            </w:r>
+          </w:p>
+        </w:tc>
+      </w:tr>
+      <w:tr>
+        <w:trPr>
+          <w:cantSplit/>
+        </w:trPr>
+        <w:tc>
+          <w:tcPr>
+            <w:tcW w:type="dxa" w:w="4032"/>
+            <w:shd w:val="clear" w:color="auto" w:fill="D3DFEE"/>
+          </w:tcPr>
+          <w:p>
+            <w:pPr>
+              <w:spacing w:before="40" w:after="40" w:line="240" w:lineRule="auto"/>
+            </w:pPr>
+            <w:r/>
+            <w:r>
+              <w:rPr>
+                <w:b/>
+                <w:color w:val="365F91"/>
+                <w:sz w:val="20"/>
+              </w:rPr>
+              <w:t>PVCs</w:t>
+            </w:r>
+          </w:p>
+        </w:tc>
+        <w:tc>
+          <w:tcPr>
+            <w:tcW w:type="dxa" w:w="6048"/>
+            <w:shd w:val="clear" w:color="auto" w:fill="D3DFEE"/>
+          </w:tcPr>
+          <w:p>
+            <w:pPr>
+              <w:spacing w:before="40" w:after="40" w:line="240" w:lineRule="auto"/>
+            </w:pPr>
+            <w:r/>
+            <w:r>
+              <w:rPr>
+                <w:color w:val="365F91"/>
+                <w:sz w:val="20"/>
+              </w:rPr>
+              <w:t>home-devpod-0, home-devpod-1, devpod-scratch, devpod-default-de-115ea all Bound, untouched</w:t>
+            </w:r>
+          </w:p>
+        </w:tc>
+      </w:tr>
+    </w:tbl>
+    <w:p>
+      <w:pPr>
+        <w:spacing w:after="40" w:line="120" w:lineRule="exact"/>
+      </w:pPr>
+    </w:p>
+    <w:p>
+      <w:pPr>
+        <w:keepLines/>
+        <w:spacing w:line="240" w:lineRule="auto" w:before="40" w:after="180"/>
+        <w:ind w:left="86" w:right="86"/>
+        <w:shd w:val="clear" w:color="auto" w:fill="F0F4F7"/>
+      </w:pPr>
+      <w:r>
+        <w:rPr>
+          <w:rFonts w:ascii="Courier New" w:hAnsi="Courier New" w:eastAsia="Courier New"/>
+          <w:sz w:val="18"/>
+        </w:rPr>
+        <w:t>$ kubectl -n devpod exec devpod-1 -c workspace -- ssh-keygen -lf /home/vscode/.ssh/authorized_keys</w:t>
+        <w:br/>
+        <w:t>256 SHA256:PBPgT1A69fRgGM1wdwWBMA/BJtPfdsXdFasYUod7JrM cyberstar@M5.local (ED25519)</w:t>
+        <w:br/>
+        <w:t>256 SHA256:94wTnD+20VEazwsIfbXdS8+pTOAfWJWKKKi+iquPrL4 cyberstar@Mac-mini.local (ED25519)</w:t>
+        <w:br/>
+        <w:t>$ ssh -F /dev/null -o ProxyCommand=none -i ~/.ssh/id_ed25519 -p 22222 vscode@127.0.0.1 'echo auth-ok $(whoami)@$(hostname)'</w:t>
+        <w:br/>
+        <w:t>auth-ok vscode@devpod-1</w:t>
+      </w:r>
+    </w:p>
+    <w:p>
+      <w:pPr>
+        <w:shd w:val="clear" w:color="auto" w:fill="D3DFEE"/>
+        <w:keepLines/>
+        <w:pBdr>
+          <w:left w:val="single" w:sz="24" w:space="6" w:color="4F81BD"/>
+        </w:pBdr>
+        <w:spacing w:before="40" w:after="180"/>
+        <w:ind w:left="115" w:right="86"/>
+      </w:pPr>
+      <w:r>
+        <w:rPr>
+          <w:b/>
+          <w:color w:val="173A53"/>
+        </w:rPr>
+        <w:t xml:space="preserve">Follow-up  </w:t>
+      </w:r>
+      <w:r>
+        <w:t>The Mac mini still needs its one-time Cloudflare Access browser login before ssh devpod-0 / devpod-1 works through the tunnel; the key itself is proven by the direct test above.</w:t>
+      </w:r>
+    </w:p>
+    <w:p>
+      <w:pPr>
+        <w:pStyle w:val="Heading1"/>
+      </w:pPr>
+      <w:r>
+        <w:t>S.9 Restore steps (in addition to Appendix A)</w:t>
+      </w:r>
+    </w:p>
+    <w:tbl>
+      <w:tblPr>
+        <w:tblStyle w:val="LightShading-Accent1"/>
+        <w:tblW w:type="auto" w:w="0"/>
+        <w:tblLayout w:type="fixed"/>
+        <w:tblLook w:firstColumn="1" w:firstRow="1" w:lastColumn="0" w:lastRow="0" w:noHBand="0" w:noVBand="1" w:val="04A0"/>
+        <w:tblBorders>
+          <w:top w:val="single" w:sz="8" w:space="0" w:color="4F81BD"/>
+          <w:left w:val="nil"/>
+          <w:bottom w:val="single" w:sz="8" w:space="0" w:color="4F81BD"/>
+          <w:right w:val="nil"/>
+          <w:insideH w:val="nil"/>
+          <w:insideV w:val="nil"/>
+        </w:tblBorders>
+      </w:tblPr>
+      <w:tblGrid>
+        <w:gridCol w:w="1008"/>
+        <w:gridCol w:w="7056"/>
+        <w:gridCol w:w="2016"/>
+      </w:tblGrid>
+      <w:tr>
+        <w:trPr>
+          <w:cantSplit/>
+          <w:tblHeader w:val="true"/>
+        </w:trPr>
+        <w:tc>
+          <w:tcPr>
+            <w:tcW w:type="dxa" w:w="1008"/>
+            <w:tcBorders>
+              <w:top w:val="single" w:sz="8" w:space="0" w:color="4F81BD"/>
+              <w:bottom w:val="single" w:sz="8" w:space="0" w:color="4F81BD"/>
+            </w:tcBorders>
+            <w:shd w:val="clear" w:color="auto" w:fill="365F91"/>
+          </w:tcPr>
+          <w:p>
+            <w:pPr>
+              <w:keepNext/>
+              <w:spacing w:before="40" w:after="40" w:line="240" w:lineRule="auto"/>
+            </w:pPr>
+            <w:r/>
+            <w:r>
+              <w:rPr>
+                <w:b/>
+                <w:color w:val="FFFFFF"/>
+                <w:sz w:val="20"/>
+              </w:rPr>
+              <w:t>Order</w:t>
+            </w:r>
+          </w:p>
+        </w:tc>
+        <w:tc>
+          <w:tcPr>
+            <w:tcW w:type="dxa" w:w="7056"/>
+            <w:tcBorders>
+              <w:top w:val="single" w:sz="8" w:space="0" w:color="4F81BD"/>
+              <w:bottom w:val="single" w:sz="8" w:space="0" w:color="4F81BD"/>
+            </w:tcBorders>
+            <w:shd w:val="clear" w:color="auto" w:fill="365F91"/>
+          </w:tcPr>
+          <w:p>
+            <w:pPr>
+              <w:keepNext/>
+              <w:spacing w:before="40" w:after="40" w:line="240" w:lineRule="auto"/>
+            </w:pPr>
+            <w:r/>
+            <w:r>
+              <w:rPr>
+                <w:b/>
+                <w:color w:val="FFFFFF"/>
+                <w:sz w:val="20"/>
+              </w:rPr>
+              <w:t>What</w:t>
+            </w:r>
+          </w:p>
+        </w:tc>
+        <w:tc>
+          <w:tcPr>
+            <w:tcW w:type="dxa" w:w="2016"/>
+            <w:tcBorders>
+              <w:top w:val="single" w:sz="8" w:space="0" w:color="4F81BD"/>
+              <w:bottom w:val="single" w:sz="8" w:space="0" w:color="4F81BD"/>
+            </w:tcBorders>
+            <w:shd w:val="clear" w:color="auto" w:fill="365F91"/>
+          </w:tcPr>
+          <w:p>
+            <w:pPr>
+              <w:keepNext/>
+              <w:spacing w:before="40" w:after="40" w:line="240" w:lineRule="auto"/>
+            </w:pPr>
+            <w:r/>
+            <w:r>
+              <w:rPr>
+                <w:b/>
+                <w:color w:val="FFFFFF"/>
+                <w:sz w:val="20"/>
+              </w:rPr>
+              <w:t>From</w:t>
+            </w:r>
+          </w:p>
+        </w:tc>
+      </w:tr>
+      <w:tr>
+        <w:trPr>
+          <w:cantSplit/>
+        </w:trPr>
+        <w:tc>
+          <w:tcPr>
+            <w:tcW w:type="dxa" w:w="1008"/>
+            <w:shd w:val="clear" w:color="auto" w:fill="D3DFEE"/>
+          </w:tcPr>
+          <w:p>
+            <w:pPr>
+              <w:spacing w:before="40" w:after="40" w:line="240" w:lineRule="auto"/>
+            </w:pPr>
+            <w:r/>
+            <w:r>
+              <w:rPr>
+                <w:b/>
+                <w:color w:val="365F91"/>
+                <w:sz w:val="20"/>
+              </w:rPr>
+              <w:t>A.12</w:t>
+            </w:r>
+          </w:p>
+        </w:tc>
+        <w:tc>
+          <w:tcPr>
+            <w:tcW w:type="dxa" w:w="7056"/>
+            <w:shd w:val="clear" w:color="auto" w:fill="D3DFEE"/>
+          </w:tcPr>
+          <w:p>
+            <w:pPr>
+              <w:spacing w:before="40" w:after="40" w:line="240" w:lineRule="auto"/>
+            </w:pPr>
+            <w:r/>
+            <w:r>
+              <w:rPr>
+                <w:color w:val="365F91"/>
+                <w:sz w:val="20"/>
+              </w:rPr>
+              <w:t>apps/base/devpod/bootstrap/authorized_keys (public keys of every Mac)</w:t>
+            </w:r>
+          </w:p>
+        </w:tc>
+        <w:tc>
+          <w:tcPr>
+            <w:tcW w:type="dxa" w:w="2016"/>
+            <w:shd w:val="clear" w:color="auto" w:fill="D3DFEE"/>
+          </w:tcPr>
+          <w:p>
+            <w:pPr>
+              <w:spacing w:before="40" w:after="40" w:line="240" w:lineRule="auto"/>
+            </w:pPr>
+            <w:r/>
+            <w:r>
+              <w:rPr>
+                <w:color w:val="365F91"/>
+                <w:sz w:val="20"/>
+              </w:rPr>
+              <w:t>S.3</w:t>
+            </w:r>
+          </w:p>
+        </w:tc>
+      </w:tr>
+      <w:tr>
+        <w:trPr>
+          <w:cantSplit/>
+        </w:trPr>
+        <w:tc>
+          <w:tcPr>
+            <w:tcW w:type="dxa" w:w="1008"/>
+            <w:shd w:val="clear" w:color="auto" w:fill="FFFFFF"/>
+          </w:tcPr>
+          <w:p>
+            <w:pPr>
+              <w:spacing w:before="40" w:after="40" w:line="240" w:lineRule="auto"/>
+            </w:pPr>
+            <w:r/>
+            <w:r>
+              <w:rPr>
+                <w:b/>
+                <w:color w:val="365F91"/>
+                <w:sz w:val="20"/>
+              </w:rPr>
+              <w:t>A.13</w:t>
+            </w:r>
+          </w:p>
+        </w:tc>
+        <w:tc>
+          <w:tcPr>
+            <w:tcW w:type="dxa" w:w="7056"/>
+            <w:shd w:val="clear" w:color="auto" w:fill="FFFFFF"/>
+          </w:tcPr>
+          <w:p>
+            <w:pPr>
+              <w:spacing w:before="40" w:after="40" w:line="240" w:lineRule="auto"/>
+            </w:pPr>
+            <w:r/>
+            <w:r>
+              <w:rPr>
+                <w:color w:val="365F91"/>
+                <w:sz w:val="20"/>
+              </w:rPr>
+              <w:t>kustomization.yaml, devpod-runtime.sh and devpod-statefulset.yaml from this supplement (they supersede sections 10, 7 and 6)</w:t>
+            </w:r>
+          </w:p>
+        </w:tc>
+        <w:tc>
+          <w:tcPr>
+            <w:tcW w:type="dxa" w:w="2016"/>
+            <w:shd w:val="clear" w:color="auto" w:fill="FFFFFF"/>
+          </w:tcPr>
+          <w:p>
+            <w:pPr>
+              <w:spacing w:before="40" w:after="40" w:line="240" w:lineRule="auto"/>
+            </w:pPr>
+            <w:r/>
+            <w:r>
+              <w:rPr>
+                <w:color w:val="365F91"/>
+                <w:sz w:val="20"/>
+              </w:rPr>
+              <w:t>S.4-S.6</w:t>
+            </w:r>
+          </w:p>
+        </w:tc>
+      </w:tr>
+      <w:tr>
+        <w:trPr>
+          <w:cantSplit/>
+        </w:trPr>
+        <w:tc>
+          <w:tcPr>
+            <w:tcW w:type="dxa" w:w="1008"/>
+            <w:shd w:val="clear" w:color="auto" w:fill="D3DFEE"/>
+          </w:tcPr>
+          <w:p>
+            <w:pPr>
+              <w:spacing w:before="40" w:after="40" w:line="240" w:lineRule="auto"/>
+            </w:pPr>
+            <w:r/>
+            <w:r>
+              <w:rPr>
+                <w:b/>
+                <w:color w:val="365F91"/>
+                <w:sz w:val="20"/>
+              </w:rPr>
+              <w:t>A.14</w:t>
+            </w:r>
+          </w:p>
+        </w:tc>
+        <w:tc>
+          <w:tcPr>
+            <w:tcW w:type="dxa" w:w="7056"/>
+            <w:shd w:val="clear" w:color="auto" w:fill="D3DFEE"/>
+          </w:tcPr>
+          <w:p>
+            <w:pPr>
+              <w:spacing w:before="40" w:after="40" w:line="240" w:lineRule="auto"/>
+            </w:pPr>
+            <w:r/>
+            <w:r>
+              <w:rPr>
+                <w:color w:val="365F91"/>
+                <w:sz w:val="20"/>
+              </w:rPr>
+              <w:t>Commit, push, reconcile; check both replicas' authorized_keys fingerprints</w:t>
+            </w:r>
+          </w:p>
+        </w:tc>
+        <w:tc>
+          <w:tcPr>
+            <w:tcW w:type="dxa" w:w="2016"/>
+            <w:shd w:val="clear" w:color="auto" w:fill="D3DFEE"/>
+          </w:tcPr>
+          <w:p>
+            <w:pPr>
+              <w:spacing w:before="40" w:after="40" w:line="240" w:lineRule="auto"/>
+            </w:pPr>
+            <w:r/>
+            <w:r>
+              <w:rPr>
+                <w:color w:val="365F91"/>
+                <w:sz w:val="20"/>
+              </w:rPr>
+              <w:t>S.10</w:t>
+            </w:r>
+          </w:p>
+        </w:tc>
+      </w:tr>
+    </w:tbl>
+    <w:p>
+      <w:pPr>
+        <w:spacing w:after="40" w:line="120" w:lineRule="exact"/>
+      </w:pPr>
+    </w:p>
+    <w:p>
+      <w:pPr>
+        <w:shd w:val="clear" w:color="auto" w:fill="FBEAEA"/>
+        <w:keepLines/>
+        <w:pBdr>
+          <w:left w:val="single" w:sz="36" w:space="6" w:color="A52A23"/>
+        </w:pBdr>
+        <w:spacing w:before="40" w:after="180"/>
+        <w:ind w:left="144" w:right="86"/>
+      </w:pPr>
+      <w:r>
+        <w:rPr>
+          <w:rFonts w:ascii="Calibri" w:hAnsi="Calibri" w:eastAsia="Calibri"/>
+          <w:b/>
+          <w:color w:val="A52A23"/>
+        </w:rPr>
+        <w:t xml:space="preserve">CRITICAL STEP  </w:t>
+      </w:r>
+      <w:r>
+        <w:rPr>
+          <w:rFonts w:ascii="Calibri" w:hAnsi="Calibri" w:eastAsia="Calibri"/>
+          <w:b/>
+          <w:color w:val="A52A23"/>
+        </w:rPr>
+        <w:t>Never delete a PVC; scaling down keeps home-devpod-1.</w:t>
+      </w:r>
+      <w:r>
+        <w:br/>
+      </w:r>
+      <w:r>
+        <w:rPr>
+          <w:rFonts w:ascii="Calibri" w:hAnsi="Calibri" w:eastAsia="Calibri"/>
+          <w:b/>
+          <w:color w:val="A52A23"/>
+        </w:rPr>
+        <w:t>Scaling back to replicas: 1 removes the pod devpod-1 only. Its volume home-devpod-1 stays (Retain) and is reused if you scale up again. Do not delete it.</w:t>
+      </w:r>
+    </w:p>
+    <w:p>
+      <w:pPr>
+        <w:pStyle w:val="Heading1"/>
+      </w:pPr>
+      <w:r>
+        <w:t>S.10 Commands</w:t>
+      </w:r>
+    </w:p>
+    <w:p>
+      <w:pPr>
+        <w:pStyle w:val="Heading2"/>
+      </w:pPr>
+      <w:r>
+        <w:t>S.10.1 Add or remove a Mac key</w:t>
+      </w:r>
+    </w:p>
+    <w:p>
+      <w:pPr>
+        <w:keepLines/>
+        <w:spacing w:line="240" w:lineRule="auto" w:before="40" w:after="180"/>
+        <w:ind w:left="86" w:right="86"/>
+        <w:shd w:val="clear" w:color="auto" w:fill="F0F4F7"/>
+      </w:pPr>
+      <w:r>
+        <w:rPr>
+          <w:rFonts w:ascii="Courier New" w:hAnsi="Courier New" w:eastAsia="Courier New"/>
+          <w:sz w:val="18"/>
+        </w:rPr>
+        <w:t>cat ~/.ssh/id_ed25519.pub; ssh-keygen -lf ~/.ssh/id_ed25519.pub        # on the Mac (public key only)</w:t>
+        <w:br/>
+        <w:t>$EDITOR apps/base/devpod/bootstrap/authorized_keys                       # add/remove the line + comment</w:t>
+        <w:br/>
+        <w:t>ssh-keygen -lf apps/base/devpod/bootstrap/authorized_keys                # every line must parse</w:t>
+        <w:br/>
+        <w:t>git add apps/base/devpod/bootstrap/authorized_keys &amp;&amp; git commit -m 'DevPod: update authorized_keys' &amp;&amp; git push</w:t>
+      </w:r>
+    </w:p>
+    <w:p>
+      <w:pPr>
+        <w:pStyle w:val="Heading2"/>
+      </w:pPr>
+      <w:r>
+        <w:t>S.10.2 kubectl: rollout and check every replica</w:t>
+      </w:r>
+    </w:p>
+    <w:p>
+      <w:pPr>
+        <w:keepLines/>
+        <w:spacing w:line="240" w:lineRule="auto" w:before="40" w:after="180"/>
+        <w:ind w:left="86" w:right="86"/>
+        <w:shd w:val="clear" w:color="auto" w:fill="F0F4F7"/>
+      </w:pPr>
+      <w:r>
+        <w:rPr>
+          <w:rFonts w:ascii="Courier New" w:hAnsi="Courier New" w:eastAsia="Courier New"/>
+          <w:sz w:val="18"/>
+        </w:rPr>
+        <w:t>kubectl -n flux-system annotate --overwrite kustomization/apps reconcile.fluxcd.io/requestedAt="$(date +%s)"</w:t>
+        <w:br/>
+        <w:t>kubectl -n devpod rollout status sts/devpod --timeout=600s</w:t>
+        <w:br/>
+        <w:t>kubectl -n devpod get pods,pvc -o wide</w:t>
+        <w:br/>
+        <w:t>for p in devpod-0 devpod-1; do kubectl -n devpod logs $p -c workspace | grep authorized_keys; \</w:t>
+        <w:br/>
+        <w:t xml:space="preserve">  kubectl -n devpod exec $p -c workspace -- ssh-keygen -lf /home/vscode/.ssh/authorized_keys; done</w:t>
+      </w:r>
+    </w:p>
+    <w:p>
+      <w:pPr>
+        <w:pStyle w:val="Heading2"/>
+      </w:pPr>
+      <w:r>
+        <w:t>S.10.3 Direct SSH test (bypasses Cloudflare)</w:t>
+      </w:r>
+    </w:p>
+    <w:p>
+      <w:pPr>
+        <w:keepLines/>
+        <w:spacing w:line="240" w:lineRule="auto" w:before="40" w:after="180"/>
+        <w:ind w:left="86" w:right="86"/>
+        <w:shd w:val="clear" w:color="auto" w:fill="F0F4F7"/>
+      </w:pPr>
+      <w:r>
+        <w:rPr>
+          <w:rFonts w:ascii="Courier New" w:hAnsi="Courier New" w:eastAsia="Courier New"/>
+          <w:sz w:val="18"/>
+        </w:rPr>
+        <w:t>kubectl -n devpod port-forward pod/devpod-1 22222:2222 &amp;</w:t>
+        <w:br/>
+        <w:t>kh=$(mktemp); ssh -F /dev/null -o ProxyCommand=none -o IdentitiesOnly=yes -i ~/.ssh/id_ed25519 \</w:t>
+        <w:br/>
+        <w:t xml:space="preserve">  -o UserKnownHostsFile=$kh -o StrictHostKeyChecking=accept-new -p 22222 vscode@127.0.0.1 true &amp;&amp; echo ok</w:t>
+        <w:br/>
+        <w:t>rm -f $kh; kill %1</w:t>
+        <w:br/>
+        <w:t>ssh -F /dev/null -o ProxyCommand=none -p 32222 vscode@&lt;node-ip&gt; true     # NodePort alternative (devpod-0)</w:t>
+      </w:r>
+    </w:p>
+    <w:p>
+      <w:pPr>
+        <w:pStyle w:val="Heading2"/>
+      </w:pPr>
+      <w:r>
+        <w:t>S.10.4 Scale replicas</w:t>
+      </w:r>
+    </w:p>
+    <w:p>
+      <w:pPr>
+        <w:keepLines/>
+        <w:spacing w:line="240" w:lineRule="auto" w:before="40" w:after="180"/>
+        <w:ind w:left="86" w:right="86"/>
+        <w:shd w:val="clear" w:color="auto" w:fill="F0F4F7"/>
+      </w:pPr>
+      <w:r>
+        <w:rPr>
+          <w:rFonts w:ascii="Courier New" w:hAnsi="Courier New" w:eastAsia="Courier New"/>
+          <w:sz w:val="18"/>
+        </w:rPr>
+        <w:t>kubectl -n devpod get sts devpod -o jsonpath='{.spec.replicas}{"\n"}'</w:t>
+        <w:br/>
+        <w:t># change spec.replicas in apps/base/devpod/devpod-statefulset.yaml and push (Flux owns it; no kubectl scale)</w:t>
       </w:r>
     </w:p>
     <w:sectPr>

</xml_diff>

<commit_message>
DevPod enhancements addendum: darker text on blue shading (combined style 2026-10-03)
</commit_message>
<xml_diff>
--- a/docs/Homelab_DevPod_Enhancements_Addendum.docx
+++ b/docs/Homelab_DevPod_Enhancements_Addendum.docx
@@ -43,7 +43,7 @@
       </w:pPr>
       <w:r>
         <w:rPr>
-          <w:color w:val="595959"/>
+          <w:color w:val="333333"/>
           <w:sz w:val="20"/>
         </w:rPr>
         <w:t>homelab-cluster main 9ae6231 · dotfiles main 2dd1f99 · StatefulSet devpod (devpod-0, devpod-1 ready) · Verified 3 October 2026 · No secrets in this document</w:t>
@@ -141,7 +141,7 @@
             <w:r>
               <w:rPr>
                 <w:b/>
-                <w:color w:val="365F91"/>
+                <w:color w:val="173A53"/>
                 <w:sz w:val="20"/>
               </w:rPr>
               <w:t>Date</w:t>
@@ -160,7 +160,7 @@
             <w:r/>
             <w:r>
               <w:rPr>
-                <w:color w:val="365F91"/>
+                <w:color w:val="1A1A1A"/>
                 <w:sz w:val="20"/>
               </w:rPr>
               <w:t>Saturday 3 October 2026 (all times CT)</w:t>
@@ -185,7 +185,7 @@
             <w:r>
               <w:rPr>
                 <w:b/>
-                <w:color w:val="365F91"/>
+                <w:color w:val="173A53"/>
                 <w:sz w:val="20"/>
               </w:rPr>
               <w:t>SSH access</w:t>
@@ -204,7 +204,7 @@
             <w:r/>
             <w:r>
               <w:rPr>
-                <w:color w:val="365F91"/>
+                <w:color w:val="1A1A1A"/>
                 <w:sz w:val="20"/>
               </w:rPr>
               <w:t>ssh devpod-0 / ssh devpod-1 through Cloudflare Tunnel skynet + Access (detail: docs/Homelab_Cloudflare_DevPod_SSH_Tunnel.docx)</w:t>
@@ -229,7 +229,7 @@
             <w:r>
               <w:rPr>
                 <w:b/>
-                <w:color w:val="365F91"/>
+                <w:color w:val="173A53"/>
                 <w:sz w:val="20"/>
               </w:rPr>
               <w:t>Git in the pod</w:t>
@@ -248,7 +248,7 @@
             <w:r/>
             <w:r>
               <w:rPr>
-                <w:color w:val="365F91"/>
+                <w:color w:val="1A1A1A"/>
                 <w:sz w:val="20"/>
               </w:rPr>
               <w:t>SSH-style GitHub URLs rewritten to HTTPS with the mounted token · commit 0989587</w:t>
@@ -273,7 +273,7 @@
             <w:r>
               <w:rPr>
                 <w:b/>
-                <w:color w:val="365F91"/>
+                <w:color w:val="173A53"/>
                 <w:sz w:val="20"/>
               </w:rPr>
               <w:t>Cluster access</w:t>
@@ -292,7 +292,7 @@
             <w:r/>
             <w:r>
               <w:rPr>
-                <w:color w:val="365F91"/>
+                <w:color w:val="1A1A1A"/>
                 <w:sz w:val="20"/>
               </w:rPr>
               <w:t>ServiceAccount devpod/devpod bound to ClusterRole cluster-admin · commit d223fb7</w:t>
@@ -317,7 +317,7 @@
             <w:r>
               <w:rPr>
                 <w:b/>
-                <w:color w:val="365F91"/>
+                <w:color w:val="173A53"/>
                 <w:sz w:val="20"/>
               </w:rPr>
               <w:t>SOPS in the pod</w:t>
@@ -336,7 +336,7 @@
             <w:r/>
             <w:r>
               <w:rPr>
-                <w:color w:val="365F91"/>
+                <w:color w:val="1A1A1A"/>
                 <w:sz w:val="20"/>
               </w:rPr>
               <w:t>Secret devpod/sops-age (created by kubectl, NOT in Git) mounted at /etc/sops-age · commit b1017b5</w:t>
@@ -361,7 +361,7 @@
             <w:r>
               <w:rPr>
                 <w:b/>
-                <w:color w:val="365F91"/>
+                <w:color w:val="173A53"/>
                 <w:sz w:val="20"/>
               </w:rPr>
               <w:t>kubectl over SSH</w:t>
@@ -380,7 +380,7 @@
             <w:r/>
             <w:r>
               <w:rPr>
-                <w:color w:val="365F91"/>
+                <w:color w:val="1A1A1A"/>
                 <w:sz w:val="20"/>
               </w:rPr>
               <w:t>fsGroup 1000 + KUBERNETES_SERVICE_HOST/PORT in /etc/environment · commit 8ba0a60</w:t>
@@ -405,7 +405,7 @@
             <w:r>
               <w:rPr>
                 <w:b/>
-                <w:color w:val="365F91"/>
+                <w:color w:val="173A53"/>
                 <w:sz w:val="20"/>
               </w:rPr>
               <w:t>Wrong state (fixed)</w:t>
@@ -455,7 +455,7 @@
             <w:r>
               <w:rPr>
                 <w:b/>
-                <w:color w:val="365F91"/>
+                <w:color w:val="173A53"/>
                 <w:sz w:val="20"/>
               </w:rPr>
               <w:t>SSH host keys</w:t>
@@ -474,7 +474,7 @@
             <w:r/>
             <w:r>
               <w:rPr>
-                <w:color w:val="365F91"/>
+                <w:color w:val="1A1A1A"/>
                 <w:sz w:val="20"/>
               </w:rPr>
               <w:t>Persistent ed25519/rsa/ecdsa keys from Secret devpod/devpod-ssh-host-keys (NOT in Git), shared by all replicas · commit 9ae6231</w:t>
@@ -499,7 +499,7 @@
             <w:r>
               <w:rPr>
                 <w:b/>
-                <w:color w:val="365F91"/>
+                <w:color w:val="173A53"/>
                 <w:sz w:val="20"/>
               </w:rPr>
               <w:t>Dotfiles</w:t>
@@ -518,7 +518,7 @@
             <w:r/>
             <w:r>
               <w:rPr>
-                <w:color w:val="365F91"/>
+                <w:color w:val="1A1A1A"/>
                 <w:sz w:val="20"/>
               </w:rPr>
               <w:t>mise: kubectl, flux2, helm, kustomize, k9s, sops, age · Invertedlight/dotfiles commit 2dd1f99</w:t>
@@ -543,7 +543,7 @@
             <w:r>
               <w:rPr>
                 <w:b/>
-                <w:color w:val="365F91"/>
+                <w:color w:val="173A53"/>
                 <w:sz w:val="20"/>
               </w:rPr>
               <w:t>Files in Git</w:t>
@@ -562,7 +562,7 @@
             <w:r/>
             <w:r>
               <w:rPr>
-                <w:color w:val="365F91"/>
+                <w:color w:val="1A1A1A"/>
                 <w:sz w:val="20"/>
               </w:rPr>
               <w:t>apps/base/devpod/{serviceaccount-devpod.yaml, clusterrolebinding-devpod-admin.yaml, kustomization.yaml, devpod-statefulset.yaml, bootstrap/devpod-runtime.sh, README.md}; dotfiles dot_config/mise/config.toml</w:t>
@@ -587,7 +587,7 @@
             <w:r>
               <w:rPr>
                 <w:b/>
-                <w:color w:val="365F91"/>
+                <w:color w:val="173A53"/>
                 <w:sz w:val="20"/>
               </w:rPr>
               <w:t>Not in Git</w:t>
@@ -606,7 +606,7 @@
             <w:r/>
             <w:r>
               <w:rPr>
-                <w:color w:val="365F91"/>
+                <w:color w:val="1A1A1A"/>
                 <w:sz w:val="20"/>
               </w:rPr>
               <w:t>Secrets devpod/sops-age and devpod/devpod-ssh-host-keys, Cloudflare tunnel/DNS/Access config, M5 ~/.ssh/config</w:t>
@@ -631,7 +631,7 @@
             <w:r>
               <w:rPr>
                 <w:b/>
-                <w:color w:val="365F91"/>
+                <w:color w:val="173A53"/>
                 <w:sz w:val="20"/>
               </w:rPr>
               <w:t>PVCs (never delete)</w:t>
@@ -650,7 +650,7 @@
             <w:r/>
             <w:r>
               <w:rPr>
-                <w:color w:val="365F91"/>
+                <w:color w:val="1A1A1A"/>
                 <w:sz w:val="20"/>
               </w:rPr>
               <w:t>home-devpod-0 (20Gi Longhorn), devpod-scratch (500Gi SMB), devpod-default-de-115ea (40Gi Longhorn)</w:t>
@@ -1102,7 +1102,7 @@
             <w:r>
               <w:rPr>
                 <w:b/>
-                <w:color w:val="365F91"/>
+                <w:color w:val="173A53"/>
                 <w:sz w:val="20"/>
               </w:rPr>
               <w:t>1</w:t>
@@ -1121,7 +1121,7 @@
             <w:r/>
             <w:r>
               <w:rPr>
-                <w:color w:val="365F91"/>
+                <w:color w:val="1A1A1A"/>
                 <w:sz w:val="20"/>
               </w:rPr>
               <w:t>Cloudflare SSH for devpod-0 and devpod-1</w:t>
@@ -1140,7 +1140,7 @@
             <w:r/>
             <w:r>
               <w:rPr>
-                <w:color w:val="365F91"/>
+                <w:color w:val="1A1A1A"/>
                 <w:sz w:val="20"/>
               </w:rPr>
               <w:t>Cloudflare dashboard/API, M5 ~/.ssh/config</w:t>
@@ -1159,7 +1159,7 @@
             <w:r/>
             <w:r>
               <w:rPr>
-                <w:color w:val="365F91"/>
+                <w:color w:val="1A1A1A"/>
                 <w:sz w:val="20"/>
               </w:rPr>
               <w:t>(not in Git)</w:t>
@@ -1184,7 +1184,7 @@
             <w:r>
               <w:rPr>
                 <w:b/>
-                <w:color w:val="365F91"/>
+                <w:color w:val="173A53"/>
                 <w:sz w:val="20"/>
               </w:rPr>
               <w:t>2</w:t>
@@ -1203,7 +1203,7 @@
             <w:r/>
             <w:r>
               <w:rPr>
-                <w:color w:val="365F91"/>
+                <w:color w:val="1A1A1A"/>
                 <w:sz w:val="20"/>
               </w:rPr>
               <w:t>git insteadOf rewrite to HTTPS</w:t>
@@ -1222,7 +1222,7 @@
             <w:r/>
             <w:r>
               <w:rPr>
-                <w:color w:val="365F91"/>
+                <w:color w:val="1A1A1A"/>
                 <w:sz w:val="20"/>
               </w:rPr>
               <w:t>apps/base/devpod/bootstrap/devpod-runtime.sh</w:t>
@@ -1241,7 +1241,7 @@
             <w:r/>
             <w:r>
               <w:rPr>
-                <w:color w:val="365F91"/>
+                <w:color w:val="1A1A1A"/>
                 <w:sz w:val="20"/>
               </w:rPr>
               <w:t>0989587</w:t>
@@ -1266,7 +1266,7 @@
             <w:r>
               <w:rPr>
                 <w:b/>
-                <w:color w:val="365F91"/>
+                <w:color w:val="173A53"/>
                 <w:sz w:val="20"/>
               </w:rPr>
               <w:t>3</w:t>
@@ -1285,7 +1285,7 @@
             <w:r/>
             <w:r>
               <w:rPr>
-                <w:color w:val="365F91"/>
+                <w:color w:val="1A1A1A"/>
                 <w:sz w:val="20"/>
               </w:rPr>
               <w:t>cluster-admin ServiceAccount + ClusterRoleBinding</w:t>
@@ -1304,7 +1304,7 @@
             <w:r/>
             <w:r>
               <w:rPr>
-                <w:color w:val="365F91"/>
+                <w:color w:val="1A1A1A"/>
                 <w:sz w:val="20"/>
               </w:rPr>
               <w:t>apps/base/devpod/serviceaccount-devpod.yaml, clusterrolebinding-devpod-admin.yaml</w:t>
@@ -1323,7 +1323,7 @@
             <w:r/>
             <w:r>
               <w:rPr>
-                <w:color w:val="365F91"/>
+                <w:color w:val="1A1A1A"/>
                 <w:sz w:val="20"/>
               </w:rPr>
               <w:t>d223fb7</w:t>
@@ -1348,7 +1348,7 @@
             <w:r>
               <w:rPr>
                 <w:b/>
-                <w:color w:val="365F91"/>
+                <w:color w:val="173A53"/>
                 <w:sz w:val="20"/>
               </w:rPr>
               <w:t>4</w:t>
@@ -1367,7 +1367,7 @@
             <w:r/>
             <w:r>
               <w:rPr>
-                <w:color w:val="365F91"/>
+                <w:color w:val="1A1A1A"/>
                 <w:sz w:val="20"/>
               </w:rPr>
               <w:t>SOPS age key Secret (out of band) + mount</w:t>
@@ -1386,7 +1386,7 @@
             <w:r/>
             <w:r>
               <w:rPr>
-                <w:color w:val="365F91"/>
+                <w:color w:val="1A1A1A"/>
                 <w:sz w:val="20"/>
               </w:rPr>
               <w:t>kubectl; devpod-statefulset.yaml, devpod-runtime.sh</w:t>
@@ -1405,7 +1405,7 @@
             <w:r/>
             <w:r>
               <w:rPr>
-                <w:color w:val="365F91"/>
+                <w:color w:val="1A1A1A"/>
                 <w:sz w:val="20"/>
               </w:rPr>
               <w:t>b1017b5</w:t>
@@ -1430,7 +1430,7 @@
             <w:r>
               <w:rPr>
                 <w:b/>
-                <w:color w:val="365F91"/>
+                <w:color w:val="173A53"/>
                 <w:sz w:val="20"/>
               </w:rPr>
               <w:t>5</w:t>
@@ -1449,7 +1449,7 @@
             <w:r/>
             <w:r>
               <w:rPr>
-                <w:color w:val="365F91"/>
+                <w:color w:val="1A1A1A"/>
                 <w:sz w:val="20"/>
               </w:rPr>
               <w:t>kubectl in SSH sessions</w:t>
@@ -1468,7 +1468,7 @@
             <w:r/>
             <w:r>
               <w:rPr>
-                <w:color w:val="365F91"/>
+                <w:color w:val="1A1A1A"/>
                 <w:sz w:val="20"/>
               </w:rPr>
               <w:t>devpod-statefulset.yaml, devpod-runtime.sh</w:t>
@@ -1487,7 +1487,7 @@
             <w:r/>
             <w:r>
               <w:rPr>
-                <w:color w:val="365F91"/>
+                <w:color w:val="1A1A1A"/>
                 <w:sz w:val="20"/>
               </w:rPr>
               <w:t>8ba0a60</w:t>
@@ -1512,7 +1512,7 @@
             <w:r>
               <w:rPr>
                 <w:b/>
-                <w:color w:val="365F91"/>
+                <w:color w:val="173A53"/>
                 <w:sz w:val="20"/>
               </w:rPr>
               <w:t>6</w:t>
@@ -1531,7 +1531,7 @@
             <w:r/>
             <w:r>
               <w:rPr>
-                <w:color w:val="365F91"/>
+                <w:color w:val="1A1A1A"/>
                 <w:sz w:val="20"/>
               </w:rPr>
               <w:t>k8s CLI tools via mise</w:t>
@@ -1550,7 +1550,7 @@
             <w:r/>
             <w:r>
               <w:rPr>
-                <w:color w:val="365F91"/>
+                <w:color w:val="1A1A1A"/>
                 <w:sz w:val="20"/>
               </w:rPr>
               <w:t>dotfiles dot_config/mise/config.toml</w:t>
@@ -1569,7 +1569,7 @@
             <w:r/>
             <w:r>
               <w:rPr>
-                <w:color w:val="365F91"/>
+                <w:color w:val="1A1A1A"/>
                 <w:sz w:val="20"/>
               </w:rPr>
               <w:t>2dd1f99</w:t>
@@ -1594,7 +1594,7 @@
             <w:r>
               <w:rPr>
                 <w:b/>
-                <w:color w:val="365F91"/>
+                <w:color w:val="173A53"/>
                 <w:sz w:val="20"/>
               </w:rPr>
               <w:t>7</w:t>
@@ -1613,7 +1613,7 @@
             <w:r/>
             <w:r>
               <w:rPr>
-                <w:color w:val="365F91"/>
+                <w:color w:val="1A1A1A"/>
                 <w:sz w:val="20"/>
               </w:rPr>
               <w:t>Persistent SSH host keys (out-of-band Secret)</w:t>
@@ -1632,7 +1632,7 @@
             <w:r/>
             <w:r>
               <w:rPr>
-                <w:color w:val="365F91"/>
+                <w:color w:val="1A1A1A"/>
                 <w:sz w:val="20"/>
               </w:rPr>
               <w:t>kubectl; devpod-statefulset.yaml, devpod-runtime.sh, README.md</w:t>
@@ -1651,7 +1651,7 @@
             <w:r/>
             <w:r>
               <w:rPr>
-                <w:color w:val="365F91"/>
+                <w:color w:val="1A1A1A"/>
                 <w:sz w:val="20"/>
               </w:rPr>
               <w:t>9ae6231</w:t>
@@ -1783,7 +1783,7 @@
             <w:r>
               <w:rPr>
                 <w:b/>
-                <w:color w:val="365F91"/>
+                <w:color w:val="173A53"/>
                 <w:sz w:val="20"/>
               </w:rPr>
               <w:t>0989587</w:t>
@@ -1802,7 +1802,7 @@
             <w:r/>
             <w:r>
               <w:rPr>
-                <w:color w:val="365F91"/>
+                <w:color w:val="1A1A1A"/>
                 <w:sz w:val="20"/>
               </w:rPr>
               <w:t>12:30</w:t>
@@ -1821,7 +1821,7 @@
             <w:r/>
             <w:r>
               <w:rPr>
-                <w:color w:val="365F91"/>
+                <w:color w:val="1A1A1A"/>
                 <w:sz w:val="20"/>
               </w:rPr>
               <w:t>DevPod: rewrite GitHub SSH URLs to HTTPS so the token is used</w:t>
@@ -1846,7 +1846,7 @@
             <w:r>
               <w:rPr>
                 <w:b/>
-                <w:color w:val="365F91"/>
+                <w:color w:val="173A53"/>
                 <w:sz w:val="20"/>
               </w:rPr>
               <w:t>d223fb7</w:t>
@@ -1865,7 +1865,7 @@
             <w:r/>
             <w:r>
               <w:rPr>
-                <w:color w:val="365F91"/>
+                <w:color w:val="1A1A1A"/>
                 <w:sz w:val="20"/>
               </w:rPr>
               <w:t>13:25</w:t>
@@ -1884,7 +1884,7 @@
             <w:r/>
             <w:r>
               <w:rPr>
-                <w:color w:val="365F91"/>
+                <w:color w:val="1A1A1A"/>
                 <w:sz w:val="20"/>
               </w:rPr>
               <w:t>DevPod: cluster-admin service account for in-cluster kubectl</w:t>
@@ -1909,7 +1909,7 @@
             <w:r>
               <w:rPr>
                 <w:b/>
-                <w:color w:val="365F91"/>
+                <w:color w:val="173A53"/>
                 <w:sz w:val="20"/>
               </w:rPr>
               <w:t>b1017b5</w:t>
@@ -1928,7 +1928,7 @@
             <w:r/>
             <w:r>
               <w:rPr>
-                <w:color w:val="365F91"/>
+                <w:color w:val="1A1A1A"/>
                 <w:sz w:val="20"/>
               </w:rPr>
               <w:t>13:26</w:t>
@@ -1947,7 +1947,7 @@
             <w:r/>
             <w:r>
               <w:rPr>
-                <w:color w:val="365F91"/>
+                <w:color w:val="1A1A1A"/>
                 <w:sz w:val="20"/>
               </w:rPr>
               <w:t>DevPod: mount SOPS age key (out-of-band Secret devpod/sops-age) for sops in the pod</w:t>
@@ -1972,7 +1972,7 @@
             <w:r>
               <w:rPr>
                 <w:b/>
-                <w:color w:val="365F91"/>
+                <w:color w:val="173A53"/>
                 <w:sz w:val="20"/>
               </w:rPr>
               <w:t>8ba0a60</w:t>
@@ -1991,7 +1991,7 @@
             <w:r/>
             <w:r>
               <w:rPr>
-                <w:color w:val="365F91"/>
+                <w:color w:val="1A1A1A"/>
                 <w:sz w:val="20"/>
               </w:rPr>
               <w:t>13:29</w:t>
@@ -2010,7 +2010,7 @@
             <w:r/>
             <w:r>
               <w:rPr>
-                <w:color w:val="365F91"/>
+                <w:color w:val="1A1A1A"/>
                 <w:sz w:val="20"/>
               </w:rPr>
               <w:t>DevPod: make in-cluster kubectl work in SSH sessions (fsGroup, /etc/environment)</w:t>
@@ -2035,7 +2035,7 @@
             <w:r>
               <w:rPr>
                 <w:b/>
-                <w:color w:val="365F91"/>
+                <w:color w:val="173A53"/>
                 <w:sz w:val="20"/>
               </w:rPr>
               <w:t>9ae6231</w:t>
@@ -2054,7 +2054,7 @@
             <w:r/>
             <w:r>
               <w:rPr>
-                <w:color w:val="365F91"/>
+                <w:color w:val="1A1A1A"/>
                 <w:sz w:val="20"/>
               </w:rPr>
               <w:t>14:03</w:t>
@@ -2073,7 +2073,7 @@
             <w:r/>
             <w:r>
               <w:rPr>
-                <w:color w:val="365F91"/>
+                <w:color w:val="1A1A1A"/>
                 <w:sz w:val="20"/>
               </w:rPr>
               <w:t>DevPod: persistent SSH host keys from out-of-band Secret</w:t>
@@ -2098,7 +2098,7 @@
             <w:r>
               <w:rPr>
                 <w:b/>
-                <w:color w:val="365F91"/>
+                <w:color w:val="173A53"/>
                 <w:sz w:val="20"/>
               </w:rPr>
               <w:t>2dd1f99 (dotfiles)</w:t>
@@ -2117,7 +2117,7 @@
             <w:r/>
             <w:r>
               <w:rPr>
-                <w:color w:val="365F91"/>
+                <w:color w:val="1A1A1A"/>
                 <w:sz w:val="20"/>
               </w:rPr>
               <w:t>13:27</w:t>
@@ -2136,7 +2136,7 @@
             <w:r/>
             <w:r>
               <w:rPr>
-                <w:color w:val="365F91"/>
+                <w:color w:val="1A1A1A"/>
                 <w:sz w:val="20"/>
               </w:rPr>
               <w:t>mise: add flux, helm, kustomize, k9s (body: also kubectl, sops and age)</w:t>
@@ -2168,6 +2168,9 @@
         <w:t xml:space="preserve">Expected  </w:t>
       </w:r>
       <w:r>
+        <w:rPr>
+          <w:color w:val="1A1A1A"/>
+        </w:rPr>
         <w:t>Each push to the DevPod manifests restarts devpod-0 (Flux applies within about a minute). The home PVC and everything on it survive; only the SSH session drops.</w:t>
       </w:r>
     </w:p>
@@ -2276,7 +2279,7 @@
             <w:r>
               <w:rPr>
                 <w:b/>
-                <w:color w:val="365F91"/>
+                <w:color w:val="173A53"/>
                 <w:sz w:val="20"/>
               </w:rPr>
               <w:t>Tunnel</w:t>
@@ -2295,7 +2298,7 @@
             <w:r/>
             <w:r>
               <w:rPr>
-                <w:color w:val="365F91"/>
+                <w:color w:val="1A1A1A"/>
                 <w:sz w:val="20"/>
               </w:rPr>
               <w:t>skynet (a5001115-de2b-4afc-8540-af1e19ea06b9), in-cluster Deployment cloudflare/cloudflared, 2 replicas</w:t>
@@ -2320,7 +2323,7 @@
             <w:r>
               <w:rPr>
                 <w:b/>
-                <w:color w:val="365F91"/>
+                <w:color w:val="173A53"/>
                 <w:sz w:val="20"/>
               </w:rPr>
               <w:t>Ingress rules</w:t>
@@ -2339,7 +2342,7 @@
             <w:r/>
             <w:r>
               <w:rPr>
-                <w:color w:val="365F91"/>
+                <w:color w:val="1A1A1A"/>
                 <w:sz w:val="20"/>
               </w:rPr>
               <w:t>devpod-0.jameshomelab.org → tcp://devpod-0.devpod.devpod.svc.cluster.local:2222; devpod-1.jameshomelab.org → tcp://devpod-1.devpod.devpod.svc.cluster.local:2222; above the *.jameshomelab.org HTTP wildcard</w:t>
@@ -2364,7 +2367,7 @@
             <w:r>
               <w:rPr>
                 <w:b/>
-                <w:color w:val="365F91"/>
+                <w:color w:val="173A53"/>
                 <w:sz w:val="20"/>
               </w:rPr>
               <w:t>DNS</w:t>
@@ -2383,7 +2386,7 @@
             <w:r/>
             <w:r>
               <w:rPr>
-                <w:color w:val="365F91"/>
+                <w:color w:val="1A1A1A"/>
                 <w:sz w:val="20"/>
               </w:rPr>
               <w:t>Proxied CNAMEs devpod-0 and devpod-1 → a5001115-de2b-4afc-8540-af1e19ea06b9.cfargotunnel.com</w:t>
@@ -2408,7 +2411,7 @@
             <w:r>
               <w:rPr>
                 <w:b/>
-                <w:color w:val="365F91"/>
+                <w:color w:val="173A53"/>
                 <w:sz w:val="20"/>
               </w:rPr>
               <w:t>Access</w:t>
@@ -2427,7 +2430,7 @@
             <w:r/>
             <w:r>
               <w:rPr>
-                <w:color w:val="365F91"/>
+                <w:color w:val="1A1A1A"/>
                 <w:sz w:val="20"/>
               </w:rPr>
               <w:t>Self-hosted apps devpod-0 and devpod-1, both using reusable policy 'devpod access' (Allow, email james.richardson@invertedlight.com)</w:t>
@@ -2452,7 +2455,7 @@
             <w:r>
               <w:rPr>
                 <w:b/>
-                <w:color w:val="365F91"/>
+                <w:color w:val="173A53"/>
                 <w:sz w:val="20"/>
               </w:rPr>
               <w:t>Client</w:t>
@@ -2471,7 +2474,7 @@
             <w:r/>
             <w:r>
               <w:rPr>
-                <w:color w:val="365F91"/>
+                <w:color w:val="1A1A1A"/>
                 <w:sz w:val="20"/>
               </w:rPr>
               <w:t>cloudflared on the Mac + ~/.ssh/config below (IdentitiesOnly yes: the pod trusts only id_ed25519)</w:t>
@@ -2496,7 +2499,7 @@
             <w:r>
               <w:rPr>
                 <w:b/>
-                <w:color w:val="365F91"/>
+                <w:color w:val="173A53"/>
                 <w:sz w:val="20"/>
               </w:rPr>
               <w:t>2FA</w:t>
@@ -2515,7 +2518,7 @@
             <w:r/>
             <w:r>
               <w:rPr>
-                <w:color w:val="365F91"/>
+                <w:color w:val="1A1A1A"/>
                 <w:sz w:val="20"/>
               </w:rPr>
               <w:t>Cloudflare account: YubiKey, Touch ID, email, authenticator app; recovery codes in 1Password / Apple Passwords</w:t>
@@ -2559,8 +2562,9 @@
       </w:pPr>
       <w:r>
         <w:rPr>
-          <w:rFonts w:ascii="Courier New" w:hAnsi="Courier New" w:eastAsia="Courier New"/>
-          <w:sz w:val="18"/>
+          <w:rFonts w:ascii="Consolas" w:hAnsi="Consolas" w:eastAsia="Consolas"/>
+          <w:color w:val="000000"/>
+          <w:sz w:val="19"/>
         </w:rPr>
         <w:t>Host devpod-0</w:t>
         <w:br/>
@@ -2612,8 +2616,9 @@
       </w:pPr>
       <w:r>
         <w:rPr>
-          <w:rFonts w:ascii="Courier New" w:hAnsi="Courier New" w:eastAsia="Courier New"/>
-          <w:sz w:val="18"/>
+          <w:rFonts w:ascii="Consolas" w:hAnsi="Consolas" w:eastAsia="Consolas"/>
+          <w:color w:val="000000"/>
+          <w:sz w:val="19"/>
         </w:rPr>
         <w:t>{</w:t>
         <w:br/>
@@ -2697,8 +2702,9 @@
       </w:pPr>
       <w:r>
         <w:rPr>
-          <w:rFonts w:ascii="Courier New" w:hAnsi="Courier New" w:eastAsia="Courier New"/>
-          <w:sz w:val="18"/>
+          <w:rFonts w:ascii="Consolas" w:hAnsi="Consolas" w:eastAsia="Consolas"/>
+          <w:color w:val="000000"/>
+          <w:sz w:val="19"/>
         </w:rPr>
         <w:t>apiVersion: apps/v1</w:t>
         <w:br/>
@@ -3150,6 +3156,9 @@
         <w:t xml:space="preserve">Note  </w:t>
       </w:r>
       <w:r>
+        <w:rPr>
+          <w:color w:val="1A1A1A"/>
+        </w:rPr>
         <w:t>Shipped as ConfigMap devpod-bootstrap-&lt;hash&gt; by configMapGenerator, so editing it rolls the StatefulSet.</w:t>
       </w:r>
     </w:p>
@@ -3169,8 +3178,9 @@
       </w:pPr>
       <w:r>
         <w:rPr>
-          <w:rFonts w:ascii="Courier New" w:hAnsi="Courier New" w:eastAsia="Courier New"/>
-          <w:sz w:val="18"/>
+          <w:rFonts w:ascii="Consolas" w:hAnsi="Consolas" w:eastAsia="Consolas"/>
+          <w:color w:val="000000"/>
+          <w:sz w:val="19"/>
         </w:rPr>
         <w:t>#!/bin/bash</w:t>
         <w:br/>
@@ -3410,8 +3420,9 @@
       </w:pPr>
       <w:r>
         <w:rPr>
-          <w:rFonts w:ascii="Courier New" w:hAnsi="Courier New" w:eastAsia="Courier New"/>
-          <w:sz w:val="18"/>
+          <w:rFonts w:ascii="Consolas" w:hAnsi="Consolas" w:eastAsia="Consolas"/>
+          <w:color w:val="000000"/>
+          <w:sz w:val="19"/>
         </w:rPr>
         <w:t># Identity for the DevPod workspace pods (StatefulSet/devpod). kubectl inside</w:t>
         <w:br/>
@@ -3469,8 +3480,9 @@
       </w:pPr>
       <w:r>
         <w:rPr>
-          <w:rFonts w:ascii="Courier New" w:hAnsi="Courier New" w:eastAsia="Courier New"/>
-          <w:sz w:val="18"/>
+          <w:rFonts w:ascii="Consolas" w:hAnsi="Consolas" w:eastAsia="Consolas"/>
+          <w:color w:val="000000"/>
+          <w:sz w:val="19"/>
         </w:rPr>
         <w:t># Full cluster-admin for the DevPod workspace service account.</w:t>
         <w:br/>
@@ -3595,8 +3607,9 @@
       </w:pPr>
       <w:r>
         <w:rPr>
-          <w:rFonts w:ascii="Courier New" w:hAnsi="Courier New" w:eastAsia="Courier New"/>
-          <w:sz w:val="18"/>
+          <w:rFonts w:ascii="Consolas" w:hAnsi="Consolas" w:eastAsia="Consolas"/>
+          <w:color w:val="000000"/>
+          <w:sz w:val="19"/>
         </w:rPr>
         <w:t>apiVersion: kustomize.config.k8s.io/v1beta1</w:t>
         <w:br/>
@@ -3672,8 +3685,9 @@
       </w:pPr>
       <w:r>
         <w:rPr>
-          <w:rFonts w:ascii="Courier New" w:hAnsi="Courier New" w:eastAsia="Courier New"/>
-          <w:sz w:val="18"/>
+          <w:rFonts w:ascii="Consolas" w:hAnsi="Consolas" w:eastAsia="Consolas"/>
+          <w:color w:val="000000"/>
+          <w:sz w:val="19"/>
         </w:rPr>
         <w:t># System git config: helper for github.com over HTTPS, never prompt.</w:t>
         <w:br/>
@@ -3741,8 +3755,9 @@
       </w:pPr>
       <w:r>
         <w:rPr>
-          <w:rFonts w:ascii="Courier New" w:hAnsi="Courier New" w:eastAsia="Courier New"/>
-          <w:sz w:val="18"/>
+          <w:rFonts w:ascii="Consolas" w:hAnsi="Consolas" w:eastAsia="Consolas"/>
+          <w:color w:val="000000"/>
+          <w:sz w:val="19"/>
         </w:rPr>
         <w:t>[tools]</w:t>
         <w:br/>
@@ -3931,7 +3946,7 @@
             <w:r>
               <w:rPr>
                 <w:b/>
-                <w:color w:val="365F91"/>
+                <w:color w:val="173A53"/>
                 <w:sz w:val="20"/>
               </w:rPr>
               <w:t>kubectl</w:t>
@@ -3950,7 +3965,7 @@
             <w:r/>
             <w:r>
               <w:rPr>
-                <w:color w:val="365F91"/>
+                <w:color w:val="1A1A1A"/>
                 <w:sz w:val="20"/>
               </w:rPr>
               <w:t>aqua:kubernetes/kubernetes/kubectl</w:t>
@@ -3969,7 +3984,7 @@
             <w:r/>
             <w:r>
               <w:rPr>
-                <w:color w:val="365F91"/>
+                <w:color w:val="1A1A1A"/>
                 <w:sz w:val="20"/>
               </w:rPr>
               <w:t>v1.37.1</w:t>
@@ -3988,7 +4003,7 @@
             <w:r/>
             <w:r>
               <w:rPr>
-                <w:color w:val="365F91"/>
+                <w:color w:val="1A1A1A"/>
                 <w:sz w:val="20"/>
               </w:rPr>
               <w:t>kubectl version --client</w:t>
@@ -4013,7 +4028,7 @@
             <w:r>
               <w:rPr>
                 <w:b/>
-                <w:color w:val="365F91"/>
+                <w:color w:val="173A53"/>
                 <w:sz w:val="20"/>
               </w:rPr>
               <w:t>flux2</w:t>
@@ -4032,7 +4047,7 @@
             <w:r/>
             <w:r>
               <w:rPr>
-                <w:color w:val="365F91"/>
+                <w:color w:val="1A1A1A"/>
                 <w:sz w:val="20"/>
               </w:rPr>
               <w:t>aqua:fluxcd/flux2</w:t>
@@ -4051,7 +4066,7 @@
             <w:r/>
             <w:r>
               <w:rPr>
-                <w:color w:val="365F91"/>
+                <w:color w:val="1A1A1A"/>
                 <w:sz w:val="20"/>
               </w:rPr>
               <w:t>v2.9.6</w:t>
@@ -4070,7 +4085,7 @@
             <w:r/>
             <w:r>
               <w:rPr>
-                <w:color w:val="365F91"/>
+                <w:color w:val="1A1A1A"/>
                 <w:sz w:val="20"/>
               </w:rPr>
               <w:t>flux version --client</w:t>
@@ -4095,7 +4110,7 @@
             <w:r>
               <w:rPr>
                 <w:b/>
-                <w:color w:val="365F91"/>
+                <w:color w:val="173A53"/>
                 <w:sz w:val="20"/>
               </w:rPr>
               <w:t>helm</w:t>
@@ -4114,7 +4129,7 @@
             <w:r/>
             <w:r>
               <w:rPr>
-                <w:color w:val="365F91"/>
+                <w:color w:val="1A1A1A"/>
                 <w:sz w:val="20"/>
               </w:rPr>
               <w:t>aqua:helm/helm</w:t>
@@ -4133,7 +4148,7 @@
             <w:r/>
             <w:r>
               <w:rPr>
-                <w:color w:val="365F91"/>
+                <w:color w:val="1A1A1A"/>
                 <w:sz w:val="20"/>
               </w:rPr>
               <w:t>v4.3.0</w:t>
@@ -4152,7 +4167,7 @@
             <w:r/>
             <w:r>
               <w:rPr>
-                <w:color w:val="365F91"/>
+                <w:color w:val="1A1A1A"/>
                 <w:sz w:val="20"/>
               </w:rPr>
               <w:t>helm version</w:t>
@@ -4177,7 +4192,7 @@
             <w:r>
               <w:rPr>
                 <w:b/>
-                <w:color w:val="365F91"/>
+                <w:color w:val="173A53"/>
                 <w:sz w:val="20"/>
               </w:rPr>
               <w:t>kustomize</w:t>
@@ -4196,7 +4211,7 @@
             <w:r/>
             <w:r>
               <w:rPr>
-                <w:color w:val="365F91"/>
+                <w:color w:val="1A1A1A"/>
                 <w:sz w:val="20"/>
               </w:rPr>
               <w:t>aqua:kubernetes-sigs/kustomize</w:t>
@@ -4215,7 +4230,7 @@
             <w:r/>
             <w:r>
               <w:rPr>
-                <w:color w:val="365F91"/>
+                <w:color w:val="1A1A1A"/>
                 <w:sz w:val="20"/>
               </w:rPr>
               <w:t>v5.8.2</w:t>
@@ -4234,7 +4249,7 @@
             <w:r/>
             <w:r>
               <w:rPr>
-                <w:color w:val="365F91"/>
+                <w:color w:val="1A1A1A"/>
                 <w:sz w:val="20"/>
               </w:rPr>
               <w:t>kustomize version</w:t>
@@ -4259,7 +4274,7 @@
             <w:r>
               <w:rPr>
                 <w:b/>
-                <w:color w:val="365F91"/>
+                <w:color w:val="173A53"/>
                 <w:sz w:val="20"/>
               </w:rPr>
               <w:t>k9s</w:t>
@@ -4278,7 +4293,7 @@
             <w:r/>
             <w:r>
               <w:rPr>
-                <w:color w:val="365F91"/>
+                <w:color w:val="1A1A1A"/>
                 <w:sz w:val="20"/>
               </w:rPr>
               <w:t>aqua:derailed/k9s</w:t>
@@ -4297,7 +4312,7 @@
             <w:r/>
             <w:r>
               <w:rPr>
-                <w:color w:val="365F91"/>
+                <w:color w:val="1A1A1A"/>
                 <w:sz w:val="20"/>
               </w:rPr>
               <w:t>v0.51.0</w:t>
@@ -4316,7 +4331,7 @@
             <w:r/>
             <w:r>
               <w:rPr>
-                <w:color w:val="365F91"/>
+                <w:color w:val="1A1A1A"/>
                 <w:sz w:val="20"/>
               </w:rPr>
               <w:t>k9s version</w:t>
@@ -4341,7 +4356,7 @@
             <w:r>
               <w:rPr>
                 <w:b/>
-                <w:color w:val="365F91"/>
+                <w:color w:val="173A53"/>
                 <w:sz w:val="20"/>
               </w:rPr>
               <w:t>sops</w:t>
@@ -4360,7 +4375,7 @@
             <w:r/>
             <w:r>
               <w:rPr>
-                <w:color w:val="365F91"/>
+                <w:color w:val="1A1A1A"/>
                 <w:sz w:val="20"/>
               </w:rPr>
               <w:t>aqua:getsops/sops</w:t>
@@ -4379,7 +4394,7 @@
             <w:r/>
             <w:r>
               <w:rPr>
-                <w:color w:val="365F91"/>
+                <w:color w:val="1A1A1A"/>
                 <w:sz w:val="20"/>
               </w:rPr>
               <w:t>3.13.3</w:t>
@@ -4398,7 +4413,7 @@
             <w:r/>
             <w:r>
               <w:rPr>
-                <w:color w:val="365F91"/>
+                <w:color w:val="1A1A1A"/>
                 <w:sz w:val="20"/>
               </w:rPr>
               <w:t>sops --version</w:t>
@@ -4423,7 +4438,7 @@
             <w:r>
               <w:rPr>
                 <w:b/>
-                <w:color w:val="365F91"/>
+                <w:color w:val="173A53"/>
                 <w:sz w:val="20"/>
               </w:rPr>
               <w:t>age</w:t>
@@ -4442,7 +4457,7 @@
             <w:r/>
             <w:r>
               <w:rPr>
-                <w:color w:val="365F91"/>
+                <w:color w:val="1A1A1A"/>
                 <w:sz w:val="20"/>
               </w:rPr>
               <w:t>aqua:FiloSottile/age</w:t>
@@ -4461,7 +4476,7 @@
             <w:r/>
             <w:r>
               <w:rPr>
-                <w:color w:val="365F91"/>
+                <w:color w:val="1A1A1A"/>
                 <w:sz w:val="20"/>
               </w:rPr>
               <w:t>v1.3.2</w:t>
@@ -4480,7 +4495,7 @@
             <w:r/>
             <w:r>
               <w:rPr>
-                <w:color w:val="365F91"/>
+                <w:color w:val="1A1A1A"/>
                 <w:sz w:val="20"/>
               </w:rPr>
               <w:t>age --version</w:t>
@@ -4523,8 +4538,9 @@
       </w:pPr>
       <w:r>
         <w:rPr>
-          <w:rFonts w:ascii="Courier New" w:hAnsi="Courier New" w:eastAsia="Courier New"/>
-          <w:sz w:val="18"/>
+          <w:rFonts w:ascii="Consolas" w:hAnsi="Consolas" w:eastAsia="Consolas"/>
+          <w:color w:val="000000"/>
+          <w:sz w:val="19"/>
         </w:rPr>
         <w:t># DevPod namespace</w:t>
         <w:br/>
@@ -4764,8 +4780,9 @@
       </w:pPr>
       <w:r>
         <w:rPr>
-          <w:rFonts w:ascii="Courier New" w:hAnsi="Courier New" w:eastAsia="Courier New"/>
-          <w:sz w:val="18"/>
+          <w:rFonts w:ascii="Consolas" w:hAnsi="Consolas" w:eastAsia="Consolas"/>
+          <w:color w:val="000000"/>
+          <w:sz w:val="19"/>
         </w:rPr>
         <w:t>kubectl get secret sops-age -n flux-system -o json \</w:t>
         <w:br/>
@@ -4795,6 +4812,9 @@
         <w:ind w:left="115" w:right="86"/>
       </w:pPr>
       <w:r>
+        <w:rPr>
+          <w:color w:val="1A1A1A"/>
+        </w:rPr>
         <w:t>kubectl create (not apply) avoids a last-applied-configuration annotation that would hold a second copy of the key. To remove the key from the pods: kubectl -n devpod delete secret sops-age, then restart the StatefulSet.</w:t>
       </w:r>
     </w:p>
@@ -4929,7 +4949,7 @@
             <w:r>
               <w:rPr>
                 <w:b/>
-                <w:color w:val="365F91"/>
+                <w:color w:val="173A53"/>
                 <w:sz w:val="20"/>
               </w:rPr>
               <w:t>ssh_host_ed25519_key(.pub)</w:t>
@@ -4948,7 +4968,7 @@
             <w:r/>
             <w:r>
               <w:rPr>
-                <w:color w:val="365F91"/>
+                <w:color w:val="1A1A1A"/>
                 <w:sz w:val="20"/>
               </w:rPr>
               <w:t>ED25519 256</w:t>
@@ -4967,7 +4987,7 @@
             <w:r/>
             <w:r>
               <w:rPr>
-                <w:color w:val="365F91"/>
+                <w:color w:val="1A1A1A"/>
                 <w:sz w:val="20"/>
               </w:rPr>
               <w:t>SHA256:LofwfAOeWEyde5UMKRAR53ka7v0Mt5Kmjvo+3uWDl0o</w:t>
@@ -4992,7 +5012,7 @@
             <w:r>
               <w:rPr>
                 <w:b/>
-                <w:color w:val="365F91"/>
+                <w:color w:val="173A53"/>
                 <w:sz w:val="20"/>
               </w:rPr>
               <w:t>ssh_host_rsa_key(.pub)</w:t>
@@ -5011,7 +5031,7 @@
             <w:r/>
             <w:r>
               <w:rPr>
-                <w:color w:val="365F91"/>
+                <w:color w:val="1A1A1A"/>
                 <w:sz w:val="20"/>
               </w:rPr>
               <w:t>RSA 4096</w:t>
@@ -5030,7 +5050,7 @@
             <w:r/>
             <w:r>
               <w:rPr>
-                <w:color w:val="365F91"/>
+                <w:color w:val="1A1A1A"/>
                 <w:sz w:val="20"/>
               </w:rPr>
               <w:t>SHA256:VZ6LmqLvRJ9yKruXlJABfpAj2Gsh8uxUzPu03G11iY0</w:t>
@@ -5055,7 +5075,7 @@
             <w:r>
               <w:rPr>
                 <w:b/>
-                <w:color w:val="365F91"/>
+                <w:color w:val="173A53"/>
                 <w:sz w:val="20"/>
               </w:rPr>
               <w:t>ssh_host_ecdsa_key(.pub)</w:t>
@@ -5074,7 +5094,7 @@
             <w:r/>
             <w:r>
               <w:rPr>
-                <w:color w:val="365F91"/>
+                <w:color w:val="1A1A1A"/>
                 <w:sz w:val="20"/>
               </w:rPr>
               <w:t>ECDSA 256</w:t>
@@ -5093,7 +5113,7 @@
             <w:r/>
             <w:r>
               <w:rPr>
-                <w:color w:val="365F91"/>
+                <w:color w:val="1A1A1A"/>
                 <w:sz w:val="20"/>
               </w:rPr>
               <w:t>SHA256:btqn6AL1GRF6jswoU9xhGFtHUaCHYwGQC0aMPTh259I</w:t>
@@ -5154,8 +5174,9 @@
       </w:pPr>
       <w:r>
         <w:rPr>
-          <w:rFonts w:ascii="Courier New" w:hAnsi="Courier New" w:eastAsia="Courier New"/>
-          <w:sz w:val="18"/>
+          <w:rFonts w:ascii="Consolas" w:hAnsi="Consolas" w:eastAsia="Consolas"/>
+          <w:color w:val="000000"/>
+          <w:sz w:val="19"/>
         </w:rPr>
         <w:t>bash -c '</w:t>
         <w:br/>
@@ -5207,8 +5228,9 @@
       </w:pPr>
       <w:r>
         <w:rPr>
-          <w:rFonts w:ascii="Courier New" w:hAnsi="Courier New" w:eastAsia="Courier New"/>
-          <w:sz w:val="18"/>
+          <w:rFonts w:ascii="Consolas" w:hAnsi="Consolas" w:eastAsia="Consolas"/>
+          <w:color w:val="000000"/>
+          <w:sz w:val="19"/>
         </w:rPr>
         <w:t>### SSH host keys (`Secret devpod/devpod-ssh-host-keys`, not in Git)</w:t>
         <w:br/>
@@ -5267,8 +5289,9 @@
       </w:pPr>
       <w:r>
         <w:rPr>
-          <w:rFonts w:ascii="Courier New" w:hAnsi="Courier New" w:eastAsia="Courier New"/>
-          <w:sz w:val="18"/>
+          <w:rFonts w:ascii="Consolas" w:hAnsi="Consolas" w:eastAsia="Consolas"/>
+          <w:color w:val="000000"/>
+          <w:sz w:val="19"/>
         </w:rPr>
         <w:t>cp -p ~/.ssh/known_hosts ~/.ssh/known_hosts.bak-20261003-hostkeys</w:t>
         <w:br/>
@@ -5387,7 +5410,7 @@
             <w:r>
               <w:rPr>
                 <w:b/>
-                <w:color w:val="365F91"/>
+                <w:color w:val="173A53"/>
                 <w:sz w:val="20"/>
               </w:rPr>
               <w:t>Flux apps lastAppliedRevision</w:t>
@@ -5406,7 +5429,7 @@
             <w:r/>
             <w:r>
               <w:rPr>
-                <w:color w:val="365F91"/>
+                <w:color w:val="1A1A1A"/>
                 <w:sz w:val="20"/>
               </w:rPr>
               <w:t>main@sha1:8ba0a6023a1f3f48bbc80e07dc5fe8de1ea597a6</w:t>
@@ -5431,7 +5454,7 @@
             <w:r>
               <w:rPr>
                 <w:b/>
-                <w:color w:val="365F91"/>
+                <w:color w:val="173A53"/>
                 <w:sz w:val="20"/>
               </w:rPr>
               <w:t>devpod-0</w:t>
@@ -5450,7 +5473,7 @@
             <w:r/>
             <w:r>
               <w:rPr>
-                <w:color w:val="365F91"/>
+                <w:color w:val="1A1A1A"/>
                 <w:sz w:val="20"/>
               </w:rPr>
               <w:t>Recreated 13:30 CT, Ready; serviceAccountName devpod; fsGroup 1000; sshd listening on 2222</w:t>
@@ -5475,7 +5498,7 @@
             <w:r>
               <w:rPr>
                 <w:b/>
-                <w:color w:val="365F91"/>
+                <w:color w:val="173A53"/>
                 <w:sz w:val="20"/>
               </w:rPr>
               <w:t>kubectl auth can-i '*' '*' --as=system:serviceaccount:devpod:devpod</w:t>
@@ -5494,7 +5517,7 @@
             <w:r/>
             <w:r>
               <w:rPr>
-                <w:color w:val="365F91"/>
+                <w:color w:val="1A1A1A"/>
                 <w:sz w:val="20"/>
               </w:rPr>
               <w:t>yes</w:t>
@@ -5519,7 +5542,7 @@
             <w:r>
               <w:rPr>
                 <w:b/>
-                <w:color w:val="365F91"/>
+                <w:color w:val="173A53"/>
                 <w:sz w:val="20"/>
               </w:rPr>
               <w:t>SA token in pod</w:t>
@@ -5538,7 +5561,7 @@
             <w:r/>
             <w:r>
               <w:rPr>
-                <w:color w:val="365F91"/>
+                <w:color w:val="1A1A1A"/>
                 <w:sz w:val="20"/>
               </w:rPr>
               <w:t>-rw-r----- 1 root vscode 1161 …/serviceaccount/token</w:t>
@@ -5563,7 +5586,7 @@
             <w:r>
               <w:rPr>
                 <w:b/>
-                <w:color w:val="365F91"/>
+                <w:color w:val="173A53"/>
                 <w:sz w:val="20"/>
               </w:rPr>
               <w:t>/etc/environment keys</w:t>
@@ -5582,7 +5605,7 @@
             <w:r/>
             <w:r>
               <w:rPr>
-                <w:color w:val="365F91"/>
+                <w:color w:val="1A1A1A"/>
                 <w:sz w:val="20"/>
               </w:rPr>
               <w:t>KUBERNETES_SERVICE_HOST, KUBERNETES_SERVICE_PORT, SOPS_AGE_KEY_FILE</w:t>
@@ -5607,7 +5630,7 @@
             <w:r>
               <w:rPr>
                 <w:b/>
-                <w:color w:val="365F91"/>
+                <w:color w:val="173A53"/>
                 <w:sz w:val="20"/>
               </w:rPr>
               <w:t>Pod log</w:t>
@@ -5626,7 +5649,7 @@
             <w:r/>
             <w:r>
               <w:rPr>
-                <w:color w:val="365F91"/>
+                <w:color w:val="1A1A1A"/>
                 <w:sz w:val="20"/>
               </w:rPr>
               <w:t>devpod-runtime: GitHub token present · devpod-runtime: SOPS age key present</w:t>
@@ -5651,7 +5674,7 @@
             <w:r>
               <w:rPr>
                 <w:b/>
-                <w:color w:val="365F91"/>
+                <w:color w:val="173A53"/>
                 <w:sz w:val="20"/>
               </w:rPr>
               <w:t>vscode: kubectl get nodes</w:t>
@@ -5670,7 +5693,7 @@
             <w:r/>
             <w:r>
               <w:rPr>
-                <w:color w:val="365F91"/>
+                <w:color w:val="1A1A1A"/>
                 <w:sz w:val="20"/>
               </w:rPr>
               <w:t>6 nodes Ready (skynet-cp-01..03, skynet-wrk-01..03), v1.36.3+k3s1</w:t>
@@ -5695,7 +5718,7 @@
             <w:r>
               <w:rPr>
                 <w:b/>
-                <w:color w:val="365F91"/>
+                <w:color w:val="173A53"/>
                 <w:sz w:val="20"/>
               </w:rPr>
               <w:t>SSH from M5 via Cloudflare</w:t>
@@ -5714,7 +5737,7 @@
             <w:r/>
             <w:r>
               <w:rPr>
-                <w:color w:val="365F91"/>
+                <w:color w:val="1A1A1A"/>
                 <w:sz w:val="20"/>
               </w:rPr>
               <w:t>hostname devpod-0; SOPS_AGE_KEY_FILE=/run/devpod-sops/keys.txt; 6 nodes; can-i delete pvc -A = yes; flux v2.9.6</w:t>
@@ -5739,7 +5762,7 @@
             <w:r>
               <w:rPr>
                 <w:b/>
-                <w:color w:val="365F91"/>
+                <w:color w:val="173A53"/>
                 <w:sz w:val="20"/>
               </w:rPr>
               <w:t>chezmoi update + mise install</w:t>
@@ -5758,7 +5781,7 @@
             <w:r/>
             <w:r>
               <w:rPr>
-                <w:color w:val="365F91"/>
+                <w:color w:val="1A1A1A"/>
                 <w:sz w:val="20"/>
               </w:rPr>
               <w:t>exit 0 at dotfiles 2dd1f99; 6 new tools installed (kubectl already present)</w:t>
@@ -5783,7 +5806,7 @@
             <w:r>
               <w:rPr>
                 <w:b/>
-                <w:color w:val="365F91"/>
+                <w:color w:val="173A53"/>
                 <w:sz w:val="20"/>
               </w:rPr>
               <w:t>sops -d apps/staging/devpod/github-credentials.yaml</w:t>
@@ -5802,7 +5825,7 @@
             <w:r/>
             <w:r>
               <w:rPr>
-                <w:color w:val="365F91"/>
+                <w:color w:val="1A1A1A"/>
                 <w:sz w:val="20"/>
               </w:rPr>
               <w:t>exit 0 → Secret devpod/github-credentials, keys token, username (values not printed)</w:t>
@@ -5827,7 +5850,7 @@
             <w:r>
               <w:rPr>
                 <w:b/>
-                <w:color w:val="365F91"/>
+                <w:color w:val="173A53"/>
                 <w:sz w:val="20"/>
               </w:rPr>
               <w:t>Host keys: Flux rollout of 9ae6231</w:t>
@@ -5846,7 +5869,7 @@
             <w:r/>
             <w:r>
               <w:rPr>
-                <w:color w:val="365F91"/>
+                <w:color w:val="1A1A1A"/>
                 <w:sz w:val="20"/>
               </w:rPr>
               <w:t>devpod-0 recreated 14:04 CT; log 'devpod-runtime: persistent SSH host keys installed'; /etc/ssh keys 0600, .pub 0644 root</w:t>
@@ -5871,7 +5894,7 @@
             <w:r>
               <w:rPr>
                 <w:b/>
-                <w:color w:val="365F91"/>
+                <w:color w:val="173A53"/>
                 <w:sz w:val="20"/>
               </w:rPr>
               <w:t>Host keys served by sshd (ssh-keyscan -p 2222 127.0.0.1)</w:t>
@@ -5890,7 +5913,7 @@
             <w:r/>
             <w:r>
               <w:rPr>
-                <w:color w:val="365F91"/>
+                <w:color w:val="1A1A1A"/>
                 <w:sz w:val="20"/>
               </w:rPr>
               <w:t>ED25519 LofwfAOe…l0o · RSA VZ6LmqLv…iY0 · ECDSA btqn6AL1…59I = Secret</w:t>
@@ -5915,7 +5938,7 @@
             <w:r>
               <w:rPr>
                 <w:b/>
-                <w:color w:val="365F91"/>
+                <w:color w:val="173A53"/>
                 <w:sz w:val="20"/>
               </w:rPr>
               <w:t>After kubectl delete pod devpod-0 (pod only)</w:t>
@@ -5934,7 +5957,7 @@
             <w:r/>
             <w:r>
               <w:rPr>
-                <w:color w:val="365F91"/>
+                <w:color w:val="1A1A1A"/>
                 <w:sz w:val="20"/>
               </w:rPr>
               <w:t>Recreated 14:06 CT; same three fingerprints; PVCs untouched</w:t>
@@ -5959,7 +5982,7 @@
             <w:r>
               <w:rPr>
                 <w:b/>
-                <w:color w:val="365F91"/>
+                <w:color w:val="173A53"/>
                 <w:sz w:val="20"/>
               </w:rPr>
               <w:t>M5: ssh devpod-0 true</w:t>
@@ -5978,7 +6001,7 @@
             <w:r/>
             <w:r>
               <w:rPr>
-                <w:color w:val="365F91"/>
+                <w:color w:val="1A1A1A"/>
                 <w:sz w:val="20"/>
               </w:rPr>
               <w:t>exit 0 with StrictHostKeyChecking ask (no prompt, no warning)</w:t>
@@ -6003,7 +6026,7 @@
             <w:r>
               <w:rPr>
                 <w:b/>
-                <w:color w:val="365F91"/>
+                <w:color w:val="173A53"/>
                 <w:sz w:val="20"/>
               </w:rPr>
               <w:t>PVCs</w:t>
@@ -6022,7 +6045,7 @@
             <w:r/>
             <w:r>
               <w:rPr>
-                <w:color w:val="365F91"/>
+                <w:color w:val="1A1A1A"/>
                 <w:sz w:val="20"/>
               </w:rPr>
               <w:t>home-devpod-0, devpod-scratch, devpod-default-de-115ea all Bound, untouched</w:t>
@@ -6045,8 +6068,9 @@
       </w:pPr>
       <w:r>
         <w:rPr>
-          <w:rFonts w:ascii="Courier New" w:hAnsi="Courier New" w:eastAsia="Courier New"/>
-          <w:sz w:val="18"/>
+          <w:rFonts w:ascii="Consolas" w:hAnsi="Consolas" w:eastAsia="Consolas"/>
+          <w:color w:val="000000"/>
+          <w:sz w:val="19"/>
         </w:rPr>
         <w:t>$ kubectl -n devpod exec devpod-0 -c workspace -- sh -c 'ssh-keyscan -p 2222 127.0.0.1 2&gt;/dev/null | ssh-keygen -lf -'</w:t>
         <w:br/>
@@ -6070,8 +6094,9 @@
       </w:pPr>
       <w:r>
         <w:rPr>
-          <w:rFonts w:ascii="Courier New" w:hAnsi="Courier New" w:eastAsia="Courier New"/>
-          <w:sz w:val="18"/>
+          <w:rFonts w:ascii="Consolas" w:hAnsi="Consolas" w:eastAsia="Consolas"/>
+          <w:color w:val="000000"/>
+          <w:sz w:val="19"/>
         </w:rPr>
         <w:t>$ su - vscode -c 'kubectl get nodes'</w:t>
         <w:br/>
@@ -6216,7 +6241,7 @@
             <w:r>
               <w:rPr>
                 <w:b/>
-                <w:color w:val="365F91"/>
+                <w:color w:val="173A53"/>
                 <w:sz w:val="20"/>
               </w:rPr>
               <w:t>SSH host keys regenerated on every restart (ssh-keygen -A on the container filesystem)</w:t>
@@ -6235,7 +6260,7 @@
             <w:r/>
             <w:r>
               <w:rPr>
-                <w:color w:val="365F91"/>
+                <w:color w:val="1A1A1A"/>
                 <w:sz w:val="20"/>
               </w:rPr>
               <w:t>After any rollout: 'REMOTE HOST IDENTIFICATION HAS CHANGED' / Host key verification failed</w:t>
@@ -6254,7 +6279,7 @@
             <w:r/>
             <w:r>
               <w:rPr>
-                <w:color w:val="365F91"/>
+                <w:color w:val="1A1A1A"/>
                 <w:sz w:val="20"/>
               </w:rPr>
               <w:t>RESOLVED in 9ae6231 (section 15): keys come from Secret devpod-ssh-host-keys. Only after a deliberate key rotation: ssh-keygen -R devpod-0 / devpod-1 and re-add.</w:t>
@@ -6279,7 +6304,7 @@
             <w:r>
               <w:rPr>
                 <w:b/>
-                <w:color w:val="365F91"/>
+                <w:color w:val="173A53"/>
                 <w:sz w:val="20"/>
               </w:rPr>
               <w:t>GH_TOKEN not set in zsh login shells (/etc/profile.d/devpod-github.sh is never read by zsh)</w:t>
@@ -6298,7 +6323,7 @@
             <w:r/>
             <w:r>
               <w:rPr>
-                <w:color w:val="365F91"/>
+                <w:color w:val="1A1A1A"/>
                 <w:sz w:val="20"/>
               </w:rPr>
               <w:t>gh CLI not authenticated; git is fine (credential helper)</w:t>
@@ -6317,7 +6342,7 @@
             <w:r/>
             <w:r>
               <w:rPr>
-                <w:color w:val="365F91"/>
+                <w:color w:val="1A1A1A"/>
                 <w:sz w:val="20"/>
               </w:rPr>
               <w:t>Move GH_TOKEN to /etc/environment or a zsh-read file (not done).</w:t>
@@ -6457,7 +6482,7 @@
             <w:r>
               <w:rPr>
                 <w:b/>
-                <w:color w:val="365F91"/>
+                <w:color w:val="173A53"/>
                 <w:sz w:val="20"/>
               </w:rPr>
               <w:t>1</w:t>
@@ -6476,7 +6501,7 @@
             <w:r/>
             <w:r>
               <w:rPr>
-                <w:color w:val="365F91"/>
+                <w:color w:val="1A1A1A"/>
                 <w:sz w:val="20"/>
               </w:rPr>
               <w:t>apps/base/devpod/serviceaccount-devpod.yaml</w:t>
@@ -6495,7 +6520,7 @@
             <w:r/>
             <w:r>
               <w:rPr>
-                <w:color w:val="365F91"/>
+                <w:color w:val="1A1A1A"/>
                 <w:sz w:val="20"/>
               </w:rPr>
               <w:t>Section 8</w:t>
@@ -6520,7 +6545,7 @@
             <w:r>
               <w:rPr>
                 <w:b/>
-                <w:color w:val="365F91"/>
+                <w:color w:val="173A53"/>
                 <w:sz w:val="20"/>
               </w:rPr>
               <w:t>2</w:t>
@@ -6539,7 +6564,7 @@
             <w:r/>
             <w:r>
               <w:rPr>
-                <w:color w:val="365F91"/>
+                <w:color w:val="1A1A1A"/>
                 <w:sz w:val="20"/>
               </w:rPr>
               <w:t>apps/base/devpod/clusterrolebinding-devpod-admin.yaml</w:t>
@@ -6558,7 +6583,7 @@
             <w:r/>
             <w:r>
               <w:rPr>
-                <w:color w:val="365F91"/>
+                <w:color w:val="1A1A1A"/>
                 <w:sz w:val="20"/>
               </w:rPr>
               <w:t>Section 9</w:t>
@@ -6583,7 +6608,7 @@
             <w:r>
               <w:rPr>
                 <w:b/>
-                <w:color w:val="365F91"/>
+                <w:color w:val="173A53"/>
                 <w:sz w:val="20"/>
               </w:rPr>
               <w:t>3</w:t>
@@ -6602,7 +6627,7 @@
             <w:r/>
             <w:r>
               <w:rPr>
-                <w:color w:val="365F91"/>
+                <w:color w:val="1A1A1A"/>
                 <w:sz w:val="20"/>
               </w:rPr>
               <w:t>apps/base/devpod/kustomization.yaml</w:t>
@@ -6621,7 +6646,7 @@
             <w:r/>
             <w:r>
               <w:rPr>
-                <w:color w:val="365F91"/>
+                <w:color w:val="1A1A1A"/>
                 <w:sz w:val="20"/>
               </w:rPr>
               <w:t>Section 10</w:t>
@@ -6646,7 +6671,7 @@
             <w:r>
               <w:rPr>
                 <w:b/>
-                <w:color w:val="365F91"/>
+                <w:color w:val="173A53"/>
                 <w:sz w:val="20"/>
               </w:rPr>
               <w:t>4</w:t>
@@ -6665,7 +6690,7 @@
             <w:r/>
             <w:r>
               <w:rPr>
-                <w:color w:val="365F91"/>
+                <w:color w:val="1A1A1A"/>
                 <w:sz w:val="20"/>
               </w:rPr>
               <w:t>apps/base/devpod/bootstrap/devpod-runtime.sh (mode 0755)</w:t>
@@ -6684,7 +6709,7 @@
             <w:r/>
             <w:r>
               <w:rPr>
-                <w:color w:val="365F91"/>
+                <w:color w:val="1A1A1A"/>
                 <w:sz w:val="20"/>
               </w:rPr>
               <w:t>Section 7</w:t>
@@ -6709,7 +6734,7 @@
             <w:r>
               <w:rPr>
                 <w:b/>
-                <w:color w:val="365F91"/>
+                <w:color w:val="173A53"/>
                 <w:sz w:val="20"/>
               </w:rPr>
               <w:t>5</w:t>
@@ -6728,7 +6753,7 @@
             <w:r/>
             <w:r>
               <w:rPr>
-                <w:color w:val="365F91"/>
+                <w:color w:val="1A1A1A"/>
                 <w:sz w:val="20"/>
               </w:rPr>
               <w:t>apps/base/devpod/devpod-statefulset.yaml</w:t>
@@ -6747,7 +6772,7 @@
             <w:r/>
             <w:r>
               <w:rPr>
-                <w:color w:val="365F91"/>
+                <w:color w:val="1A1A1A"/>
                 <w:sz w:val="20"/>
               </w:rPr>
               <w:t>Section 6</w:t>
@@ -6772,7 +6797,7 @@
             <w:r>
               <w:rPr>
                 <w:b/>
-                <w:color w:val="365F91"/>
+                <w:color w:val="173A53"/>
                 <w:sz w:val="20"/>
               </w:rPr>
               <w:t>6</w:t>
@@ -6791,7 +6816,7 @@
             <w:r/>
             <w:r>
               <w:rPr>
-                <w:color w:val="365F91"/>
+                <w:color w:val="1A1A1A"/>
                 <w:sz w:val="20"/>
               </w:rPr>
               <w:t>apps/base/devpod/README.md</w:t>
@@ -6810,7 +6835,7 @@
             <w:r/>
             <w:r>
               <w:rPr>
-                <w:color w:val="365F91"/>
+                <w:color w:val="1A1A1A"/>
                 <w:sz w:val="20"/>
               </w:rPr>
               <w:t>Section 13</w:t>
@@ -6835,7 +6860,7 @@
             <w:r>
               <w:rPr>
                 <w:b/>
-                <w:color w:val="365F91"/>
+                <w:color w:val="173A53"/>
                 <w:sz w:val="20"/>
               </w:rPr>
               <w:t>7</w:t>
@@ -6854,7 +6879,7 @@
             <w:r/>
             <w:r>
               <w:rPr>
-                <w:color w:val="365F91"/>
+                <w:color w:val="1A1A1A"/>
                 <w:sz w:val="20"/>
               </w:rPr>
               <w:t>Commit + push; flux reconcile; wait for devpod-0 Ready</w:t>
@@ -6873,7 +6898,7 @@
             <w:r/>
             <w:r>
               <w:rPr>
-                <w:color w:val="365F91"/>
+                <w:color w:val="1A1A1A"/>
                 <w:sz w:val="20"/>
               </w:rPr>
               <w:t>Appendix B.2</w:t>
@@ -6898,7 +6923,7 @@
             <w:r>
               <w:rPr>
                 <w:b/>
-                <w:color w:val="365F91"/>
+                <w:color w:val="173A53"/>
                 <w:sz w:val="20"/>
               </w:rPr>
               <w:t>8</w:t>
@@ -6917,7 +6942,7 @@
             <w:r/>
             <w:r>
               <w:rPr>
-                <w:color w:val="365F91"/>
+                <w:color w:val="1A1A1A"/>
                 <w:sz w:val="20"/>
               </w:rPr>
               <w:t>Secret devpod/sops-age by kubectl (then restart the StatefulSet)</w:t>
@@ -6936,7 +6961,7 @@
             <w:r/>
             <w:r>
               <w:rPr>
-                <w:color w:val="365F91"/>
+                <w:color w:val="1A1A1A"/>
                 <w:sz w:val="20"/>
               </w:rPr>
               <w:t>Section 14</w:t>
@@ -6961,7 +6986,7 @@
             <w:r>
               <w:rPr>
                 <w:b/>
-                <w:color w:val="365F91"/>
+                <w:color w:val="173A53"/>
                 <w:sz w:val="20"/>
               </w:rPr>
               <w:t>8a</w:t>
@@ -6980,7 +7005,7 @@
             <w:r/>
             <w:r>
               <w:rPr>
-                <w:color w:val="365F91"/>
+                <w:color w:val="1A1A1A"/>
                 <w:sz w:val="20"/>
               </w:rPr>
               <w:t>Secret devpod/devpod-ssh-host-keys by kubectl (section 15; then restart the StatefulSet)</w:t>
@@ -6999,7 +7024,7 @@
             <w:r/>
             <w:r>
               <w:rPr>
-                <w:color w:val="365F91"/>
+                <w:color w:val="1A1A1A"/>
                 <w:sz w:val="20"/>
               </w:rPr>
               <w:t>Section 15</w:t>
@@ -7024,7 +7049,7 @@
             <w:r>
               <w:rPr>
                 <w:b/>
-                <w:color w:val="365F91"/>
+                <w:color w:val="173A53"/>
                 <w:sz w:val="20"/>
               </w:rPr>
               <w:t>9</w:t>
@@ -7043,7 +7068,7 @@
             <w:r/>
             <w:r>
               <w:rPr>
-                <w:color w:val="365F91"/>
+                <w:color w:val="1A1A1A"/>
                 <w:sz w:val="20"/>
               </w:rPr>
               <w:t>Dotfiles dot_config/mise/config.toml; chezmoi update &amp;&amp; mise install</w:t>
@@ -7062,7 +7087,7 @@
             <w:r/>
             <w:r>
               <w:rPr>
-                <w:color w:val="365F91"/>
+                <w:color w:val="1A1A1A"/>
                 <w:sz w:val="20"/>
               </w:rPr>
               <w:t>Section 12</w:t>
@@ -7087,7 +7112,7 @@
             <w:r>
               <w:rPr>
                 <w:b/>
-                <w:color w:val="365F91"/>
+                <w:color w:val="173A53"/>
                 <w:sz w:val="20"/>
               </w:rPr>
               <w:t>10</w:t>
@@ -7106,7 +7131,7 @@
             <w:r/>
             <w:r>
               <w:rPr>
-                <w:color w:val="365F91"/>
+                <w:color w:val="1A1A1A"/>
                 <w:sz w:val="20"/>
               </w:rPr>
               <w:t>Cloudflare ingress, DNS, Access; ~/.ssh/config on the Mac</w:t>
@@ -7125,7 +7150,7 @@
             <w:r/>
             <w:r>
               <w:rPr>
-                <w:color w:val="365F91"/>
+                <w:color w:val="1A1A1A"/>
                 <w:sz w:val="20"/>
               </w:rPr>
               <w:t>Sections 4-5 + Cloudflare guide</w:t>
@@ -7150,7 +7175,7 @@
             <w:r>
               <w:rPr>
                 <w:b/>
-                <w:color w:val="365F91"/>
+                <w:color w:val="173A53"/>
                 <w:sz w:val="20"/>
               </w:rPr>
               <w:t>11</w:t>
@@ -7169,7 +7194,7 @@
             <w:r/>
             <w:r>
               <w:rPr>
-                <w:color w:val="365F91"/>
+                <w:color w:val="1A1A1A"/>
                 <w:sz w:val="20"/>
               </w:rPr>
               <w:t>known_hosts entries for devpod-0 and devpod-1 on each Mac</w:t>
@@ -7188,7 +7213,7 @@
             <w:r/>
             <w:r>
               <w:rPr>
-                <w:color w:val="365F91"/>
+                <w:color w:val="1A1A1A"/>
                 <w:sz w:val="20"/>
               </w:rPr>
               <w:t>Section 15.2</w:t>
@@ -7341,8 +7366,9 @@
       </w:pPr>
       <w:r>
         <w:rPr>
-          <w:rFonts w:ascii="Courier New" w:hAnsi="Courier New" w:eastAsia="Courier New"/>
-          <w:sz w:val="18"/>
+          <w:rFonts w:ascii="Consolas" w:hAnsi="Consolas" w:eastAsia="Consolas"/>
+          <w:color w:val="000000"/>
+          <w:sz w:val="19"/>
         </w:rPr>
         <w:t>kubectl -n devpod get sa devpod</w:t>
         <w:br/>
@@ -7370,8 +7396,9 @@
       </w:pPr>
       <w:r>
         <w:rPr>
-          <w:rFonts w:ascii="Courier New" w:hAnsi="Courier New" w:eastAsia="Courier New"/>
-          <w:sz w:val="18"/>
+          <w:rFonts w:ascii="Consolas" w:hAnsi="Consolas" w:eastAsia="Consolas"/>
+          <w:color w:val="000000"/>
+          <w:sz w:val="19"/>
         </w:rPr>
         <w:t>kubectl -n flux-system annotate --overwrite gitrepository/flux-system reconcile.fluxcd.io/requestedAt="$(date +%s)"</w:t>
         <w:br/>
@@ -7407,8 +7434,9 @@
       </w:pPr>
       <w:r>
         <w:rPr>
-          <w:rFonts w:ascii="Courier New" w:hAnsi="Courier New" w:eastAsia="Courier New"/>
-          <w:sz w:val="18"/>
+          <w:rFonts w:ascii="Consolas" w:hAnsi="Consolas" w:eastAsia="Consolas"/>
+          <w:color w:val="000000"/>
+          <w:sz w:val="19"/>
         </w:rPr>
         <w:t>kubectl -n flux-system get secret sops-age -o jsonpath='{.data}' | jq -r 'keys[]'</w:t>
         <w:br/>
@@ -7434,8 +7462,9 @@
       </w:pPr>
       <w:r>
         <w:rPr>
-          <w:rFonts w:ascii="Courier New" w:hAnsi="Courier New" w:eastAsia="Courier New"/>
-          <w:sz w:val="18"/>
+          <w:rFonts w:ascii="Consolas" w:hAnsi="Consolas" w:eastAsia="Consolas"/>
+          <w:color w:val="000000"/>
+          <w:sz w:val="19"/>
         </w:rPr>
         <w:t>kubectl -n devpod exec -it devpod-0 -c workspace -- su - vscode</w:t>
         <w:br/>
@@ -7467,8 +7496,9 @@
       </w:pPr>
       <w:r>
         <w:rPr>
-          <w:rFonts w:ascii="Courier New" w:hAnsi="Courier New" w:eastAsia="Courier New"/>
-          <w:sz w:val="18"/>
+          <w:rFonts w:ascii="Consolas" w:hAnsi="Consolas" w:eastAsia="Consolas"/>
+          <w:color w:val="000000"/>
+          <w:sz w:val="19"/>
         </w:rPr>
         <w:t>chezmoi update --force</w:t>
         <w:br/>
@@ -7496,8 +7526,9 @@
       </w:pPr>
       <w:r>
         <w:rPr>
-          <w:rFonts w:ascii="Courier New" w:hAnsi="Courier New" w:eastAsia="Courier New"/>
-          <w:sz w:val="18"/>
+          <w:rFonts w:ascii="Consolas" w:hAnsi="Consolas" w:eastAsia="Consolas"/>
+          <w:color w:val="000000"/>
+          <w:sz w:val="19"/>
         </w:rPr>
         <w:t>git config --system --get-all url.https://github.com/.insteadOf</w:t>
         <w:br/>
@@ -7523,8 +7554,9 @@
       </w:pPr>
       <w:r>
         <w:rPr>
-          <w:rFonts w:ascii="Courier New" w:hAnsi="Courier New" w:eastAsia="Courier New"/>
-          <w:sz w:val="18"/>
+          <w:rFonts w:ascii="Consolas" w:hAnsi="Consolas" w:eastAsia="Consolas"/>
+          <w:color w:val="000000"/>
+          <w:sz w:val="19"/>
         </w:rPr>
         <w:t>ssh-keygen -F devpod-0 -l                          # fingerprints in known_hosts</w:t>
         <w:br/>
@@ -7552,8 +7584,9 @@
       </w:pPr>
       <w:r>
         <w:rPr>
-          <w:rFonts w:ascii="Courier New" w:hAnsi="Courier New" w:eastAsia="Courier New"/>
-          <w:sz w:val="18"/>
+          <w:rFonts w:ascii="Consolas" w:hAnsi="Consolas" w:eastAsia="Consolas"/>
+          <w:color w:val="000000"/>
+          <w:sz w:val="19"/>
         </w:rPr>
         <w:t>kubectl -n devpod get secret devpod-ssh-host-keys -o json | jq -r '.data|keys[]'</w:t>
         <w:br/>
@@ -7585,8 +7618,9 @@
       </w:pPr>
       <w:r>
         <w:rPr>
-          <w:rFonts w:ascii="Courier New" w:hAnsi="Courier New" w:eastAsia="Courier New"/>
-          <w:sz w:val="18"/>
+          <w:rFonts w:ascii="Consolas" w:hAnsi="Consolas" w:eastAsia="Consolas"/>
+          <w:color w:val="000000"/>
+          <w:sz w:val="19"/>
         </w:rPr>
         <w:t>rg -n 'AGE-SECRET-KEY|ghp_|github_pat_|BEGIN (OPENSSH|RSA|EC) PRIVATE KEY|eyJ[A-Za-z0-9_-]{20,}' docs/ || echo clean</w:t>
       </w:r>
@@ -7697,7 +7731,7 @@
             <w:r>
               <w:rPr>
                 <w:b/>
-                <w:color w:val="365F91"/>
+                <w:color w:val="173A53"/>
                 <w:sz w:val="20"/>
               </w:rPr>
               <w:t>Replicas</w:t>
@@ -7716,7 +7750,7 @@
             <w:r/>
             <w:r>
               <w:rPr>
-                <w:color w:val="365F91"/>
+                <w:color w:val="1A1A1A"/>
                 <w:sz w:val="20"/>
               </w:rPr>
               <w:t>StatefulSet devpod scaled 1 → 2 (James, commit 1de0d06, 15:10 CT): devpod-0 + devpod-1</w:t>
@@ -7741,7 +7775,7 @@
             <w:r>
               <w:rPr>
                 <w:b/>
-                <w:color w:val="365F91"/>
+                <w:color w:val="173A53"/>
                 <w:sz w:val="20"/>
               </w:rPr>
               <w:t>New volume</w:t>
@@ -7760,7 +7794,7 @@
             <w:r/>
             <w:r>
               <w:rPr>
-                <w:color w:val="365F91"/>
+                <w:color w:val="1A1A1A"/>
                 <w:sz w:val="20"/>
               </w:rPr>
               <w:t>home-devpod-1 (Longhorn 20Gi, from volumeClaimTemplates) on skynet-wrk-01</w:t>
@@ -7785,7 +7819,7 @@
             <w:r>
               <w:rPr>
                 <w:b/>
-                <w:color w:val="365F91"/>
+                <w:color w:val="173A53"/>
                 <w:sz w:val="20"/>
               </w:rPr>
               <w:t>Wrong state (fixed)</w:t>
@@ -7835,7 +7869,7 @@
             <w:r>
               <w:rPr>
                 <w:b/>
-                <w:color w:val="365F91"/>
+                <w:color w:val="173A53"/>
                 <w:sz w:val="20"/>
               </w:rPr>
               <w:t>Fix</w:t>
@@ -7854,7 +7888,7 @@
             <w:r/>
             <w:r>
               <w:rPr>
-                <w:color w:val="365F91"/>
+                <w:color w:val="1A1A1A"/>
                 <w:sz w:val="20"/>
               </w:rPr>
               <w:t>bootstrap/authorized_keys in Git → ConfigMap devpod-bootstrap → devpod-runtime.sh overwrites /home/vscode/.ssh/authorized_keys on every start, every replica · commit 3d78804 (15:19 CT)</w:t>
@@ -7879,7 +7913,7 @@
             <w:r>
               <w:rPr>
                 <w:b/>
-                <w:color w:val="365F91"/>
+                <w:color w:val="173A53"/>
                 <w:sz w:val="20"/>
               </w:rPr>
               <w:t>Keys</w:t>
@@ -7898,7 +7932,7 @@
             <w:r/>
             <w:r>
               <w:rPr>
-                <w:color w:val="365F91"/>
+                <w:color w:val="1A1A1A"/>
                 <w:sz w:val="20"/>
               </w:rPr>
               <w:t>M5 SHA256:PBPgT1A69fRgGM1wdwWBMA/BJtPfdsXdFasYUod7JrM · Mac mini SHA256:94wTnD+20VEazwsIfbXdS8+pTOAfWJWKKKi+iquPrL4</w:t>
@@ -7923,7 +7957,7 @@
             <w:r>
               <w:rPr>
                 <w:b/>
-                <w:color w:val="365F91"/>
+                <w:color w:val="173A53"/>
                 <w:sz w:val="20"/>
               </w:rPr>
               <w:t>Source of truth</w:t>
@@ -7942,7 +7976,7 @@
             <w:r/>
             <w:r>
               <w:rPr>
-                <w:color w:val="365F91"/>
+                <w:color w:val="1A1A1A"/>
                 <w:sz w:val="20"/>
               </w:rPr>
               <w:t>Git. Removing a line revokes that key after the rollout; keys added by hand in a pod are overwritten</w:t>
@@ -7967,7 +8001,7 @@
             <w:r>
               <w:rPr>
                 <w:b/>
-                <w:color w:val="365F91"/>
+                <w:color w:val="173A53"/>
                 <w:sz w:val="20"/>
               </w:rPr>
               <w:t>Files changed</w:t>
@@ -7986,7 +8020,7 @@
             <w:r/>
             <w:r>
               <w:rPr>
-                <w:color w:val="365F91"/>
+                <w:color w:val="1A1A1A"/>
                 <w:sz w:val="20"/>
               </w:rPr>
               <w:t>apps/base/devpod/bootstrap/authorized_keys (new), kustomization.yaml, bootstrap/devpod-runtime.sh, README.md (devpod-statefulset.yaml: replicas only, 1de0d06)</w:t>
@@ -8011,7 +8045,7 @@
             <w:r>
               <w:rPr>
                 <w:b/>
-                <w:color w:val="365F91"/>
+                <w:color w:val="173A53"/>
                 <w:sz w:val="20"/>
               </w:rPr>
               <w:t>PVCs (never delete)</w:t>
@@ -8030,7 +8064,7 @@
             <w:r/>
             <w:r>
               <w:rPr>
-                <w:color w:val="365F91"/>
+                <w:color w:val="1A1A1A"/>
                 <w:sz w:val="20"/>
               </w:rPr>
               <w:t>home-devpod-0, home-devpod-1, devpod-scratch, devpod-default-de-115ea</w:t>
@@ -8196,7 +8230,7 @@
             <w:r>
               <w:rPr>
                 <w:b/>
-                <w:color w:val="365F91"/>
+                <w:color w:val="173A53"/>
                 <w:sz w:val="20"/>
               </w:rPr>
               <w:t>8</w:t>
@@ -8215,7 +8249,7 @@
             <w:r/>
             <w:r>
               <w:rPr>
-                <w:color w:val="365F91"/>
+                <w:color w:val="1A1A1A"/>
                 <w:sz w:val="20"/>
               </w:rPr>
               <w:t>Second replica devpod-1 (own home volume)</w:t>
@@ -8234,7 +8268,7 @@
             <w:r/>
             <w:r>
               <w:rPr>
-                <w:color w:val="365F91"/>
+                <w:color w:val="1A1A1A"/>
                 <w:sz w:val="20"/>
               </w:rPr>
               <w:t>devpod-statefulset.yaml replicas: 2</w:t>
@@ -8253,7 +8287,7 @@
             <w:r/>
             <w:r>
               <w:rPr>
-                <w:color w:val="365F91"/>
+                <w:color w:val="1A1A1A"/>
                 <w:sz w:val="20"/>
               </w:rPr>
               <w:t>1de0d06</w:t>
@@ -8278,7 +8312,7 @@
             <w:r>
               <w:rPr>
                 <w:b/>
-                <w:color w:val="365F91"/>
+                <w:color w:val="173A53"/>
                 <w:sz w:val="20"/>
               </w:rPr>
               <w:t>9</w:t>
@@ -8297,7 +8331,7 @@
             <w:r/>
             <w:r>
               <w:rPr>
-                <w:color w:val="365F91"/>
+                <w:color w:val="1A1A1A"/>
                 <w:sz w:val="20"/>
               </w:rPr>
               <w:t>Repo-managed SSH authorized_keys for all replicas</w:t>
@@ -8316,7 +8350,7 @@
             <w:r/>
             <w:r>
               <w:rPr>
-                <w:color w:val="365F91"/>
+                <w:color w:val="1A1A1A"/>
                 <w:sz w:val="20"/>
               </w:rPr>
               <w:t>bootstrap/authorized_keys, kustomization.yaml, devpod-runtime.sh, README.md</w:t>
@@ -8335,7 +8369,7 @@
             <w:r/>
             <w:r>
               <w:rPr>
-                <w:color w:val="365F91"/>
+                <w:color w:val="1A1A1A"/>
                 <w:sz w:val="20"/>
               </w:rPr>
               <w:t>3d78804</w:t>
@@ -8467,7 +8501,7 @@
             <w:r>
               <w:rPr>
                 <w:b/>
-                <w:color w:val="365F91"/>
+                <w:color w:val="173A53"/>
                 <w:sz w:val="20"/>
               </w:rPr>
               <w:t>1de0d06</w:t>
@@ -8486,7 +8520,7 @@
             <w:r/>
             <w:r>
               <w:rPr>
-                <w:color w:val="365F91"/>
+                <w:color w:val="1A1A1A"/>
                 <w:sz w:val="20"/>
               </w:rPr>
               <w:t>15:10</w:t>
@@ -8505,7 +8539,7 @@
             <w:r/>
             <w:r>
               <w:rPr>
-                <w:color w:val="365F91"/>
+                <w:color w:val="1A1A1A"/>
                 <w:sz w:val="20"/>
               </w:rPr>
               <w:t>increasing devpod stateful set to 2 (James)</w:t>
@@ -8530,7 +8564,7 @@
             <w:r>
               <w:rPr>
                 <w:b/>
-                <w:color w:val="365F91"/>
+                <w:color w:val="173A53"/>
                 <w:sz w:val="20"/>
               </w:rPr>
               <w:t>3d78804</w:t>
@@ -8549,7 +8583,7 @@
             <w:r/>
             <w:r>
               <w:rPr>
-                <w:color w:val="365F91"/>
+                <w:color w:val="1A1A1A"/>
                 <w:sz w:val="20"/>
               </w:rPr>
               <w:t>15:19</w:t>
@@ -8568,7 +8602,7 @@
             <w:r/>
             <w:r>
               <w:rPr>
-                <w:color w:val="365F91"/>
+                <w:color w:val="1A1A1A"/>
                 <w:sz w:val="20"/>
               </w:rPr>
               <w:t>DevPod: manage SSH authorized_keys from repo for all replicas</w:t>
@@ -8600,6 +8634,9 @@
         <w:t xml:space="preserve">Note  </w:t>
       </w:r>
       <w:r>
+        <w:rPr>
+          <w:color w:val="1A1A1A"/>
+        </w:rPr>
         <w:t>Cloudflare routing for devpod-1 (tunnel rule, DNS, Access app, Host devpod-1 on both Macs) and the shared host keys were already in place (sections 3-5 and 15), so devpod-1 needed no Cloudflare change.</w:t>
       </w:r>
     </w:p>
@@ -8776,8 +8813,9 @@
       </w:pPr>
       <w:r>
         <w:rPr>
-          <w:rFonts w:ascii="Courier New" w:hAnsi="Courier New" w:eastAsia="Courier New"/>
-          <w:sz w:val="18"/>
+          <w:rFonts w:ascii="Consolas" w:hAnsi="Consolas" w:eastAsia="Consolas"/>
+          <w:color w:val="000000"/>
+          <w:sz w:val="19"/>
         </w:rPr>
         <w:t># SSH public keys allowed to log in as vscode on EVERY DevPod replica.</w:t>
         <w:br/>
@@ -8863,8 +8901,9 @@
       </w:pPr>
       <w:r>
         <w:rPr>
-          <w:rFonts w:ascii="Courier New" w:hAnsi="Courier New" w:eastAsia="Courier New"/>
-          <w:sz w:val="18"/>
+          <w:rFonts w:ascii="Consolas" w:hAnsi="Consolas" w:eastAsia="Consolas"/>
+          <w:color w:val="000000"/>
+          <w:sz w:val="19"/>
         </w:rPr>
         <w:t>apiVersion: kustomize.config.k8s.io/v1beta1</w:t>
         <w:br/>
@@ -8944,6 +8983,9 @@
         <w:t xml:space="preserve">Note  </w:t>
       </w:r>
       <w:r>
+        <w:rPr>
+          <w:color w:val="1A1A1A"/>
+        </w:rPr>
         <w:t>Supersedes the copy of this file in section 7.</w:t>
       </w:r>
     </w:p>
@@ -8963,8 +9005,9 @@
       </w:pPr>
       <w:r>
         <w:rPr>
-          <w:rFonts w:ascii="Courier New" w:hAnsi="Courier New" w:eastAsia="Courier New"/>
-          <w:sz w:val="18"/>
+          <w:rFonts w:ascii="Consolas" w:hAnsi="Consolas" w:eastAsia="Consolas"/>
+          <w:color w:val="000000"/>
+          <w:sz w:val="19"/>
         </w:rPr>
         <w:t>#!/bin/bash</w:t>
         <w:br/>
@@ -9234,6 +9277,9 @@
         <w:t xml:space="preserve">Note  </w:t>
       </w:r>
       <w:r>
+        <w:rPr>
+          <w:color w:val="1A1A1A"/>
+        </w:rPr>
         <w:t>Supersedes the copy of this file in section 6.</w:t>
       </w:r>
     </w:p>
@@ -9253,8 +9299,9 @@
       </w:pPr>
       <w:r>
         <w:rPr>
-          <w:rFonts w:ascii="Courier New" w:hAnsi="Courier New" w:eastAsia="Courier New"/>
-          <w:sz w:val="18"/>
+          <w:rFonts w:ascii="Consolas" w:hAnsi="Consolas" w:eastAsia="Consolas"/>
+          <w:color w:val="000000"/>
+          <w:sz w:val="19"/>
         </w:rPr>
         <w:t>apiVersion: apps/v1</w:t>
         <w:br/>
@@ -9705,8 +9752,9 @@
       </w:pPr>
       <w:r>
         <w:rPr>
-          <w:rFonts w:ascii="Courier New" w:hAnsi="Courier New" w:eastAsia="Courier New"/>
-          <w:sz w:val="18"/>
+          <w:rFonts w:ascii="Consolas" w:hAnsi="Consolas" w:eastAsia="Consolas"/>
+          <w:color w:val="000000"/>
+          <w:sz w:val="19"/>
         </w:rPr>
         <w:t>### SSH authorized_keys (repo-managed, all replicas)</w:t>
         <w:br/>
@@ -9821,7 +9869,7 @@
             <w:r>
               <w:rPr>
                 <w:b/>
-                <w:color w:val="365F91"/>
+                <w:color w:val="173A53"/>
                 <w:sz w:val="20"/>
               </w:rPr>
               <w:t>Key lines in Git vs devpod-0 before push</w:t>
@@ -9840,7 +9888,7 @@
             <w:r/>
             <w:r>
               <w:rPr>
-                <w:color w:val="365F91"/>
+                <w:color w:val="1A1A1A"/>
                 <w:sz w:val="20"/>
               </w:rPr>
               <w:t>sha256 of key lines identical (668dc602…aeb35)</w:t>
@@ -9865,7 +9913,7 @@
             <w:r>
               <w:rPr>
                 <w:b/>
-                <w:color w:val="365F91"/>
+                <w:color w:val="173A53"/>
                 <w:sz w:val="20"/>
               </w:rPr>
               <w:t>Flux apps lastAppliedRevision</w:t>
@@ -9884,7 +9932,7 @@
             <w:r/>
             <w:r>
               <w:rPr>
-                <w:color w:val="365F91"/>
+                <w:color w:val="1A1A1A"/>
                 <w:sz w:val="20"/>
               </w:rPr>
               <w:t>main@sha1:3d78804fe9a4dbd24b1c116046dd59306e1fadf3</w:t>
@@ -9909,7 +9957,7 @@
             <w:r>
               <w:rPr>
                 <w:b/>
-                <w:color w:val="365F91"/>
+                <w:color w:val="173A53"/>
                 <w:sz w:val="20"/>
               </w:rPr>
               <w:t>Rollout</w:t>
@@ -9928,7 +9976,7 @@
             <w:r/>
             <w:r>
               <w:rPr>
-                <w:color w:val="365F91"/>
+                <w:color w:val="1A1A1A"/>
                 <w:sz w:val="20"/>
               </w:rPr>
               <w:t>devpod-1 recreated 15:21:00 CT (skynet-wrk-01), devpod-0 15:21:48 CT (skynet-wrk-02); both 1/1 Ready</w:t>
@@ -9953,7 +10001,7 @@
             <w:r>
               <w:rPr>
                 <w:b/>
-                <w:color w:val="365F91"/>
+                <w:color w:val="173A53"/>
                 <w:sz w:val="20"/>
               </w:rPr>
               <w:t>Pod log (both)</w:t>
@@ -9972,7 +10020,7 @@
             <w:r/>
             <w:r>
               <w:rPr>
-                <w:color w:val="365F91"/>
+                <w:color w:val="1A1A1A"/>
                 <w:sz w:val="20"/>
               </w:rPr>
               <w:t>devpod-runtime: authorized_keys written from repo (2 keys)</w:t>
@@ -9997,7 +10045,7 @@
             <w:r>
               <w:rPr>
                 <w:b/>
-                <w:color w:val="365F91"/>
+                <w:color w:val="173A53"/>
                 <w:sz w:val="20"/>
               </w:rPr>
               <w:t>Perms (both)</w:t>
@@ -10016,7 +10064,7 @@
             <w:r/>
             <w:r>
               <w:rPr>
-                <w:color w:val="365F91"/>
+                <w:color w:val="1A1A1A"/>
                 <w:sz w:val="20"/>
               </w:rPr>
               <w:t>drwx--S--- vscode vscode ~/.ssh · -rw------- vscode vscode authorized_keys</w:t>
@@ -10041,7 +10089,7 @@
             <w:r>
               <w:rPr>
                 <w:b/>
-                <w:color w:val="365F91"/>
+                <w:color w:val="173A53"/>
                 <w:sz w:val="20"/>
               </w:rPr>
               <w:t>Fingerprints (both)</w:t>
@@ -10060,7 +10108,7 @@
             <w:r/>
             <w:r>
               <w:rPr>
-                <w:color w:val="365F91"/>
+                <w:color w:val="1A1A1A"/>
                 <w:sz w:val="20"/>
               </w:rPr>
               <w:t>exactly M5 PBPgT1A6…7JrM and Mac mini 94wTnD+2…rL4</w:t>
@@ -10085,7 +10133,7 @@
             <w:r>
               <w:rPr>
                 <w:b/>
-                <w:color w:val="365F91"/>
+                <w:color w:val="173A53"/>
                 <w:sz w:val="20"/>
               </w:rPr>
               <w:t>Overwrite test</w:t>
@@ -10104,7 +10152,7 @@
             <w:r/>
             <w:r>
               <w:rPr>
-                <w:color w:val="365F91"/>
+                <w:color w:val="1A1A1A"/>
                 <w:sz w:val="20"/>
               </w:rPr>
               <w:t>marker line appended by hand to devpod-1's file before the rollout: gone afterwards (0 matches)</w:t>
@@ -10129,7 +10177,7 @@
             <w:r>
               <w:rPr>
                 <w:b/>
-                <w:color w:val="365F91"/>
+                <w:color w:val="173A53"/>
                 <w:sz w:val="20"/>
               </w:rPr>
               <w:t>Mac mini → devpod-0 (kubectl port-forward, mini key, throwaway known_hosts)</w:t>
@@ -10148,7 +10196,7 @@
             <w:r/>
             <w:r>
               <w:rPr>
-                <w:color w:val="365F91"/>
+                <w:color w:val="1A1A1A"/>
                 <w:sz w:val="20"/>
               </w:rPr>
               <w:t>auth-ok vscode@devpod-0, exit 0, host key ED25519 LofwfAOe…l0o</w:t>
@@ -10173,7 +10221,7 @@
             <w:r>
               <w:rPr>
                 <w:b/>
-                <w:color w:val="365F91"/>
+                <w:color w:val="173A53"/>
                 <w:sz w:val="20"/>
               </w:rPr>
               <w:t>Mac mini → devpod-1 (same method)</w:t>
@@ -10192,7 +10240,7 @@
             <w:r/>
             <w:r>
               <w:rPr>
-                <w:color w:val="365F91"/>
+                <w:color w:val="1A1A1A"/>
                 <w:sz w:val="20"/>
               </w:rPr>
               <w:t>auth-ok vscode@devpod-1, exit 0, same host key</w:t>
@@ -10217,7 +10265,7 @@
             <w:r>
               <w:rPr>
                 <w:b/>
-                <w:color w:val="365F91"/>
+                <w:color w:val="173A53"/>
                 <w:sz w:val="20"/>
               </w:rPr>
               <w:t>M5 → ssh devpod-0 via Cloudflare</w:t>
@@ -10236,7 +10284,7 @@
             <w:r/>
             <w:r>
               <w:rPr>
-                <w:color w:val="365F91"/>
+                <w:color w:val="1A1A1A"/>
                 <w:sz w:val="20"/>
               </w:rPr>
               <w:t>exit 0 (ok-devpod-0). First try during the rollout, before sshd was up: 'websocket: bad handshake'; retry seconds later succeeded</w:t>
@@ -10261,7 +10309,7 @@
             <w:r>
               <w:rPr>
                 <w:b/>
-                <w:color w:val="365F91"/>
+                <w:color w:val="173A53"/>
                 <w:sz w:val="20"/>
               </w:rPr>
               <w:t>PVCs</w:t>
@@ -10280,7 +10328,7 @@
             <w:r/>
             <w:r>
               <w:rPr>
-                <w:color w:val="365F91"/>
+                <w:color w:val="1A1A1A"/>
                 <w:sz w:val="20"/>
               </w:rPr>
               <w:t>home-devpod-0, home-devpod-1, devpod-scratch, devpod-default-de-115ea all Bound, untouched</w:t>
@@ -10303,8 +10351,9 @@
       </w:pPr>
       <w:r>
         <w:rPr>
-          <w:rFonts w:ascii="Courier New" w:hAnsi="Courier New" w:eastAsia="Courier New"/>
-          <w:sz w:val="18"/>
+          <w:rFonts w:ascii="Consolas" w:hAnsi="Consolas" w:eastAsia="Consolas"/>
+          <w:color w:val="000000"/>
+          <w:sz w:val="19"/>
         </w:rPr>
         <w:t>$ kubectl -n devpod exec devpod-1 -c workspace -- ssh-keygen -lf /home/vscode/.ssh/authorized_keys</w:t>
         <w:br/>
@@ -10335,6 +10384,9 @@
         <w:t xml:space="preserve">Follow-up  </w:t>
       </w:r>
       <w:r>
+        <w:rPr>
+          <w:color w:val="1A1A1A"/>
+        </w:rPr>
         <w:t>The Mac mini still needs its one-time Cloudflare Access browser login before ssh devpod-0 / devpod-1 works through the tunnel; the key itself is proven by the direct test above.</w:t>
       </w:r>
     </w:p>
@@ -10464,7 +10516,7 @@
             <w:r>
               <w:rPr>
                 <w:b/>
-                <w:color w:val="365F91"/>
+                <w:color w:val="173A53"/>
                 <w:sz w:val="20"/>
               </w:rPr>
               <w:t>A.12</w:t>
@@ -10483,7 +10535,7 @@
             <w:r/>
             <w:r>
               <w:rPr>
-                <w:color w:val="365F91"/>
+                <w:color w:val="1A1A1A"/>
                 <w:sz w:val="20"/>
               </w:rPr>
               <w:t>apps/base/devpod/bootstrap/authorized_keys (public keys of every Mac)</w:t>
@@ -10502,7 +10554,7 @@
             <w:r/>
             <w:r>
               <w:rPr>
-                <w:color w:val="365F91"/>
+                <w:color w:val="1A1A1A"/>
                 <w:sz w:val="20"/>
               </w:rPr>
               <w:t>S.3</w:t>
@@ -10527,7 +10579,7 @@
             <w:r>
               <w:rPr>
                 <w:b/>
-                <w:color w:val="365F91"/>
+                <w:color w:val="173A53"/>
                 <w:sz w:val="20"/>
               </w:rPr>
               <w:t>A.13</w:t>
@@ -10546,7 +10598,7 @@
             <w:r/>
             <w:r>
               <w:rPr>
-                <w:color w:val="365F91"/>
+                <w:color w:val="1A1A1A"/>
                 <w:sz w:val="20"/>
               </w:rPr>
               <w:t>kustomization.yaml, devpod-runtime.sh and devpod-statefulset.yaml from this supplement (they supersede sections 10, 7 and 6)</w:t>
@@ -10565,7 +10617,7 @@
             <w:r/>
             <w:r>
               <w:rPr>
-                <w:color w:val="365F91"/>
+                <w:color w:val="1A1A1A"/>
                 <w:sz w:val="20"/>
               </w:rPr>
               <w:t>S.4-S.6</w:t>
@@ -10590,7 +10642,7 @@
             <w:r>
               <w:rPr>
                 <w:b/>
-                <w:color w:val="365F91"/>
+                <w:color w:val="173A53"/>
                 <w:sz w:val="20"/>
               </w:rPr>
               <w:t>A.14</w:t>
@@ -10609,7 +10661,7 @@
             <w:r/>
             <w:r>
               <w:rPr>
-                <w:color w:val="365F91"/>
+                <w:color w:val="1A1A1A"/>
                 <w:sz w:val="20"/>
               </w:rPr>
               <w:t>Commit, push, reconcile; check both replicas' authorized_keys fingerprints</w:t>
@@ -10628,7 +10680,7 @@
             <w:r/>
             <w:r>
               <w:rPr>
-                <w:color w:val="365F91"/>
+                <w:color w:val="1A1A1A"/>
                 <w:sz w:val="20"/>
               </w:rPr>
               <w:t>S.10</w:t>
@@ -10705,8 +10757,9 @@
       </w:pPr>
       <w:r>
         <w:rPr>
-          <w:rFonts w:ascii="Courier New" w:hAnsi="Courier New" w:eastAsia="Courier New"/>
-          <w:sz w:val="18"/>
+          <w:rFonts w:ascii="Consolas" w:hAnsi="Consolas" w:eastAsia="Consolas"/>
+          <w:color w:val="000000"/>
+          <w:sz w:val="19"/>
         </w:rPr>
         <w:t>cat ~/.ssh/id_ed25519.pub; ssh-keygen -lf ~/.ssh/id_ed25519.pub        # on the Mac (public key only)</w:t>
         <w:br/>
@@ -10734,8 +10787,9 @@
       </w:pPr>
       <w:r>
         <w:rPr>
-          <w:rFonts w:ascii="Courier New" w:hAnsi="Courier New" w:eastAsia="Courier New"/>
-          <w:sz w:val="18"/>
+          <w:rFonts w:ascii="Consolas" w:hAnsi="Consolas" w:eastAsia="Consolas"/>
+          <w:color w:val="000000"/>
+          <w:sz w:val="19"/>
         </w:rPr>
         <w:t>kubectl -n flux-system annotate --overwrite kustomization/apps reconcile.fluxcd.io/requestedAt="$(date +%s)"</w:t>
         <w:br/>
@@ -10765,8 +10819,9 @@
       </w:pPr>
       <w:r>
         <w:rPr>
-          <w:rFonts w:ascii="Courier New" w:hAnsi="Courier New" w:eastAsia="Courier New"/>
-          <w:sz w:val="18"/>
+          <w:rFonts w:ascii="Consolas" w:hAnsi="Consolas" w:eastAsia="Consolas"/>
+          <w:color w:val="000000"/>
+          <w:sz w:val="19"/>
         </w:rPr>
         <w:t>kubectl -n devpod port-forward pod/devpod-1 22222:2222 &amp;</w:t>
         <w:br/>
@@ -10796,8 +10851,9 @@
       </w:pPr>
       <w:r>
         <w:rPr>
-          <w:rFonts w:ascii="Courier New" w:hAnsi="Courier New" w:eastAsia="Courier New"/>
-          <w:sz w:val="18"/>
+          <w:rFonts w:ascii="Consolas" w:hAnsi="Consolas" w:eastAsia="Consolas"/>
+          <w:color w:val="000000"/>
+          <w:sz w:val="19"/>
         </w:rPr>
         <w:t>kubectl -n devpod get sts devpod -o jsonpath='{.spec.replicas}{"\n"}'</w:t>
         <w:br/>

</xml_diff>

<commit_message>
DevPod enhancements addendum: Supplement 2, pod-to-pod SSH
</commit_message>
<xml_diff>
--- a/docs/Homelab_DevPod_Enhancements_Addendum.docx
+++ b/docs/Homelab_DevPod_Enhancements_Addendum.docx
@@ -10858,6 +10858,3344 @@
         <w:t>kubectl -n devpod get sts devpod -o jsonpath='{.spec.replicas}{"\n"}'</w:t>
         <w:br/>
         <w:t># change spec.replicas in apps/base/devpod/devpod-statefulset.yaml and push (Flux owns it; no kubectl scale)</w:t>
+      </w:r>
+    </w:p>
+    <w:p>
+      <w:pPr>
+        <w:pStyle w:val="Heading1"/>
+        <w:pageBreakBefore/>
+      </w:pPr>
+      <w:r>
+        <w:t>Supplement 2: pod-to-pod SSH (Oct 3, 2026)</w:t>
+      </w:r>
+    </w:p>
+    <w:p>
+      <w:r>
+        <w:t>Appended after Supplement 1 so only these pages need printing. Everything before this page is unchanged. This supplement covers commit 80b00d4.</w:t>
+      </w:r>
+    </w:p>
+    <w:tbl>
+      <w:tblPr>
+        <w:tblStyle w:val="LightShading-Accent1"/>
+        <w:tblW w:type="auto" w:w="0"/>
+        <w:tblLayout w:type="fixed"/>
+        <w:tblLook w:firstColumn="1" w:firstRow="1" w:lastColumn="0" w:lastRow="0" w:noHBand="0" w:noVBand="1" w:val="04A0"/>
+        <w:tblBorders>
+          <w:top w:val="single" w:sz="8" w:space="0" w:color="4F81BD"/>
+          <w:left w:val="nil"/>
+          <w:bottom w:val="single" w:sz="8" w:space="0" w:color="4F81BD"/>
+          <w:right w:val="nil"/>
+          <w:insideH w:val="nil"/>
+          <w:insideV w:val="nil"/>
+        </w:tblBorders>
+      </w:tblPr>
+      <w:tblGrid>
+        <w:gridCol w:w="2592"/>
+        <w:gridCol w:w="7488"/>
+      </w:tblGrid>
+      <w:tr>
+        <w:trPr>
+          <w:cantSplit/>
+          <w:tblHeader w:val="true"/>
+        </w:trPr>
+        <w:tc>
+          <w:tcPr>
+            <w:tcW w:type="dxa" w:w="2592"/>
+            <w:tcBorders>
+              <w:top w:val="single" w:sz="8" w:space="0" w:color="4F81BD"/>
+              <w:bottom w:val="single" w:sz="8" w:space="0" w:color="4F81BD"/>
+            </w:tcBorders>
+            <w:shd w:val="clear" w:color="auto" w:fill="365F91"/>
+          </w:tcPr>
+          <w:p>
+            <w:pPr>
+              <w:keepNext/>
+              <w:spacing w:before="40" w:after="40" w:line="240" w:lineRule="auto"/>
+            </w:pPr>
+            <w:r/>
+            <w:r>
+              <w:rPr>
+                <w:b/>
+                <w:color w:val="FFFFFF"/>
+                <w:sz w:val="20"/>
+              </w:rPr>
+              <w:t>Field</w:t>
+            </w:r>
+          </w:p>
+        </w:tc>
+        <w:tc>
+          <w:tcPr>
+            <w:tcW w:type="dxa" w:w="7488"/>
+            <w:tcBorders>
+              <w:top w:val="single" w:sz="8" w:space="0" w:color="4F81BD"/>
+              <w:bottom w:val="single" w:sz="8" w:space="0" w:color="4F81BD"/>
+            </w:tcBorders>
+            <w:shd w:val="clear" w:color="auto" w:fill="365F91"/>
+          </w:tcPr>
+          <w:p>
+            <w:pPr>
+              <w:keepNext/>
+              <w:spacing w:before="40" w:after="40" w:line="240" w:lineRule="auto"/>
+            </w:pPr>
+            <w:r/>
+            <w:r>
+              <w:rPr>
+                <w:b/>
+                <w:color w:val="FFFFFF"/>
+                <w:sz w:val="20"/>
+              </w:rPr>
+              <w:t>Value</w:t>
+            </w:r>
+          </w:p>
+        </w:tc>
+      </w:tr>
+      <w:tr>
+        <w:trPr>
+          <w:cantSplit/>
+        </w:trPr>
+        <w:tc>
+          <w:tcPr>
+            <w:tcW w:type="dxa" w:w="2592"/>
+            <w:shd w:val="clear" w:color="auto" w:fill="D3DFEE"/>
+          </w:tcPr>
+          <w:p>
+            <w:pPr>
+              <w:spacing w:before="40" w:after="40" w:line="240" w:lineRule="auto"/>
+            </w:pPr>
+            <w:r/>
+            <w:r>
+              <w:rPr>
+                <w:b/>
+                <w:color w:val="173A53"/>
+                <w:sz w:val="20"/>
+              </w:rPr>
+              <w:t>Goal</w:t>
+            </w:r>
+          </w:p>
+        </w:tc>
+        <w:tc>
+          <w:tcPr>
+            <w:tcW w:type="dxa" w:w="7488"/>
+            <w:shd w:val="clear" w:color="auto" w:fill="D3DFEE"/>
+          </w:tcPr>
+          <w:p>
+            <w:pPr>
+              <w:spacing w:before="40" w:after="40" w:line="240" w:lineRule="auto"/>
+            </w:pPr>
+            <w:r/>
+            <w:r>
+              <w:rPr>
+                <w:color w:val="1A1A1A"/>
+                <w:sz w:val="20"/>
+              </w:rPr>
+              <w:t>ssh / scp / rsync between DevPod replicas by short name (ssh devpod-1 from devpod-0 and back), no prompts</w:t>
+            </w:r>
+          </w:p>
+        </w:tc>
+      </w:tr>
+      <w:tr>
+        <w:trPr>
+          <w:cantSplit/>
+        </w:trPr>
+        <w:tc>
+          <w:tcPr>
+            <w:tcW w:type="dxa" w:w="2592"/>
+            <w:shd w:val="clear" w:color="auto" w:fill="FFFFFF"/>
+          </w:tcPr>
+          <w:p>
+            <w:pPr>
+              <w:spacing w:before="40" w:after="40" w:line="240" w:lineRule="auto"/>
+            </w:pPr>
+            <w:r/>
+            <w:r>
+              <w:rPr>
+                <w:b/>
+                <w:color w:val="173A53"/>
+                <w:sz w:val="20"/>
+              </w:rPr>
+              <w:t>Commit</w:t>
+            </w:r>
+          </w:p>
+        </w:tc>
+        <w:tc>
+          <w:tcPr>
+            <w:tcW w:type="dxa" w:w="7488"/>
+            <w:shd w:val="clear" w:color="auto" w:fill="FFFFFF"/>
+          </w:tcPr>
+          <w:p>
+            <w:pPr>
+              <w:spacing w:before="40" w:after="40" w:line="240" w:lineRule="auto"/>
+            </w:pPr>
+            <w:r/>
+            <w:r>
+              <w:rPr>
+                <w:color w:val="1A1A1A"/>
+                <w:sz w:val="20"/>
+              </w:rPr>
+              <w:t>80b00d4 'DevPod: pod-to-pod SSH with internal key' (15:55 CT)</w:t>
+            </w:r>
+          </w:p>
+        </w:tc>
+      </w:tr>
+      <w:tr>
+        <w:trPr>
+          <w:cantSplit/>
+        </w:trPr>
+        <w:tc>
+          <w:tcPr>
+            <w:tcW w:type="dxa" w:w="2592"/>
+            <w:shd w:val="clear" w:color="auto" w:fill="D3DFEE"/>
+          </w:tcPr>
+          <w:p>
+            <w:pPr>
+              <w:spacing w:before="40" w:after="40" w:line="240" w:lineRule="auto"/>
+            </w:pPr>
+            <w:r/>
+            <w:r>
+              <w:rPr>
+                <w:b/>
+                <w:color w:val="173A53"/>
+                <w:sz w:val="20"/>
+              </w:rPr>
+              <w:t>Key</w:t>
+            </w:r>
+          </w:p>
+        </w:tc>
+        <w:tc>
+          <w:tcPr>
+            <w:tcW w:type="dxa" w:w="7488"/>
+            <w:shd w:val="clear" w:color="auto" w:fill="D3DFEE"/>
+          </w:tcPr>
+          <w:p>
+            <w:pPr>
+              <w:spacing w:before="40" w:after="40" w:line="240" w:lineRule="auto"/>
+            </w:pPr>
+            <w:r/>
+            <w:r>
+              <w:rPr>
+                <w:color w:val="1A1A1A"/>
+                <w:sz w:val="20"/>
+              </w:rPr>
+              <w:t>One ed25519 pair, comment devpod-internal, SHA256:wEg59Nbjp9s6181SaeJUxWVtC0g+CE2bxtMsL/YSEYc</w:t>
+            </w:r>
+          </w:p>
+        </w:tc>
+      </w:tr>
+      <w:tr>
+        <w:trPr>
+          <w:cantSplit/>
+        </w:trPr>
+        <w:tc>
+          <w:tcPr>
+            <w:tcW w:type="dxa" w:w="2592"/>
+            <w:shd w:val="clear" w:color="auto" w:fill="FFFFFF"/>
+          </w:tcPr>
+          <w:p>
+            <w:pPr>
+              <w:spacing w:before="40" w:after="40" w:line="240" w:lineRule="auto"/>
+            </w:pPr>
+            <w:r/>
+            <w:r>
+              <w:rPr>
+                <w:b/>
+                <w:color w:val="173A53"/>
+                <w:sz w:val="20"/>
+              </w:rPr>
+              <w:t>Private key</w:t>
+            </w:r>
+          </w:p>
+        </w:tc>
+        <w:tc>
+          <w:tcPr>
+            <w:tcW w:type="dxa" w:w="7488"/>
+            <w:shd w:val="clear" w:color="auto" w:fill="FFFFFF"/>
+          </w:tcPr>
+          <w:p>
+            <w:pPr>
+              <w:spacing w:before="40" w:after="40" w:line="240" w:lineRule="auto"/>
+            </w:pPr>
+            <w:r/>
+            <w:r>
+              <w:rPr>
+                <w:color w:val="1A1A1A"/>
+                <w:sz w:val="20"/>
+              </w:rPr>
+              <w:t>Only in Secret devpod/devpod-internal-ssh (created by kubectl on the Mac mini, NOT in Git); installed as ~/.ssh/id_ed25519_devpod (0600 vscode) on every start</w:t>
+            </w:r>
+          </w:p>
+        </w:tc>
+      </w:tr>
+      <w:tr>
+        <w:trPr>
+          <w:cantSplit/>
+        </w:trPr>
+        <w:tc>
+          <w:tcPr>
+            <w:tcW w:type="dxa" w:w="2592"/>
+            <w:shd w:val="clear" w:color="auto" w:fill="D3DFEE"/>
+          </w:tcPr>
+          <w:p>
+            <w:pPr>
+              <w:spacing w:before="40" w:after="40" w:line="240" w:lineRule="auto"/>
+            </w:pPr>
+            <w:r/>
+            <w:r>
+              <w:rPr>
+                <w:b/>
+                <w:color w:val="173A53"/>
+                <w:sz w:val="20"/>
+              </w:rPr>
+              <w:t>Public key</w:t>
+            </w:r>
+          </w:p>
+        </w:tc>
+        <w:tc>
+          <w:tcPr>
+            <w:tcW w:type="dxa" w:w="7488"/>
+            <w:shd w:val="clear" w:color="auto" w:fill="D3DFEE"/>
+          </w:tcPr>
+          <w:p>
+            <w:pPr>
+              <w:spacing w:before="40" w:after="40" w:line="240" w:lineRule="auto"/>
+            </w:pPr>
+            <w:r/>
+            <w:r>
+              <w:rPr>
+                <w:color w:val="1A1A1A"/>
+                <w:sz w:val="20"/>
+              </w:rPr>
+              <w:t>bootstrap/authorized_keys with from="10.42.0.0/16" (repo-managed, all replicas)</w:t>
+            </w:r>
+          </w:p>
+        </w:tc>
+      </w:tr>
+      <w:tr>
+        <w:trPr>
+          <w:cantSplit/>
+        </w:trPr>
+        <w:tc>
+          <w:tcPr>
+            <w:tcW w:type="dxa" w:w="2592"/>
+            <w:shd w:val="clear" w:color="auto" w:fill="FFFFFF"/>
+          </w:tcPr>
+          <w:p>
+            <w:pPr>
+              <w:spacing w:before="40" w:after="40" w:line="240" w:lineRule="auto"/>
+            </w:pPr>
+            <w:r/>
+            <w:r>
+              <w:rPr>
+                <w:b/>
+                <w:color w:val="173A53"/>
+                <w:sz w:val="20"/>
+              </w:rPr>
+              <w:t>Client config</w:t>
+            </w:r>
+          </w:p>
+        </w:tc>
+        <w:tc>
+          <w:tcPr>
+            <w:tcW w:type="dxa" w:w="7488"/>
+            <w:shd w:val="clear" w:color="auto" w:fill="FFFFFF"/>
+          </w:tcPr>
+          <w:p>
+            <w:pPr>
+              <w:spacing w:before="40" w:after="40" w:line="240" w:lineRule="auto"/>
+            </w:pPr>
+            <w:r/>
+            <w:r>
+              <w:rPr>
+                <w:color w:val="1A1A1A"/>
+                <w:sz w:val="20"/>
+              </w:rPr>
+              <w:t>/etc/ssh/ssh_config.d/devpod.conf: Host devpod-* !devpod-*.* → %h.devpod.devpod.svc.cluster.local:2222</w:t>
+            </w:r>
+          </w:p>
+        </w:tc>
+      </w:tr>
+      <w:tr>
+        <w:trPr>
+          <w:cantSplit/>
+        </w:trPr>
+        <w:tc>
+          <w:tcPr>
+            <w:tcW w:type="dxa" w:w="2592"/>
+            <w:shd w:val="clear" w:color="auto" w:fill="D3DFEE"/>
+          </w:tcPr>
+          <w:p>
+            <w:pPr>
+              <w:spacing w:before="40" w:after="40" w:line="240" w:lineRule="auto"/>
+            </w:pPr>
+            <w:r/>
+            <w:r>
+              <w:rPr>
+                <w:b/>
+                <w:color w:val="173A53"/>
+                <w:sz w:val="20"/>
+              </w:rPr>
+              <w:t>Host trust</w:t>
+            </w:r>
+          </w:p>
+        </w:tc>
+        <w:tc>
+          <w:tcPr>
+            <w:tcW w:type="dxa" w:w="7488"/>
+            <w:shd w:val="clear" w:color="auto" w:fill="D3DFEE"/>
+          </w:tcPr>
+          <w:p>
+            <w:pPr>
+              <w:spacing w:before="40" w:after="40" w:line="240" w:lineRule="auto"/>
+            </w:pPr>
+            <w:r/>
+            <w:r>
+              <w:rPr>
+                <w:color w:val="1A1A1A"/>
+                <w:sz w:val="20"/>
+              </w:rPr>
+              <w:t>/etc/ssh/ssh_known_hosts built from the shared host keys (Secret devpod-ssh-host-keys): no prompt</w:t>
+            </w:r>
+          </w:p>
+        </w:tc>
+      </w:tr>
+      <w:tr>
+        <w:trPr>
+          <w:cantSplit/>
+        </w:trPr>
+        <w:tc>
+          <w:tcPr>
+            <w:tcW w:type="dxa" w:w="2592"/>
+            <w:shd w:val="clear" w:color="auto" w:fill="FFFFFF"/>
+          </w:tcPr>
+          <w:p>
+            <w:pPr>
+              <w:spacing w:before="40" w:after="40" w:line="240" w:lineRule="auto"/>
+            </w:pPr>
+            <w:r/>
+            <w:r>
+              <w:rPr>
+                <w:b/>
+                <w:color w:val="173A53"/>
+                <w:sz w:val="20"/>
+              </w:rPr>
+              <w:t>Tools</w:t>
+            </w:r>
+          </w:p>
+        </w:tc>
+        <w:tc>
+          <w:tcPr>
+            <w:tcW w:type="dxa" w:w="7488"/>
+            <w:shd w:val="clear" w:color="auto" w:fill="FFFFFF"/>
+          </w:tcPr>
+          <w:p>
+            <w:pPr>
+              <w:spacing w:before="40" w:after="40" w:line="240" w:lineRule="auto"/>
+            </w:pPr>
+            <w:r/>
+            <w:r>
+              <w:rPr>
+                <w:color w:val="1A1A1A"/>
+                <w:sz w:val="20"/>
+              </w:rPr>
+              <w:t>ssh/scp from openssh (installed by the workspace command); rsync 3.4.1 already in the base image</w:t>
+            </w:r>
+          </w:p>
+        </w:tc>
+      </w:tr>
+      <w:tr>
+        <w:trPr>
+          <w:cantSplit/>
+        </w:trPr>
+        <w:tc>
+          <w:tcPr>
+            <w:tcW w:type="dxa" w:w="2592"/>
+            <w:shd w:val="clear" w:color="auto" w:fill="D3DFEE"/>
+          </w:tcPr>
+          <w:p>
+            <w:pPr>
+              <w:spacing w:before="40" w:after="40" w:line="240" w:lineRule="auto"/>
+            </w:pPr>
+            <w:r/>
+            <w:r>
+              <w:rPr>
+                <w:b/>
+                <w:color w:val="173A53"/>
+                <w:sz w:val="20"/>
+              </w:rPr>
+              <w:t>Not touched</w:t>
+            </w:r>
+          </w:p>
+        </w:tc>
+        <w:tc>
+          <w:tcPr>
+            <w:tcW w:type="dxa" w:w="7488"/>
+            <w:shd w:val="clear" w:color="auto" w:fill="D3DFEE"/>
+          </w:tcPr>
+          <w:p>
+            <w:pPr>
+              <w:spacing w:before="40" w:after="40" w:line="240" w:lineRule="auto"/>
+            </w:pPr>
+            <w:r/>
+            <w:r>
+              <w:rPr>
+                <w:color w:val="1A1A1A"/>
+                <w:sz w:val="20"/>
+              </w:rPr>
+              <w:t>chezmoi-managed ~/.ssh files; Mac access via Cloudflare (verified from the M5)</w:t>
+            </w:r>
+          </w:p>
+        </w:tc>
+      </w:tr>
+      <w:tr>
+        <w:trPr>
+          <w:cantSplit/>
+        </w:trPr>
+        <w:tc>
+          <w:tcPr>
+            <w:tcW w:type="dxa" w:w="2592"/>
+            <w:shd w:val="clear" w:color="auto" w:fill="FFFFFF"/>
+          </w:tcPr>
+          <w:p>
+            <w:pPr>
+              <w:spacing w:before="40" w:after="40" w:line="240" w:lineRule="auto"/>
+            </w:pPr>
+            <w:r/>
+            <w:r>
+              <w:rPr>
+                <w:b/>
+                <w:color w:val="173A53"/>
+                <w:sz w:val="20"/>
+              </w:rPr>
+              <w:t>PVCs (never delete)</w:t>
+            </w:r>
+          </w:p>
+        </w:tc>
+        <w:tc>
+          <w:tcPr>
+            <w:tcW w:type="dxa" w:w="7488"/>
+            <w:shd w:val="clear" w:color="auto" w:fill="FFFFFF"/>
+          </w:tcPr>
+          <w:p>
+            <w:pPr>
+              <w:spacing w:before="40" w:after="40" w:line="240" w:lineRule="auto"/>
+            </w:pPr>
+            <w:r/>
+            <w:r>
+              <w:rPr>
+                <w:color w:val="1A1A1A"/>
+                <w:sz w:val="20"/>
+              </w:rPr>
+              <w:t>home-devpod-0, home-devpod-1, devpod-scratch, devpod-default-de-115ea</w:t>
+            </w:r>
+          </w:p>
+        </w:tc>
+      </w:tr>
+    </w:tbl>
+    <w:p>
+      <w:pPr>
+        <w:spacing w:after="40" w:line="120" w:lineRule="exact"/>
+      </w:pPr>
+    </w:p>
+    <w:p>
+      <w:pPr>
+        <w:shd w:val="clear" w:color="auto" w:fill="D3DFEE"/>
+        <w:keepLines/>
+        <w:pBdr>
+          <w:left w:val="single" w:sz="24" w:space="6" w:color="4F81BD"/>
+        </w:pBdr>
+        <w:spacing w:before="40" w:after="180"/>
+        <w:ind w:left="115" w:right="86"/>
+      </w:pPr>
+      <w:r>
+        <w:rPr>
+          <w:b/>
+          <w:color w:val="173A53"/>
+        </w:rPr>
+        <w:t xml:space="preserve">Limitation  </w:t>
+      </w:r>
+      <w:r>
+        <w:rPr>
+          <w:color w:val="1A1A1A"/>
+        </w:rPr>
+        <w:t>The from="10.42.0.0/16" restriction is weaker than it looks. Pod-to-pod traffic keeps the pod IP (verified: devpod-1's sshd saw 10.42.2.101 = devpod-0), but the cloudflared pods (10.42.1.16) and NodePort traffic, which kube-proxy SNATs to the node's pod-network address, are in that range too: the internal key also logged in via NodePort 32222. It only blocks sources outside the pod network. The real protection is that the private key exists only in the Secret and inside the pods.</w:t>
+      </w:r>
+    </w:p>
+    <w:p>
+      <w:pPr>
+        <w:pStyle w:val="Heading2"/>
+      </w:pPr>
+      <w:r>
+        <w:t>S2.1 Overview</w:t>
+      </w:r>
+    </w:p>
+    <w:tbl>
+      <w:tblPr>
+        <w:tblStyle w:val="LightShading-Accent1"/>
+        <w:tblW w:type="auto" w:w="0"/>
+        <w:tblLayout w:type="fixed"/>
+        <w:tblLook w:firstColumn="1" w:firstRow="1" w:lastColumn="0" w:lastRow="0" w:noHBand="0" w:noVBand="1" w:val="04A0"/>
+        <w:tblBorders>
+          <w:top w:val="single" w:sz="8" w:space="0" w:color="4F81BD"/>
+          <w:left w:val="nil"/>
+          <w:bottom w:val="single" w:sz="8" w:space="0" w:color="4F81BD"/>
+          <w:right w:val="nil"/>
+          <w:insideH w:val="nil"/>
+          <w:insideV w:val="nil"/>
+        </w:tblBorders>
+      </w:tblPr>
+      <w:tblGrid>
+        <w:gridCol w:w="576"/>
+        <w:gridCol w:w="4320"/>
+        <w:gridCol w:w="3744"/>
+        <w:gridCol w:w="1440"/>
+      </w:tblGrid>
+      <w:tr>
+        <w:trPr>
+          <w:cantSplit/>
+          <w:tblHeader w:val="true"/>
+        </w:trPr>
+        <w:tc>
+          <w:tcPr>
+            <w:tcW w:type="dxa" w:w="576"/>
+            <w:tcBorders>
+              <w:top w:val="single" w:sz="8" w:space="0" w:color="4F81BD"/>
+              <w:bottom w:val="single" w:sz="8" w:space="0" w:color="4F81BD"/>
+            </w:tcBorders>
+            <w:shd w:val="clear" w:color="auto" w:fill="365F91"/>
+          </w:tcPr>
+          <w:p>
+            <w:pPr>
+              <w:keepNext/>
+              <w:spacing w:before="40" w:after="40" w:line="240" w:lineRule="auto"/>
+            </w:pPr>
+            <w:r/>
+            <w:r>
+              <w:rPr>
+                <w:b/>
+                <w:color w:val="FFFFFF"/>
+                <w:sz w:val="20"/>
+              </w:rPr>
+              <w:t>#</w:t>
+            </w:r>
+          </w:p>
+        </w:tc>
+        <w:tc>
+          <w:tcPr>
+            <w:tcW w:type="dxa" w:w="4320"/>
+            <w:tcBorders>
+              <w:top w:val="single" w:sz="8" w:space="0" w:color="4F81BD"/>
+              <w:bottom w:val="single" w:sz="8" w:space="0" w:color="4F81BD"/>
+            </w:tcBorders>
+            <w:shd w:val="clear" w:color="auto" w:fill="365F91"/>
+          </w:tcPr>
+          <w:p>
+            <w:pPr>
+              <w:keepNext/>
+              <w:spacing w:before="40" w:after="40" w:line="240" w:lineRule="auto"/>
+            </w:pPr>
+            <w:r/>
+            <w:r>
+              <w:rPr>
+                <w:b/>
+                <w:color w:val="FFFFFF"/>
+                <w:sz w:val="20"/>
+              </w:rPr>
+              <w:t>Enhancement</w:t>
+            </w:r>
+          </w:p>
+        </w:tc>
+        <w:tc>
+          <w:tcPr>
+            <w:tcW w:type="dxa" w:w="3744"/>
+            <w:tcBorders>
+              <w:top w:val="single" w:sz="8" w:space="0" w:color="4F81BD"/>
+              <w:bottom w:val="single" w:sz="8" w:space="0" w:color="4F81BD"/>
+            </w:tcBorders>
+            <w:shd w:val="clear" w:color="auto" w:fill="365F91"/>
+          </w:tcPr>
+          <w:p>
+            <w:pPr>
+              <w:keepNext/>
+              <w:spacing w:before="40" w:after="40" w:line="240" w:lineRule="auto"/>
+            </w:pPr>
+            <w:r/>
+            <w:r>
+              <w:rPr>
+                <w:b/>
+                <w:color w:val="FFFFFF"/>
+                <w:sz w:val="20"/>
+              </w:rPr>
+              <w:t>Where</w:t>
+            </w:r>
+          </w:p>
+        </w:tc>
+        <w:tc>
+          <w:tcPr>
+            <w:tcW w:type="dxa" w:w="1440"/>
+            <w:tcBorders>
+              <w:top w:val="single" w:sz="8" w:space="0" w:color="4F81BD"/>
+              <w:bottom w:val="single" w:sz="8" w:space="0" w:color="4F81BD"/>
+            </w:tcBorders>
+            <w:shd w:val="clear" w:color="auto" w:fill="365F91"/>
+          </w:tcPr>
+          <w:p>
+            <w:pPr>
+              <w:keepNext/>
+              <w:spacing w:before="40" w:after="40" w:line="240" w:lineRule="auto"/>
+            </w:pPr>
+            <w:r/>
+            <w:r>
+              <w:rPr>
+                <w:b/>
+                <w:color w:val="FFFFFF"/>
+                <w:sz w:val="20"/>
+              </w:rPr>
+              <w:t>Commit</w:t>
+            </w:r>
+          </w:p>
+        </w:tc>
+      </w:tr>
+      <w:tr>
+        <w:trPr>
+          <w:cantSplit/>
+        </w:trPr>
+        <w:tc>
+          <w:tcPr>
+            <w:tcW w:type="dxa" w:w="576"/>
+            <w:shd w:val="clear" w:color="auto" w:fill="D3DFEE"/>
+          </w:tcPr>
+          <w:p>
+            <w:pPr>
+              <w:spacing w:before="40" w:after="40" w:line="240" w:lineRule="auto"/>
+            </w:pPr>
+            <w:r/>
+            <w:r>
+              <w:rPr>
+                <w:b/>
+                <w:color w:val="173A53"/>
+                <w:sz w:val="20"/>
+              </w:rPr>
+              <w:t>10</w:t>
+            </w:r>
+          </w:p>
+        </w:tc>
+        <w:tc>
+          <w:tcPr>
+            <w:tcW w:type="dxa" w:w="4320"/>
+            <w:shd w:val="clear" w:color="auto" w:fill="D3DFEE"/>
+          </w:tcPr>
+          <w:p>
+            <w:pPr>
+              <w:spacing w:before="40" w:after="40" w:line="240" w:lineRule="auto"/>
+            </w:pPr>
+            <w:r/>
+            <w:r>
+              <w:rPr>
+                <w:color w:val="1A1A1A"/>
+                <w:sz w:val="20"/>
+              </w:rPr>
+              <w:t>Pod-to-pod SSH key (out-of-band Secret) + client config + system known_hosts</w:t>
+            </w:r>
+          </w:p>
+        </w:tc>
+        <w:tc>
+          <w:tcPr>
+            <w:tcW w:type="dxa" w:w="3744"/>
+            <w:shd w:val="clear" w:color="auto" w:fill="D3DFEE"/>
+          </w:tcPr>
+          <w:p>
+            <w:pPr>
+              <w:spacing w:before="40" w:after="40" w:line="240" w:lineRule="auto"/>
+            </w:pPr>
+            <w:r/>
+            <w:r>
+              <w:rPr>
+                <w:color w:val="1A1A1A"/>
+                <w:sz w:val="20"/>
+              </w:rPr>
+              <w:t>kubectl; devpod-statefulset.yaml, devpod-runtime.sh, authorized_keys, README.md</w:t>
+            </w:r>
+          </w:p>
+        </w:tc>
+        <w:tc>
+          <w:tcPr>
+            <w:tcW w:type="dxa" w:w="1440"/>
+            <w:shd w:val="clear" w:color="auto" w:fill="D3DFEE"/>
+          </w:tcPr>
+          <w:p>
+            <w:pPr>
+              <w:spacing w:before="40" w:after="40" w:line="240" w:lineRule="auto"/>
+            </w:pPr>
+            <w:r/>
+            <w:r>
+              <w:rPr>
+                <w:color w:val="1A1A1A"/>
+                <w:sz w:val="20"/>
+              </w:rPr>
+              <w:t>80b00d4</w:t>
+            </w:r>
+          </w:p>
+        </w:tc>
+      </w:tr>
+    </w:tbl>
+    <w:p>
+      <w:pPr>
+        <w:spacing w:after="40" w:line="120" w:lineRule="exact"/>
+      </w:pPr>
+    </w:p>
+    <w:tbl>
+      <w:tblPr>
+        <w:tblStyle w:val="LightShading-Accent1"/>
+        <w:tblW w:type="auto" w:w="0"/>
+        <w:tblLayout w:type="fixed"/>
+        <w:tblLook w:firstColumn="1" w:firstRow="1" w:lastColumn="0" w:lastRow="0" w:noHBand="0" w:noVBand="1" w:val="04A0"/>
+        <w:tblBorders>
+          <w:top w:val="single" w:sz="8" w:space="0" w:color="4F81BD"/>
+          <w:left w:val="nil"/>
+          <w:bottom w:val="single" w:sz="8" w:space="0" w:color="4F81BD"/>
+          <w:right w:val="nil"/>
+          <w:insideH w:val="nil"/>
+          <w:insideV w:val="nil"/>
+        </w:tblBorders>
+      </w:tblPr>
+      <w:tblGrid>
+        <w:gridCol w:w="2304"/>
+        <w:gridCol w:w="1296"/>
+        <w:gridCol w:w="6480"/>
+      </w:tblGrid>
+      <w:tr>
+        <w:trPr>
+          <w:cantSplit/>
+          <w:tblHeader w:val="true"/>
+        </w:trPr>
+        <w:tc>
+          <w:tcPr>
+            <w:tcW w:type="dxa" w:w="2304"/>
+            <w:tcBorders>
+              <w:top w:val="single" w:sz="8" w:space="0" w:color="4F81BD"/>
+              <w:bottom w:val="single" w:sz="8" w:space="0" w:color="4F81BD"/>
+            </w:tcBorders>
+            <w:shd w:val="clear" w:color="auto" w:fill="365F91"/>
+          </w:tcPr>
+          <w:p>
+            <w:pPr>
+              <w:keepNext/>
+              <w:spacing w:before="40" w:after="40" w:line="240" w:lineRule="auto"/>
+            </w:pPr>
+            <w:r/>
+            <w:r>
+              <w:rPr>
+                <w:b/>
+                <w:color w:val="FFFFFF"/>
+                <w:sz w:val="20"/>
+              </w:rPr>
+              <w:t>Commit (homelab-cluster)</w:t>
+            </w:r>
+          </w:p>
+        </w:tc>
+        <w:tc>
+          <w:tcPr>
+            <w:tcW w:type="dxa" w:w="1296"/>
+            <w:tcBorders>
+              <w:top w:val="single" w:sz="8" w:space="0" w:color="4F81BD"/>
+              <w:bottom w:val="single" w:sz="8" w:space="0" w:color="4F81BD"/>
+            </w:tcBorders>
+            <w:shd w:val="clear" w:color="auto" w:fill="365F91"/>
+          </w:tcPr>
+          <w:p>
+            <w:pPr>
+              <w:keepNext/>
+              <w:spacing w:before="40" w:after="40" w:line="240" w:lineRule="auto"/>
+            </w:pPr>
+            <w:r/>
+            <w:r>
+              <w:rPr>
+                <w:b/>
+                <w:color w:val="FFFFFF"/>
+                <w:sz w:val="20"/>
+              </w:rPr>
+              <w:t>Time (CT)</w:t>
+            </w:r>
+          </w:p>
+        </w:tc>
+        <w:tc>
+          <w:tcPr>
+            <w:tcW w:type="dxa" w:w="6480"/>
+            <w:tcBorders>
+              <w:top w:val="single" w:sz="8" w:space="0" w:color="4F81BD"/>
+              <w:bottom w:val="single" w:sz="8" w:space="0" w:color="4F81BD"/>
+            </w:tcBorders>
+            <w:shd w:val="clear" w:color="auto" w:fill="365F91"/>
+          </w:tcPr>
+          <w:p>
+            <w:pPr>
+              <w:keepNext/>
+              <w:spacing w:before="40" w:after="40" w:line="240" w:lineRule="auto"/>
+            </w:pPr>
+            <w:r/>
+            <w:r>
+              <w:rPr>
+                <w:b/>
+                <w:color w:val="FFFFFF"/>
+                <w:sz w:val="20"/>
+              </w:rPr>
+              <w:t>Message</w:t>
+            </w:r>
+          </w:p>
+        </w:tc>
+      </w:tr>
+      <w:tr>
+        <w:trPr>
+          <w:cantSplit/>
+        </w:trPr>
+        <w:tc>
+          <w:tcPr>
+            <w:tcW w:type="dxa" w:w="2304"/>
+            <w:shd w:val="clear" w:color="auto" w:fill="D3DFEE"/>
+          </w:tcPr>
+          <w:p>
+            <w:pPr>
+              <w:spacing w:before="40" w:after="40" w:line="240" w:lineRule="auto"/>
+            </w:pPr>
+            <w:r/>
+            <w:r>
+              <w:rPr>
+                <w:b/>
+                <w:color w:val="173A53"/>
+                <w:sz w:val="20"/>
+              </w:rPr>
+              <w:t>80b00d4</w:t>
+            </w:r>
+          </w:p>
+        </w:tc>
+        <w:tc>
+          <w:tcPr>
+            <w:tcW w:type="dxa" w:w="1296"/>
+            <w:shd w:val="clear" w:color="auto" w:fill="D3DFEE"/>
+          </w:tcPr>
+          <w:p>
+            <w:pPr>
+              <w:spacing w:before="40" w:after="40" w:line="240" w:lineRule="auto"/>
+            </w:pPr>
+            <w:r/>
+            <w:r>
+              <w:rPr>
+                <w:color w:val="1A1A1A"/>
+                <w:sz w:val="20"/>
+              </w:rPr>
+              <w:t>15:55</w:t>
+            </w:r>
+          </w:p>
+        </w:tc>
+        <w:tc>
+          <w:tcPr>
+            <w:tcW w:type="dxa" w:w="6480"/>
+            <w:shd w:val="clear" w:color="auto" w:fill="D3DFEE"/>
+          </w:tcPr>
+          <w:p>
+            <w:pPr>
+              <w:spacing w:before="40" w:after="40" w:line="240" w:lineRule="auto"/>
+            </w:pPr>
+            <w:r/>
+            <w:r>
+              <w:rPr>
+                <w:color w:val="1A1A1A"/>
+                <w:sz w:val="20"/>
+              </w:rPr>
+              <w:t>DevPod: pod-to-pod SSH with internal key</w:t>
+            </w:r>
+          </w:p>
+        </w:tc>
+      </w:tr>
+    </w:tbl>
+    <w:p>
+      <w:pPr>
+        <w:spacing w:after="40" w:line="120" w:lineRule="exact"/>
+      </w:pPr>
+    </w:p>
+    <w:p>
+      <w:pPr>
+        <w:pStyle w:val="Heading2"/>
+      </w:pPr>
+      <w:r>
+        <w:t>S2.2 Learning: a copied Mac ssh config overrides the pod config</w:t>
+      </w:r>
+    </w:p>
+    <w:p>
+      <w:pPr>
+        <w:shd w:val="clear" w:color="auto" w:fill="FBEAEA"/>
+        <w:keepNext/>
+        <w:keepLines/>
+        <w:pBdr>
+          <w:left w:val="single" w:sz="36" w:space="6" w:color="A52A23"/>
+        </w:pBdr>
+        <w:spacing w:before="40" w:after="0"/>
+        <w:ind w:left="144" w:right="86"/>
+      </w:pPr>
+      <w:r>
+        <w:rPr>
+          <w:rFonts w:ascii="Calibri" w:hAnsi="Calibri" w:eastAsia="Calibri"/>
+          <w:b/>
+          <w:color w:val="A52A23"/>
+        </w:rPr>
+        <w:t xml:space="preserve">MISTAKE  </w:t>
+      </w:r>
+      <w:r>
+        <w:rPr>
+          <w:rFonts w:ascii="Calibri" w:hAnsi="Calibri" w:eastAsia="Calibri"/>
+          <w:b/>
+          <w:color w:val="A52A23"/>
+        </w:rPr>
+        <w:t>~/.ssh/config on devpod-1 was a copy of the Mac mini's config</w:t>
+      </w:r>
+      <w:r>
+        <w:br/>
+      </w:r>
+      <w:r>
+        <w:rPr>
+          <w:rFonts w:ascii="Calibri" w:hAnsi="Calibri" w:eastAsia="Calibri"/>
+          <w:b/>
+          <w:color w:val="A52A23"/>
+        </w:rPr>
+        <w:t>Wrong state: /home/vscode/.ssh/config on home-devpod-1 (written 15:46 CT, not chezmoi-managed) held the Mac's Host devpod-0 / devpod-1 blocks with ProxyCommand /opt/homebrew/bin/cloudflared. A user config wins over /etc/ssh/ssh_config.d, so ssh devpod-0 inside the pod tried to run a Mac binary.</w:t>
+      </w:r>
+      <w:r>
+        <w:br/>
+      </w:r>
+      <w:r>
+        <w:rPr>
+          <w:rFonts w:ascii="Calibri" w:hAnsi="Calibri" w:eastAsia="Calibri"/>
+          <w:b/>
+          <w:color w:val="A52A23"/>
+        </w:rPr>
+        <w:t>Never copy a Mac's ~/.ssh/config into a pod.</w:t>
+      </w:r>
+    </w:p>
+    <w:p>
+      <w:pPr>
+        <w:shd w:val="clear" w:color="auto" w:fill="FBEAEA"/>
+        <w:keepNext/>
+        <w:keepLines/>
+        <w:pBdr>
+          <w:left w:val="single" w:sz="36" w:space="6" w:color="A52A23"/>
+        </w:pBdr>
+        <w:spacing w:before="80" w:after="0"/>
+        <w:ind w:left="144" w:right="86"/>
+      </w:pPr>
+      <w:r>
+        <w:rPr>
+          <w:rFonts w:ascii="Calibri" w:hAnsi="Calibri" w:eastAsia="Calibri"/>
+          <w:b/>
+          <w:color w:val="A52A23"/>
+          <w:sz w:val="20"/>
+        </w:rPr>
+        <w:t>Observed failure</w:t>
+      </w:r>
+    </w:p>
+    <w:p>
+      <w:pPr>
+        <w:shd w:val="clear" w:color="auto" w:fill="FBEAEA"/>
+        <w:keepLines/>
+        <w:pBdr>
+          <w:left w:val="single" w:sz="36" w:space="6" w:color="A52A23"/>
+        </w:pBdr>
+        <w:spacing w:before="0" w:after="180" w:line="240" w:lineRule="auto"/>
+        <w:ind w:left="144" w:right="86"/>
+      </w:pPr>
+      <w:r>
+        <w:rPr>
+          <w:rFonts w:ascii="Courier New" w:hAnsi="Courier New" w:eastAsia="Courier New"/>
+          <w:b w:val="0"/>
+          <w:color w:val="A52A23"/>
+          <w:sz w:val="18"/>
+        </w:rPr>
+        <w:t>$ ssh devpod-0 hostname        # as vscode on devpod-1</w:t>
+        <w:br/>
+        <w:t>zsh:1: no such file or directory: /opt/homebrew/bin/cloudflared</w:t>
+        <w:br/>
+        <w:t>Connection closed by UNKNOWN port 65535</w:t>
+      </w:r>
+    </w:p>
+    <w:p>
+      <w:r>
+        <w:rPr>
+          <w:b/>
+          <w:color w:val="173A53"/>
+        </w:rPr>
+        <w:t xml:space="preserve">Fix  </w:t>
+      </w:r>
+      <w:r>
+        <w:t>Renamed to ~/.ssh/config.bak-20261003-macmini-copy (kept, not deleted); the managed system config then applied and devpod-1 → devpod-0 worked (S2.8).</w:t>
+      </w:r>
+    </w:p>
+    <w:p>
+      <w:pPr>
+        <w:pStyle w:val="Heading1"/>
+      </w:pPr>
+      <w:r>
+        <w:t>S2.3 Secret devpod/devpod-internal-ssh (created out of band)</w:t>
+      </w:r>
+    </w:p>
+    <w:p>
+      <w:r>
+        <w:t>Created on the Mac mini at 15:53 CT. Keys id_ed25519 and id_ed25519.pub. The workspace container of every replica mounts it read-only (0400, optional) at /etc/devpod/internal-ssh; devpod-runtime.sh copies the private key to ~/.ssh/id_ed25519_devpod. Flux does not prune it (not in Git).</w:t>
+      </w:r>
+    </w:p>
+    <w:p>
+      <w:pPr>
+        <w:shd w:val="clear" w:color="auto" w:fill="FBEAEA"/>
+        <w:keepLines/>
+        <w:pBdr>
+          <w:left w:val="single" w:sz="36" w:space="6" w:color="A52A23"/>
+        </w:pBdr>
+        <w:spacing w:before="40" w:after="180"/>
+        <w:ind w:left="144" w:right="86"/>
+      </w:pPr>
+      <w:r>
+        <w:rPr>
+          <w:rFonts w:ascii="Calibri" w:hAnsi="Calibri" w:eastAsia="Calibri"/>
+          <w:b/>
+          <w:color w:val="A52A23"/>
+        </w:rPr>
+        <w:t xml:space="preserve">CRITICAL STEP  </w:t>
+      </w:r>
+      <w:r>
+        <w:rPr>
+          <w:rFonts w:ascii="Calibri" w:hAnsi="Calibri" w:eastAsia="Calibri"/>
+          <w:b/>
+          <w:color w:val="A52A23"/>
+        </w:rPr>
+        <w:t>Never commit, print or paste the internal private key.</w:t>
+      </w:r>
+      <w:r>
+        <w:br/>
+      </w:r>
+      <w:r>
+        <w:rPr>
+          <w:rFonts w:ascii="Calibri" w:hAnsi="Calibri" w:eastAsia="Calibri"/>
+          <w:b/>
+          <w:color w:val="A52A23"/>
+        </w:rPr>
+        <w:t>Generate it in a temp dir, load it with kubectl create secret generic, print only the public key and fingerprint, and let the trap delete the temp dir (confirmed removed).</w:t>
+      </w:r>
+    </w:p>
+    <w:p>
+      <w:pPr>
+        <w:keepLines/>
+        <w:spacing w:line="240" w:lineRule="auto" w:before="40" w:after="180"/>
+        <w:ind w:left="86" w:right="86"/>
+        <w:shd w:val="clear" w:color="auto" w:fill="F0F4F7"/>
+      </w:pPr>
+      <w:r>
+        <w:rPr>
+          <w:rFonts w:ascii="Consolas" w:hAnsi="Consolas" w:eastAsia="Consolas"/>
+          <w:color w:val="000000"/>
+          <w:sz w:val="19"/>
+        </w:rPr>
+        <w:t>bash -c '</w:t>
+        <w:br/>
+        <w:t>set -e; d=$(mktemp -d); trap "rm -rf \"$d\"" EXIT; umask 077</w:t>
+        <w:br/>
+        <w:t>ssh-keygen -q -t ed25519 -N "" -C devpod-internal -f "$d/id_ed25519"</w:t>
+        <w:br/>
+        <w:t>kubectl -n devpod delete secret devpod-internal-ssh --ignore-not-found      # rotation only</w:t>
+        <w:br/>
+        <w:t>kubectl -n devpod create secret generic devpod-internal-ssh \</w:t>
+        <w:br/>
+        <w:t xml:space="preserve">  --from-file=id_ed25519="$d/id_ed25519" --from-file=id_ed25519.pub="$d/id_ed25519.pub" &gt;/dev/null</w:t>
+        <w:br/>
+        <w:t>kubectl -n devpod label secret devpod-internal-ssh app.kubernetes.io/name=devpod app.kubernetes.io/part-of=homelab-dev</w:t>
+        <w:br/>
+        <w:t>ssh-keygen -lf "$d/id_ed25519.pub"; cat "$d/id_ed25519.pub"'      # public key + fingerprint only</w:t>
+        <w:br/>
+        <w:t>kubectl -n devpod get secret devpod-internal-ssh -o json | jq -r '.data|keys[]'   # id_ed25519, id_ed25519.pub</w:t>
+      </w:r>
+    </w:p>
+    <w:p>
+      <w:pPr>
+        <w:pStyle w:val="Heading1"/>
+      </w:pPr>
+      <w:r>
+        <w:t>S2.4. File: apps/base/devpod/bootstrap/authorized_keys</w:t>
+      </w:r>
+    </w:p>
+    <w:p>
+      <w:r>
+        <w:t>Adds the devpod-internal public key with from="10.42.0.0/16". Full file at 80b00d4.</w:t>
+      </w:r>
+    </w:p>
+    <w:p>
+      <w:pPr>
+        <w:shd w:val="clear" w:color="auto" w:fill="D3DFEE"/>
+        <w:keepLines/>
+        <w:pBdr>
+          <w:left w:val="single" w:sz="24" w:space="6" w:color="4F81BD"/>
+        </w:pBdr>
+        <w:spacing w:before="40" w:after="180"/>
+        <w:ind w:left="115" w:right="86"/>
+      </w:pPr>
+      <w:r>
+        <w:rPr>
+          <w:b/>
+          <w:color w:val="173A53"/>
+        </w:rPr>
+        <w:t xml:space="preserve">Note  </w:t>
+      </w:r>
+      <w:r>
+        <w:rPr>
+          <w:color w:val="1A1A1A"/>
+        </w:rPr>
+        <w:t>Supersedes the copy in S.3.</w:t>
+      </w:r>
+    </w:p>
+    <w:p>
+      <w:pPr>
+        <w:pStyle w:val="Heading3"/>
+      </w:pPr>
+      <w:r>
+        <w:t>Full file</w:t>
+      </w:r>
+    </w:p>
+    <w:p>
+      <w:pPr>
+        <w:keepLines/>
+        <w:spacing w:line="240" w:lineRule="auto" w:before="40" w:after="180"/>
+        <w:ind w:left="86" w:right="86"/>
+        <w:shd w:val="clear" w:color="auto" w:fill="F0F4F7"/>
+      </w:pPr>
+      <w:r>
+        <w:rPr>
+          <w:rFonts w:ascii="Consolas" w:hAnsi="Consolas" w:eastAsia="Consolas"/>
+          <w:color w:val="000000"/>
+          <w:sz w:val="19"/>
+        </w:rPr>
+        <w:t># SSH public keys allowed to log in as vscode on EVERY DevPod replica.</w:t>
+        <w:br/>
+        <w:t># Source of truth: devpod-runtime.sh overwrites /home/vscode/.ssh/authorized_keys</w:t>
+        <w:br/>
+        <w:t># from this file on each start, so removing a line here revokes that key after</w:t>
+        <w:br/>
+        <w:t># the rollout. Public keys only. One key per line; comments are ignored by sshd.</w:t>
+        <w:br/>
+        <w:t># M5 (SHA256:PBPgT1A69fRgGM1wdwWBMA/BJtPfdsXdFasYUod7JrM)</w:t>
+        <w:br/>
+        <w:t>ssh-ed25519 AAAAC3NzaC1lZDI1NTE5AAAAILsJOJoQ3ER+1depvyKbowRDYCuMzv3TrmQfiReNifSN cyberstar@M5.local</w:t>
+        <w:br/>
+        <w:t># Mac mini (SHA256:94wTnD+20VEazwsIfbXdS8+pTOAfWJWKKKi+iquPrL4)</w:t>
+        <w:br/>
+        <w:t>ssh-ed25519 AAAAC3NzaC1lZDI1NTE5AAAAIHCwtsmUTypZCoxGRvWqfuWrUSI1iXT7XROuC29aJHTP cyberstar@Mac-mini.local</w:t>
+        <w:br/>
+        <w:t># Pod-to-pod key (SHA256:wEg59Nbjp9s6181SaeJUxWVtC0g+CE2bxtMsL/YSEYc). Private half only in</w:t>
+        <w:br/>
+        <w:t># Secret devpod/devpod-internal-ssh (not in Git). from= limits it to pod-network sources</w:t>
+        <w:br/>
+        <w:t># (10.42.0.0/16; pod-to-pod traffic is not SNATed). Note: cloudflared pods are also in</w:t>
+        <w:br/>
+        <w:t># that range, so this narrows rather than fully isolates the key.</w:t>
+        <w:br/>
+        <w:t>from="10.42.0.0/16" ssh-ed25519 AAAAC3NzaC1lZDI1NTE5AAAAIFkwMQOk4B8XXmud/rvynmQDuOLOzNgyhe8pXmM3MREw devpod-internal</w:t>
+      </w:r>
+    </w:p>
+    <w:p>
+      <w:pPr>
+        <w:pStyle w:val="Heading1"/>
+      </w:pPr>
+      <w:r>
+        <w:t>S2.5. File: apps/base/devpod/bootstrap/devpod-runtime.sh</w:t>
+      </w:r>
+    </w:p>
+    <w:p>
+      <w:r>
+        <w:t>New pod-to-pod block (after the host keys): installs the key, writes /etc/ssh/ssh_config.d/devpod.conf and /etc/ssh/ssh_known_hosts. The authorized_keys key count now also matches lines with a from= prefix.</w:t>
+      </w:r>
+    </w:p>
+    <w:p>
+      <w:pPr>
+        <w:shd w:val="clear" w:color="auto" w:fill="D3DFEE"/>
+        <w:keepLines/>
+        <w:pBdr>
+          <w:left w:val="single" w:sz="24" w:space="6" w:color="4F81BD"/>
+        </w:pBdr>
+        <w:spacing w:before="40" w:after="180"/>
+        <w:ind w:left="115" w:right="86"/>
+      </w:pPr>
+      <w:r>
+        <w:rPr>
+          <w:b/>
+          <w:color w:val="173A53"/>
+        </w:rPr>
+        <w:t xml:space="preserve">Note  </w:t>
+      </w:r>
+      <w:r>
+        <w:rPr>
+          <w:color w:val="1A1A1A"/>
+        </w:rPr>
+        <w:t>Supersedes the copies in section 7 and S.5.</w:t>
+      </w:r>
+    </w:p>
+    <w:p>
+      <w:pPr>
+        <w:pStyle w:val="Heading3"/>
+      </w:pPr>
+      <w:r>
+        <w:t>Full file</w:t>
+      </w:r>
+    </w:p>
+    <w:p>
+      <w:pPr>
+        <w:spacing w:line="240" w:lineRule="auto" w:before="40" w:after="180"/>
+        <w:ind w:left="86" w:right="86"/>
+        <w:shd w:val="clear" w:color="auto" w:fill="F0F4F7"/>
+      </w:pPr>
+      <w:r>
+        <w:rPr>
+          <w:rFonts w:ascii="Consolas" w:hAnsi="Consolas" w:eastAsia="Consolas"/>
+          <w:color w:val="000000"/>
+          <w:sz w:val="19"/>
+        </w:rPr>
+        <w:t>#!/bin/bash</w:t>
+        <w:br/>
+        <w:t># Per-start setup for anything that lives on the container filesystem</w:t>
+        <w:br/>
+        <w:t># (lost on every restart): git credential helper, gh token, login shell,</w:t>
+        <w:br/>
+        <w:t># mise on PATH. Safe to run in the bootstrap initContainer and in workspace.</w:t>
+        <w:br/>
+        <w:t>set -uo pipefail</w:t>
+        <w:br/>
+        <w:t>DEV_USER=vscode</w:t>
+        <w:br/>
+        <w:t>DEV_HOME=/home/vscode</w:t>
+        <w:br/>
+        <w:t>SRC=/etc/devpod/github/token</w:t>
+        <w:br/>
+        <w:t>RUN_DIR=/run/devpod-github</w:t>
+        <w:br/>
+        <w:br/>
+        <w:t># Copy the token to a vscode-readable file outside the home PVC.</w:t>
+        <w:br/>
+        <w:t>if [ -s "$SRC" ]; then</w:t>
+        <w:br/>
+        <w:t xml:space="preserve">  mkdir -p "$RUN_DIR"</w:t>
+        <w:br/>
+        <w:t xml:space="preserve">  install -m 0400 -o 1000 -g 1000 "$SRC" "$RUN_DIR/token"</w:t>
+        <w:br/>
+        <w:t xml:space="preserve">  chmod 0500 "$RUN_DIR"; chown 1000:1000 "$RUN_DIR"</w:t>
+        <w:br/>
+        <w:t xml:space="preserve">  echo "devpod-runtime: GitHub token present"</w:t>
+        <w:br/>
+        <w:t>else</w:t>
+        <w:br/>
+        <w:t xml:space="preserve">  echo "devpod-runtime: no GitHub token mounted; private repos will not clone"</w:t>
+        <w:br/>
+        <w:t>fi</w:t>
+        <w:br/>
+        <w:br/>
+        <w:t># SSH authorized_keys for vscode, from the repo (bootstrap/authorized_keys in</w:t>
+        <w:br/>
+        <w:t># ConfigMap devpod-bootstrap). Overwritten on every start so Git is the source</w:t>
+        <w:br/>
+        <w:t># of truth: removing a key in Git revokes it. Skipped (existing file kept) if</w:t>
+        <w:br/>
+        <w:t># the ConfigMap copy has no key lines, so a bad edit can't lock everyone out.</w:t>
+        <w:br/>
+        <w:t>AK_SRC=/opt/devpod-bootstrap/authorized_keys</w:t>
+        <w:br/>
+        <w:t>AK_DIR="$DEV_HOME/.ssh"</w:t>
+        <w:br/>
+        <w:t>AK_KEYS='^(from="[^"]*" +)?(ssh-|ecdsa-|sk-)'</w:t>
+        <w:br/>
+        <w:t>if [ -f "$AK_SRC" ] &amp;&amp; grep -qE "$AK_KEYS" "$AK_SRC"; then</w:t>
+        <w:br/>
+        <w:t xml:space="preserve">  install -d -m 0700 -o 1000 -g 1000 "$AK_DIR"</w:t>
+        <w:br/>
+        <w:t xml:space="preserve">  install -m 0600 -o 1000 -g 1000 "$AK_SRC" "$AK_DIR/authorized_keys.new"</w:t>
+        <w:br/>
+        <w:t xml:space="preserve">  mv -f "$AK_DIR/authorized_keys.new" "$AK_DIR/authorized_keys"</w:t>
+        <w:br/>
+        <w:t xml:space="preserve">  echo "devpod-runtime: authorized_keys written from repo ($(grep -cE "$AK_KEYS" "$AK_SRC") keys)"</w:t>
+        <w:br/>
+        <w:t>else</w:t>
+        <w:br/>
+        <w:t xml:space="preserve">  echo "devpod-runtime: no keys in $AK_SRC; leaving existing authorized_keys"</w:t>
+        <w:br/>
+        <w:t>fi</w:t>
+        <w:br/>
+        <w:br/>
+        <w:t># Persistent SSH host keys (Secret devpod/devpod-ssh-host-keys, mounted only</w:t>
+        <w:br/>
+        <w:t># in workspace). Copy before sshd is installed/started so the fingerprint is</w:t>
+        <w:br/>
+        <w:t># the same on every restart and every replica. Without the Secret the</w:t>
+        <w:br/>
+        <w:t># workspace command falls back to ssh-keygen -A (keys change on restart).</w:t>
+        <w:br/>
+        <w:t>HK_SRC=/etc/devpod/ssh-host-keys</w:t>
+        <w:br/>
+        <w:t>if ls "$HK_SRC"/ssh_host_*_key &gt;/dev/null 2&gt;&amp;1; then</w:t>
+        <w:br/>
+        <w:t xml:space="preserve">  mkdir -p /etc/ssh</w:t>
+        <w:br/>
+        <w:t xml:space="preserve">  for k in "$HK_SRC"/ssh_host_*_key; do</w:t>
+        <w:br/>
+        <w:t xml:space="preserve">    n=$(basename "$k")</w:t>
+        <w:br/>
+        <w:t xml:space="preserve">    install -m 0600 -o 0 -g 0 "$k" "/etc/ssh/$n"</w:t>
+        <w:br/>
+        <w:t xml:space="preserve">    [ -s "$k.pub" ] &amp;&amp; install -m 0644 -o 0 -g 0 "$k.pub" "/etc/ssh/$n.pub"</w:t>
+        <w:br/>
+        <w:t xml:space="preserve">  done</w:t>
+        <w:br/>
+        <w:t xml:space="preserve">  echo "devpod-runtime: persistent SSH host keys installed"</w:t>
+        <w:br/>
+        <w:t>else</w:t>
+        <w:br/>
+        <w:t xml:space="preserve">  echo "devpod-runtime: no SSH host key Secret; sshd will generate throwaway keys"</w:t>
+        <w:br/>
+        <w:t>fi</w:t>
+        <w:br/>
+        <w:br/>
+        <w:t># Pod-to-pod SSH (Secret devpod/devpod-internal-ssh, mounted only in</w:t>
+        <w:br/>
+        <w:t># workspace): install the internal client key, a system ssh client config for</w:t>
+        <w:br/>
+        <w:t># the devpod-N short names, and a system known_hosts built from the shared</w:t>
+        <w:br/>
+        <w:t># host keys, so "ssh devpod-1" works between replicas with no prompt.</w:t>
+        <w:br/>
+        <w:t># Lives in /etc (container fs) so chezmoi-managed ~/.ssh files are untouched.</w:t>
+        <w:br/>
+        <w:t>IK_SRC=/etc/devpod/internal-ssh/id_ed25519</w:t>
+        <w:br/>
+        <w:t>if [ -s "$IK_SRC" ]; then</w:t>
+        <w:br/>
+        <w:t xml:space="preserve">  install -d -m 0700 -o 1000 -g 1000 "$DEV_HOME/.ssh"</w:t>
+        <w:br/>
+        <w:t xml:space="preserve">  install -m 0600 -o 1000 -g 1000 "$IK_SRC" "$DEV_HOME/.ssh/id_ed25519_devpod"</w:t>
+        <w:br/>
+        <w:t xml:space="preserve">  [ -s "$IK_SRC.pub" ] &amp;&amp; install -m 0644 -o 1000 -g 1000 "$IK_SRC.pub" "$DEV_HOME/.ssh/id_ed25519_devpod.pub"</w:t>
+        <w:br/>
+        <w:t xml:space="preserve">  mkdir -p /etc/ssh/ssh_config.d</w:t>
+        <w:br/>
+        <w:t xml:space="preserve">  cat &gt; /etc/ssh/ssh_config.d/devpod.conf &lt;&lt;'SSHCFG'</w:t>
+        <w:br/>
+        <w:t># Managed by devpod-runtime.sh (homelab-cluster). Pod-to-pod SSH by short name.</w:t>
+        <w:br/>
+        <w:t>Host devpod-* !devpod-*.*</w:t>
+        <w:br/>
+        <w:t xml:space="preserve">  HostName %h.devpod.devpod.svc.cluster.local</w:t>
+        <w:br/>
+        <w:t xml:space="preserve">  Port 2222</w:t>
+        <w:br/>
+        <w:t xml:space="preserve">  User vscode</w:t>
+        <w:br/>
+        <w:t xml:space="preserve">  IdentityFile ~/.ssh/id_ed25519_devpod</w:t>
+        <w:br/>
+        <w:t xml:space="preserve">  IdentitiesOnly yes</w:t>
+        <w:br/>
+        <w:t>SSHCFG</w:t>
+        <w:br/>
+        <w:t xml:space="preserve">  chmod 0644 /etc/ssh/ssh_config.d/devpod.conf</w:t>
+        <w:br/>
+        <w:t xml:space="preserve">  : &gt; /etc/ssh/ssh_known_hosts</w:t>
+        <w:br/>
+        <w:t xml:space="preserve">  for pub in "$HK_SRC"/ssh_host_*_key.pub; do</w:t>
+        <w:br/>
+        <w:t xml:space="preserve">    [ -s "$pub" ] || continue</w:t>
+        <w:br/>
+        <w:t xml:space="preserve">    printf '%s %s\n' 'devpod-*,[devpod-*.devpod.devpod.svc.cluster.local]:2222,[devpod-*]:2222' "$(awk '{print $1, $2}' "$pub")" &gt;&gt; /etc/ssh/ssh_known_hosts</w:t>
+        <w:br/>
+        <w:t xml:space="preserve">  done</w:t>
+        <w:br/>
+        <w:t xml:space="preserve">  chmod 0644 /etc/ssh/ssh_known_hosts</w:t>
+        <w:br/>
+        <w:t xml:space="preserve">  echo "devpod-runtime: pod-to-pod SSH key, client config and known_hosts installed"</w:t>
+        <w:br/>
+        <w:t>else</w:t>
+        <w:br/>
+        <w:t xml:space="preserve">  echo "devpod-runtime: no internal SSH key Secret; pod-to-pod SSH not configured"</w:t>
+        <w:br/>
+        <w:t>fi</w:t>
+        <w:br/>
+        <w:br/>
+        <w:t># SOPS age private key (Secret devpod/sops-age, mounted only in workspace).</w:t>
+        <w:br/>
+        <w:t># Copy to the container fs for vscode; ~/.config/sops/age/keys.txt (sops'</w:t>
+        <w:br/>
+        <w:t># default path) is only a symlink, so the key never lands on the home PVC.</w:t>
+        <w:br/>
+        <w:t>AGE_SRC=/etc/sops-age/age.agekey</w:t>
+        <w:br/>
+        <w:t>AGE_DIR=/run/devpod-sops</w:t>
+        <w:br/>
+        <w:t>if [ -s "$AGE_SRC" ]; then</w:t>
+        <w:br/>
+        <w:t xml:space="preserve">  mkdir -p "$AGE_DIR"</w:t>
+        <w:br/>
+        <w:t xml:space="preserve">  install -m 0400 -o 1000 -g 1000 "$AGE_SRC" "$AGE_DIR/keys.txt"</w:t>
+        <w:br/>
+        <w:t xml:space="preserve">  chmod 0500 "$AGE_DIR"; chown 1000:1000 "$AGE_DIR"</w:t>
+        <w:br/>
+        <w:t xml:space="preserve">  install -d -m 0700 -o 1000 -g 1000 "$DEV_HOME/.config/sops" "$DEV_HOME/.config/sops/age"</w:t>
+        <w:br/>
+        <w:t xml:space="preserve">  if [ ! -e "$DEV_HOME/.config/sops/age/keys.txt" ] || [ -L "$DEV_HOME/.config/sops/age/keys.txt" ]; then</w:t>
+        <w:br/>
+        <w:t xml:space="preserve">    ln -sfn "$AGE_DIR/keys.txt" "$DEV_HOME/.config/sops/age/keys.txt"</w:t>
+        <w:br/>
+        <w:t xml:space="preserve">    chown -h 1000:1000 "$DEV_HOME/.config/sops/age/keys.txt"</w:t>
+        <w:br/>
+        <w:t xml:space="preserve">  fi</w:t>
+        <w:br/>
+        <w:t xml:space="preserve">  cat &gt; /etc/profile.d/devpod-sops.sh &lt;&lt;'PROF'</w:t>
+        <w:br/>
+        <w:t>if [ -r /run/devpod-sops/keys.txt ]; then SOPS_AGE_KEY_FILE=/run/devpod-sops/keys.txt; export SOPS_AGE_KEY_FILE; fi</w:t>
+        <w:br/>
+        <w:t>PROF</w:t>
+        <w:br/>
+        <w:t xml:space="preserve">  echo "devpod-runtime: SOPS age key present"</w:t>
+        <w:br/>
+        <w:t>else</w:t>
+        <w:br/>
+        <w:t xml:space="preserve">  echo "devpod-runtime: no SOPS age key mounted; sops -d will not work"</w:t>
+        <w:br/>
+        <w:t>fi</w:t>
+        <w:br/>
+        <w:br/>
+        <w:t># System git config: helper for github.com over HTTPS, never prompt.</w:t>
+        <w:br/>
+        <w:t>git config --system credential.https://github.com.helper /opt/devpod-bootstrap/git-credential-devpod</w:t>
+        <w:br/>
+        <w:t>git config --system credential.https://github.com.username x-access-token</w:t>
+        <w:br/>
+        <w:t>git config --system credential.https://github.com.useHttpPath false</w:t>
+        <w:br/>
+        <w:t># Rewrite SSH-style GitHub URLs (git@github.com:, ssh://git@github.com/,</w:t>
+        <w:br/>
+        <w:t># bare github.com:) to HTTPS so the token helper above is used; the pod has</w:t>
+        <w:br/>
+        <w:t># no SSH key on GitHub. Reset and re-add so reruns stay idempotent.</w:t>
+        <w:br/>
+        <w:t>git config --system --unset-all url.https://github.com/.insteadOf 2&gt;/dev/null || true</w:t>
+        <w:br/>
+        <w:t>for pfx in git@github.com: ssh://git@github.com/ github.com:; do</w:t>
+        <w:br/>
+        <w:t xml:space="preserve">  git config --system --add url.https://github.com/.insteadOf "$pfx" || echo "devpod-runtime: insteadOf $pfx failed"</w:t>
+        <w:br/>
+        <w:t>done</w:t>
+        <w:br/>
+        <w:br/>
+        <w:t># gh (if installed) reads GH_TOKEN in login shells.</w:t>
+        <w:br/>
+        <w:t>cat &gt; /etc/profile.d/devpod-github.sh &lt;&lt;'PROF'</w:t>
+        <w:br/>
+        <w:t>if [ -r /run/devpod-github/token ]; then GH_TOKEN="$(cat /run/devpod-github/token)"; export GH_TOKEN; fi</w:t>
+        <w:br/>
+        <w:t>PROF</w:t>
+        <w:br/>
+        <w:t># mise for every login shell (root via kubectl exec, vscode via ssh).</w:t>
+        <w:br/>
+        <w:t>cat &gt; /etc/profile.d/devpod-mise.sh &lt;&lt;'PROF'</w:t>
+        <w:br/>
+        <w:t>case ":$PATH:" in *":/home/vscode/.local/bin:"*) ;; *) PATH="/home/vscode/.local/bin:$PATH";; esac</w:t>
+        <w:br/>
+        <w:t>export PATH</w:t>
+        <w:br/>
+        <w:t>PROF</w:t>
+        <w:br/>
+        <w:t>ln -sf "$DEV_HOME/.local/bin/mise" /usr/local/bin/mise 2&gt;/dev/null || true</w:t>
+        <w:br/>
+        <w:t># Homebrew (on the home PVC) for every login shell, including bash login</w:t>
+        <w:br/>
+        <w:t># shells that never reach the dotfiles' interactive .bashrc.</w:t>
+        <w:br/>
+        <w:t>cat &gt; /etc/profile.d/devpod-brew.sh &lt;&lt;'PROF'</w:t>
+        <w:br/>
+        <w:t>if [ -x /home/linuxbrew/.linuxbrew/bin/brew ]; then</w:t>
+        <w:br/>
+        <w:t xml:space="preserve">  case ":$PATH:" in *":/home/linuxbrew/.linuxbrew/bin:"*) ;; *) eval "$(/home/linuxbrew/.linuxbrew/bin/brew shellenv)";; esac</w:t>
+        <w:br/>
+        <w:t>fi</w:t>
+        <w:br/>
+        <w:t>PROF</w:t>
+        <w:br/>
+        <w:br/>
+        <w:t># SSH and "su -" sessions don't inherit the container env, so kubectl's</w:t>
+        <w:br/>
+        <w:t># in-cluster config (KUBERNETES_SERVICE_HOST/PORT + the mounted SA token)</w:t>
+        <w:br/>
+        <w:t># would fall back to localhost:8080. pam_env reads /etc/environment for</w:t>
+        <w:br/>
+        <w:t># sshd and su regardless of shell (zsh skips /etc/profile.d).</w:t>
+        <w:br/>
+        <w:t>sed -i '/^KUBERNETES_SERVICE_HOST=/d;/^KUBERNETES_SERVICE_PORT=/d;/^SOPS_AGE_KEY_FILE=/d' /etc/environment 2&gt;/dev/null || true</w:t>
+        <w:br/>
+        <w:t>if [ -n "${KUBERNETES_SERVICE_HOST:-}" ]; then</w:t>
+        <w:br/>
+        <w:t xml:space="preserve">  printf 'KUBERNETES_SERVICE_HOST=%s\nKUBERNETES_SERVICE_PORT=%s\n' "$KUBERNETES_SERVICE_HOST" "${KUBERNETES_SERVICE_PORT:-443}" &gt;&gt; /etc/environment</w:t>
+        <w:br/>
+        <w:t>fi</w:t>
+        <w:br/>
+        <w:t>if [ -r "${AGE_DIR}/keys.txt" ]; then</w:t>
+        <w:br/>
+        <w:t xml:space="preserve">  echo "SOPS_AGE_KEY_FILE=${AGE_DIR}/keys.txt" &gt;&gt; /etc/environment</w:t>
+        <w:br/>
+        <w:t>fi</w:t>
+        <w:br/>
+        <w:br/>
+        <w:t># The dotfiles setup runs "sudo chsh -s zsh $USER"; /etc/passwd is not</w:t>
+        <w:br/>
+        <w:t># on the PVC, so repeat it on every start.</w:t>
+        <w:br/>
+        <w:t>if command -v zsh &gt;/dev/null 2&gt;&amp;1; then</w:t>
+        <w:br/>
+        <w:t xml:space="preserve">  chsh -s "$(command -v zsh)" "$DEV_USER" || echo "devpod-runtime: chsh failed"</w:t>
+        <w:br/>
+        <w:t>fi</w:t>
+        <w:br/>
+        <w:t>exit 0</w:t>
+      </w:r>
+    </w:p>
+    <w:p>
+      <w:pPr>
+        <w:pStyle w:val="Heading1"/>
+      </w:pPr>
+      <w:r>
+        <w:t>S2.6. File: apps/base/devpod/devpod-statefulset.yaml</w:t>
+      </w:r>
+    </w:p>
+    <w:p>
+      <w:r>
+        <w:t>New internal-ssh volume (Secret devpod-internal-ssh, optional, 0400) and read-only mount at /etc/devpod/internal-ssh. Full file at 80b00d4.</w:t>
+      </w:r>
+    </w:p>
+    <w:p>
+      <w:pPr>
+        <w:shd w:val="clear" w:color="auto" w:fill="D3DFEE"/>
+        <w:keepLines/>
+        <w:pBdr>
+          <w:left w:val="single" w:sz="24" w:space="6" w:color="4F81BD"/>
+        </w:pBdr>
+        <w:spacing w:before="40" w:after="180"/>
+        <w:ind w:left="115" w:right="86"/>
+      </w:pPr>
+      <w:r>
+        <w:rPr>
+          <w:b/>
+          <w:color w:val="173A53"/>
+        </w:rPr>
+        <w:t xml:space="preserve">Note  </w:t>
+      </w:r>
+      <w:r>
+        <w:rPr>
+          <w:color w:val="1A1A1A"/>
+        </w:rPr>
+        <w:t>Supersedes the copies in section 6 and S.6.</w:t>
+      </w:r>
+    </w:p>
+    <w:p>
+      <w:pPr>
+        <w:pStyle w:val="Heading3"/>
+      </w:pPr>
+      <w:r>
+        <w:t>Full file</w:t>
+      </w:r>
+    </w:p>
+    <w:p>
+      <w:pPr>
+        <w:spacing w:line="240" w:lineRule="auto" w:before="40" w:after="180"/>
+        <w:ind w:left="86" w:right="86"/>
+        <w:shd w:val="clear" w:color="auto" w:fill="F0F4F7"/>
+      </w:pPr>
+      <w:r>
+        <w:rPr>
+          <w:rFonts w:ascii="Consolas" w:hAnsi="Consolas" w:eastAsia="Consolas"/>
+          <w:color w:val="000000"/>
+          <w:sz w:val="19"/>
+        </w:rPr>
+        <w:t>apiVersion: apps/v1</w:t>
+        <w:br/>
+        <w:t>kind: StatefulSet</w:t>
+        <w:br/>
+        <w:t>metadata:</w:t>
+        <w:br/>
+        <w:t xml:space="preserve">  name: devpod</w:t>
+        <w:br/>
+        <w:t xml:space="preserve">  namespace: devpod</w:t>
+        <w:br/>
+        <w:t xml:space="preserve">  labels:</w:t>
+        <w:br/>
+        <w:t xml:space="preserve">    app.kubernetes.io/name: devpod</w:t>
+        <w:br/>
+        <w:t xml:space="preserve">    app.kubernetes.io/part-of: homelab-dev</w:t>
+        <w:br/>
+        <w:t>spec:</w:t>
+        <w:br/>
+        <w:t xml:space="preserve">  serviceName: devpod</w:t>
+        <w:br/>
+        <w:t xml:space="preserve">  replicas: 2</w:t>
+        <w:br/>
+        <w:t xml:space="preserve">  podManagementPolicy: Parallel</w:t>
+        <w:br/>
+        <w:t xml:space="preserve">  selector:</w:t>
+        <w:br/>
+        <w:t xml:space="preserve">    matchLabels:</w:t>
+        <w:br/>
+        <w:t xml:space="preserve">      app.kubernetes.io/name: devpod</w:t>
+        <w:br/>
+        <w:t xml:space="preserve">  template:</w:t>
+        <w:br/>
+        <w:t xml:space="preserve">    metadata:</w:t>
+        <w:br/>
+        <w:t xml:space="preserve">      labels:</w:t>
+        <w:br/>
+        <w:t xml:space="preserve">        app.kubernetes.io/name: devpod</w:t>
+        <w:br/>
+        <w:t xml:space="preserve">        app.kubernetes.io/part-of: homelab-dev</w:t>
+        <w:br/>
+        <w:t xml:space="preserve">    spec:</w:t>
+        <w:br/>
+        <w:t xml:space="preserve">      # cluster-admin via clusterrolebinding-devpod-admin.yaml; kubectl uses</w:t>
+        <w:br/>
+        <w:t xml:space="preserve">      # the mounted token (in-cluster config), no kubeconfig needed.</w:t>
+        <w:br/>
+        <w:t xml:space="preserve">      serviceAccountName: devpod</w:t>
+        <w:br/>
+        <w:t xml:space="preserve">      automountServiceAccountToken: true</w:t>
+        <w:br/>
+        <w:t xml:space="preserve">      # Containers run as root, so the projected SA token would be root-only</w:t>
+        <w:br/>
+        <w:t xml:space="preserve">      # (0600). fsGroup 1000 makes it group-readable for vscode (kubectl over</w:t>
+        <w:br/>
+        <w:t xml:space="preserve">      # SSH). OnRootMismatch: the Longhorn home root is already 1000:1000, so</w:t>
+        <w:br/>
+        <w:t xml:space="preserve">      # no recursive chown; the RWX SMB scratch is skipped by its CSI policy.</w:t>
+        <w:br/>
+        <w:t xml:space="preserve">      securityContext:</w:t>
+        <w:br/>
+        <w:t xml:space="preserve">        fsGroup: 1000</w:t>
+        <w:br/>
+        <w:t xml:space="preserve">        fsGroupChangePolicy: OnRootMismatch</w:t>
+        <w:br/>
+        <w:t xml:space="preserve">      affinity:</w:t>
+        <w:br/>
+        <w:t xml:space="preserve">        nodeAffinity:</w:t>
+        <w:br/>
+        <w:t xml:space="preserve">          requiredDuringSchedulingIgnoredDuringExecution:</w:t>
+        <w:br/>
+        <w:t xml:space="preserve">            nodeSelectorTerms:</w:t>
+        <w:br/>
+        <w:t xml:space="preserve">              - matchExpressions:</w:t>
+        <w:br/>
+        <w:t xml:space="preserve">                  - key: kubernetes.io/hostname</w:t>
+        <w:br/>
+        <w:t xml:space="preserve">                    operator: In</w:t>
+        <w:br/>
+        <w:t xml:space="preserve">                    values: [skynet-wrk-01, skynet-wrk-02, skynet-wrk-03]</w:t>
+        <w:br/>
+        <w:t xml:space="preserve">      initContainers:</w:t>
+        <w:br/>
+        <w:t xml:space="preserve">        - name: home-perms</w:t>
+        <w:br/>
+        <w:t xml:space="preserve">          image: mcr.microsoft.com/devcontainers/base:debian</w:t>
+        <w:br/>
+        <w:t xml:space="preserve">          imagePullPolicy: IfNotPresent</w:t>
+        <w:br/>
+        <w:t xml:space="preserve">          command:</w:t>
+        <w:br/>
+        <w:t xml:space="preserve">            - sh</w:t>
+        <w:br/>
+        <w:t xml:space="preserve">            - -c</w:t>
+        <w:br/>
+        <w:t xml:space="preserve">            - |</w:t>
+        <w:br/>
+        <w:t xml:space="preserve">              mkdir -p /home/vscode</w:t>
+        <w:br/>
+        <w:t xml:space="preserve">              if [ ! -f /home/vscode/.profile ]; then</w:t>
+        <w:br/>
+        <w:t xml:space="preserve">                cp -a /etc/skel/. /home/vscode/ 2&gt;/dev/null || true</w:t>
+        <w:br/>
+        <w:t xml:space="preserve">              fi</w:t>
+        <w:br/>
+        <w:t xml:space="preserve">              chown -R 1000:1000 /home/vscode</w:t>
+        <w:br/>
+        <w:t xml:space="preserve">          securityContext:</w:t>
+        <w:br/>
+        <w:t xml:space="preserve">            runAsUser: 0</w:t>
+        <w:br/>
+        <w:t xml:space="preserve">          volumeMounts:</w:t>
+        <w:br/>
+        <w:t xml:space="preserve">            - name: home</w:t>
+        <w:br/>
+        <w:t xml:space="preserve">              mountPath: /home/vscode</w:t>
+        <w:br/>
+        <w:t xml:space="preserve">        # Base environment: GitHub auth, Invertedlight/dotfiles setup,</w:t>
+        <w:br/>
+        <w:t xml:space="preserve">        # mise + tools. Full run only when ~/.devpod-bootstrap-done is</w:t>
+        <w:br/>
+        <w:t xml:space="preserve">        # missing (new home volume); otherwise skips. Always exits 0;</w:t>
+        <w:br/>
+        <w:t xml:space="preserve">        # result in ~/.devpod-bootstrap.status and ~/.devpod-bootstrap.log.</w:t>
+        <w:br/>
+        <w:t xml:space="preserve">        - name: bootstrap</w:t>
+        <w:br/>
+        <w:t xml:space="preserve">          image: mcr.microsoft.com/devcontainers/base:debian</w:t>
+        <w:br/>
+        <w:t xml:space="preserve">          imagePullPolicy: IfNotPresent</w:t>
+        <w:br/>
+        <w:t xml:space="preserve">          command: ["/bin/bash", "/opt/devpod-bootstrap/bootstrap.sh"]</w:t>
+        <w:br/>
+        <w:t xml:space="preserve">          securityContext:</w:t>
+        <w:br/>
+        <w:t xml:space="preserve">            runAsUser: 0</w:t>
+        <w:br/>
+        <w:t xml:space="preserve">          resources:</w:t>
+        <w:br/>
+        <w:t xml:space="preserve">            requests:</w:t>
+        <w:br/>
+        <w:t xml:space="preserve">              cpu: 250m</w:t>
+        <w:br/>
+        <w:t xml:space="preserve">              memory: 512Mi</w:t>
+        <w:br/>
+        <w:t xml:space="preserve">            limits:</w:t>
+        <w:br/>
+        <w:t xml:space="preserve">              cpu: "2"</w:t>
+        <w:br/>
+        <w:t xml:space="preserve">              memory: 4Gi</w:t>
+        <w:br/>
+        <w:t xml:space="preserve">          volumeMounts:</w:t>
+        <w:br/>
+        <w:t xml:space="preserve">            - name: home</w:t>
+        <w:br/>
+        <w:t xml:space="preserve">              mountPath: /home/vscode</w:t>
+        <w:br/>
+        <w:t xml:space="preserve">            - name: bootstrap</w:t>
+        <w:br/>
+        <w:t xml:space="preserve">              mountPath: /opt/devpod-bootstrap</w:t>
+        <w:br/>
+        <w:t xml:space="preserve">              readOnly: true</w:t>
+        <w:br/>
+        <w:t xml:space="preserve">            - name: github-credentials</w:t>
+        <w:br/>
+        <w:t xml:space="preserve">              mountPath: /etc/devpod/github</w:t>
+        <w:br/>
+        <w:t xml:space="preserve">              readOnly: true</w:t>
+        <w:br/>
+        <w:t xml:space="preserve">      containers:</w:t>
+        <w:br/>
+        <w:t xml:space="preserve">        - name: workspace</w:t>
+        <w:br/>
+        <w:t xml:space="preserve">          image: mcr.microsoft.com/devcontainers/base:debian</w:t>
+        <w:br/>
+        <w:t xml:space="preserve">          imagePullPolicy: IfNotPresent</w:t>
+        <w:br/>
+        <w:t xml:space="preserve">          # base:debian has no ssh-init.sh. Install openssh as root, listen</w:t>
+        <w:br/>
+        <w:t xml:space="preserve">          # on 2222, then stay up. A man-db trigger must not fail the pod.</w:t>
+        <w:br/>
+        <w:t xml:space="preserve">          command: ["/bin/bash", "-lc"]</w:t>
+        <w:br/>
+        <w:t xml:space="preserve">          args:</w:t>
+        <w:br/>
+        <w:t xml:space="preserve">            - |</w:t>
+        <w:br/>
+        <w:t xml:space="preserve">              set -uo pipefail</w:t>
+        <w:br/>
+        <w:t xml:space="preserve">              # git credential helper, GH_TOKEN, zsh login shell, mise PATH.</w:t>
+        <w:br/>
+        <w:t xml:space="preserve">              /opt/devpod-bootstrap/devpod-runtime.sh || echo "devpod-runtime failed"</w:t>
+        <w:br/>
+        <w:t xml:space="preserve">              if ! command -v sshd &gt;/dev/null 2&gt;&amp;1; then</w:t>
+        <w:br/>
+        <w:t xml:space="preserve">                mkdir -p /etc/dpkg/dpkg.cfg.d</w:t>
+        <w:br/>
+        <w:t xml:space="preserve">                printf 'path-exclude=/usr/share/man/*\npath-exclude=/usr/share/doc/*\n' &gt; /etc/dpkg/dpkg.cfg.d/01-nodoc</w:t>
+        <w:br/>
+        <w:t xml:space="preserve">                rm -f /var/lib/man-db/auto-update</w:t>
+        <w:br/>
+        <w:t xml:space="preserve">                apt-get update</w:t>
+        <w:br/>
+        <w:t xml:space="preserve">                DEBIAN_FRONTEND=noninteractive apt-get install -y --no-install-recommends openssh-server file || true</w:t>
+        <w:br/>
+        <w:t xml:space="preserve">              fi</w:t>
+        <w:br/>
+        <w:t xml:space="preserve">              mkdir -p /var/run/sshd /home/vscode/.ssh</w:t>
+        <w:br/>
+        <w:t xml:space="preserve">              # Host keys come from Secret devpod-ssh-host-keys (copied by</w:t>
+        <w:br/>
+        <w:t xml:space="preserve">              # devpod-runtime.sh). Generate throwaway keys only if absent.</w:t>
+        <w:br/>
+        <w:t xml:space="preserve">              if ! ls /etc/ssh/ssh_host_*_key &gt;/dev/null 2&gt;&amp;1; then</w:t>
+        <w:br/>
+        <w:t xml:space="preserve">                echo "no persistent host keys; generating (will change on restart)"</w:t>
+        <w:br/>
+        <w:t xml:space="preserve">                ssh-keygen -A || true</w:t>
+        <w:br/>
+        <w:t xml:space="preserve">              fi</w:t>
+        <w:br/>
+        <w:t xml:space="preserve">              if [ -f /etc/ssh/sshd_config ]; then</w:t>
+        <w:br/>
+        <w:t xml:space="preserve">                sed -i 's/^#\?Port .*/Port 2222/' /etc/ssh/sshd_config</w:t>
+        <w:br/>
+        <w:t xml:space="preserve">                grep -q '^Port 2222' /etc/ssh/sshd_config || echo 'Port 2222' &gt;&gt; /etc/ssh/sshd_config</w:t>
+        <w:br/>
+        <w:t xml:space="preserve">                sed -i 's/^#\?PasswordAuthentication.*/PasswordAuthentication no/' /etc/ssh/sshd_config</w:t>
+        <w:br/>
+        <w:t xml:space="preserve">                sed -i 's/^#\?PermitRootLogin.*/PermitRootLogin no/' /etc/ssh/sshd_config</w:t>
+        <w:br/>
+        <w:t xml:space="preserve">              fi</w:t>
+        <w:br/>
+        <w:t xml:space="preserve">              chown -R vscode:vscode /home/vscode/.ssh || true</w:t>
+        <w:br/>
+        <w:t xml:space="preserve">              chmod 700 /home/vscode/.ssh || true</w:t>
+        <w:br/>
+        <w:t xml:space="preserve">              if [ -x /usr/sbin/sshd ]; then</w:t>
+        <w:br/>
+        <w:t xml:space="preserve">                /usr/sbin/sshd || echo "sshd failed to start"</w:t>
+        <w:br/>
+        <w:t xml:space="preserve">              else</w:t>
+        <w:br/>
+        <w:t xml:space="preserve">                echo "sshd binary missing after install"</w:t>
+        <w:br/>
+        <w:t xml:space="preserve">              fi</w:t>
+        <w:br/>
+        <w:t xml:space="preserve">              # Homebrew on the home PVC (/home/linuxbrew); installs as</w:t>
+        <w:br/>
+        <w:t xml:space="preserve">              # vscode only when missing. Background so sshd is not delayed.</w:t>
+        <w:br/>
+        <w:t xml:space="preserve">              /opt/devpod-bootstrap/devpod-brew.sh &amp;</w:t>
+        <w:br/>
+        <w:t xml:space="preserve">              exec sleep infinity</w:t>
+        <w:br/>
+        <w:t xml:space="preserve">          securityContext:</w:t>
+        <w:br/>
+        <w:t xml:space="preserve">            runAsUser: 0</w:t>
+        <w:br/>
+        <w:t xml:space="preserve">          ports:</w:t>
+        <w:br/>
+        <w:t xml:space="preserve">            - name: ssh</w:t>
+        <w:br/>
+        <w:t xml:space="preserve">              containerPort: 2222</w:t>
+        <w:br/>
+        <w:t xml:space="preserve">          resources:</w:t>
+        <w:br/>
+        <w:t xml:space="preserve">            requests:</w:t>
+        <w:br/>
+        <w:t xml:space="preserve">              cpu: 250m</w:t>
+        <w:br/>
+        <w:t xml:space="preserve">              memory: 512Mi</w:t>
+        <w:br/>
+        <w:t xml:space="preserve">            limits:</w:t>
+        <w:br/>
+        <w:t xml:space="preserve">              cpu: "2"</w:t>
+        <w:br/>
+        <w:t xml:space="preserve">              memory: 4Gi</w:t>
+        <w:br/>
+        <w:t xml:space="preserve">          volumeMounts:</w:t>
+        <w:br/>
+        <w:t xml:space="preserve">            - name: home</w:t>
+        <w:br/>
+        <w:t xml:space="preserve">              mountPath: /home/vscode</w:t>
+        <w:br/>
+        <w:t xml:space="preserve">            # Homebrew prefix on the same PVC so it survives restarts.</w:t>
+        <w:br/>
+        <w:t xml:space="preserve">            - name: home</w:t>
+        <w:br/>
+        <w:t xml:space="preserve">              mountPath: /home/linuxbrew</w:t>
+        <w:br/>
+        <w:t xml:space="preserve">              subPath: .linuxbrew-root</w:t>
+        <w:br/>
+        <w:t xml:space="preserve">            - name: scratch</w:t>
+        <w:br/>
+        <w:t xml:space="preserve">              mountPath: /scratch</w:t>
+        <w:br/>
+        <w:t xml:space="preserve">            - name: bootstrap</w:t>
+        <w:br/>
+        <w:t xml:space="preserve">              mountPath: /opt/devpod-bootstrap</w:t>
+        <w:br/>
+        <w:t xml:space="preserve">              readOnly: true</w:t>
+        <w:br/>
+        <w:t xml:space="preserve">            - name: github-credentials</w:t>
+        <w:br/>
+        <w:t xml:space="preserve">              mountPath: /etc/devpod/github</w:t>
+        <w:br/>
+        <w:t xml:space="preserve">              readOnly: true</w:t>
+        <w:br/>
+        <w:t xml:space="preserve">            # SOPS age private key (Secret devpod/sops-age, created by</w:t>
+        <w:br/>
+        <w:t xml:space="preserve">            # kubectl out of band, not in Git). See README.</w:t>
+        <w:br/>
+        <w:t xml:space="preserve">            - name: sops-age</w:t>
+        <w:br/>
+        <w:t xml:space="preserve">              mountPath: /etc/sops-age</w:t>
+        <w:br/>
+        <w:t xml:space="preserve">              readOnly: true</w:t>
+        <w:br/>
+        <w:t xml:space="preserve">            # SSH host keys (Secret devpod/devpod-ssh-host-keys, created by</w:t>
+        <w:br/>
+        <w:t xml:space="preserve">            # kubectl out of band, not in Git). Shared by all replicas.</w:t>
+        <w:br/>
+        <w:t xml:space="preserve">            - name: ssh-host-keys</w:t>
+        <w:br/>
+        <w:t xml:space="preserve">              mountPath: /etc/devpod/ssh-host-keys</w:t>
+        <w:br/>
+        <w:t xml:space="preserve">              readOnly: true</w:t>
+        <w:br/>
+        <w:t xml:space="preserve">            # Pod-to-pod SSH client key (Secret devpod/devpod-internal-ssh,</w:t>
+        <w:br/>
+        <w:t xml:space="preserve">            # created by kubectl out of band, not in Git).</w:t>
+        <w:br/>
+        <w:t xml:space="preserve">            - name: internal-ssh</w:t>
+        <w:br/>
+        <w:t xml:space="preserve">              mountPath: /etc/devpod/internal-ssh</w:t>
+        <w:br/>
+        <w:t xml:space="preserve">              readOnly: true</w:t>
+        <w:br/>
+        <w:t xml:space="preserve">      volumes:</w:t>
+        <w:br/>
+        <w:t xml:space="preserve">        - name: scratch</w:t>
+        <w:br/>
+        <w:t xml:space="preserve">          persistentVolumeClaim:</w:t>
+        <w:br/>
+        <w:t xml:space="preserve">            claimName: devpod-scratch</w:t>
+        <w:br/>
+        <w:t xml:space="preserve">        - name: bootstrap</w:t>
+        <w:br/>
+        <w:t xml:space="preserve">          configMap:</w:t>
+        <w:br/>
+        <w:t xml:space="preserve">            name: devpod-bootstrap</w:t>
+        <w:br/>
+        <w:t xml:space="preserve">            defaultMode: 0755</w:t>
+        <w:br/>
+        <w:t xml:space="preserve">        # SOPS secret from apps/staging/devpod/github-credentials.yaml.</w:t>
+        <w:br/>
+        <w:t xml:space="preserve">        # Root-only on disk; devpod-runtime.sh copies the token to</w:t>
+        <w:br/>
+        <w:t xml:space="preserve">        # /run/devpod-github (container fs, not the PVC) for vscode.</w:t>
+        <w:br/>
+        <w:t xml:space="preserve">        - name: github-credentials</w:t>
+        <w:br/>
+        <w:t xml:space="preserve">          secret:</w:t>
+        <w:br/>
+        <w:t xml:space="preserve">            secretName: github-credentials</w:t>
+        <w:br/>
+        <w:t xml:space="preserve">            optional: true</w:t>
+        <w:br/>
+        <w:t xml:space="preserve">            defaultMode: 0400</w:t>
+        <w:br/>
+        <w:t xml:space="preserve">        # Copy of flux-system/sops-age (key age.agekey), made with kubectl;</w:t>
+        <w:br/>
+        <w:t xml:space="preserve">        # NOT in Git. Root-only on disk; devpod-runtime.sh copies it to</w:t>
+        <w:br/>
+        <w:t xml:space="preserve">        # /run/devpod-sops/keys.txt (container fs, not the PVC) for vscode.</w:t>
+        <w:br/>
+        <w:t xml:space="preserve">        # optional so the pod still starts if the Secret is missing.</w:t>
+        <w:br/>
+        <w:t xml:space="preserve">        - name: sops-age</w:t>
+        <w:br/>
+        <w:t xml:space="preserve">          secret:</w:t>
+        <w:br/>
+        <w:t xml:space="preserve">            secretName: sops-age</w:t>
+        <w:br/>
+        <w:t xml:space="preserve">            optional: true</w:t>
+        <w:br/>
+        <w:t xml:space="preserve">            defaultMode: 0400</w:t>
+        <w:br/>
+        <w:t xml:space="preserve">        # Persistent sshd host keys so the fingerprint survives restarts.</w:t>
+        <w:br/>
+        <w:t xml:space="preserve">        # NOT in Git; see README. devpod-runtime.sh copies them to /etc/ssh.</w:t>
+        <w:br/>
+        <w:t xml:space="preserve">        - name: ssh-host-keys</w:t>
+        <w:br/>
+        <w:t xml:space="preserve">          secret:</w:t>
+        <w:br/>
+        <w:t xml:space="preserve">            secretName: devpod-ssh-host-keys</w:t>
+        <w:br/>
+        <w:t xml:space="preserve">            optional: true</w:t>
+        <w:br/>
+        <w:t xml:space="preserve">            defaultMode: 0400</w:t>
+        <w:br/>
+        <w:t xml:space="preserve">        # Shared ed25519 key for pod-to-pod SSH (public half is in</w:t>
+        <w:br/>
+        <w:t xml:space="preserve">        # bootstrap/authorized_keys). NOT in Git; see README.</w:t>
+        <w:br/>
+        <w:t xml:space="preserve">        - name: internal-ssh</w:t>
+        <w:br/>
+        <w:t xml:space="preserve">          secret:</w:t>
+        <w:br/>
+        <w:t xml:space="preserve">            secretName: devpod-internal-ssh</w:t>
+        <w:br/>
+        <w:t xml:space="preserve">            optional: true</w:t>
+        <w:br/>
+        <w:t xml:space="preserve">            defaultMode: 0400</w:t>
+        <w:br/>
+        <w:t xml:space="preserve">  volumeClaimTemplates:</w:t>
+        <w:br/>
+        <w:t xml:space="preserve">    - metadata:</w:t>
+        <w:br/>
+        <w:t xml:space="preserve">        name: home</w:t>
+        <w:br/>
+        <w:t xml:space="preserve">        labels:</w:t>
+        <w:br/>
+        <w:t xml:space="preserve">          app.kubernetes.io/name: devpod</w:t>
+        <w:br/>
+        <w:t xml:space="preserve">          app.kubernetes.io/part-of: homelab-dev</w:t>
+        <w:br/>
+        <w:t xml:space="preserve">      spec:</w:t>
+        <w:br/>
+        <w:t xml:space="preserve">        accessModes:</w:t>
+        <w:br/>
+        <w:t xml:space="preserve">          - ReadWriteOnce</w:t>
+        <w:br/>
+        <w:t xml:space="preserve">        storageClassName: longhorn</w:t>
+        <w:br/>
+        <w:t xml:space="preserve">        resources:</w:t>
+        <w:br/>
+        <w:t xml:space="preserve">          requests:</w:t>
+        <w:br/>
+        <w:t xml:space="preserve">            storage: 20Gi</w:t>
+      </w:r>
+    </w:p>
+    <w:p>
+      <w:pPr>
+        <w:pStyle w:val="Heading1"/>
+      </w:pPr>
+      <w:r>
+        <w:t>S2.7. File: apps/base/devpod/README.md (excerpt: Pod-to-pod SSH)</w:t>
+      </w:r>
+    </w:p>
+    <w:p>
+      <w:r>
+        <w:t>New README section: usage, key handling, create/rotate.</w:t>
+      </w:r>
+    </w:p>
+    <w:p>
+      <w:pPr>
+        <w:pStyle w:val="Heading3"/>
+      </w:pPr>
+      <w:r>
+        <w:t>Excerpt</w:t>
+      </w:r>
+    </w:p>
+    <w:p>
+      <w:pPr>
+        <w:spacing w:line="240" w:lineRule="auto" w:before="40" w:after="180"/>
+        <w:ind w:left="86" w:right="86"/>
+        <w:shd w:val="clear" w:color="auto" w:fill="F0F4F7"/>
+      </w:pPr>
+      <w:r>
+        <w:rPr>
+          <w:rFonts w:ascii="Consolas" w:hAnsi="Consolas" w:eastAsia="Consolas"/>
+          <w:color w:val="000000"/>
+          <w:sz w:val="19"/>
+        </w:rPr>
+        <w:t>### Pod-to-pod SSH (`Secret devpod/devpod-internal-ssh`, not in Git)</w:t>
+        <w:br/>
+        <w:br/>
+        <w:t>Replicas can SSH to each other by short name: `ssh devpod-1 hostname`, `scp f devpod-1:`, `rsync -a dir/ devpod-1:dir/`.</w:t>
+        <w:br/>
+        <w:br/>
+        <w:t>- Key: one ed25519 pair (comment `devpod-internal`, `SHA256:wEg59Nbjp9s6181SaeJUxWVtC0g+CE2bxtMsL/YSEYc`). The private half lives only in Secret `devpod/devpod-internal-ssh` (keys `id_ed25519`, `id_ed25519.pub`), created with kubectl and **never committed**. The public half is in `bootstrap/authorized_keys` with `from="10.42.0.0/16"` (pod network; pod-to-pod traffic keeps the pod IP). cloudflared pods are in that range too, so this narrows the key rather than isolating it.</w:t>
+        <w:br/>
+        <w:t>- On each start `devpod-runtime.sh` installs `~/.ssh/id_ed25519_devpod` (0600, vscode), writes `/etc/ssh/ssh_config.d/devpod.conf` (`Host devpod-* !devpod-*.*` → `%h.devpod.devpod.svc.cluster.local`, port 2222, that key, `IdentitiesOnly yes`) and `/etc/ssh/ssh_known_hosts` from the shared host keys, so there's no host key prompt. Nothing in chezmoi-managed `~/.ssh` files is touched.</w:t>
+        <w:br/>
+        <w:br/>
+        <w:t>Create or rotate (from a Mac with cluster access; nothing printed but the public key and fingerprint):</w:t>
+        <w:br/>
+        <w:br/>
+        <w:t>```sh</w:t>
+        <w:br/>
+        <w:t>bash -c '</w:t>
+        <w:br/>
+        <w:t>set -e; d=$(mktemp -d); trap "rm -rf \"$d\"" EXIT; umask 077</w:t>
+        <w:br/>
+        <w:t>ssh-keygen -q -t ed25519 -N "" -C devpod-internal -f "$d/id_ed25519"</w:t>
+        <w:br/>
+        <w:t>kubectl -n devpod delete secret devpod-internal-ssh --ignore-not-found</w:t>
+        <w:br/>
+        <w:t>kubectl -n devpod create secret generic devpod-internal-ssh \</w:t>
+        <w:br/>
+        <w:t xml:space="preserve">  --from-file=id_ed25519="$d/id_ed25519" --from-file=id_ed25519.pub="$d/id_ed25519.pub" &gt;/dev/null</w:t>
+        <w:br/>
+        <w:t>ssh-keygen -lf "$d/id_ed25519.pub"; cat "$d/id_ed25519.pub"'</w:t>
+        <w:br/>
+        <w:t>```</w:t>
+        <w:br/>
+        <w:br/>
+        <w:t>After a rotation, replace the `devpod-internal` line in `bootstrap/authorized_keys` with the new public key (keep the `from=` prefix) and push; Flux rolls every replica.</w:t>
+      </w:r>
+    </w:p>
+    <w:p>
+      <w:pPr>
+        <w:pStyle w:val="Heading1"/>
+      </w:pPr>
+      <w:r>
+        <w:t>S2.7b. File: Files generated in each pod (not in Git)</w:t>
+      </w:r>
+    </w:p>
+    <w:p>
+      <w:r>
+        <w:t>What devpod-runtime.sh writes on every start (key bodies shortened here).</w:t>
+      </w:r>
+    </w:p>
+    <w:p>
+      <w:pPr>
+        <w:pStyle w:val="Heading3"/>
+      </w:pPr>
+      <w:r>
+        <w:t>Generated</w:t>
+      </w:r>
+    </w:p>
+    <w:p>
+      <w:pPr>
+        <w:keepLines/>
+        <w:spacing w:line="240" w:lineRule="auto" w:before="40" w:after="180"/>
+        <w:ind w:left="86" w:right="86"/>
+        <w:shd w:val="clear" w:color="auto" w:fill="F0F4F7"/>
+      </w:pPr>
+      <w:r>
+        <w:rPr>
+          <w:rFonts w:ascii="Consolas" w:hAnsi="Consolas" w:eastAsia="Consolas"/>
+          <w:color w:val="000000"/>
+          <w:sz w:val="19"/>
+        </w:rPr>
+        <w:t># /etc/ssh/ssh_config.d/devpod.conf (written by devpod-runtime.sh on every start)</w:t>
+        <w:br/>
+        <w:t># Managed by devpod-runtime.sh (homelab-cluster). Pod-to-pod SSH by short name.</w:t>
+        <w:br/>
+        <w:t>Host devpod-* !devpod-*.*</w:t>
+        <w:br/>
+        <w:t xml:space="preserve">  HostName %h.devpod.devpod.svc.cluster.local</w:t>
+        <w:br/>
+        <w:t xml:space="preserve">  Port 2222</w:t>
+        <w:br/>
+        <w:t xml:space="preserve">  User vscode</w:t>
+        <w:br/>
+        <w:t xml:space="preserve">  IdentityFile ~/.ssh/id_ed25519_devpod</w:t>
+        <w:br/>
+        <w:t xml:space="preserve">  IdentitiesOnly yes</w:t>
+        <w:br/>
+        <w:br/>
+        <w:t># /etc/ssh/ssh_known_hosts (built from the shared host keys in Secret devpod-ssh-host-keys)</w:t>
+        <w:br/>
+        <w:t>devpod-*,[devpod-*.devpod.devpod.svc.cluster.local]:2222,[devpod-*]:2222 ecdsa-sha2-nistp256 AAAAE2VjZHNh…</w:t>
+        <w:br/>
+        <w:t>devpod-*,[devpod-*.devpod.devpod.svc.cluster.local]:2222,[devpod-*]:2222 ssh-ed25519 AAAAC3NzaC1l…</w:t>
+        <w:br/>
+        <w:t>devpod-*,[devpod-*.devpod.devpod.svc.cluster.local]:2222,[devpod-*]:2222 ssh-rsa AAAAB3NzaC1y…</w:t>
+        <w:br/>
+        <w:br/>
+        <w:t># ~/.ssh/id_ed25519_devpod (0600 vscode) and id_ed25519_devpod.pub (0644): copied from the Secret</w:t>
+      </w:r>
+    </w:p>
+    <w:p>
+      <w:pPr>
+        <w:pStyle w:val="Heading1"/>
+      </w:pPr>
+      <w:r>
+        <w:t>S2.8 Verification (3 Oct 2026, 15:56-16:05 CT)</w:t>
+      </w:r>
+    </w:p>
+    <w:tbl>
+      <w:tblPr>
+        <w:tblStyle w:val="LightShading-Accent1"/>
+        <w:tblW w:type="auto" w:w="0"/>
+        <w:tblLayout w:type="fixed"/>
+        <w:tblLook w:firstColumn="1" w:firstRow="1" w:lastColumn="0" w:lastRow="0" w:noHBand="0" w:noVBand="1" w:val="04A0"/>
+        <w:tblBorders>
+          <w:top w:val="single" w:sz="8" w:space="0" w:color="4F81BD"/>
+          <w:left w:val="nil"/>
+          <w:bottom w:val="single" w:sz="8" w:space="0" w:color="4F81BD"/>
+          <w:right w:val="nil"/>
+          <w:insideH w:val="nil"/>
+          <w:insideV w:val="nil"/>
+        </w:tblBorders>
+      </w:tblPr>
+      <w:tblGrid>
+        <w:gridCol w:w="3744"/>
+        <w:gridCol w:w="6336"/>
+      </w:tblGrid>
+      <w:tr>
+        <w:trPr>
+          <w:cantSplit/>
+          <w:tblHeader w:val="true"/>
+        </w:trPr>
+        <w:tc>
+          <w:tcPr>
+            <w:tcW w:type="dxa" w:w="3744"/>
+            <w:tcBorders>
+              <w:top w:val="single" w:sz="8" w:space="0" w:color="4F81BD"/>
+              <w:bottom w:val="single" w:sz="8" w:space="0" w:color="4F81BD"/>
+            </w:tcBorders>
+            <w:shd w:val="clear" w:color="auto" w:fill="365F91"/>
+          </w:tcPr>
+          <w:p>
+            <w:pPr>
+              <w:keepNext/>
+              <w:spacing w:before="40" w:after="40" w:line="240" w:lineRule="auto"/>
+            </w:pPr>
+            <w:r/>
+            <w:r>
+              <w:rPr>
+                <w:b/>
+                <w:color w:val="FFFFFF"/>
+                <w:sz w:val="20"/>
+              </w:rPr>
+              <w:t>Check</w:t>
+            </w:r>
+          </w:p>
+        </w:tc>
+        <w:tc>
+          <w:tcPr>
+            <w:tcW w:type="dxa" w:w="6336"/>
+            <w:tcBorders>
+              <w:top w:val="single" w:sz="8" w:space="0" w:color="4F81BD"/>
+              <w:bottom w:val="single" w:sz="8" w:space="0" w:color="4F81BD"/>
+            </w:tcBorders>
+            <w:shd w:val="clear" w:color="auto" w:fill="365F91"/>
+          </w:tcPr>
+          <w:p>
+            <w:pPr>
+              <w:keepNext/>
+              <w:spacing w:before="40" w:after="40" w:line="240" w:lineRule="auto"/>
+            </w:pPr>
+            <w:r/>
+            <w:r>
+              <w:rPr>
+                <w:b/>
+                <w:color w:val="FFFFFF"/>
+                <w:sz w:val="20"/>
+              </w:rPr>
+              <w:t>Result</w:t>
+            </w:r>
+          </w:p>
+        </w:tc>
+      </w:tr>
+      <w:tr>
+        <w:trPr>
+          <w:cantSplit/>
+        </w:trPr>
+        <w:tc>
+          <w:tcPr>
+            <w:tcW w:type="dxa" w:w="3744"/>
+            <w:shd w:val="clear" w:color="auto" w:fill="D3DFEE"/>
+          </w:tcPr>
+          <w:p>
+            <w:pPr>
+              <w:spacing w:before="40" w:after="40" w:line="240" w:lineRule="auto"/>
+            </w:pPr>
+            <w:r/>
+            <w:r>
+              <w:rPr>
+                <w:b/>
+                <w:color w:val="173A53"/>
+                <w:sz w:val="20"/>
+              </w:rPr>
+              <w:t>Flux apps lastAppliedRevision</w:t>
+            </w:r>
+          </w:p>
+        </w:tc>
+        <w:tc>
+          <w:tcPr>
+            <w:tcW w:type="dxa" w:w="6336"/>
+            <w:shd w:val="clear" w:color="auto" w:fill="D3DFEE"/>
+          </w:tcPr>
+          <w:p>
+            <w:pPr>
+              <w:spacing w:before="40" w:after="40" w:line="240" w:lineRule="auto"/>
+            </w:pPr>
+            <w:r/>
+            <w:r>
+              <w:rPr>
+                <w:color w:val="1A1A1A"/>
+                <w:sz w:val="20"/>
+              </w:rPr>
+              <w:t>main@sha1:80b00d48c6e8011769f04cd8e7b2c57a5b41167b</w:t>
+            </w:r>
+          </w:p>
+        </w:tc>
+      </w:tr>
+      <w:tr>
+        <w:trPr>
+          <w:cantSplit/>
+        </w:trPr>
+        <w:tc>
+          <w:tcPr>
+            <w:tcW w:type="dxa" w:w="3744"/>
+            <w:shd w:val="clear" w:color="auto" w:fill="FFFFFF"/>
+          </w:tcPr>
+          <w:p>
+            <w:pPr>
+              <w:spacing w:before="40" w:after="40" w:line="240" w:lineRule="auto"/>
+            </w:pPr>
+            <w:r/>
+            <w:r>
+              <w:rPr>
+                <w:b/>
+                <w:color w:val="173A53"/>
+                <w:sz w:val="20"/>
+              </w:rPr>
+              <w:t>Rollout</w:t>
+            </w:r>
+          </w:p>
+        </w:tc>
+        <w:tc>
+          <w:tcPr>
+            <w:tcW w:type="dxa" w:w="6336"/>
+            <w:shd w:val="clear" w:color="auto" w:fill="FFFFFF"/>
+          </w:tcPr>
+          <w:p>
+            <w:pPr>
+              <w:spacing w:before="40" w:after="40" w:line="240" w:lineRule="auto"/>
+            </w:pPr>
+            <w:r/>
+            <w:r>
+              <w:rPr>
+                <w:color w:val="1A1A1A"/>
+                <w:sz w:val="20"/>
+              </w:rPr>
+              <w:t>devpod-1 (10.42.4.127, skynet-wrk-01) and devpod-0 (10.42.2.102, skynet-wrk-02) recreated, both 1/1 Ready</w:t>
+            </w:r>
+          </w:p>
+        </w:tc>
+      </w:tr>
+      <w:tr>
+        <w:trPr>
+          <w:cantSplit/>
+        </w:trPr>
+        <w:tc>
+          <w:tcPr>
+            <w:tcW w:type="dxa" w:w="3744"/>
+            <w:shd w:val="clear" w:color="auto" w:fill="D3DFEE"/>
+          </w:tcPr>
+          <w:p>
+            <w:pPr>
+              <w:spacing w:before="40" w:after="40" w:line="240" w:lineRule="auto"/>
+            </w:pPr>
+            <w:r/>
+            <w:r>
+              <w:rPr>
+                <w:b/>
+                <w:color w:val="173A53"/>
+                <w:sz w:val="20"/>
+              </w:rPr>
+              <w:t>Pod log (both)</w:t>
+            </w:r>
+          </w:p>
+        </w:tc>
+        <w:tc>
+          <w:tcPr>
+            <w:tcW w:type="dxa" w:w="6336"/>
+            <w:shd w:val="clear" w:color="auto" w:fill="D3DFEE"/>
+          </w:tcPr>
+          <w:p>
+            <w:pPr>
+              <w:spacing w:before="40" w:after="40" w:line="240" w:lineRule="auto"/>
+            </w:pPr>
+            <w:r/>
+            <w:r>
+              <w:rPr>
+                <w:color w:val="1A1A1A"/>
+                <w:sz w:val="20"/>
+              </w:rPr>
+              <w:t>authorized_keys written from repo (3 keys) · persistent SSH host keys installed · pod-to-pod SSH key, client config and known_hosts installed</w:t>
+            </w:r>
+          </w:p>
+        </w:tc>
+      </w:tr>
+      <w:tr>
+        <w:trPr>
+          <w:cantSplit/>
+        </w:trPr>
+        <w:tc>
+          <w:tcPr>
+            <w:tcW w:type="dxa" w:w="3744"/>
+            <w:shd w:val="clear" w:color="auto" w:fill="FFFFFF"/>
+          </w:tcPr>
+          <w:p>
+            <w:pPr>
+              <w:spacing w:before="40" w:after="40" w:line="240" w:lineRule="auto"/>
+            </w:pPr>
+            <w:r/>
+            <w:r>
+              <w:rPr>
+                <w:b/>
+                <w:color w:val="173A53"/>
+                <w:sz w:val="20"/>
+              </w:rPr>
+              <w:t>authorized_keys (both)</w:t>
+            </w:r>
+          </w:p>
+        </w:tc>
+        <w:tc>
+          <w:tcPr>
+            <w:tcW w:type="dxa" w:w="6336"/>
+            <w:shd w:val="clear" w:color="auto" w:fill="FFFFFF"/>
+          </w:tcPr>
+          <w:p>
+            <w:pPr>
+              <w:spacing w:before="40" w:after="40" w:line="240" w:lineRule="auto"/>
+            </w:pPr>
+            <w:r/>
+            <w:r>
+              <w:rPr>
+                <w:color w:val="1A1A1A"/>
+                <w:sz w:val="20"/>
+              </w:rPr>
+              <w:t>M5 PBPgT1A6…7JrM, Mac mini 94wTnD+2…rL4, devpod-internal wEg59Nbj…EYc</w:t>
+            </w:r>
+          </w:p>
+        </w:tc>
+      </w:tr>
+      <w:tr>
+        <w:trPr>
+          <w:cantSplit/>
+        </w:trPr>
+        <w:tc>
+          <w:tcPr>
+            <w:tcW w:type="dxa" w:w="3744"/>
+            <w:shd w:val="clear" w:color="auto" w:fill="D3DFEE"/>
+          </w:tcPr>
+          <w:p>
+            <w:pPr>
+              <w:spacing w:before="40" w:after="40" w:line="240" w:lineRule="auto"/>
+            </w:pPr>
+            <w:r/>
+            <w:r>
+              <w:rPr>
+                <w:b/>
+                <w:color w:val="173A53"/>
+                <w:sz w:val="20"/>
+              </w:rPr>
+              <w:t>~/.ssh/id_ed25519_devpod</w:t>
+            </w:r>
+          </w:p>
+        </w:tc>
+        <w:tc>
+          <w:tcPr>
+            <w:tcW w:type="dxa" w:w="6336"/>
+            <w:shd w:val="clear" w:color="auto" w:fill="D3DFEE"/>
+          </w:tcPr>
+          <w:p>
+            <w:pPr>
+              <w:spacing w:before="40" w:after="40" w:line="240" w:lineRule="auto"/>
+            </w:pPr>
+            <w:r/>
+            <w:r>
+              <w:rPr>
+                <w:color w:val="1A1A1A"/>
+                <w:sz w:val="20"/>
+              </w:rPr>
+              <w:t>-rw------- vscode vscode (both)</w:t>
+            </w:r>
+          </w:p>
+        </w:tc>
+      </w:tr>
+      <w:tr>
+        <w:trPr>
+          <w:cantSplit/>
+        </w:trPr>
+        <w:tc>
+          <w:tcPr>
+            <w:tcW w:type="dxa" w:w="3744"/>
+            <w:shd w:val="clear" w:color="auto" w:fill="FFFFFF"/>
+          </w:tcPr>
+          <w:p>
+            <w:pPr>
+              <w:spacing w:before="40" w:after="40" w:line="240" w:lineRule="auto"/>
+            </w:pPr>
+            <w:r/>
+            <w:r>
+              <w:rPr>
+                <w:b/>
+                <w:color w:val="173A53"/>
+                <w:sz w:val="20"/>
+              </w:rPr>
+              <w:t>Pod-to-pod source IP</w:t>
+            </w:r>
+          </w:p>
+        </w:tc>
+        <w:tc>
+          <w:tcPr>
+            <w:tcW w:type="dxa" w:w="6336"/>
+            <w:shd w:val="clear" w:color="auto" w:fill="FFFFFF"/>
+          </w:tcPr>
+          <w:p>
+            <w:pPr>
+              <w:spacing w:before="40" w:after="40" w:line="240" w:lineRule="auto"/>
+            </w:pPr>
+            <w:r/>
+            <w:r>
+              <w:rPr>
+                <w:color w:val="1A1A1A"/>
+                <w:sz w:val="20"/>
+              </w:rPr>
+              <w:t>devpod-1 sshd saw 10.42.2.101 (devpod-0's pod IP): no SNAT</w:t>
+            </w:r>
+          </w:p>
+        </w:tc>
+      </w:tr>
+      <w:tr>
+        <w:trPr>
+          <w:cantSplit/>
+        </w:trPr>
+        <w:tc>
+          <w:tcPr>
+            <w:tcW w:type="dxa" w:w="3744"/>
+            <w:shd w:val="clear" w:color="auto" w:fill="D3DFEE"/>
+          </w:tcPr>
+          <w:p>
+            <w:pPr>
+              <w:spacing w:before="40" w:after="40" w:line="240" w:lineRule="auto"/>
+            </w:pPr>
+            <w:r/>
+            <w:r>
+              <w:rPr>
+                <w:b/>
+                <w:color w:val="173A53"/>
+                <w:sz w:val="20"/>
+              </w:rPr>
+              <w:t>devpod-0 → ssh devpod-1 hostname</w:t>
+            </w:r>
+          </w:p>
+        </w:tc>
+        <w:tc>
+          <w:tcPr>
+            <w:tcW w:type="dxa" w:w="6336"/>
+            <w:shd w:val="clear" w:color="auto" w:fill="D3DFEE"/>
+          </w:tcPr>
+          <w:p>
+            <w:pPr>
+              <w:spacing w:before="40" w:after="40" w:line="240" w:lineRule="auto"/>
+            </w:pPr>
+            <w:r/>
+            <w:r>
+              <w:rPr>
+                <w:color w:val="1A1A1A"/>
+                <w:sz w:val="20"/>
+              </w:rPr>
+              <w:t>devpod-1, exit 0, no prompt</w:t>
+            </w:r>
+          </w:p>
+        </w:tc>
+      </w:tr>
+      <w:tr>
+        <w:trPr>
+          <w:cantSplit/>
+        </w:trPr>
+        <w:tc>
+          <w:tcPr>
+            <w:tcW w:type="dxa" w:w="3744"/>
+            <w:shd w:val="clear" w:color="auto" w:fill="FFFFFF"/>
+          </w:tcPr>
+          <w:p>
+            <w:pPr>
+              <w:spacing w:before="40" w:after="40" w:line="240" w:lineRule="auto"/>
+            </w:pPr>
+            <w:r/>
+            <w:r>
+              <w:rPr>
+                <w:b/>
+                <w:color w:val="173A53"/>
+                <w:sz w:val="20"/>
+              </w:rPr>
+              <w:t>devpod-1 → ssh devpod-0 hostname</w:t>
+            </w:r>
+          </w:p>
+        </w:tc>
+        <w:tc>
+          <w:tcPr>
+            <w:tcW w:type="dxa" w:w="6336"/>
+            <w:shd w:val="clear" w:color="auto" w:fill="FFFFFF"/>
+          </w:tcPr>
+          <w:p>
+            <w:pPr>
+              <w:spacing w:before="40" w:after="40" w:line="240" w:lineRule="auto"/>
+            </w:pPr>
+            <w:r/>
+            <w:r>
+              <w:rPr>
+                <w:color w:val="1A1A1A"/>
+                <w:sz w:val="20"/>
+              </w:rPr>
+              <w:t>devpod-0, exit 0, no prompt (after the S2.2 fix)</w:t>
+            </w:r>
+          </w:p>
+        </w:tc>
+      </w:tr>
+      <w:tr>
+        <w:trPr>
+          <w:cantSplit/>
+        </w:trPr>
+        <w:tc>
+          <w:tcPr>
+            <w:tcW w:type="dxa" w:w="3744"/>
+            <w:shd w:val="clear" w:color="auto" w:fill="D3DFEE"/>
+          </w:tcPr>
+          <w:p>
+            <w:pPr>
+              <w:spacing w:before="40" w:after="40" w:line="240" w:lineRule="auto"/>
+            </w:pPr>
+            <w:r/>
+            <w:r>
+              <w:rPr>
+                <w:b/>
+                <w:color w:val="173A53"/>
+                <w:sz w:val="20"/>
+              </w:rPr>
+              <w:t>scp + rsync, both directions</w:t>
+            </w:r>
+          </w:p>
+        </w:tc>
+        <w:tc>
+          <w:tcPr>
+            <w:tcW w:type="dxa" w:w="6336"/>
+            <w:shd w:val="clear" w:color="auto" w:fill="D3DFEE"/>
+          </w:tcPr>
+          <w:p>
+            <w:pPr>
+              <w:spacing w:before="40" w:after="40" w:line="240" w:lineRule="auto"/>
+            </w:pPr>
+            <w:r/>
+            <w:r>
+              <w:rPr>
+                <w:color w:val="1A1A1A"/>
+                <w:sz w:val="20"/>
+              </w:rPr>
+              <w:t>4 KiB random file: scp_ok, rsync_ok; sha256 identical on the far side; test files removed</w:t>
+            </w:r>
+          </w:p>
+        </w:tc>
+      </w:tr>
+      <w:tr>
+        <w:trPr>
+          <w:cantSplit/>
+        </w:trPr>
+        <w:tc>
+          <w:tcPr>
+            <w:tcW w:type="dxa" w:w="3744"/>
+            <w:shd w:val="clear" w:color="auto" w:fill="FFFFFF"/>
+          </w:tcPr>
+          <w:p>
+            <w:pPr>
+              <w:spacing w:before="40" w:after="40" w:line="240" w:lineRule="auto"/>
+            </w:pPr>
+            <w:r/>
+            <w:r>
+              <w:rPr>
+                <w:b/>
+                <w:color w:val="173A53"/>
+                <w:sz w:val="20"/>
+              </w:rPr>
+              <w:t>M5 → ssh devpod-0 via Cloudflare</w:t>
+            </w:r>
+          </w:p>
+        </w:tc>
+        <w:tc>
+          <w:tcPr>
+            <w:tcW w:type="dxa" w:w="6336"/>
+            <w:shd w:val="clear" w:color="auto" w:fill="FFFFFF"/>
+          </w:tcPr>
+          <w:p>
+            <w:pPr>
+              <w:spacing w:before="40" w:after="40" w:line="240" w:lineRule="auto"/>
+            </w:pPr>
+            <w:r/>
+            <w:r>
+              <w:rPr>
+                <w:color w:val="1A1A1A"/>
+                <w:sz w:val="20"/>
+              </w:rPr>
+              <w:t>ok-devpod-0, and from there ssh devpod-1 hostname → devpod-1 (exit 0)</w:t>
+            </w:r>
+          </w:p>
+        </w:tc>
+      </w:tr>
+      <w:tr>
+        <w:trPr>
+          <w:cantSplit/>
+        </w:trPr>
+        <w:tc>
+          <w:tcPr>
+            <w:tcW w:type="dxa" w:w="3744"/>
+            <w:shd w:val="clear" w:color="auto" w:fill="D3DFEE"/>
+          </w:tcPr>
+          <w:p>
+            <w:pPr>
+              <w:spacing w:before="40" w:after="40" w:line="240" w:lineRule="auto"/>
+            </w:pPr>
+            <w:r/>
+            <w:r>
+              <w:rPr>
+                <w:b/>
+                <w:color w:val="173A53"/>
+                <w:sz w:val="20"/>
+              </w:rPr>
+              <w:t>PVCs</w:t>
+            </w:r>
+          </w:p>
+        </w:tc>
+        <w:tc>
+          <w:tcPr>
+            <w:tcW w:type="dxa" w:w="6336"/>
+            <w:shd w:val="clear" w:color="auto" w:fill="D3DFEE"/>
+          </w:tcPr>
+          <w:p>
+            <w:pPr>
+              <w:spacing w:before="40" w:after="40" w:line="240" w:lineRule="auto"/>
+            </w:pPr>
+            <w:r/>
+            <w:r>
+              <w:rPr>
+                <w:color w:val="1A1A1A"/>
+                <w:sz w:val="20"/>
+              </w:rPr>
+              <w:t>home-devpod-0, home-devpod-1, devpod-scratch, devpod-default-de-115ea all Bound, untouched</w:t>
+            </w:r>
+          </w:p>
+        </w:tc>
+      </w:tr>
+    </w:tbl>
+    <w:p>
+      <w:pPr>
+        <w:spacing w:after="40" w:line="120" w:lineRule="exact"/>
+      </w:pPr>
+    </w:p>
+    <w:p>
+      <w:pPr>
+        <w:keepLines/>
+        <w:spacing w:line="240" w:lineRule="auto" w:before="40" w:after="180"/>
+        <w:ind w:left="86" w:right="86"/>
+        <w:shd w:val="clear" w:color="auto" w:fill="F0F4F7"/>
+      </w:pPr>
+      <w:r>
+        <w:rPr>
+          <w:rFonts w:ascii="Consolas" w:hAnsi="Consolas" w:eastAsia="Consolas"/>
+          <w:color w:val="000000"/>
+          <w:sz w:val="19"/>
+        </w:rPr>
+        <w:t>$ ssh -o BatchMode=yes devpod-1 hostname          # as vscode on devpod-0</w:t>
+        <w:br/>
+        <w:t>devpod-1</w:t>
+        <w:br/>
+        <w:t>$ scp -q /tmp/p2p-devpod-0.bin devpod-1:/tmp/ &amp;&amp; echo scp_ok</w:t>
+        <w:br/>
+        <w:t>scp_ok</w:t>
+        <w:br/>
+        <w:t>$ rsync -a /tmp/p2p-devpod-0.bin devpod-1:/tmp/p2p-devpod-0.rsync &amp;&amp; echo rsync_ok</w:t>
+        <w:br/>
+        <w:t>rsync_ok</w:t>
+        <w:br/>
+        <w:t>$ ssh devpod-1 'sha256sum /tmp/p2p-devpod-0.bin /tmp/p2p-devpod-0.rsync | cut -c1-16'</w:t>
+        <w:br/>
+        <w:t>394ad4c6cdfbcb2e</w:t>
+        <w:br/>
+        <w:t>394ad4c6cdfbcb2e</w:t>
+      </w:r>
+    </w:p>
+    <w:p>
+      <w:pPr>
+        <w:pStyle w:val="Heading1"/>
+      </w:pPr>
+      <w:r>
+        <w:t>S2.9 Restore steps (in addition to Appendix A and S.9)</w:t>
+      </w:r>
+    </w:p>
+    <w:tbl>
+      <w:tblPr>
+        <w:tblStyle w:val="LightShading-Accent1"/>
+        <w:tblW w:type="auto" w:w="0"/>
+        <w:tblLayout w:type="fixed"/>
+        <w:tblLook w:firstColumn="1" w:firstRow="1" w:lastColumn="0" w:lastRow="0" w:noHBand="0" w:noVBand="1" w:val="04A0"/>
+        <w:tblBorders>
+          <w:top w:val="single" w:sz="8" w:space="0" w:color="4F81BD"/>
+          <w:left w:val="nil"/>
+          <w:bottom w:val="single" w:sz="8" w:space="0" w:color="4F81BD"/>
+          <w:right w:val="nil"/>
+          <w:insideH w:val="nil"/>
+          <w:insideV w:val="nil"/>
+        </w:tblBorders>
+      </w:tblPr>
+      <w:tblGrid>
+        <w:gridCol w:w="1008"/>
+        <w:gridCol w:w="7056"/>
+        <w:gridCol w:w="2016"/>
+      </w:tblGrid>
+      <w:tr>
+        <w:trPr>
+          <w:cantSplit/>
+          <w:tblHeader w:val="true"/>
+        </w:trPr>
+        <w:tc>
+          <w:tcPr>
+            <w:tcW w:type="dxa" w:w="1008"/>
+            <w:tcBorders>
+              <w:top w:val="single" w:sz="8" w:space="0" w:color="4F81BD"/>
+              <w:bottom w:val="single" w:sz="8" w:space="0" w:color="4F81BD"/>
+            </w:tcBorders>
+            <w:shd w:val="clear" w:color="auto" w:fill="365F91"/>
+          </w:tcPr>
+          <w:p>
+            <w:pPr>
+              <w:keepNext/>
+              <w:spacing w:before="40" w:after="40" w:line="240" w:lineRule="auto"/>
+            </w:pPr>
+            <w:r/>
+            <w:r>
+              <w:rPr>
+                <w:b/>
+                <w:color w:val="FFFFFF"/>
+                <w:sz w:val="20"/>
+              </w:rPr>
+              <w:t>Order</w:t>
+            </w:r>
+          </w:p>
+        </w:tc>
+        <w:tc>
+          <w:tcPr>
+            <w:tcW w:type="dxa" w:w="7056"/>
+            <w:tcBorders>
+              <w:top w:val="single" w:sz="8" w:space="0" w:color="4F81BD"/>
+              <w:bottom w:val="single" w:sz="8" w:space="0" w:color="4F81BD"/>
+            </w:tcBorders>
+            <w:shd w:val="clear" w:color="auto" w:fill="365F91"/>
+          </w:tcPr>
+          <w:p>
+            <w:pPr>
+              <w:keepNext/>
+              <w:spacing w:before="40" w:after="40" w:line="240" w:lineRule="auto"/>
+            </w:pPr>
+            <w:r/>
+            <w:r>
+              <w:rPr>
+                <w:b/>
+                <w:color w:val="FFFFFF"/>
+                <w:sz w:val="20"/>
+              </w:rPr>
+              <w:t>What</w:t>
+            </w:r>
+          </w:p>
+        </w:tc>
+        <w:tc>
+          <w:tcPr>
+            <w:tcW w:type="dxa" w:w="2016"/>
+            <w:tcBorders>
+              <w:top w:val="single" w:sz="8" w:space="0" w:color="4F81BD"/>
+              <w:bottom w:val="single" w:sz="8" w:space="0" w:color="4F81BD"/>
+            </w:tcBorders>
+            <w:shd w:val="clear" w:color="auto" w:fill="365F91"/>
+          </w:tcPr>
+          <w:p>
+            <w:pPr>
+              <w:keepNext/>
+              <w:spacing w:before="40" w:after="40" w:line="240" w:lineRule="auto"/>
+            </w:pPr>
+            <w:r/>
+            <w:r>
+              <w:rPr>
+                <w:b/>
+                <w:color w:val="FFFFFF"/>
+                <w:sz w:val="20"/>
+              </w:rPr>
+              <w:t>From</w:t>
+            </w:r>
+          </w:p>
+        </w:tc>
+      </w:tr>
+      <w:tr>
+        <w:trPr>
+          <w:cantSplit/>
+        </w:trPr>
+        <w:tc>
+          <w:tcPr>
+            <w:tcW w:type="dxa" w:w="1008"/>
+            <w:shd w:val="clear" w:color="auto" w:fill="D3DFEE"/>
+          </w:tcPr>
+          <w:p>
+            <w:pPr>
+              <w:spacing w:before="40" w:after="40" w:line="240" w:lineRule="auto"/>
+            </w:pPr>
+            <w:r/>
+            <w:r>
+              <w:rPr>
+                <w:b/>
+                <w:color w:val="173A53"/>
+                <w:sz w:val="20"/>
+              </w:rPr>
+              <w:t>A.15</w:t>
+            </w:r>
+          </w:p>
+        </w:tc>
+        <w:tc>
+          <w:tcPr>
+            <w:tcW w:type="dxa" w:w="7056"/>
+            <w:shd w:val="clear" w:color="auto" w:fill="D3DFEE"/>
+          </w:tcPr>
+          <w:p>
+            <w:pPr>
+              <w:spacing w:before="40" w:after="40" w:line="240" w:lineRule="auto"/>
+            </w:pPr>
+            <w:r/>
+            <w:r>
+              <w:rPr>
+                <w:color w:val="1A1A1A"/>
+                <w:sz w:val="20"/>
+              </w:rPr>
+              <w:t>Secret devpod/devpod-internal-ssh by kubectl (new key pair if the old one is lost)</w:t>
+            </w:r>
+          </w:p>
+        </w:tc>
+        <w:tc>
+          <w:tcPr>
+            <w:tcW w:type="dxa" w:w="2016"/>
+            <w:shd w:val="clear" w:color="auto" w:fill="D3DFEE"/>
+          </w:tcPr>
+          <w:p>
+            <w:pPr>
+              <w:spacing w:before="40" w:after="40" w:line="240" w:lineRule="auto"/>
+            </w:pPr>
+            <w:r/>
+            <w:r>
+              <w:rPr>
+                <w:color w:val="1A1A1A"/>
+                <w:sz w:val="20"/>
+              </w:rPr>
+              <w:t>S2.3</w:t>
+            </w:r>
+          </w:p>
+        </w:tc>
+      </w:tr>
+      <w:tr>
+        <w:trPr>
+          <w:cantSplit/>
+        </w:trPr>
+        <w:tc>
+          <w:tcPr>
+            <w:tcW w:type="dxa" w:w="1008"/>
+            <w:shd w:val="clear" w:color="auto" w:fill="FFFFFF"/>
+          </w:tcPr>
+          <w:p>
+            <w:pPr>
+              <w:spacing w:before="40" w:after="40" w:line="240" w:lineRule="auto"/>
+            </w:pPr>
+            <w:r/>
+            <w:r>
+              <w:rPr>
+                <w:b/>
+                <w:color w:val="173A53"/>
+                <w:sz w:val="20"/>
+              </w:rPr>
+              <w:t>A.16</w:t>
+            </w:r>
+          </w:p>
+        </w:tc>
+        <w:tc>
+          <w:tcPr>
+            <w:tcW w:type="dxa" w:w="7056"/>
+            <w:shd w:val="clear" w:color="auto" w:fill="FFFFFF"/>
+          </w:tcPr>
+          <w:p>
+            <w:pPr>
+              <w:spacing w:before="40" w:after="40" w:line="240" w:lineRule="auto"/>
+            </w:pPr>
+            <w:r/>
+            <w:r>
+              <w:rPr>
+                <w:color w:val="1A1A1A"/>
+                <w:sz w:val="20"/>
+              </w:rPr>
+              <w:t>authorized_keys with the matching devpod-internal public line (keep from=)</w:t>
+            </w:r>
+          </w:p>
+        </w:tc>
+        <w:tc>
+          <w:tcPr>
+            <w:tcW w:type="dxa" w:w="2016"/>
+            <w:shd w:val="clear" w:color="auto" w:fill="FFFFFF"/>
+          </w:tcPr>
+          <w:p>
+            <w:pPr>
+              <w:spacing w:before="40" w:after="40" w:line="240" w:lineRule="auto"/>
+            </w:pPr>
+            <w:r/>
+            <w:r>
+              <w:rPr>
+                <w:color w:val="1A1A1A"/>
+                <w:sz w:val="20"/>
+              </w:rPr>
+              <w:t>S2.4</w:t>
+            </w:r>
+          </w:p>
+        </w:tc>
+      </w:tr>
+      <w:tr>
+        <w:trPr>
+          <w:cantSplit/>
+        </w:trPr>
+        <w:tc>
+          <w:tcPr>
+            <w:tcW w:type="dxa" w:w="1008"/>
+            <w:shd w:val="clear" w:color="auto" w:fill="D3DFEE"/>
+          </w:tcPr>
+          <w:p>
+            <w:pPr>
+              <w:spacing w:before="40" w:after="40" w:line="240" w:lineRule="auto"/>
+            </w:pPr>
+            <w:r/>
+            <w:r>
+              <w:rPr>
+                <w:b/>
+                <w:color w:val="173A53"/>
+                <w:sz w:val="20"/>
+              </w:rPr>
+              <w:t>A.17</w:t>
+            </w:r>
+          </w:p>
+        </w:tc>
+        <w:tc>
+          <w:tcPr>
+            <w:tcW w:type="dxa" w:w="7056"/>
+            <w:shd w:val="clear" w:color="auto" w:fill="D3DFEE"/>
+          </w:tcPr>
+          <w:p>
+            <w:pPr>
+              <w:spacing w:before="40" w:after="40" w:line="240" w:lineRule="auto"/>
+            </w:pPr>
+            <w:r/>
+            <w:r>
+              <w:rPr>
+                <w:color w:val="1A1A1A"/>
+                <w:sz w:val="20"/>
+              </w:rPr>
+              <w:t>devpod-runtime.sh and devpod-statefulset.yaml from this supplement (supersede 7/S.5 and 6/S.6)</w:t>
+            </w:r>
+          </w:p>
+        </w:tc>
+        <w:tc>
+          <w:tcPr>
+            <w:tcW w:type="dxa" w:w="2016"/>
+            <w:shd w:val="clear" w:color="auto" w:fill="D3DFEE"/>
+          </w:tcPr>
+          <w:p>
+            <w:pPr>
+              <w:spacing w:before="40" w:after="40" w:line="240" w:lineRule="auto"/>
+            </w:pPr>
+            <w:r/>
+            <w:r>
+              <w:rPr>
+                <w:color w:val="1A1A1A"/>
+                <w:sz w:val="20"/>
+              </w:rPr>
+              <w:t>S2.5, S2.6</w:t>
+            </w:r>
+          </w:p>
+        </w:tc>
+      </w:tr>
+      <w:tr>
+        <w:trPr>
+          <w:cantSplit/>
+        </w:trPr>
+        <w:tc>
+          <w:tcPr>
+            <w:tcW w:type="dxa" w:w="1008"/>
+            <w:shd w:val="clear" w:color="auto" w:fill="FFFFFF"/>
+          </w:tcPr>
+          <w:p>
+            <w:pPr>
+              <w:spacing w:before="40" w:after="40" w:line="240" w:lineRule="auto"/>
+            </w:pPr>
+            <w:r/>
+            <w:r>
+              <w:rPr>
+                <w:b/>
+                <w:color w:val="173A53"/>
+                <w:sz w:val="20"/>
+              </w:rPr>
+              <w:t>A.18</w:t>
+            </w:r>
+          </w:p>
+        </w:tc>
+        <w:tc>
+          <w:tcPr>
+            <w:tcW w:type="dxa" w:w="7056"/>
+            <w:shd w:val="clear" w:color="auto" w:fill="FFFFFF"/>
+          </w:tcPr>
+          <w:p>
+            <w:pPr>
+              <w:spacing w:before="40" w:after="40" w:line="240" w:lineRule="auto"/>
+            </w:pPr>
+            <w:r/>
+            <w:r>
+              <w:rPr>
+                <w:color w:val="1A1A1A"/>
+                <w:sz w:val="20"/>
+              </w:rPr>
+              <w:t>Commit, push, reconcile; test ssh devpod-1 hostname from devpod-0 and back</w:t>
+            </w:r>
+          </w:p>
+        </w:tc>
+        <w:tc>
+          <w:tcPr>
+            <w:tcW w:type="dxa" w:w="2016"/>
+            <w:shd w:val="clear" w:color="auto" w:fill="FFFFFF"/>
+          </w:tcPr>
+          <w:p>
+            <w:pPr>
+              <w:spacing w:before="40" w:after="40" w:line="240" w:lineRule="auto"/>
+            </w:pPr>
+            <w:r/>
+            <w:r>
+              <w:rPr>
+                <w:color w:val="1A1A1A"/>
+                <w:sz w:val="20"/>
+              </w:rPr>
+              <w:t>S2.10</w:t>
+            </w:r>
+          </w:p>
+        </w:tc>
+      </w:tr>
+    </w:tbl>
+    <w:p>
+      <w:pPr>
+        <w:spacing w:after="40" w:line="120" w:lineRule="exact"/>
+      </w:pPr>
+    </w:p>
+    <w:p>
+      <w:pPr>
+        <w:shd w:val="clear" w:color="auto" w:fill="FBEAEA"/>
+        <w:keepLines/>
+        <w:pBdr>
+          <w:left w:val="single" w:sz="36" w:space="6" w:color="A52A23"/>
+        </w:pBdr>
+        <w:spacing w:before="40" w:after="180"/>
+        <w:ind w:left="144" w:right="86"/>
+      </w:pPr>
+      <w:r>
+        <w:rPr>
+          <w:rFonts w:ascii="Calibri" w:hAnsi="Calibri" w:eastAsia="Calibri"/>
+          <w:b/>
+          <w:color w:val="A52A23"/>
+        </w:rPr>
+        <w:t xml:space="preserve">CRITICAL STEP  </w:t>
+      </w:r>
+      <w:r>
+        <w:rPr>
+          <w:rFonts w:ascii="Calibri" w:hAnsi="Calibri" w:eastAsia="Calibri"/>
+          <w:b/>
+          <w:color w:val="A52A23"/>
+        </w:rPr>
+        <w:t>If the internal key is rotated, the Secret and the authorized_keys line must change together.</w:t>
+      </w:r>
+      <w:r>
+        <w:br/>
+      </w:r>
+      <w:r>
+        <w:rPr>
+          <w:rFonts w:ascii="Calibri" w:hAnsi="Calibri" w:eastAsia="Calibri"/>
+          <w:b/>
+          <w:color w:val="A52A23"/>
+        </w:rPr>
+        <w:t>A mismatch silently breaks pod-to-pod SSH (Mac access is unaffected). Never restore the private key from a file in the repo or a document; it exists only in the Secret.</w:t>
+      </w:r>
+    </w:p>
+    <w:p>
+      <w:pPr>
+        <w:pStyle w:val="Heading1"/>
+      </w:pPr>
+      <w:r>
+        <w:t>S2.10 Commands</w:t>
+      </w:r>
+    </w:p>
+    <w:p>
+      <w:pPr>
+        <w:pStyle w:val="Heading2"/>
+      </w:pPr>
+      <w:r>
+        <w:t>S2.10.1 kubectl: Secret and pod state (no private data printed)</w:t>
+      </w:r>
+    </w:p>
+    <w:p>
+      <w:pPr>
+        <w:keepLines/>
+        <w:spacing w:line="240" w:lineRule="auto" w:before="40" w:after="180"/>
+        <w:ind w:left="86" w:right="86"/>
+        <w:shd w:val="clear" w:color="auto" w:fill="F0F4F7"/>
+      </w:pPr>
+      <w:r>
+        <w:rPr>
+          <w:rFonts w:ascii="Consolas" w:hAnsi="Consolas" w:eastAsia="Consolas"/>
+          <w:color w:val="000000"/>
+          <w:sz w:val="19"/>
+        </w:rPr>
+        <w:t>kubectl -n devpod get secret devpod-internal-ssh -o json | jq -r '.data|keys[]'</w:t>
+        <w:br/>
+        <w:t>kubectl -n devpod get secret devpod-internal-ssh -o json | jq -r '.data["id_ed25519.pub"]|@base64d' | ssh-keygen -lf -</w:t>
+        <w:br/>
+        <w:t>for p in devpod-0 devpod-1; do kubectl -n devpod logs $p -c workspace | grep -E 'pod-to-pod|authorized_keys'; done</w:t>
+        <w:br/>
+        <w:t>kubectl -n devpod exec devpod-1 -c workspace -- ssh-keygen -lf /home/vscode/.ssh/authorized_keys</w:t>
+        <w:br/>
+        <w:t>kubectl -n devpod exec devpod-1 -c workspace -- cat /etc/ssh/ssh_config.d/devpod.conf</w:t>
+      </w:r>
+    </w:p>
+    <w:p>
+      <w:pPr>
+        <w:pStyle w:val="Heading2"/>
+      </w:pPr>
+      <w:r>
+        <w:t>S2.10.2 Inside a pod (as vscode)</w:t>
+      </w:r>
+    </w:p>
+    <w:p>
+      <w:pPr>
+        <w:keepLines/>
+        <w:spacing w:line="240" w:lineRule="auto" w:before="40" w:after="180"/>
+        <w:ind w:left="86" w:right="86"/>
+        <w:shd w:val="clear" w:color="auto" w:fill="F0F4F7"/>
+      </w:pPr>
+      <w:r>
+        <w:rPr>
+          <w:rFonts w:ascii="Consolas" w:hAnsi="Consolas" w:eastAsia="Consolas"/>
+          <w:color w:val="000000"/>
+          <w:sz w:val="19"/>
+        </w:rPr>
+        <w:t>ssh devpod-1 hostname                   # from devpod-0 (or ssh devpod-0 from devpod-1)</w:t>
+        <w:br/>
+        <w:t>scp ./file devpod-1:/tmp/</w:t>
+        <w:br/>
+        <w:t>rsync -av ./dir/ devpod-1:dir/</w:t>
+        <w:br/>
+        <w:t>ssh -G devpod-1 | grep -E '^(hostname|port|user|identityfile|identitiesonly) '</w:t>
+        <w:br/>
+        <w:t>ls -l ~/.ssh/config 2&gt;/dev/null          # a user config here overrides the managed system config</w:t>
+      </w:r>
+    </w:p>
+    <w:p>
+      <w:pPr>
+        <w:pStyle w:val="Heading2"/>
+      </w:pPr>
+      <w:r>
+        <w:t>S2.10.3 Linux: source IP check (pod network, no SNAT)</w:t>
+      </w:r>
+    </w:p>
+    <w:p>
+      <w:pPr>
+        <w:keepLines/>
+        <w:spacing w:line="240" w:lineRule="auto" w:before="40" w:after="180"/>
+        <w:ind w:left="86" w:right="86"/>
+        <w:shd w:val="clear" w:color="auto" w:fill="F0F4F7"/>
+      </w:pPr>
+      <w:r>
+        <w:rPr>
+          <w:rFonts w:ascii="Consolas" w:hAnsi="Consolas" w:eastAsia="Consolas"/>
+          <w:color w:val="000000"/>
+          <w:sz w:val="19"/>
+        </w:rPr>
+        <w:t>kubectl -n devpod exec devpod-0 -c workspace -- bash -c \</w:t>
+        <w:br/>
+        <w:t xml:space="preserve">  'exec 3&lt;&gt;/dev/tcp/devpod-1.devpod.devpod.svc.cluster.local/2222; sleep 6' &amp;</w:t>
+        <w:br/>
+        <w:t>kubectl -n devpod exec devpod-1 -c workspace -- sh -c 'ss -tn | grep :2222'</w:t>
+        <w:br/>
+        <w:t>kubectl get nodes -o jsonpath='{range .items[*]}{.metadata.name} {.spec.podCIDR}{"\n"}{end}'</w:t>
       </w:r>
     </w:p>
     <w:sectPr>

</xml_diff>

<commit_message>
DevPod enhancements addendum: Supplement 3, image digest pin
</commit_message>
<xml_diff>
--- a/docs/Homelab_DevPod_Enhancements_Addendum.docx
+++ b/docs/Homelab_DevPod_Enhancements_Addendum.docx
@@ -14196,6 +14196,1440 @@
         <w:t>kubectl -n devpod exec devpod-1 -c workspace -- sh -c 'ss -tn | grep :2222'</w:t>
         <w:br/>
         <w:t>kubectl get nodes -o jsonpath='{range .items[*]}{.metadata.name} {.spec.podCIDR}{"\n"}{end}'</w:t>
+      </w:r>
+    </w:p>
+    <w:p>
+      <w:pPr>
+        <w:pStyle w:val="Heading1"/>
+        <w:pageBreakBefore/>
+      </w:pPr>
+      <w:r>
+        <w:t>Supplement 3: DevPod image digest pin for Renovate (Oct 3, 2026)</w:t>
+      </w:r>
+    </w:p>
+    <w:p>
+      <w:r>
+        <w:t>Appended after Supplement 2. Everything before this page is unchanged. Covers commit f663b8f only.</w:t>
+      </w:r>
+    </w:p>
+    <w:tbl>
+      <w:tblPr>
+        <w:tblStyle w:val="LightShading-Accent1"/>
+        <w:tblW w:type="auto" w:w="0"/>
+        <w:tblLayout w:type="fixed"/>
+        <w:tblLook w:firstColumn="1" w:firstRow="1" w:lastColumn="0" w:lastRow="0" w:noHBand="0" w:noVBand="1" w:val="04A0"/>
+        <w:tblBorders>
+          <w:top w:val="single" w:sz="8" w:space="0" w:color="4F81BD"/>
+          <w:left w:val="nil"/>
+          <w:bottom w:val="single" w:sz="8" w:space="0" w:color="4F81BD"/>
+          <w:right w:val="nil"/>
+          <w:insideH w:val="nil"/>
+          <w:insideV w:val="nil"/>
+        </w:tblBorders>
+      </w:tblPr>
+      <w:tblGrid>
+        <w:gridCol w:w="2592"/>
+        <w:gridCol w:w="7488"/>
+      </w:tblGrid>
+      <w:tr>
+        <w:trPr>
+          <w:cantSplit/>
+          <w:tblHeader w:val="true"/>
+        </w:trPr>
+        <w:tc>
+          <w:tcPr>
+            <w:tcW w:type="dxa" w:w="2592"/>
+            <w:tcBorders>
+              <w:top w:val="single" w:sz="8" w:space="0" w:color="4F81BD"/>
+              <w:bottom w:val="single" w:sz="8" w:space="0" w:color="4F81BD"/>
+            </w:tcBorders>
+            <w:shd w:val="clear" w:color="auto" w:fill="365F91"/>
+          </w:tcPr>
+          <w:p>
+            <w:pPr>
+              <w:keepNext/>
+              <w:spacing w:before="40" w:after="40" w:line="240" w:lineRule="auto"/>
+            </w:pPr>
+            <w:r/>
+            <w:r>
+              <w:rPr>
+                <w:b/>
+                <w:color w:val="FFFFFF"/>
+                <w:sz w:val="20"/>
+              </w:rPr>
+              <w:t>Field</w:t>
+            </w:r>
+          </w:p>
+        </w:tc>
+        <w:tc>
+          <w:tcPr>
+            <w:tcW w:type="dxa" w:w="7488"/>
+            <w:tcBorders>
+              <w:top w:val="single" w:sz="8" w:space="0" w:color="4F81BD"/>
+              <w:bottom w:val="single" w:sz="8" w:space="0" w:color="4F81BD"/>
+            </w:tcBorders>
+            <w:shd w:val="clear" w:color="auto" w:fill="365F91"/>
+          </w:tcPr>
+          <w:p>
+            <w:pPr>
+              <w:keepNext/>
+              <w:spacing w:before="40" w:after="40" w:line="240" w:lineRule="auto"/>
+            </w:pPr>
+            <w:r/>
+            <w:r>
+              <w:rPr>
+                <w:b/>
+                <w:color w:val="FFFFFF"/>
+                <w:sz w:val="20"/>
+              </w:rPr>
+              <w:t>Value</w:t>
+            </w:r>
+          </w:p>
+        </w:tc>
+      </w:tr>
+      <w:tr>
+        <w:trPr>
+          <w:cantSplit/>
+        </w:trPr>
+        <w:tc>
+          <w:tcPr>
+            <w:tcW w:type="dxa" w:w="2592"/>
+            <w:shd w:val="clear" w:color="auto" w:fill="D3DFEE"/>
+          </w:tcPr>
+          <w:p>
+            <w:pPr>
+              <w:spacing w:before="40" w:after="40" w:line="240" w:lineRule="auto"/>
+            </w:pPr>
+            <w:r/>
+            <w:r>
+              <w:rPr>
+                <w:b/>
+                <w:color w:val="173A53"/>
+                <w:sz w:val="20"/>
+              </w:rPr>
+              <w:t>Commit</w:t>
+            </w:r>
+          </w:p>
+        </w:tc>
+        <w:tc>
+          <w:tcPr>
+            <w:tcW w:type="dxa" w:w="7488"/>
+            <w:shd w:val="clear" w:color="auto" w:fill="D3DFEE"/>
+          </w:tcPr>
+          <w:p>
+            <w:pPr>
+              <w:spacing w:before="40" w:after="40" w:line="240" w:lineRule="auto"/>
+            </w:pPr>
+            <w:r/>
+            <w:r>
+              <w:rPr>
+                <w:color w:val="1A1A1A"/>
+                <w:sz w:val="20"/>
+              </w:rPr>
+              <w:t>f663b8f 'DevPod: pin devcontainers base image digest for Renovate' (16:46 CT)</w:t>
+            </w:r>
+          </w:p>
+        </w:tc>
+      </w:tr>
+      <w:tr>
+        <w:trPr>
+          <w:cantSplit/>
+        </w:trPr>
+        <w:tc>
+          <w:tcPr>
+            <w:tcW w:type="dxa" w:w="2592"/>
+            <w:shd w:val="clear" w:color="auto" w:fill="FFFFFF"/>
+          </w:tcPr>
+          <w:p>
+            <w:pPr>
+              <w:spacing w:before="40" w:after="40" w:line="240" w:lineRule="auto"/>
+            </w:pPr>
+            <w:r/>
+            <w:r>
+              <w:rPr>
+                <w:b/>
+                <w:color w:val="173A53"/>
+                <w:sz w:val="20"/>
+              </w:rPr>
+              <w:t>File touched</w:t>
+            </w:r>
+          </w:p>
+        </w:tc>
+        <w:tc>
+          <w:tcPr>
+            <w:tcW w:type="dxa" w:w="7488"/>
+            <w:shd w:val="clear" w:color="auto" w:fill="FFFFFF"/>
+          </w:tcPr>
+          <w:p>
+            <w:pPr>
+              <w:spacing w:before="40" w:after="40" w:line="240" w:lineRule="auto"/>
+            </w:pPr>
+            <w:r/>
+            <w:r>
+              <w:rPr>
+                <w:color w:val="1A1A1A"/>
+                <w:sz w:val="20"/>
+              </w:rPr>
+              <w:t>apps/base/devpod/devpod-statefulset.yaml (3 image lines: init home-perms, init bootstrap, workspace)</w:t>
+            </w:r>
+          </w:p>
+        </w:tc>
+      </w:tr>
+      <w:tr>
+        <w:trPr>
+          <w:cantSplit/>
+        </w:trPr>
+        <w:tc>
+          <w:tcPr>
+            <w:tcW w:type="dxa" w:w="2592"/>
+            <w:shd w:val="clear" w:color="auto" w:fill="D3DFEE"/>
+          </w:tcPr>
+          <w:p>
+            <w:pPr>
+              <w:spacing w:before="40" w:after="40" w:line="240" w:lineRule="auto"/>
+            </w:pPr>
+            <w:r/>
+            <w:r>
+              <w:rPr>
+                <w:b/>
+                <w:color w:val="173A53"/>
+                <w:sz w:val="20"/>
+              </w:rPr>
+              <w:t>Before</w:t>
+            </w:r>
+          </w:p>
+        </w:tc>
+        <w:tc>
+          <w:tcPr>
+            <w:tcW w:type="dxa" w:w="7488"/>
+            <w:shd w:val="clear" w:color="auto" w:fill="D3DFEE"/>
+          </w:tcPr>
+          <w:p>
+            <w:pPr>
+              <w:spacing w:before="40" w:after="40" w:line="240" w:lineRule="auto"/>
+            </w:pPr>
+            <w:r/>
+            <w:r>
+              <w:rPr>
+                <w:color w:val="1A1A1A"/>
+                <w:sz w:val="20"/>
+              </w:rPr>
+              <w:t>image: mcr.microsoft.com/devcontainers/base:debian</w:t>
+            </w:r>
+          </w:p>
+        </w:tc>
+      </w:tr>
+      <w:tr>
+        <w:trPr>
+          <w:cantSplit/>
+        </w:trPr>
+        <w:tc>
+          <w:tcPr>
+            <w:tcW w:type="dxa" w:w="2592"/>
+            <w:shd w:val="clear" w:color="auto" w:fill="FFFFFF"/>
+          </w:tcPr>
+          <w:p>
+            <w:pPr>
+              <w:spacing w:before="40" w:after="40" w:line="240" w:lineRule="auto"/>
+            </w:pPr>
+            <w:r/>
+            <w:r>
+              <w:rPr>
+                <w:b/>
+                <w:color w:val="173A53"/>
+                <w:sz w:val="20"/>
+              </w:rPr>
+              <w:t>After</w:t>
+            </w:r>
+          </w:p>
+        </w:tc>
+        <w:tc>
+          <w:tcPr>
+            <w:tcW w:type="dxa" w:w="7488"/>
+            <w:shd w:val="clear" w:color="auto" w:fill="FFFFFF"/>
+          </w:tcPr>
+          <w:p>
+            <w:pPr>
+              <w:spacing w:before="40" w:after="40" w:line="240" w:lineRule="auto"/>
+            </w:pPr>
+            <w:r/>
+            <w:r>
+              <w:rPr>
+                <w:color w:val="1A1A1A"/>
+                <w:sz w:val="20"/>
+              </w:rPr>
+              <w:t>image: mcr.microsoft.com/devcontainers/base:debian@sha256:1f851004adcd3dff3776b4a1da86727cf52280b0fdc9d5b0568c9c7d74274286</w:t>
+            </w:r>
+          </w:p>
+        </w:tc>
+      </w:tr>
+      <w:tr>
+        <w:trPr>
+          <w:cantSplit/>
+        </w:trPr>
+        <w:tc>
+          <w:tcPr>
+            <w:tcW w:type="dxa" w:w="2592"/>
+            <w:shd w:val="clear" w:color="auto" w:fill="D3DFEE"/>
+          </w:tcPr>
+          <w:p>
+            <w:pPr>
+              <w:spacing w:before="40" w:after="40" w:line="240" w:lineRule="auto"/>
+            </w:pPr>
+            <w:r/>
+            <w:r>
+              <w:rPr>
+                <w:b/>
+                <w:color w:val="173A53"/>
+                <w:sz w:val="20"/>
+              </w:rPr>
+              <w:t>Digest</w:t>
+            </w:r>
+          </w:p>
+        </w:tc>
+        <w:tc>
+          <w:tcPr>
+            <w:tcW w:type="dxa" w:w="7488"/>
+            <w:shd w:val="clear" w:color="auto" w:fill="D3DFEE"/>
+          </w:tcPr>
+          <w:p>
+            <w:pPr>
+              <w:spacing w:before="40" w:after="40" w:line="240" w:lineRule="auto"/>
+            </w:pPr>
+            <w:r/>
+            <w:r>
+              <w:rPr>
+                <w:color w:val="1A1A1A"/>
+                <w:sz w:val="20"/>
+              </w:rPr>
+              <w:t>sha256:1f851004adcd3dff3776b4a1da86727cf52280b0fdc9d5b0568c9c7d74274286 = current multi-arch OCI index for :debian on MCR, and the same digest the nodes were already running</w:t>
+            </w:r>
+          </w:p>
+        </w:tc>
+      </w:tr>
+      <w:tr>
+        <w:trPr>
+          <w:cantSplit/>
+        </w:trPr>
+        <w:tc>
+          <w:tcPr>
+            <w:tcW w:type="dxa" w:w="2592"/>
+            <w:shd w:val="clear" w:color="auto" w:fill="FFFFFF"/>
+          </w:tcPr>
+          <w:p>
+            <w:pPr>
+              <w:spacing w:before="40" w:after="40" w:line="240" w:lineRule="auto"/>
+            </w:pPr>
+            <w:r/>
+            <w:r>
+              <w:rPr>
+                <w:b/>
+                <w:color w:val="173A53"/>
+                <w:sz w:val="20"/>
+              </w:rPr>
+              <w:t>renovate.json</w:t>
+            </w:r>
+          </w:p>
+        </w:tc>
+        <w:tc>
+          <w:tcPr>
+            <w:tcW w:type="dxa" w:w="7488"/>
+            <w:shd w:val="clear" w:color="auto" w:fill="FFFFFF"/>
+          </w:tcPr>
+          <w:p>
+            <w:pPr>
+              <w:spacing w:before="40" w:after="40" w:line="240" w:lineRule="auto"/>
+            </w:pPr>
+            <w:r/>
+            <w:r>
+              <w:rPr>
+                <w:color w:val="1A1A1A"/>
+                <w:sz w:val="20"/>
+              </w:rPr>
+              <w:t>Unchanged: the kubernetes manager already scans every *.yaml (same mechanism that gives linkding its digest PRs)</w:t>
+            </w:r>
+          </w:p>
+        </w:tc>
+      </w:tr>
+      <w:tr>
+        <w:trPr>
+          <w:cantSplit/>
+        </w:trPr>
+        <w:tc>
+          <w:tcPr>
+            <w:tcW w:type="dxa" w:w="2592"/>
+            <w:shd w:val="clear" w:color="auto" w:fill="D3DFEE"/>
+          </w:tcPr>
+          <w:p>
+            <w:pPr>
+              <w:spacing w:before="40" w:after="40" w:line="240" w:lineRule="auto"/>
+            </w:pPr>
+            <w:r/>
+            <w:r>
+              <w:rPr>
+                <w:b/>
+                <w:color w:val="173A53"/>
+                <w:sz w:val="20"/>
+              </w:rPr>
+              <w:t>Pods</w:t>
+            </w:r>
+          </w:p>
+        </w:tc>
+        <w:tc>
+          <w:tcPr>
+            <w:tcW w:type="dxa" w:w="7488"/>
+            <w:shd w:val="clear" w:color="auto" w:fill="D3DFEE"/>
+          </w:tcPr>
+          <w:p>
+            <w:pPr>
+              <w:spacing w:before="40" w:after="40" w:line="240" w:lineRule="auto"/>
+            </w:pPr>
+            <w:r/>
+            <w:r>
+              <w:rPr>
+                <w:color w:val="1A1A1A"/>
+                <w:sz w:val="20"/>
+              </w:rPr>
+              <w:t>Both rolled once (pod template changed); image already present on the nodes, no pull, same content</w:t>
+            </w:r>
+          </w:p>
+        </w:tc>
+      </w:tr>
+    </w:tbl>
+    <w:p>
+      <w:pPr>
+        <w:spacing w:after="40" w:line="120" w:lineRule="exact"/>
+      </w:pPr>
+    </w:p>
+    <w:p>
+      <w:pPr>
+        <w:pStyle w:val="Heading2"/>
+      </w:pPr>
+      <w:r>
+        <w:t>S3.1 Why</w:t>
+      </w:r>
+    </w:p>
+    <w:p>
+      <w:pPr>
+        <w:pStyle w:val="ListBullet"/>
+      </w:pPr>
+      <w:r>
+        <w:t>A floating tag (:debian) gives Renovate nothing to bump: the YAML never changes when Microsoft republishes the image, so there is no PR and no record of what is running.</w:t>
+      </w:r>
+    </w:p>
+    <w:p>
+      <w:pPr>
+        <w:pStyle w:val="ListBullet"/>
+      </w:pPr>
+      <w:r>
+        <w:t>imagePullPolicy: IfNotPresent means each node keeps whatever :debian it pulled first. Nodes could run different builds, and a security rebuild would never arrive until the image is evicted.</w:t>
+      </w:r>
+    </w:p>
+    <w:p>
+      <w:pPr>
+        <w:pStyle w:val="ListBullet"/>
+      </w:pPr>
+      <w:r>
+        <w:t>With tag@digest, Renovate opens a PR when the :debian index digest changes. Merging it changes the pod template, so Flux rolls the StatefulSet onto the new build on every node, and Git shows exactly which build runs.</w:t>
+      </w:r>
+    </w:p>
+    <w:p>
+      <w:pPr>
+        <w:shd w:val="clear" w:color="auto" w:fill="D3DFEE"/>
+        <w:keepLines/>
+        <w:pBdr>
+          <w:left w:val="single" w:sz="24" w:space="6" w:color="4F81BD"/>
+        </w:pBdr>
+        <w:spacing w:before="40" w:after="180"/>
+        <w:ind w:left="115" w:right="86"/>
+      </w:pPr>
+      <w:r>
+        <w:rPr>
+          <w:b/>
+          <w:color w:val="173A53"/>
+        </w:rPr>
+        <w:t xml:space="preserve">Note  </w:t>
+      </w:r>
+      <w:r>
+        <w:rPr>
+          <w:color w:val="1A1A1A"/>
+        </w:rPr>
+        <w:t>Merging a Renovate digest PR restarts devpod-0 and devpod-1 (home volumes and their contents are kept). Merge it when a restart is convenient.</w:t>
+      </w:r>
+    </w:p>
+    <w:p>
+      <w:pPr>
+        <w:pStyle w:val="Heading1"/>
+      </w:pPr>
+      <w:r>
+        <w:t>S3.2. File: apps/base/devpod/devpod-statefulset.yaml</w:t>
+      </w:r>
+    </w:p>
+    <w:p>
+      <w:r>
+        <w:t>Full file at f663b8f. The only change since S2.6 is the three image lines.</w:t>
+      </w:r>
+    </w:p>
+    <w:p>
+      <w:pPr>
+        <w:shd w:val="clear" w:color="auto" w:fill="D3DFEE"/>
+        <w:keepLines/>
+        <w:pBdr>
+          <w:left w:val="single" w:sz="24" w:space="6" w:color="4F81BD"/>
+        </w:pBdr>
+        <w:spacing w:before="40" w:after="180"/>
+        <w:ind w:left="115" w:right="86"/>
+      </w:pPr>
+      <w:r>
+        <w:rPr>
+          <w:b/>
+          <w:color w:val="173A53"/>
+        </w:rPr>
+        <w:t xml:space="preserve">Note  </w:t>
+      </w:r>
+      <w:r>
+        <w:rPr>
+          <w:color w:val="1A1A1A"/>
+        </w:rPr>
+        <w:t>Supersedes the copies in section 6, S.6 and S2.6.</w:t>
+      </w:r>
+    </w:p>
+    <w:p>
+      <w:pPr>
+        <w:pStyle w:val="Heading3"/>
+      </w:pPr>
+      <w:r>
+        <w:t>Full file</w:t>
+      </w:r>
+    </w:p>
+    <w:p>
+      <w:pPr>
+        <w:spacing w:line="240" w:lineRule="auto" w:before="40" w:after="180"/>
+        <w:ind w:left="86" w:right="86"/>
+        <w:shd w:val="clear" w:color="auto" w:fill="F0F4F7"/>
+      </w:pPr>
+      <w:r>
+        <w:rPr>
+          <w:rFonts w:ascii="Consolas" w:hAnsi="Consolas" w:eastAsia="Consolas"/>
+          <w:color w:val="000000"/>
+          <w:sz w:val="19"/>
+        </w:rPr>
+        <w:t>apiVersion: apps/v1</w:t>
+        <w:br/>
+        <w:t>kind: StatefulSet</w:t>
+        <w:br/>
+        <w:t>metadata:</w:t>
+        <w:br/>
+        <w:t xml:space="preserve">  name: devpod</w:t>
+        <w:br/>
+        <w:t xml:space="preserve">  namespace: devpod</w:t>
+        <w:br/>
+        <w:t xml:space="preserve">  labels:</w:t>
+        <w:br/>
+        <w:t xml:space="preserve">    app.kubernetes.io/name: devpod</w:t>
+        <w:br/>
+        <w:t xml:space="preserve">    app.kubernetes.io/part-of: homelab-dev</w:t>
+        <w:br/>
+        <w:t>spec:</w:t>
+        <w:br/>
+        <w:t xml:space="preserve">  serviceName: devpod</w:t>
+        <w:br/>
+        <w:t xml:space="preserve">  replicas: 2</w:t>
+        <w:br/>
+        <w:t xml:space="preserve">  podManagementPolicy: Parallel</w:t>
+        <w:br/>
+        <w:t xml:space="preserve">  selector:</w:t>
+        <w:br/>
+        <w:t xml:space="preserve">    matchLabels:</w:t>
+        <w:br/>
+        <w:t xml:space="preserve">      app.kubernetes.io/name: devpod</w:t>
+        <w:br/>
+        <w:t xml:space="preserve">  template:</w:t>
+        <w:br/>
+        <w:t xml:space="preserve">    metadata:</w:t>
+        <w:br/>
+        <w:t xml:space="preserve">      labels:</w:t>
+        <w:br/>
+        <w:t xml:space="preserve">        app.kubernetes.io/name: devpod</w:t>
+        <w:br/>
+        <w:t xml:space="preserve">        app.kubernetes.io/part-of: homelab-dev</w:t>
+        <w:br/>
+        <w:t xml:space="preserve">    spec:</w:t>
+        <w:br/>
+        <w:t xml:space="preserve">      # cluster-admin via clusterrolebinding-devpod-admin.yaml; kubectl uses</w:t>
+        <w:br/>
+        <w:t xml:space="preserve">      # the mounted token (in-cluster config), no kubeconfig needed.</w:t>
+        <w:br/>
+        <w:t xml:space="preserve">      serviceAccountName: devpod</w:t>
+        <w:br/>
+        <w:t xml:space="preserve">      automountServiceAccountToken: true</w:t>
+        <w:br/>
+        <w:t xml:space="preserve">      # Containers run as root, so the projected SA token would be root-only</w:t>
+        <w:br/>
+        <w:t xml:space="preserve">      # (0600). fsGroup 1000 makes it group-readable for vscode (kubectl over</w:t>
+        <w:br/>
+        <w:t xml:space="preserve">      # SSH). OnRootMismatch: the Longhorn home root is already 1000:1000, so</w:t>
+        <w:br/>
+        <w:t xml:space="preserve">      # no recursive chown; the RWX SMB scratch is skipped by its CSI policy.</w:t>
+        <w:br/>
+        <w:t xml:space="preserve">      securityContext:</w:t>
+        <w:br/>
+        <w:t xml:space="preserve">        fsGroup: 1000</w:t>
+        <w:br/>
+        <w:t xml:space="preserve">        fsGroupChangePolicy: OnRootMismatch</w:t>
+        <w:br/>
+        <w:t xml:space="preserve">      affinity:</w:t>
+        <w:br/>
+        <w:t xml:space="preserve">        nodeAffinity:</w:t>
+        <w:br/>
+        <w:t xml:space="preserve">          requiredDuringSchedulingIgnoredDuringExecution:</w:t>
+        <w:br/>
+        <w:t xml:space="preserve">            nodeSelectorTerms:</w:t>
+        <w:br/>
+        <w:t xml:space="preserve">              - matchExpressions:</w:t>
+        <w:br/>
+        <w:t xml:space="preserve">                  - key: kubernetes.io/hostname</w:t>
+        <w:br/>
+        <w:t xml:space="preserve">                    operator: In</w:t>
+        <w:br/>
+        <w:t xml:space="preserve">                    values: [skynet-wrk-01, skynet-wrk-02, skynet-wrk-03]</w:t>
+        <w:br/>
+        <w:t xml:space="preserve">      initContainers:</w:t>
+        <w:br/>
+        <w:t xml:space="preserve">        - name: home-perms</w:t>
+        <w:br/>
+        <w:t xml:space="preserve">          image: mcr.microsoft.com/devcontainers/base:debian@sha256:1f851004adcd3dff3776b4a1da86727cf52280b0fdc9d5b0568c9c7d74274286</w:t>
+        <w:br/>
+        <w:t xml:space="preserve">          imagePullPolicy: IfNotPresent</w:t>
+        <w:br/>
+        <w:t xml:space="preserve">          command:</w:t>
+        <w:br/>
+        <w:t xml:space="preserve">            - sh</w:t>
+        <w:br/>
+        <w:t xml:space="preserve">            - -c</w:t>
+        <w:br/>
+        <w:t xml:space="preserve">            - |</w:t>
+        <w:br/>
+        <w:t xml:space="preserve">              mkdir -p /home/vscode</w:t>
+        <w:br/>
+        <w:t xml:space="preserve">              if [ ! -f /home/vscode/.profile ]; then</w:t>
+        <w:br/>
+        <w:t xml:space="preserve">                cp -a /etc/skel/. /home/vscode/ 2&gt;/dev/null || true</w:t>
+        <w:br/>
+        <w:t xml:space="preserve">              fi</w:t>
+        <w:br/>
+        <w:t xml:space="preserve">              chown -R 1000:1000 /home/vscode</w:t>
+        <w:br/>
+        <w:t xml:space="preserve">          securityContext:</w:t>
+        <w:br/>
+        <w:t xml:space="preserve">            runAsUser: 0</w:t>
+        <w:br/>
+        <w:t xml:space="preserve">          volumeMounts:</w:t>
+        <w:br/>
+        <w:t xml:space="preserve">            - name: home</w:t>
+        <w:br/>
+        <w:t xml:space="preserve">              mountPath: /home/vscode</w:t>
+        <w:br/>
+        <w:t xml:space="preserve">        # Base environment: GitHub auth, Invertedlight/dotfiles setup,</w:t>
+        <w:br/>
+        <w:t xml:space="preserve">        # mise + tools. Full run only when ~/.devpod-bootstrap-done is</w:t>
+        <w:br/>
+        <w:t xml:space="preserve">        # missing (new home volume); otherwise skips. Always exits 0;</w:t>
+        <w:br/>
+        <w:t xml:space="preserve">        # result in ~/.devpod-bootstrap.status and ~/.devpod-bootstrap.log.</w:t>
+        <w:br/>
+        <w:t xml:space="preserve">        - name: bootstrap</w:t>
+        <w:br/>
+        <w:t xml:space="preserve">          image: mcr.microsoft.com/devcontainers/base:debian@sha256:1f851004adcd3dff3776b4a1da86727cf52280b0fdc9d5b0568c9c7d74274286</w:t>
+        <w:br/>
+        <w:t xml:space="preserve">          imagePullPolicy: IfNotPresent</w:t>
+        <w:br/>
+        <w:t xml:space="preserve">          command: ["/bin/bash", "/opt/devpod-bootstrap/bootstrap.sh"]</w:t>
+        <w:br/>
+        <w:t xml:space="preserve">          securityContext:</w:t>
+        <w:br/>
+        <w:t xml:space="preserve">            runAsUser: 0</w:t>
+        <w:br/>
+        <w:t xml:space="preserve">          resources:</w:t>
+        <w:br/>
+        <w:t xml:space="preserve">            requests:</w:t>
+        <w:br/>
+        <w:t xml:space="preserve">              cpu: 250m</w:t>
+        <w:br/>
+        <w:t xml:space="preserve">              memory: 512Mi</w:t>
+        <w:br/>
+        <w:t xml:space="preserve">            limits:</w:t>
+        <w:br/>
+        <w:t xml:space="preserve">              cpu: "2"</w:t>
+        <w:br/>
+        <w:t xml:space="preserve">              memory: 4Gi</w:t>
+        <w:br/>
+        <w:t xml:space="preserve">          volumeMounts:</w:t>
+        <w:br/>
+        <w:t xml:space="preserve">            - name: home</w:t>
+        <w:br/>
+        <w:t xml:space="preserve">              mountPath: /home/vscode</w:t>
+        <w:br/>
+        <w:t xml:space="preserve">            - name: bootstrap</w:t>
+        <w:br/>
+        <w:t xml:space="preserve">              mountPath: /opt/devpod-bootstrap</w:t>
+        <w:br/>
+        <w:t xml:space="preserve">              readOnly: true</w:t>
+        <w:br/>
+        <w:t xml:space="preserve">            - name: github-credentials</w:t>
+        <w:br/>
+        <w:t xml:space="preserve">              mountPath: /etc/devpod/github</w:t>
+        <w:br/>
+        <w:t xml:space="preserve">              readOnly: true</w:t>
+        <w:br/>
+        <w:t xml:space="preserve">      containers:</w:t>
+        <w:br/>
+        <w:t xml:space="preserve">        - name: workspace</w:t>
+        <w:br/>
+        <w:t xml:space="preserve">          image: mcr.microsoft.com/devcontainers/base:debian@sha256:1f851004adcd3dff3776b4a1da86727cf52280b0fdc9d5b0568c9c7d74274286</w:t>
+        <w:br/>
+        <w:t xml:space="preserve">          imagePullPolicy: IfNotPresent</w:t>
+        <w:br/>
+        <w:t xml:space="preserve">          # base:debian has no ssh-init.sh. Install openssh as root, listen</w:t>
+        <w:br/>
+        <w:t xml:space="preserve">          # on 2222, then stay up. A man-db trigger must not fail the pod.</w:t>
+        <w:br/>
+        <w:t xml:space="preserve">          command: ["/bin/bash", "-lc"]</w:t>
+        <w:br/>
+        <w:t xml:space="preserve">          args:</w:t>
+        <w:br/>
+        <w:t xml:space="preserve">            - |</w:t>
+        <w:br/>
+        <w:t xml:space="preserve">              set -uo pipefail</w:t>
+        <w:br/>
+        <w:t xml:space="preserve">              # git credential helper, GH_TOKEN, zsh login shell, mise PATH.</w:t>
+        <w:br/>
+        <w:t xml:space="preserve">              /opt/devpod-bootstrap/devpod-runtime.sh || echo "devpod-runtime failed"</w:t>
+        <w:br/>
+        <w:t xml:space="preserve">              if ! command -v sshd &gt;/dev/null 2&gt;&amp;1; then</w:t>
+        <w:br/>
+        <w:t xml:space="preserve">                mkdir -p /etc/dpkg/dpkg.cfg.d</w:t>
+        <w:br/>
+        <w:t xml:space="preserve">                printf 'path-exclude=/usr/share/man/*\npath-exclude=/usr/share/doc/*\n' &gt; /etc/dpkg/dpkg.cfg.d/01-nodoc</w:t>
+        <w:br/>
+        <w:t xml:space="preserve">                rm -f /var/lib/man-db/auto-update</w:t>
+        <w:br/>
+        <w:t xml:space="preserve">                apt-get update</w:t>
+        <w:br/>
+        <w:t xml:space="preserve">                DEBIAN_FRONTEND=noninteractive apt-get install -y --no-install-recommends openssh-server file || true</w:t>
+        <w:br/>
+        <w:t xml:space="preserve">              fi</w:t>
+        <w:br/>
+        <w:t xml:space="preserve">              mkdir -p /var/run/sshd /home/vscode/.ssh</w:t>
+        <w:br/>
+        <w:t xml:space="preserve">              # Host keys come from Secret devpod-ssh-host-keys (copied by</w:t>
+        <w:br/>
+        <w:t xml:space="preserve">              # devpod-runtime.sh). Generate throwaway keys only if absent.</w:t>
+        <w:br/>
+        <w:t xml:space="preserve">              if ! ls /etc/ssh/ssh_host_*_key &gt;/dev/null 2&gt;&amp;1; then</w:t>
+        <w:br/>
+        <w:t xml:space="preserve">                echo "no persistent host keys; generating (will change on restart)"</w:t>
+        <w:br/>
+        <w:t xml:space="preserve">                ssh-keygen -A || true</w:t>
+        <w:br/>
+        <w:t xml:space="preserve">              fi</w:t>
+        <w:br/>
+        <w:t xml:space="preserve">              if [ -f /etc/ssh/sshd_config ]; then</w:t>
+        <w:br/>
+        <w:t xml:space="preserve">                sed -i 's/^#\?Port .*/Port 2222/' /etc/ssh/sshd_config</w:t>
+        <w:br/>
+        <w:t xml:space="preserve">                grep -q '^Port 2222' /etc/ssh/sshd_config || echo 'Port 2222' &gt;&gt; /etc/ssh/sshd_config</w:t>
+        <w:br/>
+        <w:t xml:space="preserve">                sed -i 's/^#\?PasswordAuthentication.*/PasswordAuthentication no/' /etc/ssh/sshd_config</w:t>
+        <w:br/>
+        <w:t xml:space="preserve">                sed -i 's/^#\?PermitRootLogin.*/PermitRootLogin no/' /etc/ssh/sshd_config</w:t>
+        <w:br/>
+        <w:t xml:space="preserve">              fi</w:t>
+        <w:br/>
+        <w:t xml:space="preserve">              chown -R vscode:vscode /home/vscode/.ssh || true</w:t>
+        <w:br/>
+        <w:t xml:space="preserve">              chmod 700 /home/vscode/.ssh || true</w:t>
+        <w:br/>
+        <w:t xml:space="preserve">              if [ -x /usr/sbin/sshd ]; then</w:t>
+        <w:br/>
+        <w:t xml:space="preserve">                /usr/sbin/sshd || echo "sshd failed to start"</w:t>
+        <w:br/>
+        <w:t xml:space="preserve">              else</w:t>
+        <w:br/>
+        <w:t xml:space="preserve">                echo "sshd binary missing after install"</w:t>
+        <w:br/>
+        <w:t xml:space="preserve">              fi</w:t>
+        <w:br/>
+        <w:t xml:space="preserve">              # Homebrew on the home PVC (/home/linuxbrew); installs as</w:t>
+        <w:br/>
+        <w:t xml:space="preserve">              # vscode only when missing. Background so sshd is not delayed.</w:t>
+        <w:br/>
+        <w:t xml:space="preserve">              /opt/devpod-bootstrap/devpod-brew.sh &amp;</w:t>
+        <w:br/>
+        <w:t xml:space="preserve">              exec sleep infinity</w:t>
+        <w:br/>
+        <w:t xml:space="preserve">          securityContext:</w:t>
+        <w:br/>
+        <w:t xml:space="preserve">            runAsUser: 0</w:t>
+        <w:br/>
+        <w:t xml:space="preserve">          ports:</w:t>
+        <w:br/>
+        <w:t xml:space="preserve">            - name: ssh</w:t>
+        <w:br/>
+        <w:t xml:space="preserve">              containerPort: 2222</w:t>
+        <w:br/>
+        <w:t xml:space="preserve">          resources:</w:t>
+        <w:br/>
+        <w:t xml:space="preserve">            requests:</w:t>
+        <w:br/>
+        <w:t xml:space="preserve">              cpu: 250m</w:t>
+        <w:br/>
+        <w:t xml:space="preserve">              memory: 512Mi</w:t>
+        <w:br/>
+        <w:t xml:space="preserve">            limits:</w:t>
+        <w:br/>
+        <w:t xml:space="preserve">              cpu: "2"</w:t>
+        <w:br/>
+        <w:t xml:space="preserve">              memory: 4Gi</w:t>
+        <w:br/>
+        <w:t xml:space="preserve">          volumeMounts:</w:t>
+        <w:br/>
+        <w:t xml:space="preserve">            - name: home</w:t>
+        <w:br/>
+        <w:t xml:space="preserve">              mountPath: /home/vscode</w:t>
+        <w:br/>
+        <w:t xml:space="preserve">            # Homebrew prefix on the same PVC so it survives restarts.</w:t>
+        <w:br/>
+        <w:t xml:space="preserve">            - name: home</w:t>
+        <w:br/>
+        <w:t xml:space="preserve">              mountPath: /home/linuxbrew</w:t>
+        <w:br/>
+        <w:t xml:space="preserve">              subPath: .linuxbrew-root</w:t>
+        <w:br/>
+        <w:t xml:space="preserve">            - name: scratch</w:t>
+        <w:br/>
+        <w:t xml:space="preserve">              mountPath: /scratch</w:t>
+        <w:br/>
+        <w:t xml:space="preserve">            - name: bootstrap</w:t>
+        <w:br/>
+        <w:t xml:space="preserve">              mountPath: /opt/devpod-bootstrap</w:t>
+        <w:br/>
+        <w:t xml:space="preserve">              readOnly: true</w:t>
+        <w:br/>
+        <w:t xml:space="preserve">            - name: github-credentials</w:t>
+        <w:br/>
+        <w:t xml:space="preserve">              mountPath: /etc/devpod/github</w:t>
+        <w:br/>
+        <w:t xml:space="preserve">              readOnly: true</w:t>
+        <w:br/>
+        <w:t xml:space="preserve">            # SOPS age private key (Secret devpod/sops-age, created by</w:t>
+        <w:br/>
+        <w:t xml:space="preserve">            # kubectl out of band, not in Git). See README.</w:t>
+        <w:br/>
+        <w:t xml:space="preserve">            - name: sops-age</w:t>
+        <w:br/>
+        <w:t xml:space="preserve">              mountPath: /etc/sops-age</w:t>
+        <w:br/>
+        <w:t xml:space="preserve">              readOnly: true</w:t>
+        <w:br/>
+        <w:t xml:space="preserve">            # SSH host keys (Secret devpod/devpod-ssh-host-keys, created by</w:t>
+        <w:br/>
+        <w:t xml:space="preserve">            # kubectl out of band, not in Git). Shared by all replicas.</w:t>
+        <w:br/>
+        <w:t xml:space="preserve">            - name: ssh-host-keys</w:t>
+        <w:br/>
+        <w:t xml:space="preserve">              mountPath: /etc/devpod/ssh-host-keys</w:t>
+        <w:br/>
+        <w:t xml:space="preserve">              readOnly: true</w:t>
+        <w:br/>
+        <w:t xml:space="preserve">            # Pod-to-pod SSH client key (Secret devpod/devpod-internal-ssh,</w:t>
+        <w:br/>
+        <w:t xml:space="preserve">            # created by kubectl out of band, not in Git).</w:t>
+        <w:br/>
+        <w:t xml:space="preserve">            - name: internal-ssh</w:t>
+        <w:br/>
+        <w:t xml:space="preserve">              mountPath: /etc/devpod/internal-ssh</w:t>
+        <w:br/>
+        <w:t xml:space="preserve">              readOnly: true</w:t>
+        <w:br/>
+        <w:t xml:space="preserve">      volumes:</w:t>
+        <w:br/>
+        <w:t xml:space="preserve">        - name: scratch</w:t>
+        <w:br/>
+        <w:t xml:space="preserve">          persistentVolumeClaim:</w:t>
+        <w:br/>
+        <w:t xml:space="preserve">            claimName: devpod-scratch</w:t>
+        <w:br/>
+        <w:t xml:space="preserve">        - name: bootstrap</w:t>
+        <w:br/>
+        <w:t xml:space="preserve">          configMap:</w:t>
+        <w:br/>
+        <w:t xml:space="preserve">            name: devpod-bootstrap</w:t>
+        <w:br/>
+        <w:t xml:space="preserve">            defaultMode: 0755</w:t>
+        <w:br/>
+        <w:t xml:space="preserve">        # SOPS secret from apps/staging/devpod/github-credentials.yaml.</w:t>
+        <w:br/>
+        <w:t xml:space="preserve">        # Root-only on disk; devpod-runtime.sh copies the token to</w:t>
+        <w:br/>
+        <w:t xml:space="preserve">        # /run/devpod-github (container fs, not the PVC) for vscode.</w:t>
+        <w:br/>
+        <w:t xml:space="preserve">        - name: github-credentials</w:t>
+        <w:br/>
+        <w:t xml:space="preserve">          secret:</w:t>
+        <w:br/>
+        <w:t xml:space="preserve">            secretName: github-credentials</w:t>
+        <w:br/>
+        <w:t xml:space="preserve">            optional: true</w:t>
+        <w:br/>
+        <w:t xml:space="preserve">            defaultMode: 0400</w:t>
+        <w:br/>
+        <w:t xml:space="preserve">        # Copy of flux-system/sops-age (key age.agekey), made with kubectl;</w:t>
+        <w:br/>
+        <w:t xml:space="preserve">        # NOT in Git. Root-only on disk; devpod-runtime.sh copies it to</w:t>
+        <w:br/>
+        <w:t xml:space="preserve">        # /run/devpod-sops/keys.txt (container fs, not the PVC) for vscode.</w:t>
+        <w:br/>
+        <w:t xml:space="preserve">        # optional so the pod still starts if the Secret is missing.</w:t>
+        <w:br/>
+        <w:t xml:space="preserve">        - name: sops-age</w:t>
+        <w:br/>
+        <w:t xml:space="preserve">          secret:</w:t>
+        <w:br/>
+        <w:t xml:space="preserve">            secretName: sops-age</w:t>
+        <w:br/>
+        <w:t xml:space="preserve">            optional: true</w:t>
+        <w:br/>
+        <w:t xml:space="preserve">            defaultMode: 0400</w:t>
+        <w:br/>
+        <w:t xml:space="preserve">        # Persistent sshd host keys so the fingerprint survives restarts.</w:t>
+        <w:br/>
+        <w:t xml:space="preserve">        # NOT in Git; see README. devpod-runtime.sh copies them to /etc/ssh.</w:t>
+        <w:br/>
+        <w:t xml:space="preserve">        - name: ssh-host-keys</w:t>
+        <w:br/>
+        <w:t xml:space="preserve">          secret:</w:t>
+        <w:br/>
+        <w:t xml:space="preserve">            secretName: devpod-ssh-host-keys</w:t>
+        <w:br/>
+        <w:t xml:space="preserve">            optional: true</w:t>
+        <w:br/>
+        <w:t xml:space="preserve">            defaultMode: 0400</w:t>
+        <w:br/>
+        <w:t xml:space="preserve">        # Shared ed25519 key for pod-to-pod SSH (public half is in</w:t>
+        <w:br/>
+        <w:t xml:space="preserve">        # bootstrap/authorized_keys). NOT in Git; see README.</w:t>
+        <w:br/>
+        <w:t xml:space="preserve">        - name: internal-ssh</w:t>
+        <w:br/>
+        <w:t xml:space="preserve">          secret:</w:t>
+        <w:br/>
+        <w:t xml:space="preserve">            secretName: devpod-internal-ssh</w:t>
+        <w:br/>
+        <w:t xml:space="preserve">            optional: true</w:t>
+        <w:br/>
+        <w:t xml:space="preserve">            defaultMode: 0400</w:t>
+        <w:br/>
+        <w:t xml:space="preserve">  volumeClaimTemplates:</w:t>
+        <w:br/>
+        <w:t xml:space="preserve">    - metadata:</w:t>
+        <w:br/>
+        <w:t xml:space="preserve">        name: home</w:t>
+        <w:br/>
+        <w:t xml:space="preserve">        labels:</w:t>
+        <w:br/>
+        <w:t xml:space="preserve">          app.kubernetes.io/name: devpod</w:t>
+        <w:br/>
+        <w:t xml:space="preserve">          app.kubernetes.io/part-of: homelab-dev</w:t>
+        <w:br/>
+        <w:t xml:space="preserve">      spec:</w:t>
+        <w:br/>
+        <w:t xml:space="preserve">        accessModes:</w:t>
+        <w:br/>
+        <w:t xml:space="preserve">          - ReadWriteOnce</w:t>
+        <w:br/>
+        <w:t xml:space="preserve">        storageClassName: longhorn</w:t>
+        <w:br/>
+        <w:t xml:space="preserve">        resources:</w:t>
+        <w:br/>
+        <w:t xml:space="preserve">          requests:</w:t>
+        <w:br/>
+        <w:t xml:space="preserve">            storage: 20Gi</w:t>
+      </w:r>
+    </w:p>
+    <w:p>
+      <w:pPr>
+        <w:pStyle w:val="Heading1"/>
+      </w:pPr>
+      <w:r>
+        <w:t>S3.3 Verification (3 Oct 2026, 16:46-16:56 CT)</w:t>
+      </w:r>
+    </w:p>
+    <w:tbl>
+      <w:tblPr>
+        <w:tblStyle w:val="LightShading-Accent1"/>
+        <w:tblW w:type="auto" w:w="0"/>
+        <w:tblLayout w:type="fixed"/>
+        <w:tblLook w:firstColumn="1" w:firstRow="1" w:lastColumn="0" w:lastRow="0" w:noHBand="0" w:noVBand="1" w:val="04A0"/>
+        <w:tblBorders>
+          <w:top w:val="single" w:sz="8" w:space="0" w:color="4F81BD"/>
+          <w:left w:val="nil"/>
+          <w:bottom w:val="single" w:sz="8" w:space="0" w:color="4F81BD"/>
+          <w:right w:val="nil"/>
+          <w:insideH w:val="nil"/>
+          <w:insideV w:val="nil"/>
+        </w:tblBorders>
+      </w:tblPr>
+      <w:tblGrid>
+        <w:gridCol w:w="3744"/>
+        <w:gridCol w:w="6336"/>
+      </w:tblGrid>
+      <w:tr>
+        <w:trPr>
+          <w:cantSplit/>
+          <w:tblHeader w:val="true"/>
+        </w:trPr>
+        <w:tc>
+          <w:tcPr>
+            <w:tcW w:type="dxa" w:w="3744"/>
+            <w:tcBorders>
+              <w:top w:val="single" w:sz="8" w:space="0" w:color="4F81BD"/>
+              <w:bottom w:val="single" w:sz="8" w:space="0" w:color="4F81BD"/>
+            </w:tcBorders>
+            <w:shd w:val="clear" w:color="auto" w:fill="365F91"/>
+          </w:tcPr>
+          <w:p>
+            <w:pPr>
+              <w:keepNext/>
+              <w:spacing w:before="40" w:after="40" w:line="240" w:lineRule="auto"/>
+            </w:pPr>
+            <w:r/>
+            <w:r>
+              <w:rPr>
+                <w:b/>
+                <w:color w:val="FFFFFF"/>
+                <w:sz w:val="20"/>
+              </w:rPr>
+              <w:t>Check</w:t>
+            </w:r>
+          </w:p>
+        </w:tc>
+        <w:tc>
+          <w:tcPr>
+            <w:tcW w:type="dxa" w:w="6336"/>
+            <w:tcBorders>
+              <w:top w:val="single" w:sz="8" w:space="0" w:color="4F81BD"/>
+              <w:bottom w:val="single" w:sz="8" w:space="0" w:color="4F81BD"/>
+            </w:tcBorders>
+            <w:shd w:val="clear" w:color="auto" w:fill="365F91"/>
+          </w:tcPr>
+          <w:p>
+            <w:pPr>
+              <w:keepNext/>
+              <w:spacing w:before="40" w:after="40" w:line="240" w:lineRule="auto"/>
+            </w:pPr>
+            <w:r/>
+            <w:r>
+              <w:rPr>
+                <w:b/>
+                <w:color w:val="FFFFFF"/>
+                <w:sz w:val="20"/>
+              </w:rPr>
+              <w:t>Result</w:t>
+            </w:r>
+          </w:p>
+        </w:tc>
+      </w:tr>
+      <w:tr>
+        <w:trPr>
+          <w:cantSplit/>
+        </w:trPr>
+        <w:tc>
+          <w:tcPr>
+            <w:tcW w:type="dxa" w:w="3744"/>
+            <w:shd w:val="clear" w:color="auto" w:fill="D3DFEE"/>
+          </w:tcPr>
+          <w:p>
+            <w:pPr>
+              <w:spacing w:before="40" w:after="40" w:line="240" w:lineRule="auto"/>
+            </w:pPr>
+            <w:r/>
+            <w:r>
+              <w:rPr>
+                <w:b/>
+                <w:color w:val="173A53"/>
+                <w:sz w:val="20"/>
+              </w:rPr>
+              <w:t>Registry</w:t>
+            </w:r>
+          </w:p>
+        </w:tc>
+        <w:tc>
+          <w:tcPr>
+            <w:tcW w:type="dxa" w:w="6336"/>
+            <w:shd w:val="clear" w:color="auto" w:fill="D3DFEE"/>
+          </w:tcPr>
+          <w:p>
+            <w:pPr>
+              <w:spacing w:before="40" w:after="40" w:line="240" w:lineRule="auto"/>
+            </w:pPr>
+            <w:r/>
+            <w:r>
+              <w:rPr>
+                <w:color w:val="1A1A1A"/>
+                <w:sz w:val="20"/>
+              </w:rPr>
+              <w:t>HEAD manifests/debian on mcr.microsoft.com: application/vnd.oci.image.index.v1+json, digest 1f851004…74286</w:t>
+            </w:r>
+          </w:p>
+        </w:tc>
+      </w:tr>
+      <w:tr>
+        <w:trPr>
+          <w:cantSplit/>
+        </w:trPr>
+        <w:tc>
+          <w:tcPr>
+            <w:tcW w:type="dxa" w:w="3744"/>
+            <w:shd w:val="clear" w:color="auto" w:fill="FFFFFF"/>
+          </w:tcPr>
+          <w:p>
+            <w:pPr>
+              <w:spacing w:before="40" w:after="40" w:line="240" w:lineRule="auto"/>
+            </w:pPr>
+            <w:r/>
+            <w:r>
+              <w:rPr>
+                <w:b/>
+                <w:color w:val="173A53"/>
+                <w:sz w:val="20"/>
+              </w:rPr>
+              <w:t>Before the pin</w:t>
+            </w:r>
+          </w:p>
+        </w:tc>
+        <w:tc>
+          <w:tcPr>
+            <w:tcW w:type="dxa" w:w="6336"/>
+            <w:shd w:val="clear" w:color="auto" w:fill="FFFFFF"/>
+          </w:tcPr>
+          <w:p>
+            <w:pPr>
+              <w:spacing w:before="40" w:after="40" w:line="240" w:lineRule="auto"/>
+            </w:pPr>
+            <w:r/>
+            <w:r>
+              <w:rPr>
+                <w:color w:val="1A1A1A"/>
+                <w:sz w:val="20"/>
+              </w:rPr>
+              <w:t>Both pods' imageID already base@sha256:1f851004…74286</w:t>
+            </w:r>
+          </w:p>
+        </w:tc>
+      </w:tr>
+      <w:tr>
+        <w:trPr>
+          <w:cantSplit/>
+        </w:trPr>
+        <w:tc>
+          <w:tcPr>
+            <w:tcW w:type="dxa" w:w="3744"/>
+            <w:shd w:val="clear" w:color="auto" w:fill="D3DFEE"/>
+          </w:tcPr>
+          <w:p>
+            <w:pPr>
+              <w:spacing w:before="40" w:after="40" w:line="240" w:lineRule="auto"/>
+            </w:pPr>
+            <w:r/>
+            <w:r>
+              <w:rPr>
+                <w:b/>
+                <w:color w:val="173A53"/>
+                <w:sz w:val="20"/>
+              </w:rPr>
+              <w:t>Flux apps lastAppliedRevision</w:t>
+            </w:r>
+          </w:p>
+        </w:tc>
+        <w:tc>
+          <w:tcPr>
+            <w:tcW w:type="dxa" w:w="6336"/>
+            <w:shd w:val="clear" w:color="auto" w:fill="D3DFEE"/>
+          </w:tcPr>
+          <w:p>
+            <w:pPr>
+              <w:spacing w:before="40" w:after="40" w:line="240" w:lineRule="auto"/>
+            </w:pPr>
+            <w:r/>
+            <w:r>
+              <w:rPr>
+                <w:color w:val="1A1A1A"/>
+                <w:sz w:val="20"/>
+              </w:rPr>
+              <w:t>main@sha1:f663b8f26535f43f2deb13382a1d3ba7271b874a</w:t>
+            </w:r>
+          </w:p>
+        </w:tc>
+      </w:tr>
+      <w:tr>
+        <w:trPr>
+          <w:cantSplit/>
+        </w:trPr>
+        <w:tc>
+          <w:tcPr>
+            <w:tcW w:type="dxa" w:w="3744"/>
+            <w:shd w:val="clear" w:color="auto" w:fill="FFFFFF"/>
+          </w:tcPr>
+          <w:p>
+            <w:pPr>
+              <w:spacing w:before="40" w:after="40" w:line="240" w:lineRule="auto"/>
+            </w:pPr>
+            <w:r/>
+            <w:r>
+              <w:rPr>
+                <w:b/>
+                <w:color w:val="173A53"/>
+                <w:sz w:val="20"/>
+              </w:rPr>
+              <w:t>Rollout</w:t>
+            </w:r>
+          </w:p>
+        </w:tc>
+        <w:tc>
+          <w:tcPr>
+            <w:tcW w:type="dxa" w:w="6336"/>
+            <w:shd w:val="clear" w:color="auto" w:fill="FFFFFF"/>
+          </w:tcPr>
+          <w:p>
+            <w:pPr>
+              <w:spacing w:before="40" w:after="40" w:line="240" w:lineRule="auto"/>
+            </w:pPr>
+            <w:r/>
+            <w:r>
+              <w:rPr>
+                <w:color w:val="1A1A1A"/>
+                <w:sz w:val="20"/>
+              </w:rPr>
+              <w:t>devpod-1 recreated 16:47:53 CT, devpod-0 16:49:29 CT; both Ready; events: image already present on machine</w:t>
+            </w:r>
+          </w:p>
+        </w:tc>
+      </w:tr>
+      <w:tr>
+        <w:trPr>
+          <w:cantSplit/>
+        </w:trPr>
+        <w:tc>
+          <w:tcPr>
+            <w:tcW w:type="dxa" w:w="3744"/>
+            <w:shd w:val="clear" w:color="auto" w:fill="D3DFEE"/>
+          </w:tcPr>
+          <w:p>
+            <w:pPr>
+              <w:spacing w:before="40" w:after="40" w:line="240" w:lineRule="auto"/>
+            </w:pPr>
+            <w:r/>
+            <w:r>
+              <w:rPr>
+                <w:b/>
+                <w:color w:val="173A53"/>
+                <w:sz w:val="20"/>
+              </w:rPr>
+              <w:t>Pod spec image (all 3 containers, both pods)</w:t>
+            </w:r>
+          </w:p>
+        </w:tc>
+        <w:tc>
+          <w:tcPr>
+            <w:tcW w:type="dxa" w:w="6336"/>
+            <w:shd w:val="clear" w:color="auto" w:fill="D3DFEE"/>
+          </w:tcPr>
+          <w:p>
+            <w:pPr>
+              <w:spacing w:before="40" w:after="40" w:line="240" w:lineRule="auto"/>
+            </w:pPr>
+            <w:r/>
+            <w:r>
+              <w:rPr>
+                <w:color w:val="1A1A1A"/>
+                <w:sz w:val="20"/>
+              </w:rPr>
+              <w:t>mcr.microsoft.com/devcontainers/base:debian@sha256:1f851004…74286</w:t>
+            </w:r>
+          </w:p>
+        </w:tc>
+      </w:tr>
+      <w:tr>
+        <w:trPr>
+          <w:cantSplit/>
+        </w:trPr>
+        <w:tc>
+          <w:tcPr>
+            <w:tcW w:type="dxa" w:w="3744"/>
+            <w:shd w:val="clear" w:color="auto" w:fill="FFFFFF"/>
+          </w:tcPr>
+          <w:p>
+            <w:pPr>
+              <w:spacing w:before="40" w:after="40" w:line="240" w:lineRule="auto"/>
+            </w:pPr>
+            <w:r/>
+            <w:r>
+              <w:rPr>
+                <w:b/>
+                <w:color w:val="173A53"/>
+                <w:sz w:val="20"/>
+              </w:rPr>
+              <w:t>Running imageID (all 3 containers, both pods)</w:t>
+            </w:r>
+          </w:p>
+        </w:tc>
+        <w:tc>
+          <w:tcPr>
+            <w:tcW w:type="dxa" w:w="6336"/>
+            <w:shd w:val="clear" w:color="auto" w:fill="FFFFFF"/>
+          </w:tcPr>
+          <w:p>
+            <w:pPr>
+              <w:spacing w:before="40" w:after="40" w:line="240" w:lineRule="auto"/>
+            </w:pPr>
+            <w:r/>
+            <w:r>
+              <w:rPr>
+                <w:color w:val="1A1A1A"/>
+                <w:sz w:val="20"/>
+              </w:rPr>
+              <w:t>mcr.microsoft.com/devcontainers/base@sha256:1f851004…74286</w:t>
+            </w:r>
+          </w:p>
+        </w:tc>
+      </w:tr>
+      <w:tr>
+        <w:trPr>
+          <w:cantSplit/>
+        </w:trPr>
+        <w:tc>
+          <w:tcPr>
+            <w:tcW w:type="dxa" w:w="3744"/>
+            <w:shd w:val="clear" w:color="auto" w:fill="D3DFEE"/>
+          </w:tcPr>
+          <w:p>
+            <w:pPr>
+              <w:spacing w:before="40" w:after="40" w:line="240" w:lineRule="auto"/>
+            </w:pPr>
+            <w:r/>
+            <w:r>
+              <w:rPr>
+                <w:b/>
+                <w:color w:val="173A53"/>
+                <w:sz w:val="20"/>
+              </w:rPr>
+              <w:t>M5 → ssh devpod-0 via Cloudflare</w:t>
+            </w:r>
+          </w:p>
+        </w:tc>
+        <w:tc>
+          <w:tcPr>
+            <w:tcW w:type="dxa" w:w="6336"/>
+            <w:shd w:val="clear" w:color="auto" w:fill="D3DFEE"/>
+          </w:tcPr>
+          <w:p>
+            <w:pPr>
+              <w:spacing w:before="40" w:after="40" w:line="240" w:lineRule="auto"/>
+            </w:pPr>
+            <w:r/>
+            <w:r>
+              <w:rPr>
+                <w:color w:val="1A1A1A"/>
+                <w:sz w:val="20"/>
+              </w:rPr>
+              <w:t>ok-devpod-0; ssh devpod-1 hostname from there → devpod-1</w:t>
+            </w:r>
+          </w:p>
+        </w:tc>
+      </w:tr>
+      <w:tr>
+        <w:trPr>
+          <w:cantSplit/>
+        </w:trPr>
+        <w:tc>
+          <w:tcPr>
+            <w:tcW w:type="dxa" w:w="3744"/>
+            <w:shd w:val="clear" w:color="auto" w:fill="FFFFFF"/>
+          </w:tcPr>
+          <w:p>
+            <w:pPr>
+              <w:spacing w:before="40" w:after="40" w:line="240" w:lineRule="auto"/>
+            </w:pPr>
+            <w:r/>
+            <w:r>
+              <w:rPr>
+                <w:b/>
+                <w:color w:val="173A53"/>
+                <w:sz w:val="20"/>
+              </w:rPr>
+              <w:t>PVCs</w:t>
+            </w:r>
+          </w:p>
+        </w:tc>
+        <w:tc>
+          <w:tcPr>
+            <w:tcW w:type="dxa" w:w="6336"/>
+            <w:shd w:val="clear" w:color="auto" w:fill="FFFFFF"/>
+          </w:tcPr>
+          <w:p>
+            <w:pPr>
+              <w:spacing w:before="40" w:after="40" w:line="240" w:lineRule="auto"/>
+            </w:pPr>
+            <w:r/>
+            <w:r>
+              <w:rPr>
+                <w:color w:val="1A1A1A"/>
+                <w:sz w:val="20"/>
+              </w:rPr>
+              <w:t>home-devpod-0, home-devpod-1, devpod-scratch, devpod-default-de-115ea all Bound, untouched</w:t>
+            </w:r>
+          </w:p>
+        </w:tc>
+      </w:tr>
+    </w:tbl>
+    <w:p>
+      <w:pPr>
+        <w:spacing w:after="40" w:line="120" w:lineRule="exact"/>
+      </w:pPr>
+    </w:p>
+    <w:p>
+      <w:pPr>
+        <w:pStyle w:val="Heading1"/>
+      </w:pPr>
+      <w:r>
+        <w:t>S3.4 Commands</w:t>
+      </w:r>
+    </w:p>
+    <w:p>
+      <w:pPr>
+        <w:keepLines/>
+        <w:spacing w:line="240" w:lineRule="auto" w:before="40" w:after="180"/>
+        <w:ind w:left="86" w:right="86"/>
+        <w:shd w:val="clear" w:color="auto" w:fill="F0F4F7"/>
+      </w:pPr>
+      <w:r>
+        <w:rPr>
+          <w:rFonts w:ascii="Consolas" w:hAnsi="Consolas" w:eastAsia="Consolas"/>
+          <w:color w:val="000000"/>
+          <w:sz w:val="19"/>
+        </w:rPr>
+        <w:t># current :debian index digest (no auth needed)</w:t>
+        <w:br/>
+        <w:t>curl -sI -H 'Accept: application/vnd.oci.image.index.v1+json' \</w:t>
+        <w:br/>
+        <w:t xml:space="preserve">  https://mcr.microsoft.com/v2/devcontainers/base/manifests/debian | grep -i docker-content-digest</w:t>
+        <w:br/>
+        <w:t># what each DevPod container runs</w:t>
+        <w:br/>
+        <w:t>kubectl -n devpod get pods -l app.kubernetes.io/name=devpod -o jsonpath=\</w:t>
+        <w:br/>
+        <w:t xml:space="preserve">  '{range .items[*]}{.metadata.name}{range .status.containerStatuses[*]} {.imageID}{end}{"\n"}{end}'</w:t>
       </w:r>
     </w:p>
     <w:sectPr>

</xml_diff>